<commit_message>
Sections 87-89: weight-2 encoding (X1 fails: the pair-product encoding is the limit; X2-X4 pass), Leung syndromes on IBM backends (D1-D3 pass on 2 of 3), optics note (EN/ES), QML note updated with §81-§87
</commit_message>
<xml_diff>
--- a/manuscript/qang_qml.docx
+++ b/manuscript/qang_qml.docx
@@ -381,7 +381,7 @@
         <w:rPr>
           <w:rFonts w:ascii="Times New Roman" w:hAnsi="Times New Roman"/>
         </w:rPr>
-        <w:t xml:space="preserve">2</w:t>
+        <w:t xml:space="preserve">3</w:t>
       </w:r>
       <w:r>
         <w:rPr>
@@ -2865,7 +2865,889 @@
         <w:rPr>
           <w:rFonts w:ascii="Times New Roman" w:hAnsi="Times New Roman"/>
         </w:rPr>
-        <w:t xml:space="preserve">qubits.</w:t>
+        <w:t xml:space="preserve">qubits,</w:t>
+      </w:r>
+      <w:r>
+        <w:rPr>
+          <w:rFonts w:ascii="Times New Roman" w:hAnsi="Times New Roman"/>
+        </w:rPr>
+        <w:t xml:space="preserve"> </w:t>
+      </w:r>
+      <w:r>
+        <w:rPr>
+          <w:rFonts w:ascii="Times New Roman" w:hAnsi="Times New Roman"/>
+        </w:rPr>
+        <w:t xml:space="preserve">although</w:t>
+      </w:r>
+      <w:r>
+        <w:rPr>
+          <w:rFonts w:ascii="Times New Roman" w:hAnsi="Times New Roman"/>
+        </w:rPr>
+        <w:t xml:space="preserve"> </w:t>
+      </w:r>
+      <w:r>
+        <w:rPr>
+          <w:rFonts w:ascii="Times New Roman" w:hAnsi="Times New Roman"/>
+        </w:rPr>
+        <w:t xml:space="preserve">alone</w:t>
+      </w:r>
+      <w:r>
+        <w:rPr>
+          <w:rFonts w:ascii="Times New Roman" w:hAnsi="Times New Roman"/>
+        </w:rPr>
+        <w:t xml:space="preserve"> </w:t>
+      </w:r>
+      <w:r>
+        <w:rPr>
+          <w:rFonts w:ascii="Times New Roman" w:hAnsi="Times New Roman"/>
+        </w:rPr>
+        <w:t xml:space="preserve">it</w:t>
+      </w:r>
+      <w:r>
+        <w:rPr>
+          <w:rFonts w:ascii="Times New Roman" w:hAnsi="Times New Roman"/>
+        </w:rPr>
+        <w:t xml:space="preserve"> </w:t>
+      </w:r>
+      <w:r>
+        <w:rPr>
+          <w:rFonts w:ascii="Times New Roman" w:hAnsi="Times New Roman"/>
+        </w:rPr>
+        <w:t xml:space="preserve">loses</w:t>
+      </w:r>
+      <w:r>
+        <w:rPr>
+          <w:rFonts w:ascii="Times New Roman" w:hAnsi="Times New Roman"/>
+        </w:rPr>
+        <w:t xml:space="preserve"> </w:t>
+      </w:r>
+      <w:r>
+        <w:rPr>
+          <w:rFonts w:ascii="Times New Roman" w:hAnsi="Times New Roman"/>
+        </w:rPr>
+        <w:t xml:space="preserve">less</w:t>
+      </w:r>
+      <w:r>
+        <w:rPr>
+          <w:rFonts w:ascii="Times New Roman" w:hAnsi="Times New Roman"/>
+        </w:rPr>
+        <w:t xml:space="preserve"> </w:t>
+      </w:r>
+      <w:r>
+        <w:rPr>
+          <w:rFonts w:ascii="Times New Roman" w:hAnsi="Times New Roman"/>
+        </w:rPr>
+        <w:t xml:space="preserve">than</w:t>
+      </w:r>
+      <w:r>
+        <w:rPr>
+          <w:rFonts w:ascii="Times New Roman" w:hAnsi="Times New Roman"/>
+        </w:rPr>
+        <w:t xml:space="preserve"> </w:t>
+      </w:r>
+      <w:r>
+        <w:rPr>
+          <w:rFonts w:ascii="Times New Roman" w:hAnsi="Times New Roman"/>
+        </w:rPr>
+        <w:t xml:space="preserve">one</w:t>
+      </w:r>
+      <w:r>
+        <w:rPr>
+          <w:rFonts w:ascii="Times New Roman" w:hAnsi="Times New Roman"/>
+        </w:rPr>
+        <w:t xml:space="preserve"> </w:t>
+      </w:r>
+      <w:r>
+        <w:rPr>
+          <w:rFonts w:ascii="Times New Roman" w:hAnsi="Times New Roman"/>
+        </w:rPr>
+        <w:t xml:space="preserve">point</w:t>
+      </w:r>
+      <w:r>
+        <w:rPr>
+          <w:rFonts w:ascii="Times New Roman" w:hAnsi="Times New Roman"/>
+        </w:rPr>
+        <w:t xml:space="preserve"> </w:t>
+      </w:r>
+      <w:r>
+        <w:rPr>
+          <w:rFonts w:ascii="Times New Roman" w:hAnsi="Times New Roman"/>
+        </w:rPr>
+        <w:t xml:space="preserve">up</w:t>
+      </w:r>
+      <w:r>
+        <w:rPr>
+          <w:rFonts w:ascii="Times New Roman" w:hAnsi="Times New Roman"/>
+        </w:rPr>
+        <w:t xml:space="preserve"> </w:t>
+      </w:r>
+      <w:r>
+        <w:rPr>
+          <w:rFonts w:ascii="Times New Roman" w:hAnsi="Times New Roman"/>
+        </w:rPr>
+        <w:t xml:space="preserve">to</w:t>
+      </w:r>
+      <w:r>
+        <w:rPr>
+          <w:rFonts w:ascii="Times New Roman" w:hAnsi="Times New Roman"/>
+        </w:rPr>
+        <w:t xml:space="preserve"> </w:t>
+      </w:r>
+      <w:r>
+        <w:rPr>
+          <w:rFonts w:ascii="Times New Roman" w:hAnsi="Times New Roman"/>
+        </w:rPr>
+        <w:t xml:space="preserve">a</w:t>
+      </w:r>
+      <w:r>
+        <w:rPr>
+          <w:rFonts w:ascii="Times New Roman" w:hAnsi="Times New Roman"/>
+        </w:rPr>
+        <w:t xml:space="preserve"> </w:t>
+      </w:r>
+      <m:oMath>
+        <m:r>
+          <m:rPr>
+            <m:sty m:val="p"/>
+          </m:rPr>
+          <m:t>±</m:t>
+        </m:r>
+        <m:r>
+          <m:t>80</m:t>
+        </m:r>
+        <m:r>
+          <m:rPr>
+            <m:sty m:val="p"/>
+          </m:rPr>
+          <m:t>%</m:t>
+        </m:r>
+      </m:oMath>
+      <w:r>
+        <w:rPr>
+          <w:rFonts w:ascii="Times New Roman" w:hAnsi="Times New Roman"/>
+        </w:rPr>
+        <w:t xml:space="preserve"> </w:t>
+      </w:r>
+      <w:r>
+        <w:rPr>
+          <w:rFonts w:ascii="Times New Roman" w:hAnsi="Times New Roman"/>
+        </w:rPr>
+        <w:t xml:space="preserve">spread</w:t>
+      </w:r>
+      <w:r>
+        <w:rPr>
+          <w:rFonts w:ascii="Times New Roman" w:hAnsi="Times New Roman"/>
+        </w:rPr>
+        <w:t xml:space="preserve"> </w:t>
+      </w:r>
+      <w:r>
+        <w:rPr>
+          <w:rFonts w:ascii="Times New Roman" w:hAnsi="Times New Roman"/>
+        </w:rPr>
+        <w:t xml:space="preserve">of</w:t>
+      </w:r>
+      <w:r>
+        <w:rPr>
+          <w:rFonts w:ascii="Times New Roman" w:hAnsi="Times New Roman"/>
+        </w:rPr>
+        <w:t xml:space="preserve"> </w:t>
+      </w:r>
+      <m:oMath>
+        <m:r>
+          <m:t>1</m:t>
+        </m:r>
+        <m:r>
+          <m:rPr>
+            <m:sty m:val="p"/>
+          </m:rPr>
+          <m:t>/</m:t>
+        </m:r>
+        <m:sSub>
+          <m:e>
+            <m:r>
+              <m:t>T</m:t>
+            </m:r>
+          </m:e>
+          <m:sub>
+            <m:r>
+              <m:t>1</m:t>
+            </m:r>
+          </m:sub>
+        </m:sSub>
+      </m:oMath>
+      <w:r>
+        <w:rPr>
+          <w:rFonts w:ascii="Times New Roman" w:hAnsi="Times New Roman"/>
+        </w:rPr>
+        <w:t xml:space="preserve">.</w:t>
+      </w:r>
+      <w:r>
+        <w:rPr>
+          <w:rFonts w:ascii="Times New Roman" w:hAnsi="Times New Roman"/>
+        </w:rPr>
+        <w:t xml:space="preserve"> </w:t>
+      </w:r>
+      <w:r>
+        <w:rPr>
+          <w:rFonts w:ascii="Times New Roman" w:hAnsi="Times New Roman"/>
+        </w:rPr>
+        <w:t xml:space="preserve">With</w:t>
+      </w:r>
+      <w:r>
+        <w:rPr>
+          <w:rFonts w:ascii="Times New Roman" w:hAnsi="Times New Roman"/>
+        </w:rPr>
+        <w:t xml:space="preserve"> </w:t>
+      </w:r>
+      <w:r>
+        <w:rPr>
+          <w:rFonts w:ascii="Times New Roman" w:hAnsi="Times New Roman"/>
+        </w:rPr>
+        <w:t xml:space="preserve">noise-aware</w:t>
+      </w:r>
+      <w:r>
+        <w:rPr>
+          <w:rFonts w:ascii="Times New Roman" w:hAnsi="Times New Roman"/>
+        </w:rPr>
+        <w:t xml:space="preserve"> </w:t>
+      </w:r>
+      <w:r>
+        <w:rPr>
+          <w:rFonts w:ascii="Times New Roman" w:hAnsi="Times New Roman"/>
+        </w:rPr>
+        <w:t xml:space="preserve">training</w:t>
+      </w:r>
+      <w:r>
+        <w:rPr>
+          <w:rFonts w:ascii="Times New Roman" w:hAnsi="Times New Roman"/>
+        </w:rPr>
+        <w:t xml:space="preserve"> </w:t>
+      </w:r>
+      <w:r>
+        <w:rPr>
+          <w:rFonts w:ascii="Times New Roman" w:hAnsi="Times New Roman"/>
+        </w:rPr>
+        <w:t xml:space="preserve">and</w:t>
+      </w:r>
+      <w:r>
+        <w:rPr>
+          <w:rFonts w:ascii="Times New Roman" w:hAnsi="Times New Roman"/>
+        </w:rPr>
+        <w:t xml:space="preserve"> </w:t>
+      </w:r>
+      <w:r>
+        <w:rPr>
+          <w:rFonts w:ascii="Times New Roman" w:hAnsi="Times New Roman"/>
+        </w:rPr>
+        <w:t xml:space="preserve">a</w:t>
+      </w:r>
+      <w:r>
+        <w:rPr>
+          <w:rFonts w:ascii="Times New Roman" w:hAnsi="Times New Roman"/>
+        </w:rPr>
+        <w:t xml:space="preserve"> </w:t>
+      </w:r>
+      <w:r>
+        <w:rPr>
+          <w:rFonts w:ascii="Times New Roman" w:hAnsi="Times New Roman"/>
+        </w:rPr>
+        <w:t xml:space="preserve">richer</w:t>
+      </w:r>
+      <w:r>
+        <w:rPr>
+          <w:rFonts w:ascii="Times New Roman" w:hAnsi="Times New Roman"/>
+        </w:rPr>
+        <w:t xml:space="preserve"> </w:t>
+      </w:r>
+      <w:r>
+        <w:rPr>
+          <w:rFonts w:ascii="Times New Roman" w:hAnsi="Times New Roman"/>
+        </w:rPr>
+        <w:t xml:space="preserve">readout,</w:t>
+      </w:r>
+      <w:r>
+        <w:rPr>
+          <w:rFonts w:ascii="Times New Roman" w:hAnsi="Times New Roman"/>
+        </w:rPr>
+        <w:t xml:space="preserve"> </w:t>
+      </w:r>
+      <w:r>
+        <w:rPr>
+          <w:rFonts w:ascii="Times New Roman" w:hAnsi="Times New Roman"/>
+        </w:rPr>
+        <w:t xml:space="preserve">the</w:t>
+      </w:r>
+      <w:r>
+        <w:rPr>
+          <w:rFonts w:ascii="Times New Roman" w:hAnsi="Times New Roman"/>
+        </w:rPr>
+        <w:t xml:space="preserve"> </w:t>
+      </w:r>
+      <w:r>
+        <w:rPr>
+          <w:rFonts w:ascii="Times New Roman" w:hAnsi="Times New Roman"/>
+        </w:rPr>
+        <w:t xml:space="preserve">model</w:t>
+      </w:r>
+      <w:r>
+        <w:rPr>
+          <w:rFonts w:ascii="Times New Roman" w:hAnsi="Times New Roman"/>
+        </w:rPr>
+        <w:t xml:space="preserve"> </w:t>
+      </w:r>
+      <w:r>
+        <w:rPr>
+          <w:rFonts w:ascii="Times New Roman" w:hAnsi="Times New Roman"/>
+        </w:rPr>
+        <w:t xml:space="preserve">without</w:t>
+      </w:r>
+      <w:r>
+        <w:rPr>
+          <w:rFonts w:ascii="Times New Roman" w:hAnsi="Times New Roman"/>
+        </w:rPr>
+        <w:t xml:space="preserve"> </w:t>
+      </w:r>
+      <w:r>
+        <w:rPr>
+          <w:rFonts w:ascii="Times New Roman" w:hAnsi="Times New Roman"/>
+        </w:rPr>
+        <w:t xml:space="preserve">the</w:t>
+      </w:r>
+      <w:r>
+        <w:rPr>
+          <w:rFonts w:ascii="Times New Roman" w:hAnsi="Times New Roman"/>
+        </w:rPr>
+        <w:t xml:space="preserve"> </w:t>
+      </w:r>
+      <w:r>
+        <w:rPr>
+          <w:rFonts w:ascii="Times New Roman" w:hAnsi="Times New Roman"/>
+        </w:rPr>
+        <w:t xml:space="preserve">filter</w:t>
+      </w:r>
+      <w:r>
+        <w:rPr>
+          <w:rFonts w:ascii="Times New Roman" w:hAnsi="Times New Roman"/>
+        </w:rPr>
+        <w:t xml:space="preserve"> </w:t>
+      </w:r>
+      <w:r>
+        <w:rPr>
+          <w:rFonts w:ascii="Times New Roman" w:hAnsi="Times New Roman"/>
+        </w:rPr>
+        <w:t xml:space="preserve">is</w:t>
+      </w:r>
+      <w:r>
+        <w:rPr>
+          <w:rFonts w:ascii="Times New Roman" w:hAnsi="Times New Roman"/>
+        </w:rPr>
+        <w:t xml:space="preserve"> </w:t>
+      </w:r>
+      <m:oMath>
+        <m:r>
+          <m:t>1.2</m:t>
+        </m:r>
+      </m:oMath>
+      <w:r>
+        <w:rPr>
+          <w:rFonts w:ascii="Times New Roman" w:hAnsi="Times New Roman"/>
+        </w:rPr>
+        <w:t xml:space="preserve"> </w:t>
+      </w:r>
+      <w:r>
+        <w:rPr>
+          <w:rFonts w:ascii="Times New Roman" w:hAnsi="Times New Roman"/>
+        </w:rPr>
+        <w:t xml:space="preserve">points</w:t>
+      </w:r>
+      <w:r>
+        <w:rPr>
+          <w:rFonts w:ascii="Times New Roman" w:hAnsi="Times New Roman"/>
+        </w:rPr>
+        <w:t xml:space="preserve"> </w:t>
+      </w:r>
+      <w:r>
+        <w:rPr>
+          <w:rFonts w:ascii="Times New Roman" w:hAnsi="Times New Roman"/>
+        </w:rPr>
+        <w:t xml:space="preserve">better:</w:t>
+      </w:r>
+      <w:r>
+        <w:rPr>
+          <w:rFonts w:ascii="Times New Roman" w:hAnsi="Times New Roman"/>
+        </w:rPr>
+        <w:t xml:space="preserve"> </w:t>
+      </w:r>
+      <w:r>
+        <w:rPr>
+          <w:rFonts w:ascii="Times New Roman" w:hAnsi="Times New Roman"/>
+        </w:rPr>
+        <w:t xml:space="preserve">discarding</w:t>
+      </w:r>
+      <w:r>
+        <w:rPr>
+          <w:rFonts w:ascii="Times New Roman" w:hAnsi="Times New Roman"/>
+        </w:rPr>
+        <w:t xml:space="preserve"> </w:t>
+      </w:r>
+      <w:r>
+        <w:rPr>
+          <w:rFonts w:ascii="Times New Roman" w:hAnsi="Times New Roman"/>
+        </w:rPr>
+        <w:t xml:space="preserve">decayed</w:t>
+      </w:r>
+      <w:r>
+        <w:rPr>
+          <w:rFonts w:ascii="Times New Roman" w:hAnsi="Times New Roman"/>
+        </w:rPr>
+        <w:t xml:space="preserve"> </w:t>
+      </w:r>
+      <w:r>
+        <w:rPr>
+          <w:rFonts w:ascii="Times New Roman" w:hAnsi="Times New Roman"/>
+        </w:rPr>
+        <w:t xml:space="preserve">shots</w:t>
+      </w:r>
+      <w:r>
+        <w:rPr>
+          <w:rFonts w:ascii="Times New Roman" w:hAnsi="Times New Roman"/>
+        </w:rPr>
+        <w:t xml:space="preserve"> </w:t>
+      </w:r>
+      <w:r>
+        <w:rPr>
+          <w:rFonts w:ascii="Times New Roman" w:hAnsi="Times New Roman"/>
+        </w:rPr>
+        <w:t xml:space="preserve">can</w:t>
+      </w:r>
+      <w:r>
+        <w:rPr>
+          <w:rFonts w:ascii="Times New Roman" w:hAnsi="Times New Roman"/>
+        </w:rPr>
+        <w:t xml:space="preserve"> </w:t>
+      </w:r>
+      <w:r>
+        <w:rPr>
+          <w:rFonts w:ascii="Times New Roman" w:hAnsi="Times New Roman"/>
+        </w:rPr>
+        <w:t xml:space="preserve">cost</w:t>
+      </w:r>
+      <w:r>
+        <w:rPr>
+          <w:rFonts w:ascii="Times New Roman" w:hAnsi="Times New Roman"/>
+        </w:rPr>
+        <w:t xml:space="preserve"> </w:t>
+      </w:r>
+      <w:r>
+        <w:rPr>
+          <w:rFonts w:ascii="Times New Roman" w:hAnsi="Times New Roman"/>
+        </w:rPr>
+        <w:t xml:space="preserve">accuracy.</w:t>
+      </w:r>
+      <w:r>
+        <w:rPr>
+          <w:rFonts w:ascii="Times New Roman" w:hAnsi="Times New Roman"/>
+        </w:rPr>
+        <w:t xml:space="preserve"> </w:t>
+      </w:r>
+      <w:r>
+        <w:rPr>
+          <w:rFonts w:ascii="Times New Roman" w:hAnsi="Times New Roman"/>
+        </w:rPr>
+        <w:t xml:space="preserve">The</w:t>
+      </w:r>
+      <w:r>
+        <w:rPr>
+          <w:rFonts w:ascii="Times New Roman" w:hAnsi="Times New Roman"/>
+        </w:rPr>
+        <w:t xml:space="preserve"> </w:t>
+      </w:r>
+      <w:r>
+        <w:rPr>
+          <w:rFonts w:ascii="Times New Roman" w:hAnsi="Times New Roman"/>
+        </w:rPr>
+        <w:t xml:space="preserve">weight-2</w:t>
+      </w:r>
+      <w:r>
+        <w:rPr>
+          <w:rFonts w:ascii="Times New Roman" w:hAnsi="Times New Roman"/>
+        </w:rPr>
+        <w:t xml:space="preserve"> </w:t>
+      </w:r>
+      <w:r>
+        <w:rPr>
+          <w:rFonts w:ascii="Times New Roman" w:hAnsi="Times New Roman"/>
+        </w:rPr>
+        <w:t xml:space="preserve">deficit</w:t>
+      </w:r>
+      <w:r>
+        <w:rPr>
+          <w:rFonts w:ascii="Times New Roman" w:hAnsi="Times New Roman"/>
+        </w:rPr>
+        <w:t xml:space="preserve"> </w:t>
+      </w:r>
+      <w:r>
+        <w:rPr>
+          <w:rFonts w:ascii="Times New Roman" w:hAnsi="Times New Roman"/>
+        </w:rPr>
+        <w:t xml:space="preserve">comes</w:t>
+      </w:r>
+      <w:r>
+        <w:rPr>
+          <w:rFonts w:ascii="Times New Roman" w:hAnsi="Times New Roman"/>
+        </w:rPr>
+        <w:t xml:space="preserve"> </w:t>
+      </w:r>
+      <w:r>
+        <w:rPr>
+          <w:rFonts w:ascii="Times New Roman" w:hAnsi="Times New Roman"/>
+        </w:rPr>
+        <w:t xml:space="preserve">from</w:t>
+      </w:r>
+      <w:r>
+        <w:rPr>
+          <w:rFonts w:ascii="Times New Roman" w:hAnsi="Times New Roman"/>
+        </w:rPr>
+        <w:t xml:space="preserve"> </w:t>
+      </w:r>
+      <w:r>
+        <w:rPr>
+          <w:rFonts w:ascii="Times New Roman" w:hAnsi="Times New Roman"/>
+        </w:rPr>
+        <w:t xml:space="preserve">the</w:t>
+      </w:r>
+      <w:r>
+        <w:rPr>
+          <w:rFonts w:ascii="Times New Roman" w:hAnsi="Times New Roman"/>
+        </w:rPr>
+        <w:t xml:space="preserve"> </w:t>
+      </w:r>
+      <w:r>
+        <w:rPr>
+          <w:rFonts w:ascii="Times New Roman" w:hAnsi="Times New Roman"/>
+        </w:rPr>
+        <w:t xml:space="preserve">pair-product</w:t>
+      </w:r>
+      <w:r>
+        <w:rPr>
+          <w:rFonts w:ascii="Times New Roman" w:hAnsi="Times New Roman"/>
+        </w:rPr>
+        <w:t xml:space="preserve"> </w:t>
+      </w:r>
+      <w:r>
+        <w:rPr>
+          <w:rFonts w:ascii="Times New Roman" w:hAnsi="Times New Roman"/>
+        </w:rPr>
+        <w:t xml:space="preserve">encoding,</w:t>
+      </w:r>
+      <w:r>
+        <w:rPr>
+          <w:rFonts w:ascii="Times New Roman" w:hAnsi="Times New Roman"/>
+        </w:rPr>
+        <w:t xml:space="preserve"> </w:t>
+      </w:r>
+      <w:r>
+        <w:rPr>
+          <w:rFonts w:ascii="Times New Roman" w:hAnsi="Times New Roman"/>
+        </w:rPr>
+        <w:t xml:space="preserve">not</w:t>
+      </w:r>
+      <w:r>
+        <w:rPr>
+          <w:rFonts w:ascii="Times New Roman" w:hAnsi="Times New Roman"/>
+        </w:rPr>
+        <w:t xml:space="preserve"> </w:t>
+      </w:r>
+      <w:r>
+        <w:rPr>
+          <w:rFonts w:ascii="Times New Roman" w:hAnsi="Times New Roman"/>
+        </w:rPr>
+        <w:t xml:space="preserve">from</w:t>
+      </w:r>
+      <w:r>
+        <w:rPr>
+          <w:rFonts w:ascii="Times New Roman" w:hAnsi="Times New Roman"/>
+        </w:rPr>
+        <w:t xml:space="preserve"> </w:t>
+      </w:r>
+      <w:r>
+        <w:rPr>
+          <w:rFonts w:ascii="Times New Roman" w:hAnsi="Times New Roman"/>
+        </w:rPr>
+        <w:t xml:space="preserve">the</w:t>
+      </w:r>
+      <w:r>
+        <w:rPr>
+          <w:rFonts w:ascii="Times New Roman" w:hAnsi="Times New Roman"/>
+        </w:rPr>
+        <w:t xml:space="preserve"> </w:t>
+      </w:r>
+      <w:r>
+        <w:rPr>
+          <w:rFonts w:ascii="Times New Roman" w:hAnsi="Times New Roman"/>
+        </w:rPr>
+        <w:t xml:space="preserve">readout.</w:t>
+      </w:r>
+      <w:r>
+        <w:rPr>
+          <w:rFonts w:ascii="Times New Roman" w:hAnsi="Times New Roman"/>
+        </w:rPr>
+        <w:t xml:space="preserve"> </w:t>
+      </w:r>
+      <w:r>
+        <w:rPr>
+          <w:rFonts w:ascii="Times New Roman" w:hAnsi="Times New Roman"/>
+        </w:rPr>
+        <w:t xml:space="preserve">On</w:t>
+      </w:r>
+      <w:r>
+        <w:rPr>
+          <w:rFonts w:ascii="Times New Roman" w:hAnsi="Times New Roman"/>
+        </w:rPr>
+        <w:t xml:space="preserve"> </w:t>
+      </w:r>
+      <w:r>
+        <w:rPr>
+          <w:rFonts w:ascii="Times New Roman" w:hAnsi="Times New Roman"/>
+        </w:rPr>
+        <w:t xml:space="preserve">noise</w:t>
+      </w:r>
+      <w:r>
+        <w:rPr>
+          <w:rFonts w:ascii="Times New Roman" w:hAnsi="Times New Roman"/>
+        </w:rPr>
+        <w:t xml:space="preserve"> </w:t>
+      </w:r>
+      <w:r>
+        <w:rPr>
+          <w:rFonts w:ascii="Times New Roman" w:hAnsi="Times New Roman"/>
+        </w:rPr>
+        <w:t xml:space="preserve">models</w:t>
+      </w:r>
+      <w:r>
+        <w:rPr>
+          <w:rFonts w:ascii="Times New Roman" w:hAnsi="Times New Roman"/>
+        </w:rPr>
+        <w:t xml:space="preserve"> </w:t>
+      </w:r>
+      <w:r>
+        <w:rPr>
+          <w:rFonts w:ascii="Times New Roman" w:hAnsi="Times New Roman"/>
+        </w:rPr>
+        <w:t xml:space="preserve">of</w:t>
+      </w:r>
+      <w:r>
+        <w:rPr>
+          <w:rFonts w:ascii="Times New Roman" w:hAnsi="Times New Roman"/>
+        </w:rPr>
+        <w:t xml:space="preserve"> </w:t>
+      </w:r>
+      <w:r>
+        <w:rPr>
+          <w:rFonts w:ascii="Times New Roman" w:hAnsi="Times New Roman"/>
+        </w:rPr>
+        <w:t xml:space="preserve">IBM</w:t>
+      </w:r>
+      <w:r>
+        <w:rPr>
+          <w:rFonts w:ascii="Times New Roman" w:hAnsi="Times New Roman"/>
+        </w:rPr>
+        <w:t xml:space="preserve"> </w:t>
+      </w:r>
+      <w:r>
+        <w:rPr>
+          <w:rFonts w:ascii="Times New Roman" w:hAnsi="Times New Roman"/>
+        </w:rPr>
+        <w:t xml:space="preserve">and</w:t>
+      </w:r>
+      <w:r>
+        <w:rPr>
+          <w:rFonts w:ascii="Times New Roman" w:hAnsi="Times New Roman"/>
+        </w:rPr>
+        <w:t xml:space="preserve"> </w:t>
+      </w:r>
+      <w:r>
+        <w:rPr>
+          <w:rFonts w:ascii="Times New Roman" w:hAnsi="Times New Roman"/>
+        </w:rPr>
+        <w:t xml:space="preserve">IonQ</w:t>
+      </w:r>
+      <w:r>
+        <w:rPr>
+          <w:rFonts w:ascii="Times New Roman" w:hAnsi="Times New Roman"/>
+        </w:rPr>
+        <w:t xml:space="preserve"> </w:t>
+      </w:r>
+      <w:r>
+        <w:rPr>
+          <w:rFonts w:ascii="Times New Roman" w:hAnsi="Times New Roman"/>
+        </w:rPr>
+        <w:t xml:space="preserve">devices</w:t>
+      </w:r>
+      <w:r>
+        <w:rPr>
+          <w:rFonts w:ascii="Times New Roman" w:hAnsi="Times New Roman"/>
+        </w:rPr>
+        <w:t xml:space="preserve"> </w:t>
+      </w:r>
+      <w:r>
+        <w:rPr>
+          <w:rFonts w:ascii="Times New Roman" w:hAnsi="Times New Roman"/>
+        </w:rPr>
+        <w:t xml:space="preserve">the</w:t>
+      </w:r>
+      <w:r>
+        <w:rPr>
+          <w:rFonts w:ascii="Times New Roman" w:hAnsi="Times New Roman"/>
+        </w:rPr>
+        <w:t xml:space="preserve"> </w:t>
+      </w:r>
+      <w:r>
+        <w:rPr>
+          <w:rFonts w:ascii="Times New Roman" w:hAnsi="Times New Roman"/>
+        </w:rPr>
+        <w:t xml:space="preserve">filter</w:t>
+      </w:r>
+      <w:r>
+        <w:rPr>
+          <w:rFonts w:ascii="Times New Roman" w:hAnsi="Times New Roman"/>
+        </w:rPr>
+        <w:t xml:space="preserve"> </w:t>
+      </w:r>
+      <w:r>
+        <w:rPr>
+          <w:rFonts w:ascii="Times New Roman" w:hAnsi="Times New Roman"/>
+        </w:rPr>
+        <w:t xml:space="preserve">cuts</w:t>
+      </w:r>
+      <w:r>
+        <w:rPr>
+          <w:rFonts w:ascii="Times New Roman" w:hAnsi="Times New Roman"/>
+        </w:rPr>
+        <w:t xml:space="preserve"> </w:t>
+      </w:r>
+      <w:r>
+        <w:rPr>
+          <w:rFonts w:ascii="Times New Roman" w:hAnsi="Times New Roman"/>
+        </w:rPr>
+        <w:t xml:space="preserve">the</w:t>
+      </w:r>
+      <w:r>
+        <w:rPr>
+          <w:rFonts w:ascii="Times New Roman" w:hAnsi="Times New Roman"/>
+        </w:rPr>
+        <w:t xml:space="preserve"> </w:t>
+      </w:r>
+      <w:r>
+        <w:rPr>
+          <w:rFonts w:ascii="Times New Roman" w:hAnsi="Times New Roman"/>
+        </w:rPr>
+        <w:t xml:space="preserve">error</w:t>
+      </w:r>
+      <w:r>
+        <w:rPr>
+          <w:rFonts w:ascii="Times New Roman" w:hAnsi="Times New Roman"/>
+        </w:rPr>
+        <w:t xml:space="preserve"> </w:t>
+      </w:r>
+      <w:r>
+        <w:rPr>
+          <w:rFonts w:ascii="Times New Roman" w:hAnsi="Times New Roman"/>
+        </w:rPr>
+        <w:t xml:space="preserve">of</w:t>
+      </w:r>
+      <w:r>
+        <w:rPr>
+          <w:rFonts w:ascii="Times New Roman" w:hAnsi="Times New Roman"/>
+        </w:rPr>
+        <w:t xml:space="preserve"> </w:t>
+      </w:r>
+      <w:r>
+        <w:rPr>
+          <w:rFonts w:ascii="Times New Roman" w:hAnsi="Times New Roman"/>
+        </w:rPr>
+        <w:t xml:space="preserve">the</w:t>
+      </w:r>
+      <w:r>
+        <w:rPr>
+          <w:rFonts w:ascii="Times New Roman" w:hAnsi="Times New Roman"/>
+        </w:rPr>
+        <w:t xml:space="preserve"> </w:t>
+      </w:r>
+      <w:r>
+        <w:rPr>
+          <w:rFonts w:ascii="Times New Roman" w:hAnsi="Times New Roman"/>
+        </w:rPr>
+        <w:t xml:space="preserve">measured</w:t>
+      </w:r>
+      <w:r>
+        <w:rPr>
+          <w:rFonts w:ascii="Times New Roman" w:hAnsi="Times New Roman"/>
+        </w:rPr>
+        <w:t xml:space="preserve"> </w:t>
+      </w:r>
+      <m:oMath>
+        <m:r>
+          <m:t>q</m:t>
+        </m:r>
+        <m:sSub>
+          <m:e>
+            <m:r>
+              <m:t>g</m:t>
+            </m:r>
+          </m:e>
+          <m:sub>
+            <m:r>
+              <m:t>Z</m:t>
+            </m:r>
+          </m:sub>
+        </m:sSub>
+      </m:oMath>
+      <w:r>
+        <w:rPr>
+          <w:rFonts w:ascii="Times New Roman" w:hAnsi="Times New Roman"/>
+        </w:rPr>
+        <w:t xml:space="preserve"> </w:t>
+      </w:r>
+      <w:r>
+        <w:rPr>
+          <w:rFonts w:ascii="Times New Roman" w:hAnsi="Times New Roman"/>
+        </w:rPr>
+        <w:t xml:space="preserve">by</w:t>
+      </w:r>
+      <w:r>
+        <w:rPr>
+          <w:rFonts w:ascii="Times New Roman" w:hAnsi="Times New Roman"/>
+        </w:rPr>
+        <w:t xml:space="preserve"> </w:t>
+      </w:r>
+      <m:oMath>
+        <m:r>
+          <m:t>2.9</m:t>
+        </m:r>
+      </m:oMath>
+      <w:r>
+        <w:rPr>
+          <w:rFonts w:ascii="Times New Roman" w:hAnsi="Times New Roman"/>
+        </w:rPr>
+        <w:t xml:space="preserve">–</w:t>
+      </w:r>
+      <m:oMath>
+        <m:r>
+          <m:t>3.6</m:t>
+        </m:r>
+        <m:r>
+          <m:rPr>
+            <m:sty m:val="p"/>
+          </m:rPr>
+          <m:t>×</m:t>
+        </m:r>
+      </m:oMath>
+      <w:r>
+        <w:rPr>
+          <w:rFonts w:ascii="Times New Roman" w:hAnsi="Times New Roman"/>
+        </w:rPr>
+        <w:t xml:space="preserve">.</w:t>
       </w:r>
       <w:r>
         <w:rPr>
@@ -3690,19 +4572,19 @@
         <w:rPr>
           <w:rFonts w:ascii="Times New Roman" w:hAnsi="Times New Roman"/>
         </w:rPr>
-        <w:t xml:space="preserve">predictions of every study were committed to the repository before the run that tested them. Of 27</w:t>
-      </w:r>
-      <w:r>
-        <w:rPr>
-          <w:rFonts w:ascii="Times New Roman" w:hAnsi="Times New Roman"/>
-        </w:rPr>
-        <w:t xml:space="preserve"> </w:t>
-      </w:r>
-      <w:r>
-        <w:rPr>
-          <w:rFonts w:ascii="Times New Roman" w:hAnsi="Times New Roman"/>
-        </w:rPr>
-        <w:t xml:space="preserve">pre-registered predictions in the studies summarized here, 22 passed and 5 failed; the failures are</w:t>
+        <w:t xml:space="preserve">predictions of every study were committed to the repository before the run that tested them. Of 44</w:t>
+      </w:r>
+      <w:r>
+        <w:rPr>
+          <w:rFonts w:ascii="Times New Roman" w:hAnsi="Times New Roman"/>
+        </w:rPr>
+        <w:t xml:space="preserve"> </w:t>
+      </w:r>
+      <w:r>
+        <w:rPr>
+          <w:rFonts w:ascii="Times New Roman" w:hAnsi="Times New Roman"/>
+        </w:rPr>
+        <w:t xml:space="preserve">pre-registered predictions in the studies summarized here, 33 passed and 11 failed; the failures are</w:t>
       </w:r>
       <w:r>
         <w:rPr>
@@ -5980,7 +6862,7 @@
       </w:r>
     </w:p>
     <w:bookmarkEnd w:id="28"/>
-    <w:bookmarkStart w:id="35" w:name="results"/>
+    <w:bookmarkStart w:id="37" w:name="results"/>
     <w:p>
       <w:pPr>
         <w:pStyle w:val="Heading1"/>
@@ -6238,7 +7120,127 @@
         <w:rPr>
           <w:rFonts w:ascii="Times New Roman" w:hAnsi="Times New Roman"/>
         </w:rPr>
-        <w:t xml:space="preserve">trained under T1, the weight-2 model without the filter was 0.6 points ahead of the filtered one.</w:t>
+        <w:t xml:space="preserve">trained under T1, the weight-2 model without the filter was 0.6 points ahead of the filtered one;</w:t>
+      </w:r>
+    </w:p>
+    <w:p>
+      <w:pPr>
+        <w:numPr>
+          <w:ilvl w:val="0"/>
+          <w:numId w:val="1001"/>
+        </w:numPr>
+      </w:pPr>
+      <w:r>
+        <w:rPr>
+          <w:rFonts w:ascii="Times New Roman" w:hAnsi="Times New Roman"/>
+        </w:rPr>
+        <w:t xml:space="preserve">in the studies of Sec. </w:t>
+      </w:r>
+      <w:hyperlink w:anchor="sec:more">
+        <w:r>
+          <w:rPr>
+            <w:rStyle w:val="Hyperlink"/>
+          </w:rPr>
+          <w:t xml:space="preserve">4.0.0.3</w:t>
+        </w:r>
+      </w:hyperlink>
+      <w:r>
+        <w:rPr>
+          <w:rFonts w:ascii="Times New Roman" w:hAnsi="Times New Roman"/>
+        </w:rPr>
+        <w:t xml:space="preserve">: the</w:t>
+      </w:r>
+      <w:r>
+        <w:rPr>
+          <w:rFonts w:ascii="Times New Roman" w:hAnsi="Times New Roman"/>
+        </w:rPr>
+        <w:t xml:space="preserve"> </w:t>
+      </w:r>
+      <m:oMath>
+        <m:r>
+          <m:rPr>
+            <m:sty m:val="p"/>
+          </m:rPr>
+          <m:t>⟨</m:t>
+        </m:r>
+        <m:sSub>
+          <m:e>
+            <m:r>
+              <m:t>Z</m:t>
+            </m:r>
+          </m:e>
+          <m:sub>
+            <m:r>
+              <m:t>i</m:t>
+            </m:r>
+          </m:sub>
+        </m:sSub>
+        <m:sSub>
+          <m:e>
+            <m:r>
+              <m:t>Z</m:t>
+            </m:r>
+          </m:e>
+          <m:sub>
+            <m:r>
+              <m:t>j</m:t>
+            </m:r>
+          </m:sub>
+        </m:sSub>
+        <m:r>
+          <m:rPr>
+            <m:sty m:val="p"/>
+          </m:rPr>
+          <m:t>⟩</m:t>
+        </m:r>
+      </m:oMath>
+      <w:r>
+        <w:rPr>
+          <w:rFonts w:ascii="Times New Roman" w:hAnsi="Times New Roman"/>
+        </w:rPr>
+        <w:t xml:space="preserve"> </w:t>
+      </w:r>
+      <w:r>
+        <w:rPr>
+          <w:rFonts w:ascii="Times New Roman" w:hAnsi="Times New Roman"/>
+        </w:rPr>
+        <w:t xml:space="preserve">readout did not help weight 2 (two</w:t>
+      </w:r>
+      <w:r>
+        <w:rPr>
+          <w:rFonts w:ascii="Times New Roman" w:hAnsi="Times New Roman"/>
+        </w:rPr>
+        <w:t xml:space="preserve"> </w:t>
+      </w:r>
+      <w:r>
+        <w:rPr>
+          <w:rFonts w:ascii="Times New Roman" w:hAnsi="Times New Roman"/>
+        </w:rPr>
+        <w:t xml:space="preserve">predictions), the filter was not neutral under noise-aware training with that readout, the gain of the</w:t>
+      </w:r>
+      <w:r>
+        <w:rPr>
+          <w:rFonts w:ascii="Times New Roman" w:hAnsi="Times New Roman"/>
+        </w:rPr>
+        <w:t xml:space="preserve"> </w:t>
+      </w:r>
+      <w:r>
+        <w:rPr>
+          <w:rFonts w:ascii="Times New Roman" w:hAnsi="Times New Roman"/>
+        </w:rPr>
+        <w:t xml:space="preserve">filter at one T1 spread had a CI touching zero, weight 2 was not more sensitive to the spread than</w:t>
+      </w:r>
+      <w:r>
+        <w:rPr>
+          <w:rFonts w:ascii="Times New Roman" w:hAnsi="Times New Roman"/>
+        </w:rPr>
+        <w:t xml:space="preserve"> </w:t>
+      </w:r>
+      <w:r>
+        <w:rPr>
+          <w:rFonts w:ascii="Times New Roman" w:hAnsi="Times New Roman"/>
+        </w:rPr>
+        <w:t xml:space="preserve">weight 1, and the pair-product encoding had a lower information ceiling than the unary one.</w:t>
       </w:r>
     </w:p>
     <w:bookmarkEnd w:id="29"/>
@@ -7637,17 +8639,1147 @@
       </w:r>
     </w:p>
     <w:bookmarkEnd w:id="34"/>
-    <w:bookmarkEnd w:id="35"/>
-    <w:bookmarkStart w:id="37" w:name="discussion"/>
+    <w:bookmarkStart w:id="35" w:name="sec:more"/>
     <w:p>
       <w:pPr>
-        <w:pStyle w:val="Heading1"/>
+        <w:pStyle w:val="Heading4"/>
       </w:pPr>
       <w:r>
         <w:rPr>
           <w:rFonts w:ascii="Times New Roman" w:hAnsi="Times New Roman"/>
         </w:rPr>
-        <w:t xml:space="preserve">Discussion</w:t>
+        <w:t xml:space="preserve">Readout, encoding and T1 spread (60 runs each).</w:t>
+      </w:r>
+    </w:p>
+    <w:p>
+      <w:pPr>
+        <w:numPr>
+          <w:ilvl w:val="0"/>
+          <w:numId w:val="1003"/>
+        </w:numPr>
+      </w:pPr>
+      <w:r>
+        <w:rPr>
+          <w:iCs/>
+          <w:rFonts w:ascii="Times New Roman" w:hAnsi="Times New Roman"/>
+          <w:i/>
+        </w:rPr>
+        <w:t xml:space="preserve">Correlation readout.</w:t>
+      </w:r>
+      <w:r>
+        <w:rPr>
+          <w:rFonts w:ascii="Times New Roman" w:hAnsi="Times New Roman"/>
+        </w:rPr>
+        <w:t xml:space="preserve"> </w:t>
+      </w:r>
+      <w:r>
+        <w:rPr>
+          <w:rFonts w:ascii="Times New Roman" w:hAnsi="Times New Roman"/>
+        </w:rPr>
+        <w:t xml:space="preserve">Adding the</w:t>
+      </w:r>
+      <w:r>
+        <w:rPr>
+          <w:rFonts w:ascii="Times New Roman" w:hAnsi="Times New Roman"/>
+        </w:rPr>
+        <w:t xml:space="preserve"> </w:t>
+      </w:r>
+      <m:oMath>
+        <m:d>
+          <m:dPr>
+            <m:begChr m:val="("/>
+            <m:endChr m:val=")"/>
+            <m:sepChr m:val=""/>
+            <m:grow/>
+          </m:dPr>
+          <m:e>
+            <m:f>
+              <m:fPr>
+                <m:type m:val="noBar"/>
+              </m:fPr>
+              <m:num>
+                <m:r>
+                  <m:t>5</m:t>
+                </m:r>
+              </m:num>
+              <m:den>
+                <m:r>
+                  <m:t>2</m:t>
+                </m:r>
+              </m:den>
+            </m:f>
+          </m:e>
+        </m:d>
+        <m:r>
+          <m:rPr>
+            <m:sty m:val="p"/>
+          </m:rPr>
+          <m:t>=</m:t>
+        </m:r>
+        <m:r>
+          <m:t>10</m:t>
+        </m:r>
+      </m:oMath>
+      <w:r>
+        <w:rPr>
+          <w:rFonts w:ascii="Times New Roman" w:hAnsi="Times New Roman"/>
+        </w:rPr>
+        <w:t xml:space="preserve"> </w:t>
+      </w:r>
+      <w:r>
+        <w:rPr>
+          <w:rFonts w:ascii="Times New Roman" w:hAnsi="Times New Roman"/>
+        </w:rPr>
+        <w:t xml:space="preserve">correlations</w:t>
+      </w:r>
+      <w:r>
+        <w:rPr>
+          <w:rFonts w:ascii="Times New Roman" w:hAnsi="Times New Roman"/>
+        </w:rPr>
+        <w:t xml:space="preserve"> </w:t>
+      </w:r>
+      <m:oMath>
+        <m:r>
+          <m:rPr>
+            <m:sty m:val="p"/>
+          </m:rPr>
+          <m:t>⟨</m:t>
+        </m:r>
+        <m:sSub>
+          <m:e>
+            <m:r>
+              <m:t>Z</m:t>
+            </m:r>
+          </m:e>
+          <m:sub>
+            <m:r>
+              <m:t>i</m:t>
+            </m:r>
+          </m:sub>
+        </m:sSub>
+        <m:sSub>
+          <m:e>
+            <m:r>
+              <m:t>Z</m:t>
+            </m:r>
+          </m:e>
+          <m:sub>
+            <m:r>
+              <m:t>j</m:t>
+            </m:r>
+          </m:sub>
+        </m:sSub>
+        <m:r>
+          <m:rPr>
+            <m:sty m:val="p"/>
+          </m:rPr>
+          <m:t>⟩</m:t>
+        </m:r>
+      </m:oMath>
+      <w:r>
+        <w:rPr>
+          <w:rFonts w:ascii="Times New Roman" w:hAnsi="Times New Roman"/>
+        </w:rPr>
+        <w:t xml:space="preserve"> </w:t>
+      </w:r>
+      <w:r>
+        <w:rPr>
+          <w:rFonts w:ascii="Times New Roman" w:hAnsi="Times New Roman"/>
+        </w:rPr>
+        <w:t xml:space="preserve">makes the</w:t>
+      </w:r>
+      <w:r>
+        <w:rPr>
+          <w:rFonts w:ascii="Times New Roman" w:hAnsi="Times New Roman"/>
+        </w:rPr>
+        <w:t xml:space="preserve"> </w:t>
+      </w:r>
+      <w:r>
+        <w:rPr>
+          <w:rFonts w:ascii="Times New Roman" w:hAnsi="Times New Roman"/>
+        </w:rPr>
+        <w:t xml:space="preserve">weight-2 readout a linear function of the whole sector distribution (rank 10 instead of 5). It did not</w:t>
+      </w:r>
+      <w:r>
+        <w:rPr>
+          <w:rFonts w:ascii="Times New Roman" w:hAnsi="Times New Roman"/>
+        </w:rPr>
+        <w:t xml:space="preserve"> </w:t>
+      </w:r>
+      <w:r>
+        <w:rPr>
+          <w:rFonts w:ascii="Times New Roman" w:hAnsi="Times New Roman"/>
+        </w:rPr>
+        <w:t xml:space="preserve">help:</w:t>
+      </w:r>
+      <w:r>
+        <w:rPr>
+          <w:rFonts w:ascii="Times New Roman" w:hAnsi="Times New Roman"/>
+        </w:rPr>
+        <w:t xml:space="preserve"> </w:t>
+      </w:r>
+      <m:oMath>
+        <m:r>
+          <m:rPr>
+            <m:sty m:val="p"/>
+          </m:rPr>
+          <m:t>−</m:t>
+        </m:r>
+        <m:r>
+          <m:t>0.6</m:t>
+        </m:r>
+      </m:oMath>
+      <w:r>
+        <w:rPr>
+          <w:rFonts w:ascii="Times New Roman" w:hAnsi="Times New Roman"/>
+        </w:rPr>
+        <w:t xml:space="preserve"> </w:t>
+      </w:r>
+      <m:oMath>
+        <m:d>
+          <m:dPr>
+            <m:begChr m:val="["/>
+            <m:endChr m:val="]"/>
+            <m:sepChr m:val=""/>
+            <m:grow/>
+          </m:dPr>
+          <m:e>
+            <m:r>
+              <m:rPr>
+                <m:sty m:val="p"/>
+              </m:rPr>
+              <m:t>−</m:t>
+            </m:r>
+            <m:r>
+              <m:t>1.5</m:t>
+            </m:r>
+            <m:r>
+              <m:rPr>
+                <m:sty m:val="p"/>
+              </m:rPr>
+              <m:t>,</m:t>
+            </m:r>
+            <m:r>
+              <m:t>0.4</m:t>
+            </m:r>
+          </m:e>
+        </m:d>
+      </m:oMath>
+      <w:r>
+        <w:rPr>
+          <w:rFonts w:ascii="Times New Roman" w:hAnsi="Times New Roman"/>
+        </w:rPr>
+        <w:t xml:space="preserve"> </w:t>
+      </w:r>
+      <w:r>
+        <w:rPr>
+          <w:rFonts w:ascii="Times New Roman" w:hAnsi="Times New Roman"/>
+        </w:rPr>
+        <w:t xml:space="preserve">points. Trained under T1 with 15 readout weights, the model</w:t>
+      </w:r>
+      <w:r>
+        <w:rPr>
+          <w:rFonts w:ascii="Times New Roman" w:hAnsi="Times New Roman"/>
+        </w:rPr>
+        <w:t xml:space="preserve"> </w:t>
+      </w:r>
+      <w:r>
+        <w:rPr>
+          <w:iCs/>
+          <w:rFonts w:ascii="Times New Roman" w:hAnsi="Times New Roman"/>
+          <w:i/>
+        </w:rPr>
+        <w:t xml:space="preserve">without</w:t>
+      </w:r>
+      <w:r>
+        <w:rPr>
+          <w:rFonts w:ascii="Times New Roman" w:hAnsi="Times New Roman"/>
+        </w:rPr>
+        <w:t xml:space="preserve"> </w:t>
+      </w:r>
+      <w:r>
+        <w:rPr>
+          <w:rFonts w:ascii="Times New Roman" w:hAnsi="Times New Roman"/>
+        </w:rPr>
+        <w:t xml:space="preserve">the</w:t>
+      </w:r>
+      <w:r>
+        <w:rPr>
+          <w:rFonts w:ascii="Times New Roman" w:hAnsi="Times New Roman"/>
+        </w:rPr>
+        <w:t xml:space="preserve"> </w:t>
+      </w:r>
+      <w:r>
+        <w:rPr>
+          <w:rFonts w:ascii="Times New Roman" w:hAnsi="Times New Roman"/>
+        </w:rPr>
+        <w:t xml:space="preserve">filter was</w:t>
+      </w:r>
+      <w:r>
+        <w:rPr>
+          <w:rFonts w:ascii="Times New Roman" w:hAnsi="Times New Roman"/>
+        </w:rPr>
+        <w:t xml:space="preserve"> </w:t>
+      </w:r>
+      <m:oMath>
+        <m:r>
+          <m:t>1.2</m:t>
+        </m:r>
+      </m:oMath>
+      <w:r>
+        <w:rPr>
+          <w:rFonts w:ascii="Times New Roman" w:hAnsi="Times New Roman"/>
+        </w:rPr>
+        <w:t xml:space="preserve"> </w:t>
+      </w:r>
+      <m:oMath>
+        <m:d>
+          <m:dPr>
+            <m:begChr m:val="["/>
+            <m:endChr m:val="]"/>
+            <m:sepChr m:val=""/>
+            <m:grow/>
+          </m:dPr>
+          <m:e>
+            <m:r>
+              <m:t>0.4</m:t>
+            </m:r>
+            <m:r>
+              <m:rPr>
+                <m:sty m:val="p"/>
+              </m:rPr>
+              <m:t>,</m:t>
+            </m:r>
+            <m:r>
+              <m:t>2.0</m:t>
+            </m:r>
+          </m:e>
+        </m:d>
+      </m:oMath>
+      <w:r>
+        <w:rPr>
+          <w:rFonts w:ascii="Times New Roman" w:hAnsi="Times New Roman"/>
+        </w:rPr>
+        <w:t xml:space="preserve"> </w:t>
+      </w:r>
+      <w:r>
+        <w:rPr>
+          <w:rFonts w:ascii="Times New Roman" w:hAnsi="Times New Roman"/>
+        </w:rPr>
+        <w:t xml:space="preserve">points better. The decayed shots still carry information about where the</w:t>
+      </w:r>
+      <w:r>
+        <w:rPr>
+          <w:rFonts w:ascii="Times New Roman" w:hAnsi="Times New Roman"/>
+        </w:rPr>
+        <w:t xml:space="preserve"> </w:t>
+      </w:r>
+      <w:r>
+        <w:rPr>
+          <w:rFonts w:ascii="Times New Roman" w:hAnsi="Times New Roman"/>
+        </w:rPr>
+        <w:t xml:space="preserve">excitations were, and the filter discards it. The filter is still exact for this readout, and trained</w:t>
+      </w:r>
+      <w:r>
+        <w:rPr>
+          <w:rFonts w:ascii="Times New Roman" w:hAnsi="Times New Roman"/>
+        </w:rPr>
+        <w:t xml:space="preserve"> </w:t>
+      </w:r>
+      <w:r>
+        <w:rPr>
+          <w:rFonts w:ascii="Times New Roman" w:hAnsi="Times New Roman"/>
+        </w:rPr>
+        <w:t xml:space="preserve">without noise it adds</w:t>
+      </w:r>
+      <w:r>
+        <w:rPr>
+          <w:rFonts w:ascii="Times New Roman" w:hAnsi="Times New Roman"/>
+        </w:rPr>
+        <w:t xml:space="preserve"> </w:t>
+      </w:r>
+      <m:oMath>
+        <m:r>
+          <m:rPr>
+            <m:sty m:val="p"/>
+          </m:rPr>
+          <m:t>+</m:t>
+        </m:r>
+        <m:r>
+          <m:t>14.9</m:t>
+        </m:r>
+      </m:oMath>
+      <w:r>
+        <w:rPr>
+          <w:rFonts w:ascii="Times New Roman" w:hAnsi="Times New Roman"/>
+        </w:rPr>
+        <w:t xml:space="preserve"> </w:t>
+      </w:r>
+      <w:r>
+        <w:rPr>
+          <w:rFonts w:ascii="Times New Roman" w:hAnsi="Times New Roman"/>
+        </w:rPr>
+        <w:t xml:space="preserve">points.</w:t>
+      </w:r>
+    </w:p>
+    <w:p>
+      <w:pPr>
+        <w:numPr>
+          <w:ilvl w:val="0"/>
+          <w:numId w:val="1003"/>
+        </w:numPr>
+      </w:pPr>
+      <w:r>
+        <w:rPr>
+          <w:iCs/>
+          <w:rFonts w:ascii="Times New Roman" w:hAnsi="Times New Roman"/>
+          <w:i/>
+        </w:rPr>
+        <w:t xml:space="preserve">Encoding.</w:t>
+      </w:r>
+      <w:r>
+        <w:rPr>
+          <w:rFonts w:ascii="Times New Roman" w:hAnsi="Times New Roman"/>
+        </w:rPr>
+        <w:t xml:space="preserve"> </w:t>
+      </w:r>
+      <w:r>
+        <w:rPr>
+          <w:rFonts w:ascii="Times New Roman" w:hAnsi="Times New Roman"/>
+        </w:rPr>
+        <w:t xml:space="preserve">The best unconstrained quadratic form in the pair-product amplitudes reaches 0.928,</w:t>
+      </w:r>
+      <w:r>
+        <w:rPr>
+          <w:rFonts w:ascii="Times New Roman" w:hAnsi="Times New Roman"/>
+        </w:rPr>
+        <w:t xml:space="preserve"> </w:t>
+      </w:r>
+      <m:oMath>
+        <m:r>
+          <m:t>2.4</m:t>
+        </m:r>
+      </m:oMath>
+      <w:r>
+        <w:rPr>
+          <w:rFonts w:ascii="Times New Roman" w:hAnsi="Times New Roman"/>
+        </w:rPr>
+        <w:t xml:space="preserve"> </w:t>
+      </w:r>
+      <m:oMath>
+        <m:d>
+          <m:dPr>
+            <m:begChr m:val="["/>
+            <m:endChr m:val="]"/>
+            <m:sepChr m:val=""/>
+            <m:grow/>
+          </m:dPr>
+          <m:e>
+            <m:r>
+              <m:t>1.7</m:t>
+            </m:r>
+            <m:r>
+              <m:rPr>
+                <m:sty m:val="p"/>
+              </m:rPr>
+              <m:t>,</m:t>
+            </m:r>
+            <m:r>
+              <m:t>3.0</m:t>
+            </m:r>
+          </m:e>
+        </m:d>
+      </m:oMath>
+      <w:r>
+        <w:rPr>
+          <w:rFonts w:ascii="Times New Roman" w:hAnsi="Times New Roman"/>
+        </w:rPr>
+        <w:t xml:space="preserve"> </w:t>
+      </w:r>
+      <w:r>
+        <w:rPr>
+          <w:rFonts w:ascii="Times New Roman" w:hAnsi="Times New Roman"/>
+        </w:rPr>
+        <w:t xml:space="preserve">points below the same ceiling for the unary amplitudes (0.952). The normalization of the</w:t>
+      </w:r>
+      <w:r>
+        <w:rPr>
+          <w:rFonts w:ascii="Times New Roman" w:hAnsi="Times New Roman"/>
+        </w:rPr>
+        <w:t xml:space="preserve"> </w:t>
+      </w:r>
+      <w:r>
+        <w:rPr>
+          <w:rFonts w:ascii="Times New Roman" w:hAnsi="Times New Roman"/>
+        </w:rPr>
+        <w:t xml:space="preserve">products distorts the data. Loading the weight-1 data on five weight-2 states instead (a</w:t>
+      </w:r>
+      <w:r>
+        <w:rPr>
+          <w:rFonts w:ascii="Times New Roman" w:hAnsi="Times New Roman"/>
+        </w:rPr>
+        <w:t xml:space="preserve"> </w:t>
+      </w:r>
+      <w:r>
+        <w:rPr>
+          <w:rFonts w:ascii="Times New Roman" w:hAnsi="Times New Roman"/>
+        </w:rPr>
+        <w:t xml:space="preserve">“</w:t>
+      </w:r>
+      <w:r>
+        <w:rPr>
+          <w:rFonts w:ascii="Times New Roman" w:hAnsi="Times New Roman"/>
+        </w:rPr>
+        <w:t xml:space="preserve">ring</w:t>
+      </w:r>
+      <w:r>
+        <w:rPr>
+          <w:rFonts w:ascii="Times New Roman" w:hAnsi="Times New Roman"/>
+        </w:rPr>
+        <w:t xml:space="preserve">”</w:t>
+      </w:r>
+      <w:r>
+        <w:rPr>
+          <w:rFonts w:ascii="Times New Roman" w:hAnsi="Times New Roman"/>
+        </w:rPr>
+        <w:t xml:space="preserve"> </w:t>
+      </w:r>
+      <w:r>
+        <w:rPr>
+          <w:rFonts w:ascii="Times New Roman" w:hAnsi="Times New Roman"/>
+        </w:rPr>
+        <w:t xml:space="preserve">of</w:t>
+      </w:r>
+      <w:r>
+        <w:rPr>
+          <w:rFonts w:ascii="Times New Roman" w:hAnsi="Times New Roman"/>
+        </w:rPr>
+        <w:t xml:space="preserve"> </w:t>
+      </w:r>
+      <w:r>
+        <w:rPr>
+          <w:rFonts w:ascii="Times New Roman" w:hAnsi="Times New Roman"/>
+        </w:rPr>
+        <w:t xml:space="preserve">pairs</w:t>
+      </w:r>
+      <w:r>
+        <w:rPr>
+          <w:rFonts w:ascii="Times New Roman" w:hAnsi="Times New Roman"/>
+        </w:rPr>
+        <w:t xml:space="preserve"> </w:t>
+      </w:r>
+      <m:oMath>
+        <m:d>
+          <m:dPr>
+            <m:begChr m:val="("/>
+            <m:endChr m:val=")"/>
+            <m:sepChr m:val=""/>
+            <m:grow/>
+          </m:dPr>
+          <m:e>
+            <m:r>
+              <m:t>k</m:t>
+            </m:r>
+            <m:r>
+              <m:rPr>
+                <m:sty m:val="p"/>
+              </m:rPr>
+              <m:t>,</m:t>
+            </m:r>
+            <m:r>
+              <m:t>k</m:t>
+            </m:r>
+            <m:r>
+              <m:rPr>
+                <m:sty m:val="p"/>
+              </m:rPr>
+              <m:t>+</m:t>
+            </m:r>
+            <m:r>
+              <m:t>1</m:t>
+            </m:r>
+          </m:e>
+        </m:d>
+      </m:oMath>
+      <w:r>
+        <w:rPr>
+          <w:rFonts w:ascii="Times New Roman" w:hAnsi="Times New Roman"/>
+        </w:rPr>
+        <w:t xml:space="preserve">) gives 0.943, within</w:t>
+      </w:r>
+      <w:r>
+        <w:rPr>
+          <w:rFonts w:ascii="Times New Roman" w:hAnsi="Times New Roman"/>
+        </w:rPr>
+        <w:t xml:space="preserve"> </w:t>
+      </w:r>
+      <m:oMath>
+        <m:r>
+          <m:t>1.0</m:t>
+        </m:r>
+      </m:oMath>
+      <w:r>
+        <w:rPr>
+          <w:rFonts w:ascii="Times New Roman" w:hAnsi="Times New Roman"/>
+        </w:rPr>
+        <w:t xml:space="preserve"> </w:t>
+      </w:r>
+      <w:r>
+        <w:rPr>
+          <w:rFonts w:ascii="Times New Roman" w:hAnsi="Times New Roman"/>
+        </w:rPr>
+        <w:t xml:space="preserve">point of weight 1 and</w:t>
+      </w:r>
+      <w:r>
+        <w:rPr>
+          <w:rFonts w:ascii="Times New Roman" w:hAnsi="Times New Roman"/>
+        </w:rPr>
+        <w:t xml:space="preserve"> </w:t>
+      </w:r>
+      <m:oMath>
+        <m:r>
+          <m:t>2.3</m:t>
+        </m:r>
+      </m:oMath>
+      <w:r>
+        <w:rPr>
+          <w:rFonts w:ascii="Times New Roman" w:hAnsi="Times New Roman"/>
+        </w:rPr>
+        <w:t xml:space="preserve"> </w:t>
+      </w:r>
+      <m:oMath>
+        <m:d>
+          <m:dPr>
+            <m:begChr m:val="["/>
+            <m:endChr m:val="]"/>
+            <m:sepChr m:val=""/>
+            <m:grow/>
+          </m:dPr>
+          <m:e>
+            <m:r>
+              <m:t>0.7</m:t>
+            </m:r>
+            <m:r>
+              <m:rPr>
+                <m:sty m:val="p"/>
+              </m:rPr>
+              <m:t>,</m:t>
+            </m:r>
+            <m:r>
+              <m:t>3.9</m:t>
+            </m:r>
+          </m:e>
+        </m:d>
+      </m:oMath>
+      <w:r>
+        <w:rPr>
+          <w:rFonts w:ascii="Times New Roman" w:hAnsi="Times New Roman"/>
+        </w:rPr>
+        <w:t xml:space="preserve"> </w:t>
+      </w:r>
+      <w:r>
+        <w:rPr>
+          <w:rFonts w:ascii="Times New Roman" w:hAnsi="Times New Roman"/>
+        </w:rPr>
+        <w:t xml:space="preserve">points above the pairs.</w:t>
+      </w:r>
+      <w:r>
+        <w:rPr>
+          <w:rFonts w:ascii="Times New Roman" w:hAnsi="Times New Roman"/>
+        </w:rPr>
+        <w:t xml:space="preserve"> </w:t>
+      </w:r>
+      <w:r>
+        <w:rPr>
+          <w:rFonts w:ascii="Times New Roman" w:hAnsi="Times New Roman"/>
+        </w:rPr>
+        <w:t xml:space="preserve">With this encoding the gain of the filter under T1 is the largest seen,</w:t>
+      </w:r>
+      <w:r>
+        <w:rPr>
+          <w:rFonts w:ascii="Times New Roman" w:hAnsi="Times New Roman"/>
+        </w:rPr>
+        <w:t xml:space="preserve"> </w:t>
+      </w:r>
+      <m:oMath>
+        <m:r>
+          <m:rPr>
+            <m:sty m:val="p"/>
+          </m:rPr>
+          <m:t>+</m:t>
+        </m:r>
+        <m:r>
+          <m:t>23.9</m:t>
+        </m:r>
+      </m:oMath>
+      <w:r>
+        <w:rPr>
+          <w:rFonts w:ascii="Times New Roman" w:hAnsi="Times New Roman"/>
+        </w:rPr>
+        <w:t xml:space="preserve"> </w:t>
+      </w:r>
+      <w:r>
+        <w:rPr>
+          <w:rFonts w:ascii="Times New Roman" w:hAnsi="Times New Roman"/>
+        </w:rPr>
+        <w:t xml:space="preserve">points.</w:t>
+      </w:r>
+    </w:p>
+    <w:p>
+      <w:pPr>
+        <w:numPr>
+          <w:ilvl w:val="0"/>
+          <w:numId w:val="1003"/>
+        </w:numPr>
+      </w:pPr>
+      <w:r>
+        <w:rPr>
+          <w:iCs/>
+          <w:rFonts w:ascii="Times New Roman" w:hAnsi="Times New Roman"/>
+          <w:i/>
+        </w:rPr>
+        <w:t xml:space="preserve">T1 spread.</w:t>
+      </w:r>
+      <w:r>
+        <w:rPr>
+          <w:rFonts w:ascii="Times New Roman" w:hAnsi="Times New Roman"/>
+        </w:rPr>
+        <w:t xml:space="preserve"> </w:t>
+      </w:r>
+      <w:r>
+        <w:rPr>
+          <w:rFonts w:ascii="Times New Roman" w:hAnsi="Times New Roman"/>
+        </w:rPr>
+        <w:t xml:space="preserve">With</w:t>
+      </w:r>
+      <w:r>
+        <w:rPr>
+          <w:rFonts w:ascii="Times New Roman" w:hAnsi="Times New Roman"/>
+        </w:rPr>
+        <w:t xml:space="preserve"> </w:t>
+      </w:r>
+      <m:oMath>
+        <m:sSub>
+          <m:e>
+            <m:r>
+              <m:t>γ</m:t>
+            </m:r>
+          </m:e>
+          <m:sub>
+            <m:r>
+              <m:t>q</m:t>
+            </m:r>
+          </m:sub>
+        </m:sSub>
+        <m:r>
+          <m:rPr>
+            <m:sty m:val="p"/>
+          </m:rPr>
+          <m:t>=</m:t>
+        </m:r>
+        <m:r>
+          <m:t>0.08</m:t>
+        </m:r>
+        <m:d>
+          <m:dPr>
+            <m:begChr m:val="("/>
+            <m:endChr m:val=")"/>
+            <m:sepChr m:val=""/>
+            <m:grow/>
+          </m:dPr>
+          <m:e>
+            <m:r>
+              <m:t>1</m:t>
+            </m:r>
+            <m:r>
+              <m:rPr>
+                <m:sty m:val="p"/>
+              </m:rPr>
+              <m:t>+</m:t>
+            </m:r>
+            <m:r>
+              <m:t>s</m:t>
+            </m:r>
+            <m:r>
+              <m:t> </m:t>
+            </m:r>
+            <m:sSub>
+              <m:e>
+                <m:r>
+                  <m:t>u</m:t>
+                </m:r>
+              </m:e>
+              <m:sub>
+                <m:r>
+                  <m:t>q</m:t>
+                </m:r>
+              </m:sub>
+            </m:sSub>
+          </m:e>
+        </m:d>
+      </m:oMath>
+      <w:r>
+        <w:rPr>
+          <w:rFonts w:ascii="Times New Roman" w:hAnsi="Times New Roman"/>
+        </w:rPr>
+        <w:t xml:space="preserve"> </w:t>
+      </w:r>
+      <w:r>
+        <w:rPr>
+          <w:rFonts w:ascii="Times New Roman" w:hAnsi="Times New Roman"/>
+        </w:rPr>
+        <w:t xml:space="preserve">and</w:t>
+      </w:r>
+      <w:r>
+        <w:rPr>
+          <w:rFonts w:ascii="Times New Roman" w:hAnsi="Times New Roman"/>
+        </w:rPr>
+        <w:t xml:space="preserve"> </w:t>
+      </w:r>
+      <m:oMath>
+        <m:sSub>
+          <m:e>
+            <m:r>
+              <m:t>u</m:t>
+            </m:r>
+          </m:e>
+          <m:sub>
+            <m:r>
+              <m:t>q</m:t>
+            </m:r>
+          </m:sub>
+        </m:sSub>
+      </m:oMath>
+      <w:r>
+        <w:rPr>
+          <w:rFonts w:ascii="Times New Roman" w:hAnsi="Times New Roman"/>
+        </w:rPr>
+        <w:t xml:space="preserve"> </w:t>
+      </w:r>
+      <w:r>
+        <w:rPr>
+          <w:rFonts w:ascii="Times New Roman" w:hAnsi="Times New Roman"/>
+        </w:rPr>
+        <w:t xml:space="preserve">spread over</w:t>
+      </w:r>
+      <w:r>
+        <w:rPr>
+          <w:rFonts w:ascii="Times New Roman" w:hAnsi="Times New Roman"/>
+        </w:rPr>
+        <w:t xml:space="preserve"> </w:t>
+      </w:r>
+      <m:oMath>
+        <m:d>
+          <m:dPr>
+            <m:begChr m:val="["/>
+            <m:endChr m:val="]"/>
+            <m:sepChr m:val=""/>
+            <m:grow/>
+          </m:dPr>
+          <m:e>
+            <m:r>
+              <m:rPr>
+                <m:sty m:val="p"/>
+              </m:rPr>
+              <m:t>−</m:t>
+            </m:r>
+            <m:r>
+              <m:t>1</m:t>
+            </m:r>
+            <m:r>
+              <m:rPr>
+                <m:sty m:val="p"/>
+              </m:rPr>
+              <m:t>,</m:t>
+            </m:r>
+            <m:r>
+              <m:t>1</m:t>
+            </m:r>
+          </m:e>
+        </m:d>
+      </m:oMath>
+      <w:r>
+        <w:rPr>
+          <w:rFonts w:ascii="Times New Roman" w:hAnsi="Times New Roman"/>
+        </w:rPr>
+        <w:t xml:space="preserve">, the loss of the</w:t>
+      </w:r>
+      <w:r>
+        <w:rPr>
+          <w:rFonts w:ascii="Times New Roman" w:hAnsi="Times New Roman"/>
+        </w:rPr>
+        <w:t xml:space="preserve"> </w:t>
+      </w:r>
+      <w:r>
+        <w:rPr>
+          <w:rFonts w:ascii="Times New Roman" w:hAnsi="Times New Roman"/>
+        </w:rPr>
+        <w:t xml:space="preserve">filter was</w:t>
+      </w:r>
+      <w:r>
+        <w:rPr>
+          <w:rFonts w:ascii="Times New Roman" w:hAnsi="Times New Roman"/>
+        </w:rPr>
+        <w:t xml:space="preserve"> </w:t>
+      </w:r>
+      <m:oMath>
+        <m:r>
+          <m:t>0.3</m:t>
+        </m:r>
+      </m:oMath>
+      <w:r>
+        <w:rPr>
+          <w:rFonts w:ascii="Times New Roman" w:hAnsi="Times New Roman"/>
+        </w:rPr>
+        <w:t xml:space="preserve">/</w:t>
+      </w:r>
+      <m:oMath>
+        <m:r>
+          <m:t>0.2</m:t>
+        </m:r>
+      </m:oMath>
+      <w:r>
+        <w:rPr>
+          <w:rFonts w:ascii="Times New Roman" w:hAnsi="Times New Roman"/>
+        </w:rPr>
+        <w:t xml:space="preserve"> </w:t>
+      </w:r>
+      <w:r>
+        <w:rPr>
+          <w:rFonts w:ascii="Times New Roman" w:hAnsi="Times New Roman"/>
+        </w:rPr>
+        <w:t xml:space="preserve">points (weight 1/2) at</w:t>
+      </w:r>
+      <w:r>
+        <w:rPr>
+          <w:rFonts w:ascii="Times New Roman" w:hAnsi="Times New Roman"/>
+        </w:rPr>
+        <w:t xml:space="preserve"> </w:t>
+      </w:r>
+      <m:oMath>
+        <m:r>
+          <m:t>s</m:t>
+        </m:r>
+        <m:r>
+          <m:rPr>
+            <m:sty m:val="p"/>
+          </m:rPr>
+          <m:t>=</m:t>
+        </m:r>
+        <m:r>
+          <m:t>0.5</m:t>
+        </m:r>
+      </m:oMath>
+      <w:r>
+        <w:rPr>
+          <w:rFonts w:ascii="Times New Roman" w:hAnsi="Times New Roman"/>
+        </w:rPr>
+        <w:t xml:space="preserve"> </w:t>
+      </w:r>
+      <w:r>
+        <w:rPr>
+          <w:rFonts w:ascii="Times New Roman" w:hAnsi="Times New Roman"/>
+        </w:rPr>
+        <w:t xml:space="preserve">and</w:t>
+      </w:r>
+      <w:r>
+        <w:rPr>
+          <w:rFonts w:ascii="Times New Roman" w:hAnsi="Times New Roman"/>
+        </w:rPr>
+        <w:t xml:space="preserve"> </w:t>
+      </w:r>
+      <m:oMath>
+        <m:r>
+          <m:t>1.4</m:t>
+        </m:r>
+      </m:oMath>
+      <w:r>
+        <w:rPr>
+          <w:rFonts w:ascii="Times New Roman" w:hAnsi="Times New Roman"/>
+        </w:rPr>
+        <w:t xml:space="preserve">/</w:t>
+      </w:r>
+      <m:oMath>
+        <m:r>
+          <m:t>1.3</m:t>
+        </m:r>
+      </m:oMath>
+      <w:r>
+        <w:rPr>
+          <w:rFonts w:ascii="Times New Roman" w:hAnsi="Times New Roman"/>
+        </w:rPr>
+        <w:t xml:space="preserve"> </w:t>
+      </w:r>
+      <w:r>
+        <w:rPr>
+          <w:rFonts w:ascii="Times New Roman" w:hAnsi="Times New Roman"/>
+        </w:rPr>
+        <w:t xml:space="preserve">at</w:t>
+      </w:r>
+      <w:r>
+        <w:rPr>
+          <w:rFonts w:ascii="Times New Roman" w:hAnsi="Times New Roman"/>
+        </w:rPr>
+        <w:t xml:space="preserve"> </w:t>
+      </w:r>
+      <m:oMath>
+        <m:r>
+          <m:t>s</m:t>
+        </m:r>
+        <m:r>
+          <m:rPr>
+            <m:sty m:val="p"/>
+          </m:rPr>
+          <m:t>=</m:t>
+        </m:r>
+        <m:r>
+          <m:t>1</m:t>
+        </m:r>
+      </m:oMath>
+      <w:r>
+        <w:rPr>
+          <w:rFonts w:ascii="Times New Roman" w:hAnsi="Times New Roman"/>
+        </w:rPr>
+        <w:t xml:space="preserve">. The filter alone keeps the loss</w:t>
+      </w:r>
+      <w:r>
+        <w:rPr>
+          <w:rFonts w:ascii="Times New Roman" w:hAnsi="Times New Roman"/>
+        </w:rPr>
+        <w:t xml:space="preserve"> </w:t>
+      </w:r>
+      <w:r>
+        <w:rPr>
+          <w:rFonts w:ascii="Times New Roman" w:hAnsi="Times New Roman"/>
+        </w:rPr>
+        <w:t xml:space="preserve">below one point up to about</w:t>
+      </w:r>
+      <w:r>
+        <w:rPr>
+          <w:rFonts w:ascii="Times New Roman" w:hAnsi="Times New Roman"/>
+        </w:rPr>
+        <w:t xml:space="preserve"> </w:t>
+      </w:r>
+      <m:oMath>
+        <m:r>
+          <m:t>s</m:t>
+        </m:r>
+        <m:r>
+          <m:rPr>
+            <m:sty m:val="p"/>
+          </m:rPr>
+          <m:t>≈</m:t>
+        </m:r>
+        <m:r>
+          <m:t>0.8</m:t>
+        </m:r>
+      </m:oMath>
+      <w:r>
+        <w:rPr>
+          <w:rFonts w:ascii="Times New Roman" w:hAnsi="Times New Roman"/>
+        </w:rPr>
+        <w:t xml:space="preserve">, i.e. a</w:t>
+      </w:r>
+      <w:r>
+        <w:rPr>
+          <w:rFonts w:ascii="Times New Roman" w:hAnsi="Times New Roman"/>
+        </w:rPr>
+        <w:t xml:space="preserve"> </w:t>
+      </w:r>
+      <m:oMath>
+        <m:r>
+          <m:rPr>
+            <m:sty m:val="p"/>
+          </m:rPr>
+          <m:t>±</m:t>
+        </m:r>
+        <m:r>
+          <m:t>80</m:t>
+        </m:r>
+        <m:r>
+          <m:rPr>
+            <m:sty m:val="p"/>
+          </m:rPr>
+          <m:t>%</m:t>
+        </m:r>
+      </m:oMath>
+      <w:r>
+        <w:rPr>
+          <w:rFonts w:ascii="Times New Roman" w:hAnsi="Times New Roman"/>
+        </w:rPr>
+        <w:t xml:space="preserve"> </w:t>
+      </w:r>
+      <w:r>
+        <w:rPr>
+          <w:rFonts w:ascii="Times New Roman" w:hAnsi="Times New Roman"/>
+        </w:rPr>
+        <w:t xml:space="preserve">spread of the decay rates</w:t>
+      </w:r>
+      <w:r>
+        <w:rPr>
+          <w:rFonts w:ascii="Times New Roman" w:hAnsi="Times New Roman"/>
+        </w:rPr>
+        <w:t xml:space="preserve"> </w:t>
+      </w:r>
+      <m:oMath>
+        <m:r>
+          <m:t>1</m:t>
+        </m:r>
+        <m:r>
+          <m:rPr>
+            <m:sty m:val="p"/>
+          </m:rPr>
+          <m:t>/</m:t>
+        </m:r>
+        <m:sSub>
+          <m:e>
+            <m:r>
+              <m:t>T</m:t>
+            </m:r>
+          </m:e>
+          <m:sub>
+            <m:r>
+              <m:t>1</m:t>
+            </m:r>
+          </m:sub>
+        </m:sSub>
+      </m:oMath>
+      <w:r>
+        <w:rPr>
+          <w:rFonts w:ascii="Times New Roman" w:hAnsi="Times New Roman"/>
+        </w:rPr>
+        <w:t xml:space="preserve"> </w:t>
+      </w:r>
+      <w:r>
+        <w:rPr>
+          <w:rFonts w:ascii="Times New Roman" w:hAnsi="Times New Roman"/>
+        </w:rPr>
+        <w:t xml:space="preserve">around their</w:t>
+      </w:r>
+      <w:r>
+        <w:rPr>
+          <w:rFonts w:ascii="Times New Roman" w:hAnsi="Times New Roman"/>
+        </w:rPr>
+        <w:t xml:space="preserve"> </w:t>
+      </w:r>
+      <w:r>
+        <w:rPr>
+          <w:rFonts w:ascii="Times New Roman" w:hAnsi="Times New Roman"/>
+        </w:rPr>
+        <w:t xml:space="preserve">mean.</w:t>
+      </w:r>
+    </w:p>
+    <w:bookmarkEnd w:id="35"/>
+    <w:bookmarkStart w:id="36" w:name="device-noise-models."/>
+    <w:p>
+      <w:pPr>
+        <w:pStyle w:val="Heading4"/>
+      </w:pPr>
+      <w:r>
+        <w:rPr>
+          <w:rFonts w:ascii="Times New Roman" w:hAnsi="Times New Roman"/>
+        </w:rPr>
+        <w:t xml:space="preserve">Device noise models.</w:t>
       </w:r>
     </w:p>
     <w:p>
@@ -7658,36 +9790,111 @@
         <w:rPr>
           <w:rFonts w:ascii="Times New Roman" w:hAnsi="Times New Roman"/>
         </w:rPr>
-        <w:t xml:space="preserve">The difference the filter makes depends on how the network was trained. Trained on a simulator and run</w:t>
-      </w:r>
-      <w:r>
-        <w:rPr>
-          <w:rFonts w:ascii="Times New Roman" w:hAnsi="Times New Roman"/>
-        </w:rPr>
-        <w:t xml:space="preserve"> </w:t>
-      </w:r>
-      <w:r>
-        <w:rPr>
-          <w:rFonts w:ascii="Times New Roman" w:hAnsi="Times New Roman"/>
-        </w:rPr>
-        <w:t xml:space="preserve">under relaxation, the filter is decisive. Its effect grows with the weight, because a weight-</w:t>
+        <w:t xml:space="preserve">The weight-1 model was compiled to Qiskit (a cascade of 4 RBS gates loads</w:t>
+      </w:r>
+      <w:r>
+        <w:rPr>
+          <w:rFonts w:ascii="Times New Roman" w:hAnsi="Times New Roman"/>
+        </w:rPr>
+        <w:t xml:space="preserve"> </w:t>
+      </w:r>
+      <w:r>
+        <w:rPr>
+          <w:rFonts w:ascii="Times New Roman" w:hAnsi="Times New Roman"/>
+        </w:rPr>
+        <w:t xml:space="preserve">the signed unary amplitudes; 15 trained RBS gates follow; the circuit matches the model to</w:t>
+      </w:r>
+      <w:r>
+        <w:rPr>
+          <w:rFonts w:ascii="Times New Roman" w:hAnsi="Times New Roman"/>
+        </w:rPr>
+        <w:t xml:space="preserve"> </w:t>
       </w:r>
       <m:oMath>
-        <m:r>
-          <m:t>k</m:t>
-        </m:r>
+        <m:sSup>
+          <m:e>
+            <m:r>
+              <m:t>10</m:t>
+            </m:r>
+          </m:e>
+          <m:sup>
+            <m:r>
+              <m:rPr>
+                <m:sty m:val="p"/>
+              </m:rPr>
+              <m:t>−</m:t>
+            </m:r>
+            <m:r>
+              <m:t>16</m:t>
+            </m:r>
+          </m:sup>
+        </m:sSup>
       </m:oMath>
       <w:r>
         <w:rPr>
           <w:rFonts w:ascii="Times New Roman" w:hAnsi="Times New Roman"/>
         </w:rPr>
-        <w:t xml:space="preserve"> </w:t>
-      </w:r>
-      <w:r>
-        <w:rPr>
-          <w:rFonts w:ascii="Times New Roman" w:hAnsi="Times New Roman"/>
-        </w:rPr>
-        <w:t xml:space="preserve">state decays</w:t>
+        <w:t xml:space="preserve">). It</w:t>
+      </w:r>
+      <w:r>
+        <w:rPr>
+          <w:rFonts w:ascii="Times New Roman" w:hAnsi="Times New Roman"/>
+        </w:rPr>
+        <w:t xml:space="preserve"> </w:t>
+      </w:r>
+      <w:r>
+        <w:rPr>
+          <w:rFonts w:ascii="Times New Roman" w:hAnsi="Times New Roman"/>
+        </w:rPr>
+        <w:t xml:space="preserve">was run on 30 iris test inputs with 1000 shots each, read with and without the filter from the same shots.</w:t>
+      </w:r>
+      <w:r>
+        <w:rPr>
+          <w:rFonts w:ascii="Times New Roman" w:hAnsi="Times New Roman"/>
+        </w:rPr>
+        <w:t xml:space="preserve"> </w:t>
+      </w:r>
+      <w:r>
+        <w:rPr>
+          <w:rFonts w:ascii="Times New Roman" w:hAnsi="Times New Roman"/>
+        </w:rPr>
+        <w:t xml:space="preserve">The noise models were those of three IBM devices (calibration-based fake backends simulated by Aer) and</w:t>
+      </w:r>
+      <w:r>
+        <w:rPr>
+          <w:rFonts w:ascii="Times New Roman" w:hAnsi="Times New Roman"/>
+        </w:rPr>
+        <w:t xml:space="preserve"> </w:t>
+      </w:r>
+      <w:r>
+        <w:rPr>
+          <w:rFonts w:ascii="Times New Roman" w:hAnsi="Times New Roman"/>
+        </w:rPr>
+        <w:t xml:space="preserve">the IonQ cloud simulator with the Aria-1 and Forte-1 noise models. On all five the accuracy was 0.933 with</w:t>
+      </w:r>
+      <w:r>
+        <w:rPr>
+          <w:rFonts w:ascii="Times New Roman" w:hAnsi="Times New Roman"/>
+        </w:rPr>
+        <w:t xml:space="preserve"> </w:t>
+      </w:r>
+      <w:r>
+        <w:rPr>
+          <w:rFonts w:ascii="Times New Roman" w:hAnsi="Times New Roman"/>
+        </w:rPr>
+        <w:t xml:space="preserve">and without the filter, equal to the noiseless accuracy: the margins of this model are wide. The error of</w:t>
+      </w:r>
+      <w:r>
+        <w:rPr>
+          <w:rFonts w:ascii="Times New Roman" w:hAnsi="Times New Roman"/>
+        </w:rPr>
+        <w:t xml:space="preserve"> </w:t>
+      </w:r>
+      <w:r>
+        <w:rPr>
+          <w:rFonts w:ascii="Times New Roman" w:hAnsi="Times New Roman"/>
+        </w:rPr>
+        <w:t xml:space="preserve">the measured</w:t>
       </w:r>
       <w:r>
         <w:rPr>
@@ -7697,8 +9904,20 @@
       </w:r>
       <m:oMath>
         <m:r>
-          <m:t>k</m:t>
-        </m:r>
+          <m:t>q</m:t>
+        </m:r>
+        <m:sSub>
+          <m:e>
+            <m:r>
+              <m:t>g</m:t>
+            </m:r>
+          </m:e>
+          <m:sub>
+            <m:r>
+              <m:t>Z</m:t>
+            </m:r>
+          </m:sub>
+        </m:sSub>
       </m:oMath>
       <w:r>
         <w:rPr>
@@ -7710,79 +9929,73 @@
         <w:rPr>
           <w:rFonts w:ascii="Times New Roman" w:hAnsi="Times New Roman"/>
         </w:rPr>
-        <w:t xml:space="preserve">times faster. Trained under a calibrated noise model, a network without the filter learns the decay, and</w:t>
-      </w:r>
-      <w:r>
-        <w:rPr>
-          <w:rFonts w:ascii="Times New Roman" w:hAnsi="Times New Roman"/>
-        </w:rPr>
-        <w:t xml:space="preserve"> </w:t>
-      </w:r>
-      <w:r>
-        <w:rPr>
-          <w:rFonts w:ascii="Times New Roman" w:hAnsi="Times New Roman"/>
-        </w:rPr>
-        <w:t xml:space="preserve">the filter adds nothing measurable. What the filter provides is therefore procedural rather than an accuracy</w:t>
-      </w:r>
-      <w:r>
-        <w:rPr>
-          <w:rFonts w:ascii="Times New Roman" w:hAnsi="Times New Roman"/>
-        </w:rPr>
-        <w:t xml:space="preserve"> </w:t>
-      </w:r>
-      <w:r>
-        <w:rPr>
-          <w:rFonts w:ascii="Times New Roman" w:hAnsi="Times New Roman"/>
-        </w:rPr>
-        <w:t xml:space="preserve">gain over the best alternative. Under equal T1 it makes noise-free training exactly valid, with no noise</w:t>
-      </w:r>
-      <w:r>
-        <w:rPr>
-          <w:rFonts w:ascii="Times New Roman" w:hAnsi="Times New Roman"/>
-        </w:rPr>
-        <w:t xml:space="preserve"> </w:t>
-      </w:r>
-      <w:r>
-        <w:rPr>
-          <w:rFonts w:ascii="Times New Roman" w:hAnsi="Times New Roman"/>
-        </w:rPr>
-        <w:t xml:space="preserve">model and no noisy training runs, and its cost (the discarded shots) is known before running. Unequal T1 and</w:t>
-      </w:r>
-      <w:r>
-        <w:rPr>
-          <w:rFonts w:ascii="Times New Roman" w:hAnsi="Times New Roman"/>
-        </w:rPr>
-        <w:t xml:space="preserve"> </w:t>
-      </w:r>
-      <w:r>
-        <w:rPr>
-          <w:rFonts w:ascii="Times New Roman" w:hAnsi="Times New Roman"/>
-        </w:rPr>
-        <w:t xml:space="preserve">dephasing are not corrected. On hardware with a large spread of T1 or strong dephasing, the filter</w:t>
-      </w:r>
-      <w:r>
-        <w:rPr>
-          <w:rFonts w:ascii="Times New Roman" w:hAnsi="Times New Roman"/>
-        </w:rPr>
-        <w:t xml:space="preserve"> </w:t>
-      </w:r>
-      <w:r>
-        <w:rPr>
-          <w:rFonts w:ascii="Times New Roman" w:hAnsi="Times New Roman"/>
-        </w:rPr>
-        <w:t xml:space="preserve">complements a noise model and does not replace it.</w:t>
+        <w:t xml:space="preserve">fell from 0.138–0.206 without the filter to 0.040–0.072 with it (</w:t>
+      </w:r>
+      <m:oMath>
+        <m:r>
+          <m:t>2.9</m:t>
+        </m:r>
+      </m:oMath>
+      <w:r>
+        <w:rPr>
+          <w:rFonts w:ascii="Times New Roman" w:hAnsi="Times New Roman"/>
+        </w:rPr>
+        <w:t xml:space="preserve">–</w:t>
+      </w:r>
+      <m:oMath>
+        <m:r>
+          <m:t>3.6</m:t>
+        </m:r>
+        <m:r>
+          <m:rPr>
+            <m:sty m:val="p"/>
+          </m:rPr>
+          <m:t>×</m:t>
+        </m:r>
+      </m:oMath>
+      <w:r>
+        <w:rPr>
+          <w:rFonts w:ascii="Times New Roman" w:hAnsi="Times New Roman"/>
+        </w:rPr>
+        <w:t xml:space="preserve">),</w:t>
+      </w:r>
+      <w:r>
+        <w:rPr>
+          <w:rFonts w:ascii="Times New Roman" w:hAnsi="Times New Roman"/>
+        </w:rPr>
+        <w:t xml:space="preserve"> </w:t>
+      </w:r>
+      <w:r>
+        <w:rPr>
+          <w:rFonts w:ascii="Times New Roman" w:hAnsi="Times New Roman"/>
+        </w:rPr>
+        <w:t xml:space="preserve">keeping 69–74% of the shots. These are noise models, not devices; the hardware runs are prepared, with</w:t>
+      </w:r>
+      <w:r>
+        <w:rPr>
+          <w:rFonts w:ascii="Times New Roman" w:hAnsi="Times New Roman"/>
+        </w:rPr>
+        <w:t xml:space="preserve"> </w:t>
+      </w:r>
+      <w:r>
+        <w:rPr>
+          <w:rFonts w:ascii="Times New Roman" w:hAnsi="Times New Roman"/>
+        </w:rPr>
+        <w:t xml:space="preserve">cost confirmations, and pending.</w:t>
       </w:r>
     </w:p>
-    <w:bookmarkStart w:id="36" w:name="limitations."/>
+    <w:bookmarkEnd w:id="36"/>
+    <w:bookmarkEnd w:id="37"/>
+    <w:bookmarkStart w:id="39" w:name="discussion"/>
     <w:p>
       <w:pPr>
-        <w:pStyle w:val="Heading4"/>
+        <w:pStyle w:val="Heading1"/>
       </w:pPr>
       <w:r>
         <w:rPr>
           <w:rFonts w:ascii="Times New Roman" w:hAnsi="Times New Roman"/>
         </w:rPr>
-        <w:t xml:space="preserve">Limitations.</w:t>
+        <w:t xml:space="preserve">Discussion</w:t>
       </w:r>
     </w:p>
     <w:p>
@@ -7793,57 +10006,255 @@
         <w:rPr>
           <w:rFonts w:ascii="Times New Roman" w:hAnsi="Times New Roman"/>
         </w:rPr>
-        <w:t xml:space="preserve">All noise is simulated. There is one architecture per weight, five qubits, and</w:t>
-      </w:r>
-      <w:r>
-        <w:rPr>
-          <w:rFonts w:ascii="Times New Roman" w:hAnsi="Times New Roman"/>
-        </w:rPr>
-        <w:t xml:space="preserve"> </w:t>
-      </w:r>
-      <w:r>
-        <w:rPr>
-          <w:rFonts w:ascii="Times New Roman" w:hAnsi="Times New Roman"/>
-        </w:rPr>
-        <w:t xml:space="preserve">small datasets in which one test sample is worth 2–3 points. The weight-2 encoding is one choice among many,</w:t>
-      </w:r>
-      <w:r>
-        <w:rPr>
-          <w:rFonts w:ascii="Times New Roman" w:hAnsi="Times New Roman"/>
-        </w:rPr>
-        <w:t xml:space="preserve"> </w:t>
-      </w:r>
-      <w:r>
-        <w:rPr>
-          <w:rFonts w:ascii="Times New Roman" w:hAnsi="Times New Roman"/>
-        </w:rPr>
-        <w:t xml:space="preserve">and it did not use the larger sector well. No quantum advantage is claimed: these networks are classically</w:t>
-      </w:r>
-      <w:r>
-        <w:rPr>
-          <w:rFonts w:ascii="Times New Roman" w:hAnsi="Times New Roman"/>
-        </w:rPr>
-        <w:t xml:space="preserve"> </w:t>
-      </w:r>
-      <w:r>
-        <w:rPr>
-          <w:rFonts w:ascii="Times New Roman" w:hAnsi="Times New Roman"/>
-        </w:rPr>
-        <w:t xml:space="preserve">simulable. A hardware run with the filter is the natural next test.</w:t>
+        <w:t xml:space="preserve">The difference the filter makes depends on how the network was trained. Trained on a simulator and run</w:t>
+      </w:r>
+      <w:r>
+        <w:rPr>
+          <w:rFonts w:ascii="Times New Roman" w:hAnsi="Times New Roman"/>
+        </w:rPr>
+        <w:t xml:space="preserve"> </w:t>
+      </w:r>
+      <w:r>
+        <w:rPr>
+          <w:rFonts w:ascii="Times New Roman" w:hAnsi="Times New Roman"/>
+        </w:rPr>
+        <w:t xml:space="preserve">under relaxation, the filter is decisive. Its effect grows with the weight, because a weight-</w:t>
+      </w:r>
+      <m:oMath>
+        <m:r>
+          <m:t>k</m:t>
+        </m:r>
+      </m:oMath>
+      <w:r>
+        <w:rPr>
+          <w:rFonts w:ascii="Times New Roman" w:hAnsi="Times New Roman"/>
+        </w:rPr>
+        <w:t xml:space="preserve"> </w:t>
+      </w:r>
+      <w:r>
+        <w:rPr>
+          <w:rFonts w:ascii="Times New Roman" w:hAnsi="Times New Roman"/>
+        </w:rPr>
+        <w:t xml:space="preserve">state decays</w:t>
+      </w:r>
+      <w:r>
+        <w:rPr>
+          <w:rFonts w:ascii="Times New Roman" w:hAnsi="Times New Roman"/>
+        </w:rPr>
+        <w:t xml:space="preserve"> </w:t>
+      </w:r>
+      <m:oMath>
+        <m:r>
+          <m:t>k</m:t>
+        </m:r>
+      </m:oMath>
+      <w:r>
+        <w:rPr>
+          <w:rFonts w:ascii="Times New Roman" w:hAnsi="Times New Roman"/>
+        </w:rPr>
+        <w:t xml:space="preserve"> </w:t>
+      </w:r>
+      <w:r>
+        <w:rPr>
+          <w:rFonts w:ascii="Times New Roman" w:hAnsi="Times New Roman"/>
+        </w:rPr>
+        <w:t xml:space="preserve">times faster. Trained under a calibrated noise model, a network without the filter learns the decay, and</w:t>
+      </w:r>
+      <w:r>
+        <w:rPr>
+          <w:rFonts w:ascii="Times New Roman" w:hAnsi="Times New Roman"/>
+        </w:rPr>
+        <w:t xml:space="preserve"> </w:t>
+      </w:r>
+      <w:r>
+        <w:rPr>
+          <w:rFonts w:ascii="Times New Roman" w:hAnsi="Times New Roman"/>
+        </w:rPr>
+        <w:t xml:space="preserve">the filter adds nothing measurable. What the filter provides is therefore procedural rather than an accuracy</w:t>
+      </w:r>
+      <w:r>
+        <w:rPr>
+          <w:rFonts w:ascii="Times New Roman" w:hAnsi="Times New Roman"/>
+        </w:rPr>
+        <w:t xml:space="preserve"> </w:t>
+      </w:r>
+      <w:r>
+        <w:rPr>
+          <w:rFonts w:ascii="Times New Roman" w:hAnsi="Times New Roman"/>
+        </w:rPr>
+        <w:t xml:space="preserve">gain over the best alternative. Under equal T1 it makes noise-free training exactly valid, with no noise</w:t>
+      </w:r>
+      <w:r>
+        <w:rPr>
+          <w:rFonts w:ascii="Times New Roman" w:hAnsi="Times New Roman"/>
+        </w:rPr>
+        <w:t xml:space="preserve"> </w:t>
+      </w:r>
+      <w:r>
+        <w:rPr>
+          <w:rFonts w:ascii="Times New Roman" w:hAnsi="Times New Roman"/>
+        </w:rPr>
+        <w:t xml:space="preserve">model and no noisy training runs, and its cost (the discarded shots) is known before running. Unequal T1 and</w:t>
+      </w:r>
+      <w:r>
+        <w:rPr>
+          <w:rFonts w:ascii="Times New Roman" w:hAnsi="Times New Roman"/>
+        </w:rPr>
+        <w:t xml:space="preserve"> </w:t>
+      </w:r>
+      <w:r>
+        <w:rPr>
+          <w:rFonts w:ascii="Times New Roman" w:hAnsi="Times New Roman"/>
+        </w:rPr>
+        <w:t xml:space="preserve">dephasing are not corrected. On hardware with a large spread of T1 or strong dephasing, the filter</w:t>
+      </w:r>
+      <w:r>
+        <w:rPr>
+          <w:rFonts w:ascii="Times New Roman" w:hAnsi="Times New Roman"/>
+        </w:rPr>
+        <w:t xml:space="preserve"> </w:t>
+      </w:r>
+      <w:r>
+        <w:rPr>
+          <w:rFonts w:ascii="Times New Roman" w:hAnsi="Times New Roman"/>
+        </w:rPr>
+        <w:t xml:space="preserve">complements a noise model and does not replace it. Two practical rules follow from the studies above. Up</w:t>
+      </w:r>
+      <w:r>
+        <w:rPr>
+          <w:rFonts w:ascii="Times New Roman" w:hAnsi="Times New Roman"/>
+        </w:rPr>
+        <w:t xml:space="preserve"> </w:t>
+      </w:r>
+      <w:r>
+        <w:rPr>
+          <w:rFonts w:ascii="Times New Roman" w:hAnsi="Times New Roman"/>
+        </w:rPr>
+        <w:t xml:space="preserve">to about a</w:t>
+      </w:r>
+      <w:r>
+        <w:rPr>
+          <w:rFonts w:ascii="Times New Roman" w:hAnsi="Times New Roman"/>
+        </w:rPr>
+        <w:t xml:space="preserve"> </w:t>
+      </w:r>
+      <m:oMath>
+        <m:r>
+          <m:rPr>
+            <m:sty m:val="p"/>
+          </m:rPr>
+          <m:t>±</m:t>
+        </m:r>
+        <m:r>
+          <m:t>80</m:t>
+        </m:r>
+        <m:r>
+          <m:rPr>
+            <m:sty m:val="p"/>
+          </m:rPr>
+          <m:t>%</m:t>
+        </m:r>
+      </m:oMath>
+      <w:r>
+        <w:rPr>
+          <w:rFonts w:ascii="Times New Roman" w:hAnsi="Times New Roman"/>
+        </w:rPr>
+        <w:t xml:space="preserve"> </w:t>
+      </w:r>
+      <w:r>
+        <w:rPr>
+          <w:rFonts w:ascii="Times New Roman" w:hAnsi="Times New Roman"/>
+        </w:rPr>
+        <w:t xml:space="preserve">spread of</w:t>
+      </w:r>
+      <w:r>
+        <w:rPr>
+          <w:rFonts w:ascii="Times New Roman" w:hAnsi="Times New Roman"/>
+        </w:rPr>
+        <w:t xml:space="preserve"> </w:t>
+      </w:r>
+      <m:oMath>
+        <m:r>
+          <m:t>1</m:t>
+        </m:r>
+        <m:r>
+          <m:rPr>
+            <m:sty m:val="p"/>
+          </m:rPr>
+          <m:t>/</m:t>
+        </m:r>
+        <m:sSub>
+          <m:e>
+            <m:r>
+              <m:t>T</m:t>
+            </m:r>
+          </m:e>
+          <m:sub>
+            <m:r>
+              <m:t>1</m:t>
+            </m:r>
+          </m:sub>
+        </m:sSub>
+      </m:oMath>
+      <w:r>
+        <w:rPr>
+          <w:rFonts w:ascii="Times New Roman" w:hAnsi="Times New Roman"/>
+        </w:rPr>
+        <w:t xml:space="preserve"> </w:t>
+      </w:r>
+      <w:r>
+        <w:rPr>
+          <w:rFonts w:ascii="Times New Roman" w:hAnsi="Times New Roman"/>
+        </w:rPr>
+        <w:t xml:space="preserve">across qubits, a network trained on a simulator can be run with the</w:t>
+      </w:r>
+      <w:r>
+        <w:rPr>
+          <w:rFonts w:ascii="Times New Roman" w:hAnsi="Times New Roman"/>
+        </w:rPr>
+        <w:t xml:space="preserve"> </w:t>
+      </w:r>
+      <w:r>
+        <w:rPr>
+          <w:rFonts w:ascii="Times New Roman" w:hAnsi="Times New Roman"/>
+        </w:rPr>
+        <w:t xml:space="preserve">filter alone, losing less than one point. When the network is instead trained under the calibrated noise,</w:t>
+      </w:r>
+      <w:r>
+        <w:rPr>
+          <w:rFonts w:ascii="Times New Roman" w:hAnsi="Times New Roman"/>
+        </w:rPr>
+        <w:t xml:space="preserve"> </w:t>
+      </w:r>
+      <w:r>
+        <w:rPr>
+          <w:rFonts w:ascii="Times New Roman" w:hAnsi="Times New Roman"/>
+        </w:rPr>
+        <w:t xml:space="preserve">and especially when its readout has many parameters, the decayed shots are useful data, and the filter can</w:t>
+      </w:r>
+      <w:r>
+        <w:rPr>
+          <w:rFonts w:ascii="Times New Roman" w:hAnsi="Times New Roman"/>
+        </w:rPr>
+        <w:t xml:space="preserve"> </w:t>
+      </w:r>
+      <w:r>
+        <w:rPr>
+          <w:rFonts w:ascii="Times New Roman" w:hAnsi="Times New Roman"/>
+        </w:rPr>
+        <w:t xml:space="preserve">cost about a point. For weight-2 models, how the data are loaded matters more than what is read out.</w:t>
       </w:r>
     </w:p>
-    <w:bookmarkEnd w:id="36"/>
-    <w:bookmarkEnd w:id="37"/>
-    <w:bookmarkStart w:id="51" w:name="code-and-data-availability"/>
+    <w:bookmarkStart w:id="38" w:name="limitations."/>
     <w:p>
       <w:pPr>
-        <w:pStyle w:val="Heading1"/>
+        <w:pStyle w:val="Heading4"/>
       </w:pPr>
       <w:r>
         <w:rPr>
           <w:rFonts w:ascii="Times New Roman" w:hAnsi="Times New Roman"/>
         </w:rPr>
-        <w:t xml:space="preserve">Code and data availability</w:t>
+        <w:t xml:space="preserve">Limitations.</w:t>
       </w:r>
     </w:p>
     <w:p>
@@ -7854,6 +10265,67 @@
         <w:rPr>
           <w:rFonts w:ascii="Times New Roman" w:hAnsi="Times New Roman"/>
         </w:rPr>
+        <w:t xml:space="preserve">All noise is simulated, including the device noise models. There is one</w:t>
+      </w:r>
+      <w:r>
+        <w:rPr>
+          <w:rFonts w:ascii="Times New Roman" w:hAnsi="Times New Roman"/>
+        </w:rPr>
+        <w:t xml:space="preserve"> </w:t>
+      </w:r>
+      <w:r>
+        <w:rPr>
+          <w:rFonts w:ascii="Times New Roman" w:hAnsi="Times New Roman"/>
+        </w:rPr>
+        <w:t xml:space="preserve">architecture per weight, five qubits, and small datasets in which one test sample is worth 2–3 points. The</w:t>
+      </w:r>
+      <w:r>
+        <w:rPr>
+          <w:rFonts w:ascii="Times New Roman" w:hAnsi="Times New Roman"/>
+        </w:rPr>
+        <w:t xml:space="preserve"> </w:t>
+      </w:r>
+      <w:r>
+        <w:rPr>
+          <w:rFonts w:ascii="Times New Roman" w:hAnsi="Times New Roman"/>
+        </w:rPr>
+        <w:t xml:space="preserve">ring encoding uses only five of the ten weight-2 states, so a better use of the larger sector is still open. No quantum advantage is claimed: these networks are classically</w:t>
+      </w:r>
+      <w:r>
+        <w:rPr>
+          <w:rFonts w:ascii="Times New Roman" w:hAnsi="Times New Roman"/>
+        </w:rPr>
+        <w:t xml:space="preserve"> </w:t>
+      </w:r>
+      <w:r>
+        <w:rPr>
+          <w:rFonts w:ascii="Times New Roman" w:hAnsi="Times New Roman"/>
+        </w:rPr>
+        <w:t xml:space="preserve">simulable. A hardware run with the filter is the natural next test.</w:t>
+      </w:r>
+    </w:p>
+    <w:bookmarkEnd w:id="38"/>
+    <w:bookmarkEnd w:id="39"/>
+    <w:bookmarkStart w:id="53" w:name="code-and-data-availability"/>
+    <w:p>
+      <w:pPr>
+        <w:pStyle w:val="Heading1"/>
+      </w:pPr>
+      <w:r>
+        <w:rPr>
+          <w:rFonts w:ascii="Times New Roman" w:hAnsi="Times New Roman"/>
+        </w:rPr>
+        <w:t xml:space="preserve">Code and data availability</w:t>
+      </w:r>
+    </w:p>
+    <w:p>
+      <w:pPr>
+        <w:pStyle w:val="FirstParagraph"/>
+      </w:pPr>
+      <w:r>
+        <w:rPr>
+          <w:rFonts w:ascii="Times New Roman" w:hAnsi="Times New Roman"/>
+        </w:rPr>
         <w:t xml:space="preserve">Models:</w:t>
       </w:r>
       <w:r>
@@ -7936,7 +10408,13 @@
         <w:rPr>
           <w:rFonts w:ascii="Times New Roman" w:hAnsi="Times New Roman"/>
         </w:rPr>
-        <w:t xml:space="preserve">,</w:t>
+        <w:t xml:space="preserve"> </w:t>
+      </w:r>
+      <w:r>
+        <w:rPr>
+          <w:rFonts w:ascii="Times New Roman" w:hAnsi="Times New Roman"/>
+        </w:rPr>
+        <w:t xml:space="preserve">(weights 1 and 2, readouts</w:t>
       </w:r>
       <w:r>
         <w:rPr>
@@ -7949,6 +10427,94 @@
           <w:rStyle w:val="VerbatimChar"/>
           <w:rFonts w:ascii="Times New Roman" w:hAnsi="Times New Roman"/>
         </w:rPr>
+        <w:t xml:space="preserve">"z"</w:t>
+      </w:r>
+      <w:r>
+        <w:rPr>
+          <w:rFonts w:ascii="Times New Roman" w:hAnsi="Times New Roman"/>
+        </w:rPr>
+        <w:t xml:space="preserve"> </w:t>
+      </w:r>
+      <w:r>
+        <w:rPr>
+          <w:rFonts w:ascii="Times New Roman" w:hAnsi="Times New Roman"/>
+        </w:rPr>
+        <w:t xml:space="preserve">and</w:t>
+      </w:r>
+      <w:r>
+        <w:rPr>
+          <w:rFonts w:ascii="Times New Roman" w:hAnsi="Times New Roman"/>
+        </w:rPr>
+        <w:t xml:space="preserve"> </w:t>
+      </w:r>
+      <w:r>
+        <w:rPr>
+          <w:rStyle w:val="VerbatimChar"/>
+          <w:rFonts w:ascii="Times New Roman" w:hAnsi="Times New Roman"/>
+        </w:rPr>
+        <w:t xml:space="preserve">"zz"</w:t>
+      </w:r>
+      <w:r>
+        <w:rPr>
+          <w:rFonts w:ascii="Times New Roman" w:hAnsi="Times New Roman"/>
+        </w:rPr>
+        <w:t xml:space="preserve">, encodings</w:t>
+      </w:r>
+      <w:r>
+        <w:rPr>
+          <w:rFonts w:ascii="Times New Roman" w:hAnsi="Times New Roman"/>
+        </w:rPr>
+        <w:t xml:space="preserve"> </w:t>
+      </w:r>
+      <w:r>
+        <w:rPr>
+          <w:rStyle w:val="VerbatimChar"/>
+          <w:rFonts w:ascii="Times New Roman" w:hAnsi="Times New Roman"/>
+        </w:rPr>
+        <w:t xml:space="preserve">"pairs"</w:t>
+      </w:r>
+      <w:r>
+        <w:rPr>
+          <w:rFonts w:ascii="Times New Roman" w:hAnsi="Times New Roman"/>
+        </w:rPr>
+        <w:t xml:space="preserve"> </w:t>
+      </w:r>
+      <w:r>
+        <w:rPr>
+          <w:rFonts w:ascii="Times New Roman" w:hAnsi="Times New Roman"/>
+        </w:rPr>
+        <w:t xml:space="preserve">and</w:t>
+      </w:r>
+      <w:r>
+        <w:rPr>
+          <w:rFonts w:ascii="Times New Roman" w:hAnsi="Times New Roman"/>
+        </w:rPr>
+        <w:t xml:space="preserve"> </w:t>
+      </w:r>
+      <w:r>
+        <w:rPr>
+          <w:rStyle w:val="VerbatimChar"/>
+          <w:rFonts w:ascii="Times New Roman" w:hAnsi="Times New Roman"/>
+        </w:rPr>
+        <w:t xml:space="preserve">"ring"</w:t>
+      </w:r>
+      <w:r>
+        <w:rPr>
+          <w:rFonts w:ascii="Times New Roman" w:hAnsi="Times New Roman"/>
+        </w:rPr>
+        <w:t xml:space="preserve">),</w:t>
+      </w:r>
+      <w:r>
+        <w:rPr>
+          <w:rFonts w:ascii="Times New Roman" w:hAnsi="Times New Roman"/>
+        </w:rPr>
+        <w:t xml:space="preserve"> </w:t>
+      </w:r>
+      <w:r>
+        <w:rPr>
+          <w:rStyle w:val="VerbatimChar"/>
+          <w:rFonts w:ascii="Times New Roman" w:hAnsi="Times New Roman"/>
+        </w:rPr>
         <w:t xml:space="preserve">kept_fraction</w:t>
       </w:r>
       <w:r>
@@ -7980,7 +10546,7 @@
         <w:rPr>
           <w:rFonts w:ascii="Times New Roman" w:hAnsi="Times New Roman"/>
         </w:rPr>
-        <w:t xml:space="preserve">. Studies:</w:t>
+        <w:t xml:space="preserve">. Hardware-ready script:</w:t>
       </w:r>
       <w:r>
         <w:rPr>
@@ -7993,6 +10559,31 @@
           <w:rStyle w:val="VerbatimChar"/>
           <w:rFonts w:ascii="Times New Roman" w:hAnsi="Times New Roman"/>
         </w:rPr>
+        <w:t xml:space="preserve">examples/qnn_hardware_qg.py</w:t>
+      </w:r>
+      <w:r>
+        <w:rPr>
+          <w:rFonts w:ascii="Times New Roman" w:hAnsi="Times New Roman"/>
+        </w:rPr>
+        <w:t xml:space="preserve"> </w:t>
+      </w:r>
+      <w:r>
+        <w:rPr>
+          <w:rFonts w:ascii="Times New Roman" w:hAnsi="Times New Roman"/>
+        </w:rPr>
+        <w:t xml:space="preserve">(IBM and IonQ). Studies:</w:t>
+      </w:r>
+      <w:r>
+        <w:rPr>
+          <w:rFonts w:ascii="Times New Roman" w:hAnsi="Times New Roman"/>
+        </w:rPr>
+        <w:t xml:space="preserve"> </w:t>
+      </w:r>
+      <w:r>
+        <w:rPr>
+          <w:rStyle w:val="VerbatimChar"/>
+          <w:rFonts w:ascii="Times New Roman" w:hAnsi="Times New Roman"/>
+        </w:rPr>
         <w:t xml:space="preserve">examples/qnn_*_qg.py</w:t>
       </w:r>
       <w:r>
@@ -8005,7 +10596,7 @@
         <w:rPr>
           <w:rFonts w:ascii="Times New Roman" w:hAnsi="Times New Roman"/>
         </w:rPr>
-        <w:t xml:space="preserve">and RESEARCH_NOTES §75–§80, with tests in</w:t>
+        <w:t xml:space="preserve">and RESEARCH_NOTES §75–§82, §85 and §87, with tests in</w:t>
       </w:r>
       <w:r>
         <w:rPr>
@@ -8106,7 +10697,7 @@
         </w:rPr>
         <w:t xml:space="preserve"> </w:t>
       </w:r>
-      <w:hyperlink r:id="rId38">
+      <w:hyperlink r:id="rId40">
         <w:r>
           <w:rPr>
             <w:rStyle w:val="Hyperlink"/>
@@ -8309,8 +10900,8 @@
         <w:t xml:space="preserve"># raw readout</w:t>
       </w:r>
     </w:p>
-    <w:bookmarkStart w:id="50" w:name="refs"/>
-    <w:bookmarkStart w:id="39" w:name="ref-bonetmonroig2018"/>
+    <w:bookmarkStart w:id="52" w:name="refs"/>
+    <w:bookmarkStart w:id="41" w:name="ref-bonetmonroig2018"/>
     <w:p>
       <w:pPr>
         <w:pStyle w:val="Bibliography"/>
@@ -8360,8 +10951,8 @@
         <w:t xml:space="preserve">98: 062339.</w:t>
       </w:r>
     </w:p>
-    <w:bookmarkEnd w:id="39"/>
-    <w:bookmarkStart w:id="40" w:name="ref-cerezo2023simulability"/>
+    <w:bookmarkEnd w:id="41"/>
+    <w:bookmarkStart w:id="42" w:name="ref-cerezo2023simulability"/>
     <w:p>
       <w:pPr>
         <w:pStyle w:val="Bibliography"/>
@@ -8403,8 +10994,8 @@
         <w:t xml:space="preserve">r, Why We Need to Rethink Variational Quantum Computing.”</w:t>
       </w:r>
     </w:p>
-    <w:bookmarkEnd w:id="40"/>
-    <w:bookmarkStart w:id="42" w:name="ref-landman2022"/>
+    <w:bookmarkEnd w:id="42"/>
+    <w:bookmarkStart w:id="44" w:name="ref-landman2022"/>
     <w:p>
       <w:pPr>
         <w:pStyle w:val="Bibliography"/>
@@ -8459,7 +11050,7 @@
         </w:rPr>
         <w:t xml:space="preserve"> </w:t>
       </w:r>
-      <w:hyperlink r:id="rId41">
+      <w:hyperlink r:id="rId43">
         <w:r>
           <w:rPr>
             <w:rStyle w:val="Hyperlink"/>
@@ -8474,8 +11065,8 @@
         <w:t xml:space="preserve">.</w:t>
       </w:r>
     </w:p>
-    <w:bookmarkEnd w:id="42"/>
-    <w:bookmarkStart w:id="43" w:name="ref-mcardle2019"/>
+    <w:bookmarkEnd w:id="44"/>
+    <w:bookmarkStart w:id="45" w:name="ref-mcardle2019"/>
     <w:p>
       <w:pPr>
         <w:pStyle w:val="Bibliography"/>
@@ -8525,8 +11116,8 @@
         <w:t xml:space="preserve">122: 180501.</w:t>
       </w:r>
     </w:p>
-    <w:bookmarkEnd w:id="43"/>
-    <w:bookmarkStart w:id="45" w:name="ref-monteverde2026qang"/>
+    <w:bookmarkEnd w:id="45"/>
+    <w:bookmarkStart w:id="47" w:name="ref-monteverde2026qang"/>
     <w:p>
       <w:pPr>
         <w:pStyle w:val="Bibliography"/>
@@ -8579,7 +11170,7 @@
         </w:rPr>
         <w:t xml:space="preserve"> </w:t>
       </w:r>
-      <w:hyperlink r:id="rId44">
+      <w:hyperlink r:id="rId46">
         <w:r>
           <w:rPr>
             <w:rStyle w:val="Hyperlink"/>
@@ -8594,8 +11185,8 @@
         <w:t xml:space="preserve">.</w:t>
       </w:r>
     </w:p>
-    <w:bookmarkEnd w:id="45"/>
-    <w:bookmarkStart w:id="47" w:name="ref-monteverde2026witness"/>
+    <w:bookmarkEnd w:id="47"/>
+    <w:bookmarkStart w:id="49" w:name="ref-monteverde2026witness"/>
     <w:p>
       <w:pPr>
         <w:pStyle w:val="Bibliography"/>
@@ -8644,7 +11235,7 @@
         </w:rPr>
         <w:t xml:space="preserve"> </w:t>
       </w:r>
-      <w:hyperlink r:id="rId46">
+      <w:hyperlink r:id="rId48">
         <w:r>
           <w:rPr>
             <w:rStyle w:val="Hyperlink"/>
@@ -8659,8 +11250,8 @@
         <w:t xml:space="preserve">.</w:t>
       </w:r>
     </w:p>
-    <w:bookmarkEnd w:id="47"/>
-    <w:bookmarkStart w:id="49" w:name="ref-wang2022quantumnat"/>
+    <w:bookmarkEnd w:id="49"/>
+    <w:bookmarkStart w:id="51" w:name="ref-wang2022quantumnat"/>
     <w:p>
       <w:pPr>
         <w:pStyle w:val="Bibliography"/>
@@ -8733,7 +11324,7 @@
         </w:rPr>
         <w:t xml:space="preserve"> </w:t>
       </w:r>
-      <w:hyperlink r:id="rId48">
+      <w:hyperlink r:id="rId50">
         <w:r>
           <w:rPr>
             <w:rStyle w:val="Hyperlink"/>
@@ -8748,9 +11339,9 @@
         <w:t xml:space="preserve">.</w:t>
       </w:r>
     </w:p>
-    <w:bookmarkEnd w:id="49"/>
-    <w:bookmarkEnd w:id="50"/>
     <w:bookmarkEnd w:id="51"/>
+    <w:bookmarkEnd w:id="52"/>
+    <w:bookmarkEnd w:id="53"/>
     <w:sectPr/>
   </w:body>
 </w:document>
@@ -8940,6 +11531,9 @@
     <w:abstractNumId w:val="991"/>
   </w:num>
   <w:num w:numId="1002">
+    <w:abstractNumId w:val="991"/>
+  </w:num>
+  <w:num w:numId="1003">
     <w:abstractNumId w:val="991"/>
   </w:num>
 </w:numbering>

</xml_diff>

<commit_message>
Sections 91-93: IonQ Forte-1 simulator on four datasets (N1-N3 pass; deterministic IonQ frequencies), joint fit (J1-J3 fail, routing diagnosis), destructive Leung syndromes (M1-M4 pass); avances notebook to §93; QML note with §90-§91
</commit_message>
<xml_diff>
--- a/manuscript/qang_qml.docx
+++ b/manuscript/qang_qml.docx
@@ -3486,7 +3486,211 @@
         <w:rPr>
           <w:rFonts w:ascii="Times New Roman" w:hAnsi="Times New Roman"/>
         </w:rPr>
-        <w:t xml:space="preserve">readout.</w:t>
+        <w:t xml:space="preserve">readout;</w:t>
+      </w:r>
+      <w:r>
+        <w:rPr>
+          <w:rFonts w:ascii="Times New Roman" w:hAnsi="Times New Roman"/>
+        </w:rPr>
+        <w:t xml:space="preserve"> </w:t>
+      </w:r>
+      <w:r>
+        <w:rPr>
+          <w:rFonts w:ascii="Times New Roman" w:hAnsi="Times New Roman"/>
+        </w:rPr>
+        <w:t xml:space="preserve">with</w:t>
+      </w:r>
+      <w:r>
+        <w:rPr>
+          <w:rFonts w:ascii="Times New Roman" w:hAnsi="Times New Roman"/>
+        </w:rPr>
+        <w:t xml:space="preserve"> </w:t>
+      </w:r>
+      <w:r>
+        <w:rPr>
+          <w:rFonts w:ascii="Times New Roman" w:hAnsi="Times New Roman"/>
+        </w:rPr>
+        <w:t xml:space="preserve">an</w:t>
+      </w:r>
+      <w:r>
+        <w:rPr>
+          <w:rFonts w:ascii="Times New Roman" w:hAnsi="Times New Roman"/>
+        </w:rPr>
+        <w:t xml:space="preserve"> </w:t>
+      </w:r>
+      <w:r>
+        <w:rPr>
+          <w:rFonts w:ascii="Times New Roman" w:hAnsi="Times New Roman"/>
+        </w:rPr>
+        <w:t xml:space="preserve">encoding</w:t>
+      </w:r>
+      <w:r>
+        <w:rPr>
+          <w:rFonts w:ascii="Times New Roman" w:hAnsi="Times New Roman"/>
+        </w:rPr>
+        <w:t xml:space="preserve"> </w:t>
+      </w:r>
+      <w:r>
+        <w:rPr>
+          <w:rFonts w:ascii="Times New Roman" w:hAnsi="Times New Roman"/>
+        </w:rPr>
+        <w:t xml:space="preserve">that</w:t>
+      </w:r>
+      <w:r>
+        <w:rPr>
+          <w:rFonts w:ascii="Times New Roman" w:hAnsi="Times New Roman"/>
+        </w:rPr>
+        <w:t xml:space="preserve"> </w:t>
+      </w:r>
+      <w:r>
+        <w:rPr>
+          <w:rFonts w:ascii="Times New Roman" w:hAnsi="Times New Roman"/>
+        </w:rPr>
+        <w:t xml:space="preserve">fills</w:t>
+      </w:r>
+      <w:r>
+        <w:rPr>
+          <w:rFonts w:ascii="Times New Roman" w:hAnsi="Times New Roman"/>
+        </w:rPr>
+        <w:t xml:space="preserve"> </w:t>
+      </w:r>
+      <w:r>
+        <w:rPr>
+          <w:rFonts w:ascii="Times New Roman" w:hAnsi="Times New Roman"/>
+        </w:rPr>
+        <w:t xml:space="preserve">the</w:t>
+      </w:r>
+      <w:r>
+        <w:rPr>
+          <w:rFonts w:ascii="Times New Roman" w:hAnsi="Times New Roman"/>
+        </w:rPr>
+        <w:t xml:space="preserve"> </w:t>
+      </w:r>
+      <w:r>
+        <w:rPr>
+          <w:rFonts w:ascii="Times New Roman" w:hAnsi="Times New Roman"/>
+        </w:rPr>
+        <w:t xml:space="preserve">whole</w:t>
+      </w:r>
+      <w:r>
+        <w:rPr>
+          <w:rFonts w:ascii="Times New Roman" w:hAnsi="Times New Roman"/>
+        </w:rPr>
+        <w:t xml:space="preserve"> </w:t>
+      </w:r>
+      <w:r>
+        <w:rPr>
+          <w:rFonts w:ascii="Times New Roman" w:hAnsi="Times New Roman"/>
+        </w:rPr>
+        <w:t xml:space="preserve">sector</w:t>
+      </w:r>
+      <w:r>
+        <w:rPr>
+          <w:rFonts w:ascii="Times New Roman" w:hAnsi="Times New Roman"/>
+        </w:rPr>
+        <w:t xml:space="preserve"> </w:t>
+      </w:r>
+      <w:r>
+        <w:rPr>
+          <w:rFonts w:ascii="Times New Roman" w:hAnsi="Times New Roman"/>
+        </w:rPr>
+        <w:t xml:space="preserve">and</w:t>
+      </w:r>
+      <w:r>
+        <w:rPr>
+          <w:rFonts w:ascii="Times New Roman" w:hAnsi="Times New Roman"/>
+        </w:rPr>
+        <w:t xml:space="preserve"> </w:t>
+      </w:r>
+      <w:r>
+        <w:rPr>
+          <w:rFonts w:ascii="Times New Roman" w:hAnsi="Times New Roman"/>
+        </w:rPr>
+        <w:t xml:space="preserve">a</w:t>
+      </w:r>
+      <w:r>
+        <w:rPr>
+          <w:rFonts w:ascii="Times New Roman" w:hAnsi="Times New Roman"/>
+        </w:rPr>
+        <w:t xml:space="preserve"> </w:t>
+      </w:r>
+      <w:r>
+        <w:rPr>
+          <w:rFonts w:ascii="Times New Roman" w:hAnsi="Times New Roman"/>
+        </w:rPr>
+        <w:t xml:space="preserve">full-rank</w:t>
+      </w:r>
+      <w:r>
+        <w:rPr>
+          <w:rFonts w:ascii="Times New Roman" w:hAnsi="Times New Roman"/>
+        </w:rPr>
+        <w:t xml:space="preserve"> </w:t>
+      </w:r>
+      <w:r>
+        <w:rPr>
+          <w:rFonts w:ascii="Times New Roman" w:hAnsi="Times New Roman"/>
+        </w:rPr>
+        <w:t xml:space="preserve">readout,</w:t>
+      </w:r>
+      <w:r>
+        <w:rPr>
+          <w:rFonts w:ascii="Times New Roman" w:hAnsi="Times New Roman"/>
+        </w:rPr>
+        <w:t xml:space="preserve"> </w:t>
+      </w:r>
+      <w:r>
+        <w:rPr>
+          <w:rFonts w:ascii="Times New Roman" w:hAnsi="Times New Roman"/>
+        </w:rPr>
+        <w:t xml:space="preserve">weight 2</w:t>
+      </w:r>
+      <w:r>
+        <w:rPr>
+          <w:rFonts w:ascii="Times New Roman" w:hAnsi="Times New Roman"/>
+        </w:rPr>
+        <w:t xml:space="preserve"> </w:t>
+      </w:r>
+      <w:r>
+        <w:rPr>
+          <w:rFonts w:ascii="Times New Roman" w:hAnsi="Times New Roman"/>
+        </w:rPr>
+        <w:t xml:space="preserve">reaches</w:t>
+      </w:r>
+      <w:r>
+        <w:rPr>
+          <w:rFonts w:ascii="Times New Roman" w:hAnsi="Times New Roman"/>
+        </w:rPr>
+        <w:t xml:space="preserve"> </w:t>
+      </w:r>
+      <w:r>
+        <w:rPr>
+          <w:rFonts w:ascii="Times New Roman" w:hAnsi="Times New Roman"/>
+        </w:rPr>
+        <w:t xml:space="preserve">the</w:t>
+      </w:r>
+      <w:r>
+        <w:rPr>
+          <w:rFonts w:ascii="Times New Roman" w:hAnsi="Times New Roman"/>
+        </w:rPr>
+        <w:t xml:space="preserve"> </w:t>
+      </w:r>
+      <w:r>
+        <w:rPr>
+          <w:rFonts w:ascii="Times New Roman" w:hAnsi="Times New Roman"/>
+        </w:rPr>
+        <w:t xml:space="preserve">weight-1</w:t>
+      </w:r>
+      <w:r>
+        <w:rPr>
+          <w:rFonts w:ascii="Times New Roman" w:hAnsi="Times New Roman"/>
+        </w:rPr>
+        <w:t xml:space="preserve"> </w:t>
+      </w:r>
+      <w:r>
+        <w:rPr>
+          <w:rFonts w:ascii="Times New Roman" w:hAnsi="Times New Roman"/>
+        </w:rPr>
+        <w:t xml:space="preserve">accuracy.</w:t>
       </w:r>
       <w:r>
         <w:rPr>
@@ -3723,7 +3927,7 @@
       </w:r>
       <m:oMath>
         <m:r>
-          <m:t>2.9</m:t>
+          <m:t>2.7</m:t>
         </m:r>
       </m:oMath>
       <w:r>
@@ -3747,7 +3951,295 @@
         <w:rPr>
           <w:rFonts w:ascii="Times New Roman" w:hAnsi="Times New Roman"/>
         </w:rPr>
-        <w:t xml:space="preserve">.</w:t>
+        <w:t xml:space="preserve">;</w:t>
+      </w:r>
+      <w:r>
+        <w:rPr>
+          <w:rFonts w:ascii="Times New Roman" w:hAnsi="Times New Roman"/>
+        </w:rPr>
+        <w:t xml:space="preserve"> </w:t>
+      </w:r>
+      <w:r>
+        <w:rPr>
+          <w:rFonts w:ascii="Times New Roman" w:hAnsi="Times New Roman"/>
+        </w:rPr>
+        <w:t xml:space="preserve">on</w:t>
+      </w:r>
+      <w:r>
+        <w:rPr>
+          <w:rFonts w:ascii="Times New Roman" w:hAnsi="Times New Roman"/>
+        </w:rPr>
+        <w:t xml:space="preserve"> </w:t>
+      </w:r>
+      <w:r>
+        <w:rPr>
+          <w:rFonts w:ascii="Times New Roman" w:hAnsi="Times New Roman"/>
+        </w:rPr>
+        <w:t xml:space="preserve">the</w:t>
+      </w:r>
+      <w:r>
+        <w:rPr>
+          <w:rFonts w:ascii="Times New Roman" w:hAnsi="Times New Roman"/>
+        </w:rPr>
+        <w:t xml:space="preserve"> </w:t>
+      </w:r>
+      <w:r>
+        <w:rPr>
+          <w:rFonts w:ascii="Times New Roman" w:hAnsi="Times New Roman"/>
+        </w:rPr>
+        <w:t xml:space="preserve">IonQ</w:t>
+      </w:r>
+      <w:r>
+        <w:rPr>
+          <w:rFonts w:ascii="Times New Roman" w:hAnsi="Times New Roman"/>
+        </w:rPr>
+        <w:t xml:space="preserve"> </w:t>
+      </w:r>
+      <w:r>
+        <w:rPr>
+          <w:rFonts w:ascii="Times New Roman" w:hAnsi="Times New Roman"/>
+        </w:rPr>
+        <w:t xml:space="preserve">Forte-1</w:t>
+      </w:r>
+      <w:r>
+        <w:rPr>
+          <w:rFonts w:ascii="Times New Roman" w:hAnsi="Times New Roman"/>
+        </w:rPr>
+        <w:t xml:space="preserve"> </w:t>
+      </w:r>
+      <w:r>
+        <w:rPr>
+          <w:rFonts w:ascii="Times New Roman" w:hAnsi="Times New Roman"/>
+        </w:rPr>
+        <w:t xml:space="preserve">noise</w:t>
+      </w:r>
+      <w:r>
+        <w:rPr>
+          <w:rFonts w:ascii="Times New Roman" w:hAnsi="Times New Roman"/>
+        </w:rPr>
+        <w:t xml:space="preserve"> </w:t>
+      </w:r>
+      <w:r>
+        <w:rPr>
+          <w:rFonts w:ascii="Times New Roman" w:hAnsi="Times New Roman"/>
+        </w:rPr>
+        <w:t xml:space="preserve">model</w:t>
+      </w:r>
+      <w:r>
+        <w:rPr>
+          <w:rFonts w:ascii="Times New Roman" w:hAnsi="Times New Roman"/>
+        </w:rPr>
+        <w:t xml:space="preserve"> </w:t>
+      </w:r>
+      <w:r>
+        <w:rPr>
+          <w:rFonts w:ascii="Times New Roman" w:hAnsi="Times New Roman"/>
+        </w:rPr>
+        <w:t xml:space="preserve">over</w:t>
+      </w:r>
+      <w:r>
+        <w:rPr>
+          <w:rFonts w:ascii="Times New Roman" w:hAnsi="Times New Roman"/>
+        </w:rPr>
+        <w:t xml:space="preserve"> </w:t>
+      </w:r>
+      <w:r>
+        <w:rPr>
+          <w:rFonts w:ascii="Times New Roman" w:hAnsi="Times New Roman"/>
+        </w:rPr>
+        <w:t xml:space="preserve">189</w:t>
+      </w:r>
+      <w:r>
+        <w:rPr>
+          <w:rFonts w:ascii="Times New Roman" w:hAnsi="Times New Roman"/>
+        </w:rPr>
+        <w:t xml:space="preserve"> </w:t>
+      </w:r>
+      <w:r>
+        <w:rPr>
+          <w:rFonts w:ascii="Times New Roman" w:hAnsi="Times New Roman"/>
+        </w:rPr>
+        <w:t xml:space="preserve">inputs</w:t>
+      </w:r>
+      <w:r>
+        <w:rPr>
+          <w:rFonts w:ascii="Times New Roman" w:hAnsi="Times New Roman"/>
+        </w:rPr>
+        <w:t xml:space="preserve"> </w:t>
+      </w:r>
+      <w:r>
+        <w:rPr>
+          <w:rFonts w:ascii="Times New Roman" w:hAnsi="Times New Roman"/>
+        </w:rPr>
+        <w:t xml:space="preserve">of</w:t>
+      </w:r>
+      <w:r>
+        <w:rPr>
+          <w:rFonts w:ascii="Times New Roman" w:hAnsi="Times New Roman"/>
+        </w:rPr>
+        <w:t xml:space="preserve"> </w:t>
+      </w:r>
+      <w:r>
+        <w:rPr>
+          <w:rFonts w:ascii="Times New Roman" w:hAnsi="Times New Roman"/>
+        </w:rPr>
+        <w:t xml:space="preserve">four</w:t>
+      </w:r>
+      <w:r>
+        <w:rPr>
+          <w:rFonts w:ascii="Times New Roman" w:hAnsi="Times New Roman"/>
+        </w:rPr>
+        <w:t xml:space="preserve"> </w:t>
+      </w:r>
+      <w:r>
+        <w:rPr>
+          <w:rFonts w:ascii="Times New Roman" w:hAnsi="Times New Roman"/>
+        </w:rPr>
+        <w:t xml:space="preserve">datasets</w:t>
+      </w:r>
+      <w:r>
+        <w:rPr>
+          <w:rFonts w:ascii="Times New Roman" w:hAnsi="Times New Roman"/>
+        </w:rPr>
+        <w:t xml:space="preserve"> </w:t>
+      </w:r>
+      <w:r>
+        <w:rPr>
+          <w:rFonts w:ascii="Times New Roman" w:hAnsi="Times New Roman"/>
+        </w:rPr>
+        <w:t xml:space="preserve">the</w:t>
+      </w:r>
+      <w:r>
+        <w:rPr>
+          <w:rFonts w:ascii="Times New Roman" w:hAnsi="Times New Roman"/>
+        </w:rPr>
+        <w:t xml:space="preserve"> </w:t>
+      </w:r>
+      <w:r>
+        <w:rPr>
+          <w:rFonts w:ascii="Times New Roman" w:hAnsi="Times New Roman"/>
+        </w:rPr>
+        <w:t xml:space="preserve">filtered</w:t>
+      </w:r>
+      <w:r>
+        <w:rPr>
+          <w:rFonts w:ascii="Times New Roman" w:hAnsi="Times New Roman"/>
+        </w:rPr>
+        <w:t xml:space="preserve"> </w:t>
+      </w:r>
+      <w:r>
+        <w:rPr>
+          <w:rFonts w:ascii="Times New Roman" w:hAnsi="Times New Roman"/>
+        </w:rPr>
+        <w:t xml:space="preserve">model</w:t>
+      </w:r>
+      <w:r>
+        <w:rPr>
+          <w:rFonts w:ascii="Times New Roman" w:hAnsi="Times New Roman"/>
+        </w:rPr>
+        <w:t xml:space="preserve"> </w:t>
+      </w:r>
+      <w:r>
+        <w:rPr>
+          <w:rFonts w:ascii="Times New Roman" w:hAnsi="Times New Roman"/>
+        </w:rPr>
+        <w:t xml:space="preserve">is</w:t>
+      </w:r>
+      <w:r>
+        <w:rPr>
+          <w:rFonts w:ascii="Times New Roman" w:hAnsi="Times New Roman"/>
+        </w:rPr>
+        <w:t xml:space="preserve"> </w:t>
+      </w:r>
+      <w:r>
+        <w:rPr>
+          <w:rFonts w:ascii="Times New Roman" w:hAnsi="Times New Roman"/>
+        </w:rPr>
+        <w:t xml:space="preserve">1.1</w:t>
+      </w:r>
+      <w:r>
+        <w:rPr>
+          <w:rFonts w:ascii="Times New Roman" w:hAnsi="Times New Roman"/>
+        </w:rPr>
+        <w:t xml:space="preserve"> </w:t>
+      </w:r>
+      <w:r>
+        <w:rPr>
+          <w:rFonts w:ascii="Times New Roman" w:hAnsi="Times New Roman"/>
+        </w:rPr>
+        <w:t xml:space="preserve">points</w:t>
+      </w:r>
+      <w:r>
+        <w:rPr>
+          <w:rFonts w:ascii="Times New Roman" w:hAnsi="Times New Roman"/>
+        </w:rPr>
+        <w:t xml:space="preserve"> </w:t>
+      </w:r>
+      <w:r>
+        <w:rPr>
+          <w:rFonts w:ascii="Times New Roman" w:hAnsi="Times New Roman"/>
+        </w:rPr>
+        <w:t xml:space="preserve">more</w:t>
+      </w:r>
+      <w:r>
+        <w:rPr>
+          <w:rFonts w:ascii="Times New Roman" w:hAnsi="Times New Roman"/>
+        </w:rPr>
+        <w:t xml:space="preserve"> </w:t>
+      </w:r>
+      <w:r>
+        <w:rPr>
+          <w:rFonts w:ascii="Times New Roman" w:hAnsi="Times New Roman"/>
+        </w:rPr>
+        <w:t xml:space="preserve">accurate</w:t>
+      </w:r>
+      <w:r>
+        <w:rPr>
+          <w:rFonts w:ascii="Times New Roman" w:hAnsi="Times New Roman"/>
+        </w:rPr>
+        <w:t xml:space="preserve"> </w:t>
+      </w:r>
+      <w:r>
+        <w:rPr>
+          <w:rFonts w:ascii="Times New Roman" w:hAnsi="Times New Roman"/>
+        </w:rPr>
+        <w:t xml:space="preserve">than</w:t>
+      </w:r>
+      <w:r>
+        <w:rPr>
+          <w:rFonts w:ascii="Times New Roman" w:hAnsi="Times New Roman"/>
+        </w:rPr>
+        <w:t xml:space="preserve"> </w:t>
+      </w:r>
+      <w:r>
+        <w:rPr>
+          <w:rFonts w:ascii="Times New Roman" w:hAnsi="Times New Roman"/>
+        </w:rPr>
+        <w:t xml:space="preserve">the</w:t>
+      </w:r>
+      <w:r>
+        <w:rPr>
+          <w:rFonts w:ascii="Times New Roman" w:hAnsi="Times New Roman"/>
+        </w:rPr>
+        <w:t xml:space="preserve"> </w:t>
+      </w:r>
+      <w:r>
+        <w:rPr>
+          <w:rFonts w:ascii="Times New Roman" w:hAnsi="Times New Roman"/>
+        </w:rPr>
+        <w:t xml:space="preserve">raw</w:t>
+      </w:r>
+      <w:r>
+        <w:rPr>
+          <w:rFonts w:ascii="Times New Roman" w:hAnsi="Times New Roman"/>
+        </w:rPr>
+        <w:t xml:space="preserve"> </w:t>
+      </w:r>
+      <w:r>
+        <w:rPr>
+          <w:rFonts w:ascii="Times New Roman" w:hAnsi="Times New Roman"/>
+        </w:rPr>
+        <w:t xml:space="preserve">one.</w:t>
       </w:r>
       <w:r>
         <w:rPr>
@@ -4204,7 +4696,7 @@
         <w:rPr>
           <w:rFonts w:ascii="Times New Roman" w:hAnsi="Times New Roman"/>
         </w:rPr>
-        <w:t xml:space="preserve">0.6.0,</w:t>
+        <w:t xml:space="preserve">0.6.2,</w:t>
       </w:r>
       <w:r>
         <w:rPr>
@@ -4572,19 +5064,19 @@
         <w:rPr>
           <w:rFonts w:ascii="Times New Roman" w:hAnsi="Times New Roman"/>
         </w:rPr>
-        <w:t xml:space="preserve">predictions of every study were committed to the repository before the run that tested them. Of 44</w:t>
-      </w:r>
-      <w:r>
-        <w:rPr>
-          <w:rFonts w:ascii="Times New Roman" w:hAnsi="Times New Roman"/>
-        </w:rPr>
-        <w:t xml:space="preserve"> </w:t>
-      </w:r>
-      <w:r>
-        <w:rPr>
-          <w:rFonts w:ascii="Times New Roman" w:hAnsi="Times New Roman"/>
-        </w:rPr>
-        <w:t xml:space="preserve">pre-registered predictions in the studies summarized here, 33 passed and 11 failed; the failures are</w:t>
+        <w:t xml:space="preserve">predictions of every study were committed to the repository before the run that tested them. Of 52</w:t>
+      </w:r>
+      <w:r>
+        <w:rPr>
+          <w:rFonts w:ascii="Times New Roman" w:hAnsi="Times New Roman"/>
+        </w:rPr>
+        <w:t xml:space="preserve"> </w:t>
+      </w:r>
+      <w:r>
+        <w:rPr>
+          <w:rFonts w:ascii="Times New Roman" w:hAnsi="Times New Roman"/>
+        </w:rPr>
+        <w:t xml:space="preserve">pre-registered predictions in the studies summarized here, 40 passed and 12 failed; the failures are</w:t>
       </w:r>
       <w:r>
         <w:rPr>
@@ -7240,7 +7732,54 @@
         <w:rPr>
           <w:rFonts w:ascii="Times New Roman" w:hAnsi="Times New Roman"/>
         </w:rPr>
-        <w:t xml:space="preserve">weight 1, and the pair-product encoding had a lower information ceiling than the unary one.</w:t>
+        <w:t xml:space="preserve">weight 1, the pair-product encoding had a lower information ceiling than the unary one, and filling the whole</w:t>
+      </w:r>
+      <w:r>
+        <w:rPr>
+          <w:rFonts w:ascii="Times New Roman" w:hAnsi="Times New Roman"/>
+        </w:rPr>
+        <w:t xml:space="preserve"> </w:t>
+      </w:r>
+      <w:r>
+        <w:rPr>
+          <w:rFonts w:ascii="Times New Roman" w:hAnsi="Times New Roman"/>
+        </w:rPr>
+        <w:t xml:space="preserve">weight-2 sector did not help with the</w:t>
+      </w:r>
+      <w:r>
+        <w:rPr>
+          <w:rFonts w:ascii="Times New Roman" w:hAnsi="Times New Roman"/>
+        </w:rPr>
+        <w:t xml:space="preserve"> </w:t>
+      </w:r>
+      <m:oMath>
+        <m:r>
+          <m:t>q</m:t>
+        </m:r>
+        <m:sSub>
+          <m:e>
+            <m:r>
+              <m:t>g</m:t>
+            </m:r>
+          </m:e>
+          <m:sub>
+            <m:r>
+              <m:t>Z</m:t>
+            </m:r>
+          </m:sub>
+        </m:sSub>
+      </m:oMath>
+      <w:r>
+        <w:rPr>
+          <w:rFonts w:ascii="Times New Roman" w:hAnsi="Times New Roman"/>
+        </w:rPr>
+        <w:t xml:space="preserve"> </w:t>
+      </w:r>
+      <w:r>
+        <w:rPr>
+          <w:rFonts w:ascii="Times New Roman" w:hAnsi="Times New Roman"/>
+        </w:rPr>
+        <w:t xml:space="preserve">readout.</w:t>
       </w:r>
     </w:p>
     <w:bookmarkEnd w:id="29"/>
@@ -9322,7 +9861,355 @@
         <w:rPr>
           <w:rFonts w:ascii="Times New Roman" w:hAnsi="Times New Roman"/>
         </w:rPr>
-        <w:t xml:space="preserve">points.</w:t>
+        <w:t xml:space="preserve">points. A</w:t>
+      </w:r>
+      <w:r>
+        <w:rPr>
+          <w:rFonts w:ascii="Times New Roman" w:hAnsi="Times New Roman"/>
+        </w:rPr>
+        <w:t xml:space="preserve"> </w:t>
+      </w:r>
+      <w:r>
+        <w:rPr>
+          <w:rFonts w:ascii="Times New Roman" w:hAnsi="Times New Roman"/>
+        </w:rPr>
+        <w:t xml:space="preserve">“</w:t>
+      </w:r>
+      <w:r>
+        <w:rPr>
+          <w:rFonts w:ascii="Times New Roman" w:hAnsi="Times New Roman"/>
+        </w:rPr>
+        <w:t xml:space="preserve">dual</w:t>
+      </w:r>
+      <w:r>
+        <w:rPr>
+          <w:rFonts w:ascii="Times New Roman" w:hAnsi="Times New Roman"/>
+        </w:rPr>
+        <w:t xml:space="preserve">”</w:t>
+      </w:r>
+      <w:r>
+        <w:rPr>
+          <w:rFonts w:ascii="Times New Roman" w:hAnsi="Times New Roman"/>
+        </w:rPr>
+        <w:t xml:space="preserve"> </w:t>
+      </w:r>
+      <w:r>
+        <w:rPr>
+          <w:rFonts w:ascii="Times New Roman" w:hAnsi="Times New Roman"/>
+        </w:rPr>
+        <w:t xml:space="preserve">encoding fills all ten weight-2 states without distortion (</w:t>
+      </w:r>
+      <m:oMath>
+        <m:r>
+          <m:t>v</m:t>
+        </m:r>
+      </m:oMath>
+      <w:r>
+        <w:rPr>
+          <w:rFonts w:ascii="Times New Roman" w:hAnsi="Times New Roman"/>
+        </w:rPr>
+        <w:t xml:space="preserve"> </w:t>
+      </w:r>
+      <w:r>
+        <w:rPr>
+          <w:rFonts w:ascii="Times New Roman" w:hAnsi="Times New Roman"/>
+        </w:rPr>
+        <w:t xml:space="preserve">on the ring,</w:t>
+      </w:r>
+      <w:r>
+        <w:rPr>
+          <w:rFonts w:ascii="Times New Roman" w:hAnsi="Times New Roman"/>
+        </w:rPr>
+        <w:t xml:space="preserve"> </w:t>
+      </w:r>
+      <m:oMath>
+        <m:d>
+          <m:dPr>
+            <m:begChr m:val="("/>
+            <m:endChr m:val=")"/>
+            <m:sepChr m:val=""/>
+            <m:grow/>
+          </m:dPr>
+          <m:e>
+            <m:sSup>
+              <m:e>
+                <m:r>
+                  <m:t>x</m:t>
+                </m:r>
+              </m:e>
+              <m:sup>
+                <m:r>
+                  <m:t>2</m:t>
+                </m:r>
+              </m:sup>
+            </m:sSup>
+            <m:r>
+              <m:rPr>
+                <m:sty m:val="p"/>
+              </m:rPr>
+              <m:t>,</m:t>
+            </m:r>
+            <m:r>
+              <m:t>1</m:t>
+            </m:r>
+          </m:e>
+        </m:d>
+        <m:r>
+          <m:rPr>
+            <m:sty m:val="p"/>
+          </m:rPr>
+          <m:t>/</m:t>
+        </m:r>
+        <m:r>
+          <m:rPr>
+            <m:sty m:val="p"/>
+          </m:rPr>
+          <m:t>∥</m:t>
+        </m:r>
+        <m:d>
+          <m:dPr>
+            <m:begChr m:val="("/>
+            <m:endChr m:val=")"/>
+            <m:sepChr m:val=""/>
+            <m:grow/>
+          </m:dPr>
+          <m:e>
+            <m:sSup>
+              <m:e>
+                <m:r>
+                  <m:t>x</m:t>
+                </m:r>
+              </m:e>
+              <m:sup>
+                <m:r>
+                  <m:t>2</m:t>
+                </m:r>
+              </m:sup>
+            </m:sSup>
+            <m:r>
+              <m:rPr>
+                <m:sty m:val="p"/>
+              </m:rPr>
+              <m:t>,</m:t>
+            </m:r>
+            <m:r>
+              <m:t>1</m:t>
+            </m:r>
+          </m:e>
+        </m:d>
+        <m:r>
+          <m:rPr>
+            <m:sty m:val="p"/>
+          </m:rPr>
+          <m:t>∥</m:t>
+        </m:r>
+      </m:oMath>
+      <w:r>
+        <w:rPr>
+          <w:rFonts w:ascii="Times New Roman" w:hAnsi="Times New Roman"/>
+        </w:rPr>
+        <w:t xml:space="preserve"> </w:t>
+      </w:r>
+      <w:r>
+        <w:rPr>
+          <w:rFonts w:ascii="Times New Roman" w:hAnsi="Times New Roman"/>
+        </w:rPr>
+        <w:t xml:space="preserve">on the</w:t>
+      </w:r>
+      <w:r>
+        <w:rPr>
+          <w:rFonts w:ascii="Times New Roman" w:hAnsi="Times New Roman"/>
+        </w:rPr>
+        <w:t xml:space="preserve"> </w:t>
+      </w:r>
+      <w:r>
+        <w:rPr>
+          <w:rFonts w:ascii="Times New Roman" w:hAnsi="Times New Roman"/>
+        </w:rPr>
+        <w:t xml:space="preserve">chords</w:t>
+      </w:r>
+      <w:r>
+        <w:rPr>
+          <w:rFonts w:ascii="Times New Roman" w:hAnsi="Times New Roman"/>
+        </w:rPr>
+        <w:t xml:space="preserve"> </w:t>
+      </w:r>
+      <m:oMath>
+        <m:d>
+          <m:dPr>
+            <m:begChr m:val="("/>
+            <m:endChr m:val=")"/>
+            <m:sepChr m:val=""/>
+            <m:grow/>
+          </m:dPr>
+          <m:e>
+            <m:r>
+              <m:t>k</m:t>
+            </m:r>
+            <m:r>
+              <m:rPr>
+                <m:sty m:val="p"/>
+              </m:rPr>
+              <m:t>,</m:t>
+            </m:r>
+            <m:r>
+              <m:t>k</m:t>
+            </m:r>
+            <m:r>
+              <m:rPr>
+                <m:sty m:val="p"/>
+              </m:rPr>
+              <m:t>+</m:t>
+            </m:r>
+            <m:r>
+              <m:t>2</m:t>
+            </m:r>
+          </m:e>
+        </m:d>
+      </m:oMath>
+      <w:r>
+        <w:rPr>
+          <w:rFonts w:ascii="Times New Roman" w:hAnsi="Times New Roman"/>
+        </w:rPr>
+        <w:t xml:space="preserve">). With the</w:t>
+      </w:r>
+      <w:r>
+        <w:rPr>
+          <w:rFonts w:ascii="Times New Roman" w:hAnsi="Times New Roman"/>
+        </w:rPr>
+        <w:t xml:space="preserve"> </w:t>
+      </w:r>
+      <m:oMath>
+        <m:r>
+          <m:t>q</m:t>
+        </m:r>
+        <m:sSub>
+          <m:e>
+            <m:r>
+              <m:t>g</m:t>
+            </m:r>
+          </m:e>
+          <m:sub>
+            <m:r>
+              <m:t>Z</m:t>
+            </m:r>
+          </m:sub>
+        </m:sSub>
+      </m:oMath>
+      <w:r>
+        <w:rPr>
+          <w:rFonts w:ascii="Times New Roman" w:hAnsi="Times New Roman"/>
+        </w:rPr>
+        <w:t xml:space="preserve"> </w:t>
+      </w:r>
+      <w:r>
+        <w:rPr>
+          <w:rFonts w:ascii="Times New Roman" w:hAnsi="Times New Roman"/>
+        </w:rPr>
+        <w:t xml:space="preserve">readout it does not help (</w:t>
+      </w:r>
+      <m:oMath>
+        <m:r>
+          <m:rPr>
+            <m:sty m:val="p"/>
+          </m:rPr>
+          <m:t>−</m:t>
+        </m:r>
+        <m:r>
+          <m:t>0.2</m:t>
+        </m:r>
+      </m:oMath>
+      <w:r>
+        <w:rPr>
+          <w:rFonts w:ascii="Times New Roman" w:hAnsi="Times New Roman"/>
+        </w:rPr>
+        <w:t xml:space="preserve"> </w:t>
+      </w:r>
+      <w:r>
+        <w:rPr>
+          <w:rFonts w:ascii="Times New Roman" w:hAnsi="Times New Roman"/>
+        </w:rPr>
+        <w:t xml:space="preserve">points against the ring), but with the</w:t>
+      </w:r>
+      <w:r>
+        <w:rPr>
+          <w:rFonts w:ascii="Times New Roman" w:hAnsi="Times New Roman"/>
+        </w:rPr>
+        <w:t xml:space="preserve"> </w:t>
+      </w:r>
+      <w:r>
+        <w:rPr>
+          <w:rFonts w:ascii="Times New Roman" w:hAnsi="Times New Roman"/>
+        </w:rPr>
+        <w:t xml:space="preserve">full-rank</w:t>
+      </w:r>
+      <w:r>
+        <w:rPr>
+          <w:rFonts w:ascii="Times New Roman" w:hAnsi="Times New Roman"/>
+        </w:rPr>
+        <w:t xml:space="preserve"> </w:t>
+      </w:r>
+      <m:oMath>
+        <m:r>
+          <m:rPr>
+            <m:sty m:val="p"/>
+          </m:rPr>
+          <m:t>⟨</m:t>
+        </m:r>
+        <m:sSub>
+          <m:e>
+            <m:r>
+              <m:t>Z</m:t>
+            </m:r>
+          </m:e>
+          <m:sub>
+            <m:r>
+              <m:t>i</m:t>
+            </m:r>
+          </m:sub>
+        </m:sSub>
+        <m:sSub>
+          <m:e>
+            <m:r>
+              <m:t>Z</m:t>
+            </m:r>
+          </m:e>
+          <m:sub>
+            <m:r>
+              <m:t>j</m:t>
+            </m:r>
+          </m:sub>
+        </m:sSub>
+        <m:r>
+          <m:rPr>
+            <m:sty m:val="p"/>
+          </m:rPr>
+          <m:t>⟩</m:t>
+        </m:r>
+      </m:oMath>
+      <w:r>
+        <w:rPr>
+          <w:rFonts w:ascii="Times New Roman" w:hAnsi="Times New Roman"/>
+        </w:rPr>
+        <w:t xml:space="preserve"> </w:t>
+      </w:r>
+      <w:r>
+        <w:rPr>
+          <w:rFonts w:ascii="Times New Roman" w:hAnsi="Times New Roman"/>
+        </w:rPr>
+        <w:t xml:space="preserve">readout the weight-2 model reaches the weight-1 accuracy (0.947 against</w:t>
+      </w:r>
+      <w:r>
+        <w:rPr>
+          <w:rFonts w:ascii="Times New Roman" w:hAnsi="Times New Roman"/>
+        </w:rPr>
+        <w:t xml:space="preserve"> </w:t>
+      </w:r>
+      <w:r>
+        <w:rPr>
+          <w:rFonts w:ascii="Times New Roman" w:hAnsi="Times New Roman"/>
+        </w:rPr>
+        <w:t xml:space="preserve">0.947 over 60 runs). Weight 2 needed both a faithful encoding and a readout that sees the whole sector.</w:t>
       </w:r>
     </w:p>
     <w:p>
@@ -9929,7 +10816,7 @@
         <w:rPr>
           <w:rFonts w:ascii="Times New Roman" w:hAnsi="Times New Roman"/>
         </w:rPr>
-        <w:t xml:space="preserve">fell from 0.138–0.206 without the filter to 0.040–0.072 with it (</w:t>
+        <w:t xml:space="preserve">fell from 0.138–0.207 without the filter to 0.040–0.069 with it (</w:t>
       </w:r>
       <m:oMath>
         <m:r>
@@ -9969,19 +10856,115 @@
         <w:rPr>
           <w:rFonts w:ascii="Times New Roman" w:hAnsi="Times New Roman"/>
         </w:rPr>
-        <w:t xml:space="preserve">keeping 69–74% of the shots. These are noise models, not devices; the hardware runs are prepared, with</w:t>
-      </w:r>
-      <w:r>
-        <w:rPr>
-          <w:rFonts w:ascii="Times New Roman" w:hAnsi="Times New Roman"/>
-        </w:rPr>
-        <w:t xml:space="preserve"> </w:t>
-      </w:r>
-      <w:r>
-        <w:rPr>
-          <w:rFonts w:ascii="Times New Roman" w:hAnsi="Times New Roman"/>
-        </w:rPr>
-        <w:t xml:space="preserve">cost confirmations, and pending.</w:t>
+        <w:t xml:space="preserve">keeping 69–74% of the shots. On the IonQ Forte-1 noise model the same pipeline was run on all four datasets (189 test inputs). The</w:t>
+      </w:r>
+      <w:r>
+        <w:rPr>
+          <w:rFonts w:ascii="Times New Roman" w:hAnsi="Times New Roman"/>
+        </w:rPr>
+        <w:t xml:space="preserve"> </w:t>
+      </w:r>
+      <w:r>
+        <w:rPr>
+          <w:rFonts w:ascii="Times New Roman" w:hAnsi="Times New Roman"/>
+        </w:rPr>
+        <w:t xml:space="preserve">pooled accuracy was 0.968 with the filter, 0.958 without and 0.979 noiseless, and the</w:t>
+      </w:r>
+      <w:r>
+        <w:rPr>
+          <w:rFonts w:ascii="Times New Roman" w:hAnsi="Times New Roman"/>
+        </w:rPr>
+        <w:t xml:space="preserve"> </w:t>
+      </w:r>
+      <m:oMath>
+        <m:r>
+          <m:t>q</m:t>
+        </m:r>
+        <m:sSub>
+          <m:e>
+            <m:r>
+              <m:t>g</m:t>
+            </m:r>
+          </m:e>
+          <m:sub>
+            <m:r>
+              <m:t>Z</m:t>
+            </m:r>
+          </m:sub>
+        </m:sSub>
+      </m:oMath>
+      <w:r>
+        <w:rPr>
+          <w:rFonts w:ascii="Times New Roman" w:hAnsi="Times New Roman"/>
+        </w:rPr>
+        <w:t xml:space="preserve"> </w:t>
+      </w:r>
+      <w:r>
+        <w:rPr>
+          <w:rFonts w:ascii="Times New Roman" w:hAnsi="Times New Roman"/>
+        </w:rPr>
+        <w:t xml:space="preserve">error was 2.7–2.9</w:t>
+      </w:r>
+      <w:r>
+        <w:rPr>
+          <w:rFonts w:ascii="Times New Roman" w:hAnsi="Times New Roman"/>
+        </w:rPr>
+        <w:t xml:space="preserve"> </w:t>
+      </w:r>
+      <w:r>
+        <w:rPr>
+          <w:rFonts w:ascii="Times New Roman" w:hAnsi="Times New Roman"/>
+        </w:rPr>
+        <w:t xml:space="preserve">times smaller with the filter on every dataset. (IonQ results use the measured frequencies returned by the</w:t>
+      </w:r>
+      <w:r>
+        <w:rPr>
+          <w:rFonts w:ascii="Times New Roman" w:hAnsi="Times New Roman"/>
+        </w:rPr>
+        <w:t xml:space="preserve"> </w:t>
+      </w:r>
+      <w:r>
+        <w:rPr>
+          <w:rFonts w:ascii="Times New Roman" w:hAnsi="Times New Roman"/>
+        </w:rPr>
+        <w:t xml:space="preserve">API; qiskit-ionq’s</w:t>
+      </w:r>
+      <w:r>
+        <w:rPr>
+          <w:rFonts w:ascii="Times New Roman" w:hAnsi="Times New Roman"/>
+        </w:rPr>
+        <w:t xml:space="preserve"> </w:t>
+      </w:r>
+      <w:r>
+        <w:rPr>
+          <w:rStyle w:val="VerbatimChar"/>
+          <w:rFonts w:ascii="Times New Roman" w:hAnsi="Times New Roman"/>
+        </w:rPr>
+        <w:t xml:space="preserve">get_counts</w:t>
+      </w:r>
+      <w:r>
+        <w:rPr>
+          <w:rFonts w:ascii="Times New Roman" w:hAnsi="Times New Roman"/>
+        </w:rPr>
+        <w:t xml:space="preserve"> </w:t>
+      </w:r>
+      <w:r>
+        <w:rPr>
+          <w:rFonts w:ascii="Times New Roman" w:hAnsi="Times New Roman"/>
+        </w:rPr>
+        <w:t xml:space="preserve">resamples them on each call.) These are noise models, not devices; the</w:t>
+      </w:r>
+      <w:r>
+        <w:rPr>
+          <w:rFonts w:ascii="Times New Roman" w:hAnsi="Times New Roman"/>
+        </w:rPr>
+        <w:t xml:space="preserve"> </w:t>
+      </w:r>
+      <w:r>
+        <w:rPr>
+          <w:rFonts w:ascii="Times New Roman" w:hAnsi="Times New Roman"/>
+        </w:rPr>
+        <w:t xml:space="preserve">hardware runs are prepared, with cost confirmations, and pending.</w:t>
       </w:r>
     </w:p>
     <w:bookmarkEnd w:id="36"/>
@@ -10289,7 +11272,7 @@
         <w:rPr>
           <w:rFonts w:ascii="Times New Roman" w:hAnsi="Times New Roman"/>
         </w:rPr>
-        <w:t xml:space="preserve">ring encoding uses only five of the ten weight-2 states, so a better use of the larger sector is still open. No quantum advantage is claimed: these networks are classically</w:t>
+        <w:t xml:space="preserve">weight-2 model reaches but does not exceed the weight-1 accuracy on these datasets. No quantum advantage is claimed: these networks are classically</w:t>
       </w:r>
       <w:r>
         <w:rPr>
@@ -10376,7 +11359,7 @@
         <w:rPr>
           <w:rFonts w:ascii="Times New Roman" w:hAnsi="Times New Roman"/>
         </w:rPr>
-        <w:t xml:space="preserve">0.6.0 (</w:t>
+        <w:t xml:space="preserve">0.6.2 (</w:t>
       </w:r>
       <w:r>
         <w:rPr>
@@ -10477,6 +11460,25 @@
         <w:rPr>
           <w:rFonts w:ascii="Times New Roman" w:hAnsi="Times New Roman"/>
         </w:rPr>
+        <w:t xml:space="preserve">,</w:t>
+      </w:r>
+      <w:r>
+        <w:rPr>
+          <w:rFonts w:ascii="Times New Roman" w:hAnsi="Times New Roman"/>
+        </w:rPr>
+        <w:t xml:space="preserve"> </w:t>
+      </w:r>
+      <w:r>
+        <w:rPr>
+          <w:rStyle w:val="VerbatimChar"/>
+          <w:rFonts w:ascii="Times New Roman" w:hAnsi="Times New Roman"/>
+        </w:rPr>
+        <w:t xml:space="preserve">"ring"</w:t>
+      </w:r>
+      <w:r>
+        <w:rPr>
+          <w:rFonts w:ascii="Times New Roman" w:hAnsi="Times New Roman"/>
+        </w:rPr>
         <w:t xml:space="preserve"> </w:t>
       </w:r>
       <w:r>
@@ -10496,7 +11498,7 @@
           <w:rStyle w:val="VerbatimChar"/>
           <w:rFonts w:ascii="Times New Roman" w:hAnsi="Times New Roman"/>
         </w:rPr>
-        <w:t xml:space="preserve">"ring"</w:t>
+        <w:t xml:space="preserve">"dual"</w:t>
       </w:r>
       <w:r>
         <w:rPr>
@@ -10596,7 +11598,7 @@
         <w:rPr>
           <w:rFonts w:ascii="Times New Roman" w:hAnsi="Times New Roman"/>
         </w:rPr>
-        <w:t xml:space="preserve">and RESEARCH_NOTES §75–§82, §85 and §87, with tests in</w:t>
+        <w:t xml:space="preserve">and RESEARCH_NOTES §75–§82, §85, §87, §90 and §91, with tests in</w:t>
       </w:r>
       <w:r>
         <w:rPr>

</xml_diff>

<commit_message>
qang 0.6.5: findings of section 95 (two-channel readout: the §81 effect does not replicate with the dual encoding; B4 passes, B1-B3 fail), QML note updated with §94-§98, README results and test count 1237
</commit_message>
<xml_diff>
--- a/manuscript/qang_qml.docx
+++ b/manuscript/qang_qml.docx
@@ -4251,6 +4251,827 @@
         <w:rPr>
           <w:rFonts w:ascii="Times New Roman" w:hAnsi="Times New Roman"/>
         </w:rPr>
+        <w:t xml:space="preserve">With</w:t>
+      </w:r>
+      <w:r>
+        <w:rPr>
+          <w:rFonts w:ascii="Times New Roman" w:hAnsi="Times New Roman"/>
+        </w:rPr>
+        <w:t xml:space="preserve"> </w:t>
+      </w:r>
+      <w:r>
+        <w:rPr>
+          <w:rFonts w:ascii="Times New Roman" w:hAnsi="Times New Roman"/>
+        </w:rPr>
+        <w:t xml:space="preserve">a</w:t>
+      </w:r>
+      <w:r>
+        <w:rPr>
+          <w:rFonts w:ascii="Times New Roman" w:hAnsi="Times New Roman"/>
+        </w:rPr>
+        <w:t xml:space="preserve"> </w:t>
+      </w:r>
+      <w:r>
+        <w:rPr>
+          <w:rFonts w:ascii="Times New Roman" w:hAnsi="Times New Roman"/>
+        </w:rPr>
+        <w:t xml:space="preserve">faithful</w:t>
+      </w:r>
+      <w:r>
+        <w:rPr>
+          <w:rFonts w:ascii="Times New Roman" w:hAnsi="Times New Roman"/>
+        </w:rPr>
+        <w:t xml:space="preserve"> </w:t>
+      </w:r>
+      <w:r>
+        <w:rPr>
+          <w:rFonts w:ascii="Times New Roman" w:hAnsi="Times New Roman"/>
+        </w:rPr>
+        <w:t xml:space="preserve">weight-2</w:t>
+      </w:r>
+      <w:r>
+        <w:rPr>
+          <w:rFonts w:ascii="Times New Roman" w:hAnsi="Times New Roman"/>
+        </w:rPr>
+        <w:t xml:space="preserve"> </w:t>
+      </w:r>
+      <w:r>
+        <w:rPr>
+          <w:rFonts w:ascii="Times New Roman" w:hAnsi="Times New Roman"/>
+        </w:rPr>
+        <w:t xml:space="preserve">encoding</w:t>
+      </w:r>
+      <w:r>
+        <w:rPr>
+          <w:rFonts w:ascii="Times New Roman" w:hAnsi="Times New Roman"/>
+        </w:rPr>
+        <w:t xml:space="preserve"> </w:t>
+      </w:r>
+      <w:r>
+        <w:rPr>
+          <w:rFonts w:ascii="Times New Roman" w:hAnsi="Times New Roman"/>
+        </w:rPr>
+        <w:t xml:space="preserve">the</w:t>
+      </w:r>
+      <w:r>
+        <w:rPr>
+          <w:rFonts w:ascii="Times New Roman" w:hAnsi="Times New Roman"/>
+        </w:rPr>
+        <w:t xml:space="preserve"> </w:t>
+      </w:r>
+      <w:r>
+        <w:rPr>
+          <w:rFonts w:ascii="Times New Roman" w:hAnsi="Times New Roman"/>
+        </w:rPr>
+        <w:t xml:space="preserve">advantage</w:t>
+      </w:r>
+      <w:r>
+        <w:rPr>
+          <w:rFonts w:ascii="Times New Roman" w:hAnsi="Times New Roman"/>
+        </w:rPr>
+        <w:t xml:space="preserve"> </w:t>
+      </w:r>
+      <w:r>
+        <w:rPr>
+          <w:rFonts w:ascii="Times New Roman" w:hAnsi="Times New Roman"/>
+        </w:rPr>
+        <w:t xml:space="preserve">of</w:t>
+      </w:r>
+      <w:r>
+        <w:rPr>
+          <w:rFonts w:ascii="Times New Roman" w:hAnsi="Times New Roman"/>
+        </w:rPr>
+        <w:t xml:space="preserve"> </w:t>
+      </w:r>
+      <w:r>
+        <w:rPr>
+          <w:rFonts w:ascii="Times New Roman" w:hAnsi="Times New Roman"/>
+        </w:rPr>
+        <w:t xml:space="preserve">the</w:t>
+      </w:r>
+      <w:r>
+        <w:rPr>
+          <w:rFonts w:ascii="Times New Roman" w:hAnsi="Times New Roman"/>
+        </w:rPr>
+        <w:t xml:space="preserve"> </w:t>
+      </w:r>
+      <w:r>
+        <w:rPr>
+          <w:rFonts w:ascii="Times New Roman" w:hAnsi="Times New Roman"/>
+        </w:rPr>
+        <w:t xml:space="preserve">unfiltered</w:t>
+      </w:r>
+      <w:r>
+        <w:rPr>
+          <w:rFonts w:ascii="Times New Roman" w:hAnsi="Times New Roman"/>
+        </w:rPr>
+        <w:t xml:space="preserve"> </w:t>
+      </w:r>
+      <w:r>
+        <w:rPr>
+          <w:rFonts w:ascii="Times New Roman" w:hAnsi="Times New Roman"/>
+        </w:rPr>
+        <w:t xml:space="preserve">model</w:t>
+      </w:r>
+      <w:r>
+        <w:rPr>
+          <w:rFonts w:ascii="Times New Roman" w:hAnsi="Times New Roman"/>
+        </w:rPr>
+        <w:t xml:space="preserve"> </w:t>
+      </w:r>
+      <w:r>
+        <w:rPr>
+          <w:rFonts w:ascii="Times New Roman" w:hAnsi="Times New Roman"/>
+        </w:rPr>
+        <w:t xml:space="preserve">under</w:t>
+      </w:r>
+      <w:r>
+        <w:rPr>
+          <w:rFonts w:ascii="Times New Roman" w:hAnsi="Times New Roman"/>
+        </w:rPr>
+        <w:t xml:space="preserve"> </w:t>
+      </w:r>
+      <w:r>
+        <w:rPr>
+          <w:rFonts w:ascii="Times New Roman" w:hAnsi="Times New Roman"/>
+        </w:rPr>
+        <w:t xml:space="preserve">noise-aware</w:t>
+      </w:r>
+      <w:r>
+        <w:rPr>
+          <w:rFonts w:ascii="Times New Roman" w:hAnsi="Times New Roman"/>
+        </w:rPr>
+        <w:t xml:space="preserve"> </w:t>
+      </w:r>
+      <w:r>
+        <w:rPr>
+          <w:rFonts w:ascii="Times New Roman" w:hAnsi="Times New Roman"/>
+        </w:rPr>
+        <w:t xml:space="preserve">training</w:t>
+      </w:r>
+      <w:r>
+        <w:rPr>
+          <w:rFonts w:ascii="Times New Roman" w:hAnsi="Times New Roman"/>
+        </w:rPr>
+        <w:t xml:space="preserve"> </w:t>
+      </w:r>
+      <w:r>
+        <w:rPr>
+          <w:rFonts w:ascii="Times New Roman" w:hAnsi="Times New Roman"/>
+        </w:rPr>
+        <w:t xml:space="preserve">disappears,</w:t>
+      </w:r>
+      <w:r>
+        <w:rPr>
+          <w:rFonts w:ascii="Times New Roman" w:hAnsi="Times New Roman"/>
+        </w:rPr>
+        <w:t xml:space="preserve"> </w:t>
+      </w:r>
+      <w:r>
+        <w:rPr>
+          <w:rFonts w:ascii="Times New Roman" w:hAnsi="Times New Roman"/>
+        </w:rPr>
+        <w:t xml:space="preserve">and</w:t>
+      </w:r>
+      <w:r>
+        <w:rPr>
+          <w:rFonts w:ascii="Times New Roman" w:hAnsi="Times New Roman"/>
+        </w:rPr>
+        <w:t xml:space="preserve"> </w:t>
+      </w:r>
+      <w:r>
+        <w:rPr>
+          <w:rFonts w:ascii="Times New Roman" w:hAnsi="Times New Roman"/>
+        </w:rPr>
+        <w:t xml:space="preserve">a</w:t>
+      </w:r>
+      <w:r>
+        <w:rPr>
+          <w:rFonts w:ascii="Times New Roman" w:hAnsi="Times New Roman"/>
+        </w:rPr>
+        <w:t xml:space="preserve"> </w:t>
+      </w:r>
+      <w:r>
+        <w:rPr>
+          <w:rFonts w:ascii="Times New Roman" w:hAnsi="Times New Roman"/>
+        </w:rPr>
+        <w:t xml:space="preserve">classifier</w:t>
+      </w:r>
+      <w:r>
+        <w:rPr>
+          <w:rFonts w:ascii="Times New Roman" w:hAnsi="Times New Roman"/>
+        </w:rPr>
+        <w:t xml:space="preserve"> </w:t>
+      </w:r>
+      <w:r>
+        <w:rPr>
+          <w:rFonts w:ascii="Times New Roman" w:hAnsi="Times New Roman"/>
+        </w:rPr>
+        <w:t xml:space="preserve">given</w:t>
+      </w:r>
+      <w:r>
+        <w:rPr>
+          <w:rFonts w:ascii="Times New Roman" w:hAnsi="Times New Roman"/>
+        </w:rPr>
+        <w:t xml:space="preserve"> </w:t>
+      </w:r>
+      <w:r>
+        <w:rPr>
+          <w:rFonts w:ascii="Times New Roman" w:hAnsi="Times New Roman"/>
+        </w:rPr>
+        <w:t xml:space="preserve">both</w:t>
+      </w:r>
+      <w:r>
+        <w:rPr>
+          <w:rFonts w:ascii="Times New Roman" w:hAnsi="Times New Roman"/>
+        </w:rPr>
+        <w:t xml:space="preserve"> </w:t>
+      </w:r>
+      <w:r>
+        <w:rPr>
+          <w:rFonts w:ascii="Times New Roman" w:hAnsi="Times New Roman"/>
+        </w:rPr>
+        <w:t xml:space="preserve">the</w:t>
+      </w:r>
+      <w:r>
+        <w:rPr>
+          <w:rFonts w:ascii="Times New Roman" w:hAnsi="Times New Roman"/>
+        </w:rPr>
+        <w:t xml:space="preserve"> </w:t>
+      </w:r>
+      <w:r>
+        <w:rPr>
+          <w:rFonts w:ascii="Times New Roman" w:hAnsi="Times New Roman"/>
+        </w:rPr>
+        <w:t xml:space="preserve">filtered</w:t>
+      </w:r>
+      <w:r>
+        <w:rPr>
+          <w:rFonts w:ascii="Times New Roman" w:hAnsi="Times New Roman"/>
+        </w:rPr>
+        <w:t xml:space="preserve"> </w:t>
+      </w:r>
+      <w:r>
+        <w:rPr>
+          <w:rFonts w:ascii="Times New Roman" w:hAnsi="Times New Roman"/>
+        </w:rPr>
+        <w:t xml:space="preserve">and</w:t>
+      </w:r>
+      <w:r>
+        <w:rPr>
+          <w:rFonts w:ascii="Times New Roman" w:hAnsi="Times New Roman"/>
+        </w:rPr>
+        <w:t xml:space="preserve"> </w:t>
+      </w:r>
+      <w:r>
+        <w:rPr>
+          <w:rFonts w:ascii="Times New Roman" w:hAnsi="Times New Roman"/>
+        </w:rPr>
+        <w:t xml:space="preserve">the</w:t>
+      </w:r>
+      <w:r>
+        <w:rPr>
+          <w:rFonts w:ascii="Times New Roman" w:hAnsi="Times New Roman"/>
+        </w:rPr>
+        <w:t xml:space="preserve"> </w:t>
+      </w:r>
+      <w:r>
+        <w:rPr>
+          <w:rFonts w:ascii="Times New Roman" w:hAnsi="Times New Roman"/>
+        </w:rPr>
+        <w:t xml:space="preserve">raw</w:t>
+      </w:r>
+      <w:r>
+        <w:rPr>
+          <w:rFonts w:ascii="Times New Roman" w:hAnsi="Times New Roman"/>
+        </w:rPr>
+        <w:t xml:space="preserve"> </w:t>
+      </w:r>
+      <w:r>
+        <w:rPr>
+          <w:rFonts w:ascii="Times New Roman" w:hAnsi="Times New Roman"/>
+        </w:rPr>
+        <w:t xml:space="preserve">features</w:t>
+      </w:r>
+      <w:r>
+        <w:rPr>
+          <w:rFonts w:ascii="Times New Roman" w:hAnsi="Times New Roman"/>
+        </w:rPr>
+        <w:t xml:space="preserve"> </w:t>
+      </w:r>
+      <w:r>
+        <w:rPr>
+          <w:rFonts w:ascii="Times New Roman" w:hAnsi="Times New Roman"/>
+        </w:rPr>
+        <w:t xml:space="preserve">gains</w:t>
+      </w:r>
+      <w:r>
+        <w:rPr>
+          <w:rFonts w:ascii="Times New Roman" w:hAnsi="Times New Roman"/>
+        </w:rPr>
+        <w:t xml:space="preserve"> </w:t>
+      </w:r>
+      <w:r>
+        <w:rPr>
+          <w:rFonts w:ascii="Times New Roman" w:hAnsi="Times New Roman"/>
+        </w:rPr>
+        <w:t xml:space="preserve">nothing</w:t>
+      </w:r>
+      <w:r>
+        <w:rPr>
+          <w:rFonts w:ascii="Times New Roman" w:hAnsi="Times New Roman"/>
+        </w:rPr>
+        <w:t xml:space="preserve"> </w:t>
+      </w:r>
+      <w:r>
+        <w:rPr>
+          <w:rFonts w:ascii="Times New Roman" w:hAnsi="Times New Roman"/>
+        </w:rPr>
+        <w:t xml:space="preserve">over</w:t>
+      </w:r>
+      <w:r>
+        <w:rPr>
+          <w:rFonts w:ascii="Times New Roman" w:hAnsi="Times New Roman"/>
+        </w:rPr>
+        <w:t xml:space="preserve"> </w:t>
+      </w:r>
+      <w:r>
+        <w:rPr>
+          <w:rFonts w:ascii="Times New Roman" w:hAnsi="Times New Roman"/>
+        </w:rPr>
+        <w:t xml:space="preserve">the</w:t>
+      </w:r>
+      <w:r>
+        <w:rPr>
+          <w:rFonts w:ascii="Times New Roman" w:hAnsi="Times New Roman"/>
+        </w:rPr>
+        <w:t xml:space="preserve"> </w:t>
+      </w:r>
+      <w:r>
+        <w:rPr>
+          <w:rFonts w:ascii="Times New Roman" w:hAnsi="Times New Roman"/>
+        </w:rPr>
+        <w:t xml:space="preserve">filter</w:t>
+      </w:r>
+      <w:r>
+        <w:rPr>
+          <w:rFonts w:ascii="Times New Roman" w:hAnsi="Times New Roman"/>
+        </w:rPr>
+        <w:t xml:space="preserve"> </w:t>
+      </w:r>
+      <w:r>
+        <w:rPr>
+          <w:rFonts w:ascii="Times New Roman" w:hAnsi="Times New Roman"/>
+        </w:rPr>
+        <w:t xml:space="preserve">alone.</w:t>
+      </w:r>
+      <w:r>
+        <w:rPr>
+          <w:rFonts w:ascii="Times New Roman" w:hAnsi="Times New Roman"/>
+        </w:rPr>
+        <w:t xml:space="preserve"> </w:t>
+      </w:r>
+      <w:r>
+        <w:rPr>
+          <w:rFonts w:ascii="Times New Roman" w:hAnsi="Times New Roman"/>
+        </w:rPr>
+        <w:t xml:space="preserve">Over</w:t>
+      </w:r>
+      <w:r>
+        <w:rPr>
+          <w:rFonts w:ascii="Times New Roman" w:hAnsi="Times New Roman"/>
+        </w:rPr>
+        <w:t xml:space="preserve"> </w:t>
+      </w:r>
+      <w:r>
+        <w:rPr>
+          <w:rFonts w:ascii="Times New Roman" w:hAnsi="Times New Roman"/>
+        </w:rPr>
+        <w:t xml:space="preserve">513</w:t>
+      </w:r>
+      <w:r>
+        <w:rPr>
+          <w:rFonts w:ascii="Times New Roman" w:hAnsi="Times New Roman"/>
+        </w:rPr>
+        <w:t xml:space="preserve"> </w:t>
+      </w:r>
+      <w:r>
+        <w:rPr>
+          <w:rFonts w:ascii="Times New Roman" w:hAnsi="Times New Roman"/>
+        </w:rPr>
+        <w:t xml:space="preserve">readout</w:t>
+      </w:r>
+      <w:r>
+        <w:rPr>
+          <w:rFonts w:ascii="Times New Roman" w:hAnsi="Times New Roman"/>
+        </w:rPr>
+        <w:t xml:space="preserve"> </w:t>
+      </w:r>
+      <w:r>
+        <w:rPr>
+          <w:rFonts w:ascii="Times New Roman" w:hAnsi="Times New Roman"/>
+        </w:rPr>
+        <w:t xml:space="preserve">configurations,</w:t>
+      </w:r>
+      <w:r>
+        <w:rPr>
+          <w:rFonts w:ascii="Times New Roman" w:hAnsi="Times New Roman"/>
+        </w:rPr>
+        <w:t xml:space="preserve"> </w:t>
+      </w:r>
+      <w:r>
+        <w:rPr>
+          <w:rFonts w:ascii="Times New Roman" w:hAnsi="Times New Roman"/>
+        </w:rPr>
+        <w:t xml:space="preserve">including</w:t>
+      </w:r>
+      <w:r>
+        <w:rPr>
+          <w:rFonts w:ascii="Times New Roman" w:hAnsi="Times New Roman"/>
+        </w:rPr>
+        <w:t xml:space="preserve"> </w:t>
+      </w:r>
+      <w:r>
+        <w:rPr>
+          <w:rFonts w:ascii="Times New Roman" w:hAnsi="Times New Roman"/>
+        </w:rPr>
+        <w:t xml:space="preserve">kept</w:t>
+      </w:r>
+      <w:r>
+        <w:rPr>
+          <w:rFonts w:ascii="Times New Roman" w:hAnsi="Times New Roman"/>
+        </w:rPr>
+        <w:t xml:space="preserve"> </w:t>
+      </w:r>
+      <w:r>
+        <w:rPr>
+          <w:rFonts w:ascii="Times New Roman" w:hAnsi="Times New Roman"/>
+        </w:rPr>
+        <w:t xml:space="preserve">fractions</w:t>
+      </w:r>
+      <w:r>
+        <w:rPr>
+          <w:rFonts w:ascii="Times New Roman" w:hAnsi="Times New Roman"/>
+        </w:rPr>
+        <w:t xml:space="preserve"> </w:t>
+      </w:r>
+      <w:r>
+        <w:rPr>
+          <w:rFonts w:ascii="Times New Roman" w:hAnsi="Times New Roman"/>
+        </w:rPr>
+        <w:t xml:space="preserve">down</w:t>
+      </w:r>
+      <w:r>
+        <w:rPr>
+          <w:rFonts w:ascii="Times New Roman" w:hAnsi="Times New Roman"/>
+        </w:rPr>
+        <w:t xml:space="preserve"> </w:t>
+      </w:r>
+      <w:r>
+        <w:rPr>
+          <w:rFonts w:ascii="Times New Roman" w:hAnsi="Times New Roman"/>
+        </w:rPr>
+        <w:t xml:space="preserve">to</w:t>
+      </w:r>
+      <w:r>
+        <w:rPr>
+          <w:rFonts w:ascii="Times New Roman" w:hAnsi="Times New Roman"/>
+        </w:rPr>
+        <w:t xml:space="preserve"> </w:t>
+      </w:r>
+      <m:oMath>
+        <m:r>
+          <m:t>2.6</m:t>
+        </m:r>
+        <m:r>
+          <m:rPr>
+            <m:sty m:val="p"/>
+          </m:rPr>
+          <m:t>×</m:t>
+        </m:r>
+        <m:sSup>
+          <m:e>
+            <m:r>
+              <m:t>10</m:t>
+            </m:r>
+          </m:e>
+          <m:sup>
+            <m:r>
+              <m:rPr>
+                <m:sty m:val="p"/>
+              </m:rPr>
+              <m:t>−</m:t>
+            </m:r>
+            <m:r>
+              <m:t>7</m:t>
+            </m:r>
+          </m:sup>
+        </m:sSup>
+      </m:oMath>
+      <w:r>
+        <w:rPr>
+          <w:rFonts w:ascii="Times New Roman" w:hAnsi="Times New Roman"/>
+        </w:rPr>
+        <w:t xml:space="preserve">,</w:t>
+      </w:r>
+      <w:r>
+        <w:rPr>
+          <w:rFonts w:ascii="Times New Roman" w:hAnsi="Times New Roman"/>
+        </w:rPr>
+        <w:t xml:space="preserve"> </w:t>
+      </w:r>
+      <w:r>
+        <w:rPr>
+          <w:rFonts w:ascii="Times New Roman" w:hAnsi="Times New Roman"/>
+        </w:rPr>
+        <w:t xml:space="preserve">unequal</w:t>
+      </w:r>
+      <w:r>
+        <w:rPr>
+          <w:rFonts w:ascii="Times New Roman" w:hAnsi="Times New Roman"/>
+        </w:rPr>
+        <w:t xml:space="preserve"> </w:t>
+      </w:r>
+      <w:r>
+        <w:rPr>
+          <w:rFonts w:ascii="Times New Roman" w:hAnsi="Times New Roman"/>
+        </w:rPr>
+        <w:t xml:space="preserve">T1</w:t>
+      </w:r>
+      <w:r>
+        <w:rPr>
+          <w:rFonts w:ascii="Times New Roman" w:hAnsi="Times New Roman"/>
+        </w:rPr>
+        <w:t xml:space="preserve"> </w:t>
+      </w:r>
+      <w:r>
+        <w:rPr>
+          <w:rFonts w:ascii="Times New Roman" w:hAnsi="Times New Roman"/>
+        </w:rPr>
+        <w:t xml:space="preserve">and</w:t>
+      </w:r>
+      <w:r>
+        <w:rPr>
+          <w:rFonts w:ascii="Times New Roman" w:hAnsi="Times New Roman"/>
+        </w:rPr>
+        <w:t xml:space="preserve"> </w:t>
+      </w:r>
+      <w:r>
+        <w:rPr>
+          <w:rFonts w:ascii="Times New Roman" w:hAnsi="Times New Roman"/>
+        </w:rPr>
+        <w:t xml:space="preserve">dephasing,</w:t>
+      </w:r>
+      <w:r>
+        <w:rPr>
+          <w:rFonts w:ascii="Times New Roman" w:hAnsi="Times New Roman"/>
+        </w:rPr>
+        <w:t xml:space="preserve"> </w:t>
+      </w:r>
+      <w:r>
+        <w:rPr>
+          <w:rFonts w:ascii="Times New Roman" w:hAnsi="Times New Roman"/>
+        </w:rPr>
+        <w:t xml:space="preserve">the</w:t>
+      </w:r>
+      <w:r>
+        <w:rPr>
+          <w:rFonts w:ascii="Times New Roman" w:hAnsi="Times New Roman"/>
+        </w:rPr>
+        <w:t xml:space="preserve"> </w:t>
+      </w:r>
+      <w:r>
+        <w:rPr>
+          <w:rFonts w:ascii="Times New Roman" w:hAnsi="Times New Roman"/>
+        </w:rPr>
+        <w:t xml:space="preserve">filter</w:t>
+      </w:r>
+      <w:r>
+        <w:rPr>
+          <w:rFonts w:ascii="Times New Roman" w:hAnsi="Times New Roman"/>
+        </w:rPr>
+        <w:t xml:space="preserve"> </w:t>
+      </w:r>
+      <w:r>
+        <w:rPr>
+          <w:rFonts w:ascii="Times New Roman" w:hAnsi="Times New Roman"/>
+        </w:rPr>
+        <w:t xml:space="preserve">has</w:t>
+      </w:r>
+      <w:r>
+        <w:rPr>
+          <w:rFonts w:ascii="Times New Roman" w:hAnsi="Times New Roman"/>
+        </w:rPr>
+        <w:t xml:space="preserve"> </w:t>
+      </w:r>
+      <w:r>
+        <w:rPr>
+          <w:rFonts w:ascii="Times New Roman" w:hAnsi="Times New Roman"/>
+        </w:rPr>
+        <w:t xml:space="preserve">the</w:t>
+      </w:r>
+      <w:r>
+        <w:rPr>
+          <w:rFonts w:ascii="Times New Roman" w:hAnsi="Times New Roman"/>
+        </w:rPr>
+        <w:t xml:space="preserve"> </w:t>
+      </w:r>
+      <w:r>
+        <w:rPr>
+          <w:rFonts w:ascii="Times New Roman" w:hAnsi="Times New Roman"/>
+        </w:rPr>
+        <w:t xml:space="preserve">lower</w:t>
+      </w:r>
+      <w:r>
+        <w:rPr>
+          <w:rFonts w:ascii="Times New Roman" w:hAnsi="Times New Roman"/>
+        </w:rPr>
+        <w:t xml:space="preserve"> </w:t>
+      </w:r>
+      <w:r>
+        <w:rPr>
+          <w:rFonts w:ascii="Times New Roman" w:hAnsi="Times New Roman"/>
+        </w:rPr>
+        <w:t xml:space="preserve">readout</w:t>
+      </w:r>
+      <w:r>
+        <w:rPr>
+          <w:rFonts w:ascii="Times New Roman" w:hAnsi="Times New Roman"/>
+        </w:rPr>
+        <w:t xml:space="preserve"> </w:t>
+      </w:r>
+      <w:r>
+        <w:rPr>
+          <w:rFonts w:ascii="Times New Roman" w:hAnsi="Times New Roman"/>
+        </w:rPr>
+        <w:t xml:space="preserve">error</w:t>
+      </w:r>
+      <w:r>
+        <w:rPr>
+          <w:rFonts w:ascii="Times New Roman" w:hAnsi="Times New Roman"/>
+        </w:rPr>
+        <w:t xml:space="preserve"> </w:t>
+      </w:r>
+      <w:r>
+        <w:rPr>
+          <w:rFonts w:ascii="Times New Roman" w:hAnsi="Times New Roman"/>
+        </w:rPr>
+        <w:t xml:space="preserve">whenever</w:t>
+      </w:r>
+      <w:r>
+        <w:rPr>
+          <w:rFonts w:ascii="Times New Roman" w:hAnsi="Times New Roman"/>
+        </w:rPr>
+        <w:t xml:space="preserve"> </w:t>
+      </w:r>
+      <w:r>
+        <w:rPr>
+          <w:rFonts w:ascii="Times New Roman" w:hAnsi="Times New Roman"/>
+        </w:rPr>
+        <w:t xml:space="preserve">about</w:t>
+      </w:r>
+      <w:r>
+        <w:rPr>
+          <w:rFonts w:ascii="Times New Roman" w:hAnsi="Times New Roman"/>
+        </w:rPr>
+        <w:t xml:space="preserve"> </w:t>
+      </w:r>
+      <w:r>
+        <w:rPr>
+          <w:rFonts w:ascii="Times New Roman" w:hAnsi="Times New Roman"/>
+        </w:rPr>
+        <w:t xml:space="preserve">20</w:t>
+      </w:r>
+      <w:r>
+        <w:rPr>
+          <w:rFonts w:ascii="Times New Roman" w:hAnsi="Times New Roman"/>
+        </w:rPr>
+        <w:t xml:space="preserve"> </w:t>
+      </w:r>
+      <w:r>
+        <w:rPr>
+          <w:rFonts w:ascii="Times New Roman" w:hAnsi="Times New Roman"/>
+        </w:rPr>
+        <w:t xml:space="preserve">shots</w:t>
+      </w:r>
+      <w:r>
+        <w:rPr>
+          <w:rFonts w:ascii="Times New Roman" w:hAnsi="Times New Roman"/>
+        </w:rPr>
+        <w:t xml:space="preserve"> </w:t>
+      </w:r>
+      <w:r>
+        <w:rPr>
+          <w:rFonts w:ascii="Times New Roman" w:hAnsi="Times New Roman"/>
+        </w:rPr>
+        <w:t xml:space="preserve">are</w:t>
+      </w:r>
+      <w:r>
+        <w:rPr>
+          <w:rFonts w:ascii="Times New Roman" w:hAnsi="Times New Roman"/>
+        </w:rPr>
+        <w:t xml:space="preserve"> </w:t>
+      </w:r>
+      <w:r>
+        <w:rPr>
+          <w:rFonts w:ascii="Times New Roman" w:hAnsi="Times New Roman"/>
+        </w:rPr>
+        <w:t xml:space="preserve">kept,</w:t>
+      </w:r>
+      <w:r>
+        <w:rPr>
+          <w:rFonts w:ascii="Times New Roman" w:hAnsi="Times New Roman"/>
+        </w:rPr>
+        <w:t xml:space="preserve"> </w:t>
+      </w:r>
+      <w:r>
+        <w:rPr>
+          <w:rFonts w:ascii="Times New Roman" w:hAnsi="Times New Roman"/>
+        </w:rPr>
+        <w:t xml:space="preserve">and</w:t>
+      </w:r>
+      <w:r>
+        <w:rPr>
+          <w:rFonts w:ascii="Times New Roman" w:hAnsi="Times New Roman"/>
+        </w:rPr>
+        <w:t xml:space="preserve"> </w:t>
+      </w:r>
+      <w:r>
+        <w:rPr>
+          <w:rFonts w:ascii="Times New Roman" w:hAnsi="Times New Roman"/>
+        </w:rPr>
+        <w:t xml:space="preserve">a</w:t>
+      </w:r>
+      <w:r>
+        <w:rPr>
+          <w:rFonts w:ascii="Times New Roman" w:hAnsi="Times New Roman"/>
+        </w:rPr>
+        <w:t xml:space="preserve"> </w:t>
+      </w:r>
+      <w:r>
+        <w:rPr>
+          <w:rFonts w:ascii="Times New Roman" w:hAnsi="Times New Roman"/>
+        </w:rPr>
+        <w:t xml:space="preserve">closed-form</w:t>
+      </w:r>
+      <w:r>
+        <w:rPr>
+          <w:rFonts w:ascii="Times New Roman" w:hAnsi="Times New Roman"/>
+        </w:rPr>
+        <w:t xml:space="preserve"> </w:t>
+      </w:r>
+      <w:r>
+        <w:rPr>
+          <w:rFonts w:ascii="Times New Roman" w:hAnsi="Times New Roman"/>
+        </w:rPr>
+        <w:t xml:space="preserve">rule</w:t>
+      </w:r>
+      <w:r>
+        <w:rPr>
+          <w:rFonts w:ascii="Times New Roman" w:hAnsi="Times New Roman"/>
+        </w:rPr>
+        <w:t xml:space="preserve"> </w:t>
+      </w:r>
+      <w:r>
+        <w:rPr>
+          <w:rFonts w:ascii="Times New Roman" w:hAnsi="Times New Roman"/>
+        </w:rPr>
+        <w:t xml:space="preserve">predicts</w:t>
+      </w:r>
+      <w:r>
+        <w:rPr>
+          <w:rFonts w:ascii="Times New Roman" w:hAnsi="Times New Roman"/>
+        </w:rPr>
+        <w:t xml:space="preserve"> </w:t>
+      </w:r>
+      <w:r>
+        <w:rPr>
+          <w:rFonts w:ascii="Times New Roman" w:hAnsi="Times New Roman"/>
+        </w:rPr>
+        <w:t xml:space="preserve">the</w:t>
+      </w:r>
+      <w:r>
+        <w:rPr>
+          <w:rFonts w:ascii="Times New Roman" w:hAnsi="Times New Roman"/>
+        </w:rPr>
+        <w:t xml:space="preserve"> </w:t>
+      </w:r>
+      <w:r>
+        <w:rPr>
+          <w:rFonts w:ascii="Times New Roman" w:hAnsi="Times New Roman"/>
+        </w:rPr>
+        <w:t xml:space="preserve">winner.</w:t>
+      </w:r>
+      <w:r>
+        <w:rPr>
+          <w:rFonts w:ascii="Times New Roman" w:hAnsi="Times New Roman"/>
+        </w:rPr>
+        <w:t xml:space="preserve"> </w:t>
+      </w:r>
+      <w:r>
+        <w:rPr>
+          <w:rFonts w:ascii="Times New Roman" w:hAnsi="Times New Roman"/>
+        </w:rPr>
         <w:t xml:space="preserve">These</w:t>
       </w:r>
       <w:r>
@@ -4696,7 +5517,7 @@
         <w:rPr>
           <w:rFonts w:ascii="Times New Roman" w:hAnsi="Times New Roman"/>
         </w:rPr>
-        <w:t xml:space="preserve">0.6.2,</w:t>
+        <w:t xml:space="preserve">0.6.5,</w:t>
       </w:r>
       <w:r>
         <w:rPr>
@@ -5064,19 +5885,19 @@
         <w:rPr>
           <w:rFonts w:ascii="Times New Roman" w:hAnsi="Times New Roman"/>
         </w:rPr>
-        <w:t xml:space="preserve">predictions of every study were committed to the repository before the run that tested them. Of 52</w:t>
-      </w:r>
-      <w:r>
-        <w:rPr>
-          <w:rFonts w:ascii="Times New Roman" w:hAnsi="Times New Roman"/>
-        </w:rPr>
-        <w:t xml:space="preserve"> </w:t>
-      </w:r>
-      <w:r>
-        <w:rPr>
-          <w:rFonts w:ascii="Times New Roman" w:hAnsi="Times New Roman"/>
-        </w:rPr>
-        <w:t xml:space="preserve">pre-registered predictions in the studies summarized here, 40 passed and 12 failed; the failures are</w:t>
+        <w:t xml:space="preserve">predictions of every study were committed to the repository before the run that tested them. Of 70</w:t>
+      </w:r>
+      <w:r>
+        <w:rPr>
+          <w:rFonts w:ascii="Times New Roman" w:hAnsi="Times New Roman"/>
+        </w:rPr>
+        <w:t xml:space="preserve"> </w:t>
+      </w:r>
+      <w:r>
+        <w:rPr>
+          <w:rFonts w:ascii="Times New Roman" w:hAnsi="Times New Roman"/>
+        </w:rPr>
+        <w:t xml:space="preserve">pre-registered predictions in the studies summarized here, 53 passed and 17 failed; the failures are</w:t>
       </w:r>
       <w:r>
         <w:rPr>
@@ -7354,7 +8175,7 @@
       </w:r>
     </w:p>
     <w:bookmarkEnd w:id="28"/>
-    <w:bookmarkStart w:id="37" w:name="results"/>
+    <w:bookmarkStart w:id="38" w:name="results"/>
     <w:p>
       <w:pPr>
         <w:pStyle w:val="Heading1"/>
@@ -7779,7 +8600,59 @@
         <w:rPr>
           <w:rFonts w:ascii="Times New Roman" w:hAnsi="Times New Roman"/>
         </w:rPr>
-        <w:t xml:space="preserve">readout.</w:t>
+        <w:t xml:space="preserve">readout;</w:t>
+      </w:r>
+    </w:p>
+    <w:p>
+      <w:pPr>
+        <w:numPr>
+          <w:ilvl w:val="0"/>
+          <w:numId w:val="1001"/>
+        </w:numPr>
+      </w:pPr>
+      <w:r>
+        <w:rPr>
+          <w:rFonts w:ascii="Times New Roman" w:hAnsi="Times New Roman"/>
+        </w:rPr>
+        <w:t xml:space="preserve">in Sec. </w:t>
+      </w:r>
+      <w:hyperlink w:anchor="sec:scaling">
+        <w:r>
+          <w:rPr>
+            <w:rStyle w:val="Hyperlink"/>
+          </w:rPr>
+          <w:t xml:space="preserve">4.0.0.5</w:t>
+        </w:r>
+      </w:hyperlink>
+      <w:r>
+        <w:rPr>
+          <w:rFonts w:ascii="Times New Roman" w:hAnsi="Times New Roman"/>
+        </w:rPr>
+        <w:t xml:space="preserve">: with less than one kept shot the filter did not lose, contrary to the</w:t>
+      </w:r>
+      <w:r>
+        <w:rPr>
+          <w:rFonts w:ascii="Times New Roman" w:hAnsi="Times New Roman"/>
+        </w:rPr>
+        <w:t xml:space="preserve"> </w:t>
+      </w:r>
+      <w:r>
+        <w:rPr>
+          <w:rFonts w:ascii="Times New Roman" w:hAnsi="Times New Roman"/>
+        </w:rPr>
+        <w:t xml:space="preserve">prediction; the raw error of the radius deficit was not smaller at half filling; and three of the four</w:t>
+      </w:r>
+      <w:r>
+        <w:rPr>
+          <w:rFonts w:ascii="Times New Roman" w:hAnsi="Times New Roman"/>
+        </w:rPr>
+        <w:t xml:space="preserve"> </w:t>
+      </w:r>
+      <w:r>
+        <w:rPr>
+          <w:rFonts w:ascii="Times New Roman" w:hAnsi="Times New Roman"/>
+        </w:rPr>
+        <w:t xml:space="preserve">predictions for the two-channel readout, including the replication of the 1.2-point effect above.</w:t>
       </w:r>
     </w:p>
     <w:bookmarkEnd w:id="29"/>
@@ -10968,8 +11841,1066 @@
       </w:r>
     </w:p>
     <w:bookmarkEnd w:id="36"/>
+    <w:bookmarkStart w:id="37" w:name="sec:scaling"/>
+    <w:p>
+      <w:pPr>
+        <w:pStyle w:val="Heading4"/>
+      </w:pPr>
+      <w:r>
+        <w:rPr>
+          <w:rFonts w:ascii="Times New Roman" w:hAnsi="Times New Roman"/>
+        </w:rPr>
+        <w:t xml:space="preserve">Two channels, shot cost and what else the filter reads.</w:t>
+      </w:r>
+    </w:p>
+    <w:p>
+      <w:pPr>
+        <w:numPr>
+          <w:ilvl w:val="0"/>
+          <w:numId w:val="1004"/>
+        </w:numPr>
+      </w:pPr>
+      <w:r>
+        <w:rPr>
+          <w:iCs/>
+          <w:rFonts w:ascii="Times New Roman" w:hAnsi="Times New Roman"/>
+          <w:i/>
+        </w:rPr>
+        <w:t xml:space="preserve">Two-channel readout (60 runs).</w:t>
+      </w:r>
+      <w:r>
+        <w:rPr>
+          <w:rFonts w:ascii="Times New Roman" w:hAnsi="Times New Roman"/>
+        </w:rPr>
+        <w:t xml:space="preserve"> </w:t>
+      </w:r>
+      <w:r>
+        <w:rPr>
+          <w:rFonts w:ascii="Times New Roman" w:hAnsi="Times New Roman"/>
+        </w:rPr>
+        <w:t xml:space="preserve">Giving the classifier both the filtered and the raw features</w:t>
+      </w:r>
+      <w:r>
+        <w:rPr>
+          <w:rFonts w:ascii="Times New Roman" w:hAnsi="Times New Roman"/>
+        </w:rPr>
+        <w:t xml:space="preserve"> </w:t>
+      </w:r>
+      <w:r>
+        <w:rPr>
+          <w:rFonts w:ascii="Times New Roman" w:hAnsi="Times New Roman"/>
+        </w:rPr>
+        <w:t xml:space="preserve">(</w:t>
+      </w:r>
+      <m:oMath>
+        <m:r>
+          <m:t>2</m:t>
+        </m:r>
+        <m:r>
+          <m:rPr>
+            <m:sty m:val="p"/>
+          </m:rPr>
+          <m:t>×</m:t>
+        </m:r>
+        <m:r>
+          <m:t>15</m:t>
+        </m:r>
+      </m:oMath>
+      <w:r>
+        <w:rPr>
+          <w:rFonts w:ascii="Times New Roman" w:hAnsi="Times New Roman"/>
+        </w:rPr>
+        <w:t xml:space="preserve"> </w:t>
+      </w:r>
+      <w:r>
+        <w:rPr>
+          <w:rFonts w:ascii="Times New Roman" w:hAnsi="Times New Roman"/>
+        </w:rPr>
+        <w:t xml:space="preserve">weights,</w:t>
+      </w:r>
+      <w:r>
+        <w:rPr>
+          <w:rFonts w:ascii="Times New Roman" w:hAnsi="Times New Roman"/>
+        </w:rPr>
+        <w:t xml:space="preserve"> </w:t>
+      </w:r>
+      <w:r>
+        <w:rPr>
+          <w:rStyle w:val="VerbatimChar"/>
+          <w:rFonts w:ascii="Times New Roman" w:hAnsi="Times New Roman"/>
+        </w:rPr>
+        <w:t xml:space="preserve">qang="both"</w:t>
+      </w:r>
+      <w:r>
+        <w:rPr>
+          <w:rFonts w:ascii="Times New Roman" w:hAnsi="Times New Roman"/>
+        </w:rPr>
+        <w:t xml:space="preserve">) was meant to keep the information of the decayed shots that made the</w:t>
+      </w:r>
+      <w:r>
+        <w:rPr>
+          <w:rFonts w:ascii="Times New Roman" w:hAnsi="Times New Roman"/>
+        </w:rPr>
+        <w:t xml:space="preserve"> </w:t>
+      </w:r>
+      <w:r>
+        <w:rPr>
+          <w:rFonts w:ascii="Times New Roman" w:hAnsi="Times New Roman"/>
+        </w:rPr>
+        <w:t xml:space="preserve">raw model 1.2 points better above. With the dual encoding that effect did not replicate: trained under T1, the</w:t>
+      </w:r>
+      <w:r>
+        <w:rPr>
+          <w:rFonts w:ascii="Times New Roman" w:hAnsi="Times New Roman"/>
+        </w:rPr>
+        <w:t xml:space="preserve"> </w:t>
+      </w:r>
+      <w:r>
+        <w:rPr>
+          <w:rFonts w:ascii="Times New Roman" w:hAnsi="Times New Roman"/>
+        </w:rPr>
+        <w:t xml:space="preserve">filtered model equals the noiseless one (0.953) and the raw one reaches 0.950 (</w:t>
+      </w:r>
+      <m:oMath>
+        <m:r>
+          <m:rPr>
+            <m:sty m:val="p"/>
+          </m:rPr>
+          <m:t>−</m:t>
+        </m:r>
+        <m:r>
+          <m:t>0.3</m:t>
+        </m:r>
+      </m:oMath>
+      <w:r>
+        <w:rPr>
+          <w:rFonts w:ascii="Times New Roman" w:hAnsi="Times New Roman"/>
+        </w:rPr>
+        <w:t xml:space="preserve"> </w:t>
+      </w:r>
+      <m:oMath>
+        <m:d>
+          <m:dPr>
+            <m:begChr m:val="["/>
+            <m:endChr m:val="]"/>
+            <m:sepChr m:val=""/>
+            <m:grow/>
+          </m:dPr>
+          <m:e>
+            <m:r>
+              <m:rPr>
+                <m:sty m:val="p"/>
+              </m:rPr>
+              <m:t>−</m:t>
+            </m:r>
+            <m:r>
+              <m:t>0.8</m:t>
+            </m:r>
+            <m:r>
+              <m:rPr>
+                <m:sty m:val="p"/>
+              </m:rPr>
+              <m:t>,</m:t>
+            </m:r>
+            <m:r>
+              <m:t>0.2</m:t>
+            </m:r>
+          </m:e>
+        </m:d>
+      </m:oMath>
+      <w:r>
+        <w:rPr>
+          <w:rFonts w:ascii="Times New Roman" w:hAnsi="Times New Roman"/>
+        </w:rPr>
+        <w:t xml:space="preserve"> </w:t>
+      </w:r>
+      <w:r>
+        <w:rPr>
+          <w:rFonts w:ascii="Times New Roman" w:hAnsi="Times New Roman"/>
+        </w:rPr>
+        <w:t xml:space="preserve">points</w:t>
+      </w:r>
+      <w:r>
+        <w:rPr>
+          <w:rFonts w:ascii="Times New Roman" w:hAnsi="Times New Roman"/>
+        </w:rPr>
+        <w:t xml:space="preserve"> </w:t>
+      </w:r>
+      <w:r>
+        <w:rPr>
+          <w:rFonts w:ascii="Times New Roman" w:hAnsi="Times New Roman"/>
+        </w:rPr>
+        <w:t xml:space="preserve">against the filter). The two channels equal the raw readout (</w:t>
+      </w:r>
+      <m:oMath>
+        <m:r>
+          <m:rPr>
+            <m:sty m:val="p"/>
+          </m:rPr>
+          <m:t>−</m:t>
+        </m:r>
+        <m:r>
+          <m:t>0.0</m:t>
+        </m:r>
+      </m:oMath>
+      <w:r>
+        <w:rPr>
+          <w:rFonts w:ascii="Times New Roman" w:hAnsi="Times New Roman"/>
+        </w:rPr>
+        <w:t xml:space="preserve"> </w:t>
+      </w:r>
+      <m:oMath>
+        <m:d>
+          <m:dPr>
+            <m:begChr m:val="["/>
+            <m:endChr m:val="]"/>
+            <m:sepChr m:val=""/>
+            <m:grow/>
+          </m:dPr>
+          <m:e>
+            <m:r>
+              <m:rPr>
+                <m:sty m:val="p"/>
+              </m:rPr>
+              <m:t>−</m:t>
+            </m:r>
+            <m:r>
+              <m:t>0.6</m:t>
+            </m:r>
+            <m:r>
+              <m:rPr>
+                <m:sty m:val="p"/>
+              </m:rPr>
+              <m:t>,</m:t>
+            </m:r>
+            <m:r>
+              <m:t>0.6</m:t>
+            </m:r>
+          </m:e>
+        </m:d>
+      </m:oMath>
+      <w:r>
+        <w:rPr>
+          <w:rFonts w:ascii="Times New Roman" w:hAnsi="Times New Roman"/>
+        </w:rPr>
+        <w:t xml:space="preserve">) and, at weight 1, the best</w:t>
+      </w:r>
+      <w:r>
+        <w:rPr>
+          <w:rFonts w:ascii="Times New Roman" w:hAnsi="Times New Roman"/>
+        </w:rPr>
+        <w:t xml:space="preserve"> </w:t>
+      </w:r>
+      <w:r>
+        <w:rPr>
+          <w:rFonts w:ascii="Times New Roman" w:hAnsi="Times New Roman"/>
+        </w:rPr>
+        <w:t xml:space="preserve">single readout (</w:t>
+      </w:r>
+      <m:oMath>
+        <m:r>
+          <m:rPr>
+            <m:sty m:val="p"/>
+          </m:rPr>
+          <m:t>+</m:t>
+        </m:r>
+        <m:r>
+          <m:t>0.0</m:t>
+        </m:r>
+      </m:oMath>
+      <w:r>
+        <w:rPr>
+          <w:rFonts w:ascii="Times New Roman" w:hAnsi="Times New Roman"/>
+        </w:rPr>
+        <w:t xml:space="preserve"> </w:t>
+      </w:r>
+      <m:oMath>
+        <m:d>
+          <m:dPr>
+            <m:begChr m:val="["/>
+            <m:endChr m:val="]"/>
+            <m:sepChr m:val=""/>
+            <m:grow/>
+          </m:dPr>
+          <m:e>
+            <m:r>
+              <m:rPr>
+                <m:sty m:val="p"/>
+              </m:rPr>
+              <m:t>−</m:t>
+            </m:r>
+            <m:r>
+              <m:t>0.4</m:t>
+            </m:r>
+            <m:r>
+              <m:rPr>
+                <m:sty m:val="p"/>
+              </m:rPr>
+              <m:t>,</m:t>
+            </m:r>
+            <m:r>
+              <m:t>0.4</m:t>
+            </m:r>
+          </m:e>
+        </m:d>
+      </m:oMath>
+      <w:r>
+        <w:rPr>
+          <w:rFonts w:ascii="Times New Roman" w:hAnsi="Times New Roman"/>
+        </w:rPr>
+        <w:t xml:space="preserve">). The earlier gap came with the distorting pair-product encoding.</w:t>
+      </w:r>
+    </w:p>
+    <w:p>
+      <w:pPr>
+        <w:numPr>
+          <w:ilvl w:val="0"/>
+          <w:numId w:val="1004"/>
+        </w:numPr>
+      </w:pPr>
+      <w:r>
+        <w:rPr>
+          <w:iCs/>
+          <w:rFonts w:ascii="Times New Roman" w:hAnsi="Times New Roman"/>
+          <w:i/>
+        </w:rPr>
+        <w:t xml:space="preserve">Shot cost.</w:t>
+      </w:r>
+      <w:r>
+        <w:rPr>
+          <w:rFonts w:ascii="Times New Roman" w:hAnsi="Times New Roman"/>
+        </w:rPr>
+        <w:t xml:space="preserve"> </w:t>
+      </w:r>
+      <w:r>
+        <w:rPr>
+          <w:rFonts w:ascii="Times New Roman" w:hAnsi="Times New Roman"/>
+        </w:rPr>
+        <w:t xml:space="preserve">For the</w:t>
+      </w:r>
+      <w:r>
+        <w:rPr>
+          <w:rFonts w:ascii="Times New Roman" w:hAnsi="Times New Roman"/>
+        </w:rPr>
+        <w:t xml:space="preserve"> </w:t>
+      </w:r>
+      <m:oMath>
+        <m:r>
+          <m:t>q</m:t>
+        </m:r>
+        <m:sSub>
+          <m:e>
+            <m:r>
+              <m:t>g</m:t>
+            </m:r>
+          </m:e>
+          <m:sub>
+            <m:r>
+              <m:t>Z</m:t>
+            </m:r>
+          </m:sub>
+        </m:sSub>
+      </m:oMath>
+      <w:r>
+        <w:rPr>
+          <w:rFonts w:ascii="Times New Roman" w:hAnsi="Times New Roman"/>
+        </w:rPr>
+        <w:t xml:space="preserve"> </w:t>
+      </w:r>
+      <w:r>
+        <w:rPr>
+          <w:rFonts w:ascii="Times New Roman" w:hAnsi="Times New Roman"/>
+        </w:rPr>
+        <w:t xml:space="preserve">readout of random weight-conserving circuits the filtered error</w:t>
+      </w:r>
+      <w:r>
+        <w:rPr>
+          <w:rFonts w:ascii="Times New Roman" w:hAnsi="Times New Roman"/>
+        </w:rPr>
+        <w:t xml:space="preserve"> </w:t>
+      </w:r>
+      <w:r>
+        <w:rPr>
+          <w:rFonts w:ascii="Times New Roman" w:hAnsi="Times New Roman"/>
+        </w:rPr>
+        <w:t xml:space="preserve">follows</w:t>
+      </w:r>
+      <w:r>
+        <w:rPr>
+          <w:rFonts w:ascii="Times New Roman" w:hAnsi="Times New Roman"/>
+        </w:rPr>
+        <w:t xml:space="preserve"> </w:t>
+      </w:r>
+      <m:oMath>
+        <m:d>
+          <m:dPr>
+            <m:begChr m:val="("/>
+            <m:endChr m:val=")"/>
+            <m:sepChr m:val=""/>
+            <m:grow/>
+          </m:dPr>
+          <m:e>
+            <m:r>
+              <m:t>1</m:t>
+            </m:r>
+            <m:r>
+              <m:rPr>
+                <m:sty m:val="p"/>
+              </m:rPr>
+              <m:t>−</m:t>
+            </m:r>
+            <m:sSup>
+              <m:e>
+                <m:r>
+                  <m:t>z</m:t>
+                </m:r>
+              </m:e>
+              <m:sup>
+                <m:r>
+                  <m:t>2</m:t>
+                </m:r>
+              </m:sup>
+            </m:sSup>
+          </m:e>
+        </m:d>
+        <m:r>
+          <m:rPr>
+            <m:sty m:val="p"/>
+          </m:rPr>
+          <m:t>/</m:t>
+        </m:r>
+        <m:d>
+          <m:dPr>
+            <m:begChr m:val="("/>
+            <m:endChr m:val=")"/>
+            <m:sepChr m:val=""/>
+            <m:grow/>
+          </m:dPr>
+          <m:e>
+            <m:r>
+              <m:t>K</m:t>
+            </m:r>
+            <m:r>
+              <m:t>S</m:t>
+            </m:r>
+          </m:e>
+        </m:d>
+      </m:oMath>
+      <w:r>
+        <w:rPr>
+          <w:rFonts w:ascii="Times New Roman" w:hAnsi="Times New Roman"/>
+        </w:rPr>
+        <w:t xml:space="preserve"> </w:t>
+      </w:r>
+      <w:r>
+        <w:rPr>
+          <w:rFonts w:ascii="Times New Roman" w:hAnsi="Times New Roman"/>
+        </w:rPr>
+        <w:t xml:space="preserve">and the raw error</w:t>
+      </w:r>
+      <w:r>
+        <w:rPr>
+          <w:rFonts w:ascii="Times New Roman" w:hAnsi="Times New Roman"/>
+        </w:rPr>
+        <w:t xml:space="preserve"> </w:t>
+      </w:r>
+      <m:oMath>
+        <m:sSup>
+          <m:e>
+            <m:d>
+              <m:dPr>
+                <m:begChr m:val="("/>
+                <m:endChr m:val=")"/>
+                <m:sepChr m:val=""/>
+                <m:grow/>
+              </m:dPr>
+              <m:e>
+                <m:r>
+                  <m:t>r</m:t>
+                </m:r>
+                <m:r>
+                  <m:rPr>
+                    <m:sty m:val="p"/>
+                  </m:rPr>
+                  <m:t>−</m:t>
+                </m:r>
+                <m:r>
+                  <m:t>z</m:t>
+                </m:r>
+              </m:e>
+            </m:d>
+          </m:e>
+          <m:sup>
+            <m:r>
+              <m:t>2</m:t>
+            </m:r>
+          </m:sup>
+        </m:sSup>
+        <m:r>
+          <m:rPr>
+            <m:sty m:val="p"/>
+          </m:rPr>
+          <m:t>+</m:t>
+        </m:r>
+        <m:d>
+          <m:dPr>
+            <m:begChr m:val="("/>
+            <m:endChr m:val=")"/>
+            <m:sepChr m:val=""/>
+            <m:grow/>
+          </m:dPr>
+          <m:e>
+            <m:r>
+              <m:t>1</m:t>
+            </m:r>
+            <m:r>
+              <m:rPr>
+                <m:sty m:val="p"/>
+              </m:rPr>
+              <m:t>−</m:t>
+            </m:r>
+            <m:sSup>
+              <m:e>
+                <m:r>
+                  <m:t>r</m:t>
+                </m:r>
+              </m:e>
+              <m:sup>
+                <m:r>
+                  <m:t>2</m:t>
+                </m:r>
+              </m:sup>
+            </m:sSup>
+          </m:e>
+        </m:d>
+        <m:r>
+          <m:rPr>
+            <m:sty m:val="p"/>
+          </m:rPr>
+          <m:t>/</m:t>
+        </m:r>
+        <m:r>
+          <m:t>S</m:t>
+        </m:r>
+      </m:oMath>
+      <w:r>
+        <w:rPr>
+          <w:rFonts w:ascii="Times New Roman" w:hAnsi="Times New Roman"/>
+        </w:rPr>
+        <w:t xml:space="preserve">, with</w:t>
+      </w:r>
+      <w:r>
+        <w:rPr>
+          <w:rFonts w:ascii="Times New Roman" w:hAnsi="Times New Roman"/>
+        </w:rPr>
+        <w:t xml:space="preserve"> </w:t>
+      </w:r>
+      <m:oMath>
+        <m:r>
+          <m:t>K</m:t>
+        </m:r>
+      </m:oMath>
+      <w:r>
+        <w:rPr>
+          <w:rFonts w:ascii="Times New Roman" w:hAnsi="Times New Roman"/>
+        </w:rPr>
+        <w:t xml:space="preserve"> </w:t>
+      </w:r>
+      <w:r>
+        <w:rPr>
+          <w:rFonts w:ascii="Times New Roman" w:hAnsi="Times New Roman"/>
+        </w:rPr>
+        <w:t xml:space="preserve">the kept fraction and</w:t>
+      </w:r>
+      <w:r>
+        <w:rPr>
+          <w:rFonts w:ascii="Times New Roman" w:hAnsi="Times New Roman"/>
+        </w:rPr>
+        <w:t xml:space="preserve"> </w:t>
+      </w:r>
+      <m:oMath>
+        <m:r>
+          <m:t>S</m:t>
+        </m:r>
+      </m:oMath>
+      <w:r>
+        <w:rPr>
+          <w:rFonts w:ascii="Times New Roman" w:hAnsi="Times New Roman"/>
+        </w:rPr>
+        <w:t xml:space="preserve"> </w:t>
+      </w:r>
+      <w:r>
+        <w:rPr>
+          <w:rFonts w:ascii="Times New Roman" w:hAnsi="Times New Roman"/>
+        </w:rPr>
+        <w:t xml:space="preserve">the shots.</w:t>
+      </w:r>
+      <w:r>
+        <w:rPr>
+          <w:rFonts w:ascii="Times New Roman" w:hAnsi="Times New Roman"/>
+        </w:rPr>
+        <w:t xml:space="preserve"> </w:t>
+      </w:r>
+      <w:r>
+        <w:rPr>
+          <w:rFonts w:ascii="Times New Roman" w:hAnsi="Times New Roman"/>
+        </w:rPr>
+        <w:t xml:space="preserve">Over 108 configurations (4–8 qubits, weight 1–4, depth 3–24) the filter has the lower error in 106 (up to</w:t>
+      </w:r>
+      <w:r>
+        <w:rPr>
+          <w:rFonts w:ascii="Times New Roman" w:hAnsi="Times New Roman"/>
+        </w:rPr>
+        <w:t xml:space="preserve"> </w:t>
+      </w:r>
+      <m:oMath>
+        <m:r>
+          <m:t>1000</m:t>
+        </m:r>
+        <m:r>
+          <m:rPr>
+            <m:sty m:val="p"/>
+          </m:rPr>
+          <m:t>×</m:t>
+        </m:r>
+      </m:oMath>
+      <w:r>
+        <w:rPr>
+          <w:rFonts w:ascii="Times New Roman" w:hAnsi="Times New Roman"/>
+        </w:rPr>
+        <w:t xml:space="preserve"> </w:t>
+      </w:r>
+      <w:r>
+        <w:rPr>
+          <w:rFonts w:ascii="Times New Roman" w:hAnsi="Times New Roman"/>
+        </w:rPr>
+        <w:t xml:space="preserve">lower), and the rule picks the winner in 99%; the break-even is 3–110 shots. Over 405 further</w:t>
+      </w:r>
+      <w:r>
+        <w:rPr>
+          <w:rFonts w:ascii="Times New Roman" w:hAnsi="Times New Roman"/>
+        </w:rPr>
+        <w:t xml:space="preserve"> </w:t>
+      </w:r>
+      <w:r>
+        <w:rPr>
+          <w:rFonts w:ascii="Times New Roman" w:hAnsi="Times New Roman"/>
+        </w:rPr>
+        <w:t xml:space="preserve">configurations with</w:t>
+      </w:r>
+      <w:r>
+        <w:rPr>
+          <w:rFonts w:ascii="Times New Roman" w:hAnsi="Times New Roman"/>
+        </w:rPr>
+        <w:t xml:space="preserve"> </w:t>
+      </w:r>
+      <m:oMath>
+        <m:r>
+          <m:t>K</m:t>
+        </m:r>
+      </m:oMath>
+      <w:r>
+        <w:rPr>
+          <w:rFonts w:ascii="Times New Roman" w:hAnsi="Times New Roman"/>
+        </w:rPr>
+        <w:t xml:space="preserve"> </w:t>
+      </w:r>
+      <w:r>
+        <w:rPr>
+          <w:rFonts w:ascii="Times New Roman" w:hAnsi="Times New Roman"/>
+        </w:rPr>
+        <w:t xml:space="preserve">down to</w:t>
+      </w:r>
+      <w:r>
+        <w:rPr>
+          <w:rFonts w:ascii="Times New Roman" w:hAnsi="Times New Roman"/>
+        </w:rPr>
+        <w:t xml:space="preserve"> </w:t>
+      </w:r>
+      <m:oMath>
+        <m:r>
+          <m:t>2.6</m:t>
+        </m:r>
+        <m:r>
+          <m:rPr>
+            <m:sty m:val="p"/>
+          </m:rPr>
+          <m:t>×</m:t>
+        </m:r>
+        <m:sSup>
+          <m:e>
+            <m:r>
+              <m:t>10</m:t>
+            </m:r>
+          </m:e>
+          <m:sup>
+            <m:r>
+              <m:rPr>
+                <m:sty m:val="p"/>
+              </m:rPr>
+              <m:t>−</m:t>
+            </m:r>
+            <m:r>
+              <m:t>7</m:t>
+            </m:r>
+          </m:sup>
+        </m:sSup>
+      </m:oMath>
+      <w:r>
+        <w:rPr>
+          <w:rFonts w:ascii="Times New Roman" w:hAnsi="Times New Roman"/>
+        </w:rPr>
+        <w:t xml:space="preserve">, unequal T1 and dephasing, it wins in every configuration</w:t>
+      </w:r>
+      <w:r>
+        <w:rPr>
+          <w:rFonts w:ascii="Times New Roman" w:hAnsi="Times New Roman"/>
+        </w:rPr>
+        <w:t xml:space="preserve"> </w:t>
+      </w:r>
+      <w:r>
+        <w:rPr>
+          <w:rFonts w:ascii="Times New Roman" w:hAnsi="Times New Roman"/>
+        </w:rPr>
+        <w:t xml:space="preserve">with at least 20 kept shots (up to</w:t>
+      </w:r>
+      <w:r>
+        <w:rPr>
+          <w:rFonts w:ascii="Times New Roman" w:hAnsi="Times New Roman"/>
+        </w:rPr>
+        <w:t xml:space="preserve"> </w:t>
+      </w:r>
+      <m:oMath>
+        <m:r>
+          <m:t>1871</m:t>
+        </m:r>
+        <m:r>
+          <m:rPr>
+            <m:sty m:val="p"/>
+          </m:rPr>
+          <m:t>×</m:t>
+        </m:r>
+      </m:oMath>
+      <w:r>
+        <w:rPr>
+          <w:rFonts w:ascii="Times New Roman" w:hAnsi="Times New Roman"/>
+        </w:rPr>
+        <w:t xml:space="preserve"> </w:t>
+      </w:r>
+      <w:r>
+        <w:rPr>
+          <w:rFonts w:ascii="Times New Roman" w:hAnsi="Times New Roman"/>
+        </w:rPr>
+        <w:t xml:space="preserve">under equal T1,</w:t>
+      </w:r>
+      <w:r>
+        <w:rPr>
+          <w:rFonts w:ascii="Times New Roman" w:hAnsi="Times New Roman"/>
+        </w:rPr>
+        <w:t xml:space="preserve"> </w:t>
+      </w:r>
+      <m:oMath>
+        <m:r>
+          <m:t>94</m:t>
+        </m:r>
+        <m:r>
+          <m:rPr>
+            <m:sty m:val="p"/>
+          </m:rPr>
+          <m:t>×</m:t>
+        </m:r>
+      </m:oMath>
+      <w:r>
+        <w:rPr>
+          <w:rFonts w:ascii="Times New Roman" w:hAnsi="Times New Roman"/>
+        </w:rPr>
+        <w:t xml:space="preserve"> </w:t>
+      </w:r>
+      <w:r>
+        <w:rPr>
+          <w:rFonts w:ascii="Times New Roman" w:hAnsi="Times New Roman"/>
+        </w:rPr>
+        <w:t xml:space="preserve">unequal,</w:t>
+      </w:r>
+      <w:r>
+        <w:rPr>
+          <w:rFonts w:ascii="Times New Roman" w:hAnsi="Times New Roman"/>
+        </w:rPr>
+        <w:t xml:space="preserve"> </w:t>
+      </w:r>
+      <m:oMath>
+        <m:r>
+          <m:t>58</m:t>
+        </m:r>
+        <m:r>
+          <m:rPr>
+            <m:sty m:val="p"/>
+          </m:rPr>
+          <m:t>×</m:t>
+        </m:r>
+      </m:oMath>
+      <w:r>
+        <w:rPr>
+          <w:rFonts w:ascii="Times New Roman" w:hAnsi="Times New Roman"/>
+        </w:rPr>
+        <w:t xml:space="preserve"> </w:t>
+      </w:r>
+      <w:r>
+        <w:rPr>
+          <w:rFonts w:ascii="Times New Roman" w:hAnsi="Times New Roman"/>
+        </w:rPr>
+        <w:t xml:space="preserve">with dephasing),</w:t>
+      </w:r>
+      <w:r>
+        <w:rPr>
+          <w:rFonts w:ascii="Times New Roman" w:hAnsi="Times New Roman"/>
+        </w:rPr>
+        <w:t xml:space="preserve"> </w:t>
+      </w:r>
+      <w:r>
+        <w:rPr>
+          <w:rFonts w:ascii="Times New Roman" w:hAnsi="Times New Roman"/>
+        </w:rPr>
+        <w:t xml:space="preserve">and a generalized rule with the biased filtered value picks the winner in 342 of 342 cases with</w:t>
+      </w:r>
+      <w:r>
+        <w:rPr>
+          <w:rFonts w:ascii="Times New Roman" w:hAnsi="Times New Roman"/>
+        </w:rPr>
+        <w:t xml:space="preserve"> </w:t>
+      </w:r>
+      <m:oMath>
+        <m:r>
+          <m:t>K</m:t>
+        </m:r>
+        <m:r>
+          <m:t>S</m:t>
+        </m:r>
+        <m:r>
+          <m:rPr>
+            <m:sty m:val="p"/>
+          </m:rPr>
+          <m:t>≥</m:t>
+        </m:r>
+        <m:r>
+          <m:t>5</m:t>
+        </m:r>
+      </m:oMath>
+      <w:r>
+        <w:rPr>
+          <w:rFonts w:ascii="Times New Roman" w:hAnsi="Times New Roman"/>
+        </w:rPr>
+        <w:t xml:space="preserve">.</w:t>
+      </w:r>
+      <w:r>
+        <w:rPr>
+          <w:rFonts w:ascii="Times New Roman" w:hAnsi="Times New Roman"/>
+        </w:rPr>
+        <w:t xml:space="preserve"> </w:t>
+      </w:r>
+      <w:r>
+        <w:rPr>
+          <w:rFonts w:ascii="Times New Roman" w:hAnsi="Times New Roman"/>
+        </w:rPr>
+        <w:t xml:space="preserve">When fewer shots survive, the raw readout has also lost the information, so the filter still did not lose.</w:t>
+      </w:r>
+    </w:p>
+    <w:p>
+      <w:pPr>
+        <w:numPr>
+          <w:ilvl w:val="0"/>
+          <w:numId w:val="1004"/>
+        </w:numPr>
+      </w:pPr>
+      <w:r>
+        <w:rPr>
+          <w:iCs/>
+          <w:rFonts w:ascii="Times New Roman" w:hAnsi="Times New Roman"/>
+          <w:i/>
+        </w:rPr>
+        <w:t xml:space="preserve">Entanglement after the filter.</w:t>
+      </w:r>
+      <w:r>
+        <w:rPr>
+          <w:rFonts w:ascii="Times New Roman" w:hAnsi="Times New Roman"/>
+        </w:rPr>
+        <w:t xml:space="preserve"> </w:t>
+      </w:r>
+      <w:r>
+        <w:rPr>
+          <w:rFonts w:ascii="Times New Roman" w:hAnsi="Times New Roman"/>
+        </w:rPr>
+        <w:t xml:space="preserve">In a fixed-weight state each qubit’s Bloch radius is</w:t>
+      </w:r>
+      <w:r>
+        <w:rPr>
+          <w:rFonts w:ascii="Times New Roman" w:hAnsi="Times New Roman"/>
+        </w:rPr>
+        <w:t xml:space="preserve"> </w:t>
+      </w:r>
+      <m:oMath>
+        <m:d>
+          <m:dPr>
+            <m:begChr m:val="|"/>
+            <m:endChr m:val="|"/>
+            <m:sepChr m:val=""/>
+            <m:grow/>
+          </m:dPr>
+          <m:e>
+            <m:r>
+              <m:t>q</m:t>
+            </m:r>
+            <m:sSub>
+              <m:e>
+                <m:r>
+                  <m:t>g</m:t>
+                </m:r>
+              </m:e>
+              <m:sub>
+                <m:r>
+                  <m:t>Z</m:t>
+                </m:r>
+              </m:sub>
+            </m:sSub>
+          </m:e>
+        </m:d>
+      </m:oMath>
+      <w:r>
+        <w:rPr>
+          <w:rFonts w:ascii="Times New Roman" w:hAnsi="Times New Roman"/>
+        </w:rPr>
+        <w:t xml:space="preserve">, and</w:t>
+      </w:r>
+      <w:r>
+        <w:rPr>
+          <w:rFonts w:ascii="Times New Roman" w:hAnsi="Times New Roman"/>
+        </w:rPr>
+        <w:t xml:space="preserve"> </w:t>
+      </w:r>
+      <w:r>
+        <w:rPr>
+          <w:rFonts w:ascii="Times New Roman" w:hAnsi="Times New Roman"/>
+        </w:rPr>
+        <w:t xml:space="preserve">for a pure register</w:t>
+      </w:r>
+      <w:r>
+        <w:rPr>
+          <w:rFonts w:ascii="Times New Roman" w:hAnsi="Times New Roman"/>
+        </w:rPr>
+        <w:t xml:space="preserve"> </w:t>
+      </w:r>
+      <m:oMath>
+        <m:r>
+          <m:t>1</m:t>
+        </m:r>
+        <m:r>
+          <m:rPr>
+            <m:sty m:val="p"/>
+          </m:rPr>
+          <m:t>−</m:t>
+        </m:r>
+        <m:r>
+          <m:t>q</m:t>
+        </m:r>
+        <m:sSubSup>
+          <m:e>
+            <m:r>
+              <m:t>g</m:t>
+            </m:r>
+          </m:e>
+          <m:sub>
+            <m:r>
+              <m:t>Z</m:t>
+            </m:r>
+          </m:sub>
+          <m:sup>
+            <m:r>
+              <m:t>2</m:t>
+            </m:r>
+          </m:sup>
+        </m:sSubSup>
+      </m:oMath>
+      <w:r>
+        <w:rPr>
+          <w:rFonts w:ascii="Times New Roman" w:hAnsi="Times New Roman"/>
+        </w:rPr>
+        <w:t xml:space="preserve"> </w:t>
+      </w:r>
+      <w:r>
+        <w:rPr>
+          <w:rFonts w:ascii="Times New Roman" w:hAnsi="Times New Roman"/>
+        </w:rPr>
+        <w:t xml:space="preserve">is its entanglement with the rest. Under equal T1 the filtered value equals the</w:t>
+      </w:r>
+      <w:r>
+        <w:rPr>
+          <w:rFonts w:ascii="Times New Roman" w:hAnsi="Times New Roman"/>
+        </w:rPr>
+        <w:t xml:space="preserve"> </w:t>
+      </w:r>
+      <w:r>
+        <w:rPr>
+          <w:rFonts w:ascii="Times New Roman" w:hAnsi="Times New Roman"/>
+        </w:rPr>
+        <w:t xml:space="preserve">noiseless one to</w:t>
+      </w:r>
+      <w:r>
+        <w:rPr>
+          <w:rFonts w:ascii="Times New Roman" w:hAnsi="Times New Roman"/>
+        </w:rPr>
+        <w:t xml:space="preserve"> </w:t>
+      </w:r>
+      <m:oMath>
+        <m:r>
+          <m:t>3</m:t>
+        </m:r>
+        <m:r>
+          <m:rPr>
+            <m:sty m:val="p"/>
+          </m:rPr>
+          <m:t>×</m:t>
+        </m:r>
+        <m:sSup>
+          <m:e>
+            <m:r>
+              <m:t>10</m:t>
+            </m:r>
+          </m:e>
+          <m:sup>
+            <m:r>
+              <m:rPr>
+                <m:sty m:val="p"/>
+              </m:rPr>
+              <m:t>−</m:t>
+            </m:r>
+            <m:r>
+              <m:t>15</m:t>
+            </m:r>
+          </m:sup>
+        </m:sSup>
+      </m:oMath>
+      <w:r>
+        <w:rPr>
+          <w:rFonts w:ascii="Times New Roman" w:hAnsi="Times New Roman"/>
+        </w:rPr>
+        <w:t xml:space="preserve">; on product states it is exactly 0, while the raw readout shows a false</w:t>
+      </w:r>
+      <w:r>
+        <w:rPr>
+          <w:rFonts w:ascii="Times New Roman" w:hAnsi="Times New Roman"/>
+        </w:rPr>
+        <w:t xml:space="preserve"> </w:t>
+      </w:r>
+      <w:r>
+        <w:rPr>
+          <w:rFonts w:ascii="Times New Roman" w:hAnsi="Times New Roman"/>
+        </w:rPr>
+        <w:t xml:space="preserve">value of 0.60–0.95.</w:t>
+      </w:r>
+    </w:p>
     <w:bookmarkEnd w:id="37"/>
-    <w:bookmarkStart w:id="39" w:name="discussion"/>
+    <w:bookmarkEnd w:id="38"/>
+    <w:bookmarkStart w:id="40" w:name="discussion"/>
     <w:p>
       <w:pPr>
         <w:pStyle w:val="Heading1"/>
@@ -11201,34 +13132,58 @@
         <w:rPr>
           <w:rFonts w:ascii="Times New Roman" w:hAnsi="Times New Roman"/>
         </w:rPr>
-        <w:t xml:space="preserve">filter alone, losing less than one point. When the network is instead trained under the calibrated noise,</w:t>
-      </w:r>
-      <w:r>
-        <w:rPr>
-          <w:rFonts w:ascii="Times New Roman" w:hAnsi="Times New Roman"/>
-        </w:rPr>
-        <w:t xml:space="preserve"> </w:t>
-      </w:r>
-      <w:r>
-        <w:rPr>
-          <w:rFonts w:ascii="Times New Roman" w:hAnsi="Times New Roman"/>
-        </w:rPr>
-        <w:t xml:space="preserve">and especially when its readout has many parameters, the decayed shots are useful data, and the filter can</w:t>
-      </w:r>
-      <w:r>
-        <w:rPr>
-          <w:rFonts w:ascii="Times New Roman" w:hAnsi="Times New Roman"/>
-        </w:rPr>
-        <w:t xml:space="preserve"> </w:t>
-      </w:r>
-      <w:r>
-        <w:rPr>
-          <w:rFonts w:ascii="Times New Roman" w:hAnsi="Times New Roman"/>
-        </w:rPr>
-        <w:t xml:space="preserve">cost about a point. For weight-2 models, how the data are loaded matters more than what is read out.</w:t>
+        <w:t xml:space="preserve">filter alone, losing less than one point. When the network is instead trained under the calibrated noise</w:t>
+      </w:r>
+      <w:r>
+        <w:rPr>
+          <w:rFonts w:ascii="Times New Roman" w:hAnsi="Times New Roman"/>
+        </w:rPr>
+        <w:t xml:space="preserve"> </w:t>
+      </w:r>
+      <w:r>
+        <w:rPr>
+          <w:rFonts w:ascii="Times New Roman" w:hAnsi="Times New Roman"/>
+        </w:rPr>
+        <w:t xml:space="preserve">with a distorting encoding and a readout with many parameters, the decayed shots were useful data and the filter</w:t>
+      </w:r>
+      <w:r>
+        <w:rPr>
+          <w:rFonts w:ascii="Times New Roman" w:hAnsi="Times New Roman"/>
+        </w:rPr>
+        <w:t xml:space="preserve"> </w:t>
+      </w:r>
+      <w:r>
+        <w:rPr>
+          <w:rFonts w:ascii="Times New Roman" w:hAnsi="Times New Roman"/>
+        </w:rPr>
+        <w:t xml:space="preserve">cost about a point; with a faithful encoding this cost disappeared, and adding the raw features to the filtered</w:t>
+      </w:r>
+      <w:r>
+        <w:rPr>
+          <w:rFonts w:ascii="Times New Roman" w:hAnsi="Times New Roman"/>
+        </w:rPr>
+        <w:t xml:space="preserve"> </w:t>
+      </w:r>
+      <w:r>
+        <w:rPr>
+          <w:rFonts w:ascii="Times New Roman" w:hAnsi="Times New Roman"/>
+        </w:rPr>
+        <w:t xml:space="preserve">ones gained nothing. For weight-2 models, how the data are loaded matters more than what is read out. The shot</w:t>
+      </w:r>
+      <w:r>
+        <w:rPr>
+          <w:rFonts w:ascii="Times New Roman" w:hAnsi="Times New Roman"/>
+        </w:rPr>
+        <w:t xml:space="preserve"> </w:t>
+      </w:r>
+      <w:r>
+        <w:rPr>
+          <w:rFonts w:ascii="Times New Roman" w:hAnsi="Times New Roman"/>
+        </w:rPr>
+        <w:t xml:space="preserve">cost of the filter did not decide against it anywhere in our scaling maps.</w:t>
       </w:r>
     </w:p>
-    <w:bookmarkStart w:id="38" w:name="limitations."/>
+    <w:bookmarkStart w:id="39" w:name="limitations."/>
     <w:p>
       <w:pPr>
         <w:pStyle w:val="Heading4"/>
@@ -11287,9 +13242,9 @@
         <w:t xml:space="preserve">simulable. A hardware run with the filter is the natural next test.</w:t>
       </w:r>
     </w:p>
-    <w:bookmarkEnd w:id="38"/>
     <w:bookmarkEnd w:id="39"/>
-    <w:bookmarkStart w:id="53" w:name="code-and-data-availability"/>
+    <w:bookmarkEnd w:id="40"/>
+    <w:bookmarkStart w:id="54" w:name="code-and-data-availability"/>
     <w:p>
       <w:pPr>
         <w:pStyle w:val="Heading1"/>
@@ -11359,7 +13314,7 @@
         <w:rPr>
           <w:rFonts w:ascii="Times New Roman" w:hAnsi="Times New Roman"/>
         </w:rPr>
-        <w:t xml:space="preserve">0.6.2 (</w:t>
+        <w:t xml:space="preserve">0.6.5 (</w:t>
       </w:r>
       <w:r>
         <w:rPr>
@@ -11504,6 +13459,25 @@
         <w:rPr>
           <w:rFonts w:ascii="Times New Roman" w:hAnsi="Times New Roman"/>
         </w:rPr>
+        <w:t xml:space="preserve">; any weight for simulation;</w:t>
+      </w:r>
+      <w:r>
+        <w:rPr>
+          <w:rFonts w:ascii="Times New Roman" w:hAnsi="Times New Roman"/>
+        </w:rPr>
+        <w:t xml:space="preserve"> </w:t>
+      </w:r>
+      <w:r>
+        <w:rPr>
+          <w:rStyle w:val="VerbatimChar"/>
+          <w:rFonts w:ascii="Times New Roman" w:hAnsi="Times New Roman"/>
+        </w:rPr>
+        <w:t xml:space="preserve">qang="both"</w:t>
+      </w:r>
+      <w:r>
+        <w:rPr>
+          <w:rFonts w:ascii="Times New Roman" w:hAnsi="Times New Roman"/>
+        </w:rPr>
         <w:t xml:space="preserve">),</w:t>
       </w:r>
       <w:r>
@@ -11598,7 +13572,7 @@
         <w:rPr>
           <w:rFonts w:ascii="Times New Roman" w:hAnsi="Times New Roman"/>
         </w:rPr>
-        <w:t xml:space="preserve">and RESEARCH_NOTES §75–§82, §85, §87, §90 and §91, with tests in</w:t>
+        <w:t xml:space="preserve">and RESEARCH_NOTES §75–§82, §85, §87, §90, §91 and §94–§98, with tests in</w:t>
       </w:r>
       <w:r>
         <w:rPr>
@@ -11699,7 +13673,7 @@
         </w:rPr>
         <w:t xml:space="preserve"> </w:t>
       </w:r>
-      <w:hyperlink r:id="rId40">
+      <w:hyperlink r:id="rId41">
         <w:r>
           <w:rPr>
             <w:rStyle w:val="Hyperlink"/>
@@ -11902,8 +13876,8 @@
         <w:t xml:space="preserve"># raw readout</w:t>
       </w:r>
     </w:p>
-    <w:bookmarkStart w:id="52" w:name="refs"/>
-    <w:bookmarkStart w:id="41" w:name="ref-bonetmonroig2018"/>
+    <w:bookmarkStart w:id="53" w:name="refs"/>
+    <w:bookmarkStart w:id="42" w:name="ref-bonetmonroig2018"/>
     <w:p>
       <w:pPr>
         <w:pStyle w:val="Bibliography"/>
@@ -11953,8 +13927,8 @@
         <w:t xml:space="preserve">98: 062339.</w:t>
       </w:r>
     </w:p>
-    <w:bookmarkEnd w:id="41"/>
-    <w:bookmarkStart w:id="42" w:name="ref-cerezo2023simulability"/>
+    <w:bookmarkEnd w:id="42"/>
+    <w:bookmarkStart w:id="43" w:name="ref-cerezo2023simulability"/>
     <w:p>
       <w:pPr>
         <w:pStyle w:val="Bibliography"/>
@@ -11996,8 +13970,8 @@
         <w:t xml:space="preserve">r, Why We Need to Rethink Variational Quantum Computing.”</w:t>
       </w:r>
     </w:p>
-    <w:bookmarkEnd w:id="42"/>
-    <w:bookmarkStart w:id="44" w:name="ref-landman2022"/>
+    <w:bookmarkEnd w:id="43"/>
+    <w:bookmarkStart w:id="45" w:name="ref-landman2022"/>
     <w:p>
       <w:pPr>
         <w:pStyle w:val="Bibliography"/>
@@ -12052,7 +14026,7 @@
         </w:rPr>
         <w:t xml:space="preserve"> </w:t>
       </w:r>
-      <w:hyperlink r:id="rId43">
+      <w:hyperlink r:id="rId44">
         <w:r>
           <w:rPr>
             <w:rStyle w:val="Hyperlink"/>
@@ -12067,8 +14041,8 @@
         <w:t xml:space="preserve">.</w:t>
       </w:r>
     </w:p>
-    <w:bookmarkEnd w:id="44"/>
-    <w:bookmarkStart w:id="45" w:name="ref-mcardle2019"/>
+    <w:bookmarkEnd w:id="45"/>
+    <w:bookmarkStart w:id="46" w:name="ref-mcardle2019"/>
     <w:p>
       <w:pPr>
         <w:pStyle w:val="Bibliography"/>
@@ -12118,8 +14092,8 @@
         <w:t xml:space="preserve">122: 180501.</w:t>
       </w:r>
     </w:p>
-    <w:bookmarkEnd w:id="45"/>
-    <w:bookmarkStart w:id="47" w:name="ref-monteverde2026qang"/>
+    <w:bookmarkEnd w:id="46"/>
+    <w:bookmarkStart w:id="48" w:name="ref-monteverde2026qang"/>
     <w:p>
       <w:pPr>
         <w:pStyle w:val="Bibliography"/>
@@ -12172,7 +14146,7 @@
         </w:rPr>
         <w:t xml:space="preserve"> </w:t>
       </w:r>
-      <w:hyperlink r:id="rId46">
+      <w:hyperlink r:id="rId47">
         <w:r>
           <w:rPr>
             <w:rStyle w:val="Hyperlink"/>
@@ -12187,8 +14161,8 @@
         <w:t xml:space="preserve">.</w:t>
       </w:r>
     </w:p>
-    <w:bookmarkEnd w:id="47"/>
-    <w:bookmarkStart w:id="49" w:name="ref-monteverde2026witness"/>
+    <w:bookmarkEnd w:id="48"/>
+    <w:bookmarkStart w:id="50" w:name="ref-monteverde2026witness"/>
     <w:p>
       <w:pPr>
         <w:pStyle w:val="Bibliography"/>
@@ -12237,7 +14211,7 @@
         </w:rPr>
         <w:t xml:space="preserve"> </w:t>
       </w:r>
-      <w:hyperlink r:id="rId48">
+      <w:hyperlink r:id="rId49">
         <w:r>
           <w:rPr>
             <w:rStyle w:val="Hyperlink"/>
@@ -12252,8 +14226,8 @@
         <w:t xml:space="preserve">.</w:t>
       </w:r>
     </w:p>
-    <w:bookmarkEnd w:id="49"/>
-    <w:bookmarkStart w:id="51" w:name="ref-wang2022quantumnat"/>
+    <w:bookmarkEnd w:id="50"/>
+    <w:bookmarkStart w:id="52" w:name="ref-wang2022quantumnat"/>
     <w:p>
       <w:pPr>
         <w:pStyle w:val="Bibliography"/>
@@ -12326,7 +14300,7 @@
         </w:rPr>
         <w:t xml:space="preserve"> </w:t>
       </w:r>
-      <w:hyperlink r:id="rId50">
+      <w:hyperlink r:id="rId51">
         <w:r>
           <w:rPr>
             <w:rStyle w:val="Hyperlink"/>
@@ -12341,9 +14315,9 @@
         <w:t xml:space="preserve">.</w:t>
       </w:r>
     </w:p>
-    <w:bookmarkEnd w:id="51"/>
     <w:bookmarkEnd w:id="52"/>
     <w:bookmarkEnd w:id="53"/>
+    <w:bookmarkEnd w:id="54"/>
     <w:sectPr/>
   </w:body>
 </w:document>
@@ -12536,6 +14510,9 @@
     <w:abstractNumId w:val="991"/>
   </w:num>
   <w:num w:numId="1003">
+    <w:abstractNumId w:val="991"/>
+  </w:num>
+  <w:num w:numId="1004">
     <w:abstractNumId w:val="991"/>
   </w:num>
 </w:numbering>

</xml_diff>

<commit_message>
qang 0.6.6: findings of section 101 (distorting against faithful encoding: the §81 effect shrinks to +0.5 points, not significant; D2, D4 pass, D1, D3, D5 fail), notes, QML note with §100-§101, README results, CHANGELOG, test count 1241
</commit_message>
<xml_diff>
--- a/manuscript/qang_qml.docx
+++ b/manuscript/qang_qml.docx
@@ -3235,7 +3235,7 @@
         <w:rPr>
           <w:rFonts w:ascii="Times New Roman" w:hAnsi="Times New Roman"/>
         </w:rPr>
-        <w:t xml:space="preserve">is</w:t>
+        <w:t xml:space="preserve">was</w:t>
       </w:r>
       <w:r>
         <w:rPr>
@@ -3270,79 +3270,228 @@
         <w:rPr>
           <w:rFonts w:ascii="Times New Roman" w:hAnsi="Times New Roman"/>
         </w:rPr>
-        <w:t xml:space="preserve">better:</w:t>
-      </w:r>
-      <w:r>
-        <w:rPr>
-          <w:rFonts w:ascii="Times New Roman" w:hAnsi="Times New Roman"/>
-        </w:rPr>
-        <w:t xml:space="preserve"> </w:t>
-      </w:r>
-      <w:r>
-        <w:rPr>
-          <w:rFonts w:ascii="Times New Roman" w:hAnsi="Times New Roman"/>
-        </w:rPr>
-        <w:t xml:space="preserve">discarding</w:t>
-      </w:r>
-      <w:r>
-        <w:rPr>
-          <w:rFonts w:ascii="Times New Roman" w:hAnsi="Times New Roman"/>
-        </w:rPr>
-        <w:t xml:space="preserve"> </w:t>
-      </w:r>
-      <w:r>
-        <w:rPr>
-          <w:rFonts w:ascii="Times New Roman" w:hAnsi="Times New Roman"/>
-        </w:rPr>
-        <w:t xml:space="preserve">decayed</w:t>
-      </w:r>
-      <w:r>
-        <w:rPr>
-          <w:rFonts w:ascii="Times New Roman" w:hAnsi="Times New Roman"/>
-        </w:rPr>
-        <w:t xml:space="preserve"> </w:t>
-      </w:r>
-      <w:r>
-        <w:rPr>
-          <w:rFonts w:ascii="Times New Roman" w:hAnsi="Times New Roman"/>
-        </w:rPr>
-        <w:t xml:space="preserve">shots</w:t>
-      </w:r>
-      <w:r>
-        <w:rPr>
-          <w:rFonts w:ascii="Times New Roman" w:hAnsi="Times New Roman"/>
-        </w:rPr>
-        <w:t xml:space="preserve"> </w:t>
-      </w:r>
-      <w:r>
-        <w:rPr>
-          <w:rFonts w:ascii="Times New Roman" w:hAnsi="Times New Roman"/>
-        </w:rPr>
-        <w:t xml:space="preserve">can</w:t>
-      </w:r>
-      <w:r>
-        <w:rPr>
-          <w:rFonts w:ascii="Times New Roman" w:hAnsi="Times New Roman"/>
-        </w:rPr>
-        <w:t xml:space="preserve"> </w:t>
-      </w:r>
-      <w:r>
-        <w:rPr>
-          <w:rFonts w:ascii="Times New Roman" w:hAnsi="Times New Roman"/>
-        </w:rPr>
-        <w:t xml:space="preserve">cost</w:t>
-      </w:r>
-      <w:r>
-        <w:rPr>
-          <w:rFonts w:ascii="Times New Roman" w:hAnsi="Times New Roman"/>
-        </w:rPr>
-        <w:t xml:space="preserve"> </w:t>
-      </w:r>
-      <w:r>
-        <w:rPr>
-          <w:rFonts w:ascii="Times New Roman" w:hAnsi="Times New Roman"/>
-        </w:rPr>
-        <w:t xml:space="preserve">accuracy.</w:t>
+        <w:t xml:space="preserve">better</w:t>
+      </w:r>
+      <w:r>
+        <w:rPr>
+          <w:rFonts w:ascii="Times New Roman" w:hAnsi="Times New Roman"/>
+        </w:rPr>
+        <w:t xml:space="preserve"> </w:t>
+      </w:r>
+      <w:r>
+        <w:rPr>
+          <w:rFonts w:ascii="Times New Roman" w:hAnsi="Times New Roman"/>
+        </w:rPr>
+        <w:t xml:space="preserve">in</w:t>
+      </w:r>
+      <w:r>
+        <w:rPr>
+          <w:rFonts w:ascii="Times New Roman" w:hAnsi="Times New Roman"/>
+        </w:rPr>
+        <w:t xml:space="preserve"> </w:t>
+      </w:r>
+      <w:r>
+        <w:rPr>
+          <w:rFonts w:ascii="Times New Roman" w:hAnsi="Times New Roman"/>
+        </w:rPr>
+        <w:t xml:space="preserve">one</w:t>
+      </w:r>
+      <w:r>
+        <w:rPr>
+          <w:rFonts w:ascii="Times New Roman" w:hAnsi="Times New Roman"/>
+        </w:rPr>
+        <w:t xml:space="preserve"> </w:t>
+      </w:r>
+      <w:r>
+        <w:rPr>
+          <w:rFonts w:ascii="Times New Roman" w:hAnsi="Times New Roman"/>
+        </w:rPr>
+        <w:t xml:space="preserve">study,</w:t>
+      </w:r>
+      <w:r>
+        <w:rPr>
+          <w:rFonts w:ascii="Times New Roman" w:hAnsi="Times New Roman"/>
+        </w:rPr>
+        <w:t xml:space="preserve"> </w:t>
+      </w:r>
+      <w:r>
+        <w:rPr>
+          <w:rFonts w:ascii="Times New Roman" w:hAnsi="Times New Roman"/>
+        </w:rPr>
+        <w:t xml:space="preserve">but</w:t>
+      </w:r>
+      <w:r>
+        <w:rPr>
+          <w:rFonts w:ascii="Times New Roman" w:hAnsi="Times New Roman"/>
+        </w:rPr>
+        <w:t xml:space="preserve"> </w:t>
+      </w:r>
+      <w:r>
+        <w:rPr>
+          <w:rFonts w:ascii="Times New Roman" w:hAnsi="Times New Roman"/>
+        </w:rPr>
+        <w:t xml:space="preserve">over</w:t>
+      </w:r>
+      <w:r>
+        <w:rPr>
+          <w:rFonts w:ascii="Times New Roman" w:hAnsi="Times New Roman"/>
+        </w:rPr>
+        <w:t xml:space="preserve"> </w:t>
+      </w:r>
+      <w:r>
+        <w:rPr>
+          <w:rFonts w:ascii="Times New Roman" w:hAnsi="Times New Roman"/>
+        </w:rPr>
+        <w:t xml:space="preserve">60</w:t>
+      </w:r>
+      <w:r>
+        <w:rPr>
+          <w:rFonts w:ascii="Times New Roman" w:hAnsi="Times New Roman"/>
+        </w:rPr>
+        <w:t xml:space="preserve"> </w:t>
+      </w:r>
+      <w:r>
+        <w:rPr>
+          <w:rFonts w:ascii="Times New Roman" w:hAnsi="Times New Roman"/>
+        </w:rPr>
+        <w:t xml:space="preserve">new</w:t>
+      </w:r>
+      <w:r>
+        <w:rPr>
+          <w:rFonts w:ascii="Times New Roman" w:hAnsi="Times New Roman"/>
+        </w:rPr>
+        <w:t xml:space="preserve"> </w:t>
+      </w:r>
+      <w:r>
+        <w:rPr>
+          <w:rFonts w:ascii="Times New Roman" w:hAnsi="Times New Roman"/>
+        </w:rPr>
+        <w:t xml:space="preserve">runs</w:t>
+      </w:r>
+      <w:r>
+        <w:rPr>
+          <w:rFonts w:ascii="Times New Roman" w:hAnsi="Times New Roman"/>
+        </w:rPr>
+        <w:t xml:space="preserve"> </w:t>
+      </w:r>
+      <w:r>
+        <w:rPr>
+          <w:rFonts w:ascii="Times New Roman" w:hAnsi="Times New Roman"/>
+        </w:rPr>
+        <w:t xml:space="preserve">that</w:t>
+      </w:r>
+      <w:r>
+        <w:rPr>
+          <w:rFonts w:ascii="Times New Roman" w:hAnsi="Times New Roman"/>
+        </w:rPr>
+        <w:t xml:space="preserve"> </w:t>
+      </w:r>
+      <w:r>
+        <w:rPr>
+          <w:rFonts w:ascii="Times New Roman" w:hAnsi="Times New Roman"/>
+        </w:rPr>
+        <w:t xml:space="preserve">gap</w:t>
+      </w:r>
+      <w:r>
+        <w:rPr>
+          <w:rFonts w:ascii="Times New Roman" w:hAnsi="Times New Roman"/>
+        </w:rPr>
+        <w:t xml:space="preserve"> </w:t>
+      </w:r>
+      <w:r>
+        <w:rPr>
+          <w:rFonts w:ascii="Times New Roman" w:hAnsi="Times New Roman"/>
+        </w:rPr>
+        <w:t xml:space="preserve">shrank</w:t>
+      </w:r>
+      <w:r>
+        <w:rPr>
+          <w:rFonts w:ascii="Times New Roman" w:hAnsi="Times New Roman"/>
+        </w:rPr>
+        <w:t xml:space="preserve"> </w:t>
+      </w:r>
+      <w:r>
+        <w:rPr>
+          <w:rFonts w:ascii="Times New Roman" w:hAnsi="Times New Roman"/>
+        </w:rPr>
+        <w:t xml:space="preserve">to</w:t>
+      </w:r>
+      <w:r>
+        <w:rPr>
+          <w:rFonts w:ascii="Times New Roman" w:hAnsi="Times New Roman"/>
+        </w:rPr>
+        <w:t xml:space="preserve"> </w:t>
+      </w:r>
+      <m:oMath>
+        <m:r>
+          <m:rPr>
+            <m:sty m:val="p"/>
+          </m:rPr>
+          <m:t>+</m:t>
+        </m:r>
+        <m:r>
+          <m:t>0.5</m:t>
+        </m:r>
+      </m:oMath>
+      <w:r>
+        <w:rPr>
+          <w:rFonts w:ascii="Times New Roman" w:hAnsi="Times New Roman"/>
+        </w:rPr>
+        <w:t xml:space="preserve"> </w:t>
+      </w:r>
+      <w:r>
+        <w:rPr>
+          <w:rFonts w:ascii="Times New Roman" w:hAnsi="Times New Roman"/>
+        </w:rPr>
+        <w:t xml:space="preserve">points</w:t>
+      </w:r>
+      <w:r>
+        <w:rPr>
+          <w:rFonts w:ascii="Times New Roman" w:hAnsi="Times New Roman"/>
+        </w:rPr>
+        <w:t xml:space="preserve"> </w:t>
+      </w:r>
+      <w:r>
+        <w:rPr>
+          <w:rFonts w:ascii="Times New Roman" w:hAnsi="Times New Roman"/>
+        </w:rPr>
+        <w:t xml:space="preserve">and</w:t>
+      </w:r>
+      <w:r>
+        <w:rPr>
+          <w:rFonts w:ascii="Times New Roman" w:hAnsi="Times New Roman"/>
+        </w:rPr>
+        <w:t xml:space="preserve"> </w:t>
+      </w:r>
+      <w:r>
+        <w:rPr>
+          <w:rFonts w:ascii="Times New Roman" w:hAnsi="Times New Roman"/>
+        </w:rPr>
+        <w:t xml:space="preserve">was</w:t>
+      </w:r>
+      <w:r>
+        <w:rPr>
+          <w:rFonts w:ascii="Times New Roman" w:hAnsi="Times New Roman"/>
+        </w:rPr>
+        <w:t xml:space="preserve"> </w:t>
+      </w:r>
+      <w:r>
+        <w:rPr>
+          <w:rFonts w:ascii="Times New Roman" w:hAnsi="Times New Roman"/>
+        </w:rPr>
+        <w:t xml:space="preserve">not</w:t>
+      </w:r>
+      <w:r>
+        <w:rPr>
+          <w:rFonts w:ascii="Times New Roman" w:hAnsi="Times New Roman"/>
+        </w:rPr>
+        <w:t xml:space="preserve"> </w:t>
+      </w:r>
+      <w:r>
+        <w:rPr>
+          <w:rFonts w:ascii="Times New Roman" w:hAnsi="Times New Roman"/>
+        </w:rPr>
+        <w:t xml:space="preserve">significant.</w:t>
       </w:r>
       <w:r>
         <w:rPr>
@@ -5517,7 +5666,7 @@
         <w:rPr>
           <w:rFonts w:ascii="Times New Roman" w:hAnsi="Times New Roman"/>
         </w:rPr>
-        <w:t xml:space="preserve">0.6.5,</w:t>
+        <w:t xml:space="preserve">0.6.6,</w:t>
       </w:r>
       <w:r>
         <w:rPr>
@@ -5885,19 +6034,19 @@
         <w:rPr>
           <w:rFonts w:ascii="Times New Roman" w:hAnsi="Times New Roman"/>
         </w:rPr>
-        <w:t xml:space="preserve">predictions of every study were committed to the repository before the run that tested them. Of 70</w:t>
-      </w:r>
-      <w:r>
-        <w:rPr>
-          <w:rFonts w:ascii="Times New Roman" w:hAnsi="Times New Roman"/>
-        </w:rPr>
-        <w:t xml:space="preserve"> </w:t>
-      </w:r>
-      <w:r>
-        <w:rPr>
-          <w:rFonts w:ascii="Times New Roman" w:hAnsi="Times New Roman"/>
-        </w:rPr>
-        <w:t xml:space="preserve">pre-registered predictions in the studies summarized here, 53 passed and 17 failed; the failures are</w:t>
+        <w:t xml:space="preserve">predictions of every study were committed to the repository before the run that tested them. Of 79</w:t>
+      </w:r>
+      <w:r>
+        <w:rPr>
+          <w:rFonts w:ascii="Times New Roman" w:hAnsi="Times New Roman"/>
+        </w:rPr>
+        <w:t xml:space="preserve"> </w:t>
+      </w:r>
+      <w:r>
+        <w:rPr>
+          <w:rFonts w:ascii="Times New Roman" w:hAnsi="Times New Roman"/>
+        </w:rPr>
+        <w:t xml:space="preserve">pre-registered predictions in the studies summarized here, 58 passed and 21 failed; the failures are</w:t>
       </w:r>
       <w:r>
         <w:rPr>
@@ -8652,7 +8801,31 @@
         <w:rPr>
           <w:rFonts w:ascii="Times New Roman" w:hAnsi="Times New Roman"/>
         </w:rPr>
-        <w:t xml:space="preserve">predictions for the two-channel readout, including the replication of the 1.2-point effect above.</w:t>
+        <w:t xml:space="preserve">predictions for the two-channel readout, including the replication of the 1.2-point effect above; on device</w:t>
+      </w:r>
+      <w:r>
+        <w:rPr>
+          <w:rFonts w:ascii="Times New Roman" w:hAnsi="Times New Roman"/>
+        </w:rPr>
+        <w:t xml:space="preserve"> </w:t>
+      </w:r>
+      <w:r>
+        <w:rPr>
+          <w:rFonts w:ascii="Times New Roman" w:hAnsi="Times New Roman"/>
+        </w:rPr>
+        <w:t xml:space="preserve">noise models, the filter removed less than half of the false radius deficit of product states; and three of</w:t>
+      </w:r>
+      <w:r>
+        <w:rPr>
+          <w:rFonts w:ascii="Times New Roman" w:hAnsi="Times New Roman"/>
+        </w:rPr>
+        <w:t xml:space="preserve"> </w:t>
+      </w:r>
+      <w:r>
+        <w:rPr>
+          <w:rFonts w:ascii="Times New Roman" w:hAnsi="Times New Roman"/>
+        </w:rPr>
+        <w:t xml:space="preserve">five predictions on distorting encodings, including a second replication of the 1.2-point effect.</w:t>
       </w:r>
     </w:p>
     <w:bookmarkEnd w:id="29"/>
@@ -12148,7 +12321,365 @@
         <w:rPr>
           <w:rFonts w:ascii="Times New Roman" w:hAnsi="Times New Roman"/>
         </w:rPr>
-        <w:t xml:space="preserve">). The earlier gap came with the distorting pair-product encoding.</w:t>
+        <w:t xml:space="preserve">).</w:t>
+      </w:r>
+    </w:p>
+    <w:p>
+      <w:pPr>
+        <w:numPr>
+          <w:ilvl w:val="0"/>
+          <w:numId w:val="1004"/>
+        </w:numPr>
+      </w:pPr>
+      <w:r>
+        <w:rPr>
+          <w:iCs/>
+          <w:rFonts w:ascii="Times New Roman" w:hAnsi="Times New Roman"/>
+          <w:i/>
+        </w:rPr>
+        <w:t xml:space="preserve">Distorting against faithful encoding (60 new runs).</w:t>
+      </w:r>
+      <w:r>
+        <w:rPr>
+          <w:rFonts w:ascii="Times New Roman" w:hAnsi="Times New Roman"/>
+        </w:rPr>
+        <w:t xml:space="preserve"> </w:t>
+      </w:r>
+      <w:r>
+        <w:rPr>
+          <w:rFonts w:ascii="Times New Roman" w:hAnsi="Times New Roman"/>
+        </w:rPr>
+        <w:t xml:space="preserve">Trained under T1 with the pair-product encoding</w:t>
+      </w:r>
+      <w:r>
+        <w:rPr>
+          <w:rFonts w:ascii="Times New Roman" w:hAnsi="Times New Roman"/>
+        </w:rPr>
+        <w:t xml:space="preserve"> </w:t>
+      </w:r>
+      <w:r>
+        <w:rPr>
+          <w:rFonts w:ascii="Times New Roman" w:hAnsi="Times New Roman"/>
+        </w:rPr>
+        <w:t xml:space="preserve">and the 15-weight readout, the raw model was ahead by</w:t>
+      </w:r>
+      <w:r>
+        <w:rPr>
+          <w:rFonts w:ascii="Times New Roman" w:hAnsi="Times New Roman"/>
+        </w:rPr>
+        <w:t xml:space="preserve"> </w:t>
+      </w:r>
+      <m:oMath>
+        <m:r>
+          <m:rPr>
+            <m:sty m:val="p"/>
+          </m:rPr>
+          <m:t>+</m:t>
+        </m:r>
+        <m:r>
+          <m:t>0.5</m:t>
+        </m:r>
+      </m:oMath>
+      <w:r>
+        <w:rPr>
+          <w:rFonts w:ascii="Times New Roman" w:hAnsi="Times New Roman"/>
+        </w:rPr>
+        <w:t xml:space="preserve"> </w:t>
+      </w:r>
+      <m:oMath>
+        <m:d>
+          <m:dPr>
+            <m:begChr m:val="["/>
+            <m:endChr m:val="]"/>
+            <m:sepChr m:val=""/>
+            <m:grow/>
+          </m:dPr>
+          <m:e>
+            <m:r>
+              <m:rPr>
+                <m:sty m:val="p"/>
+              </m:rPr>
+              <m:t>−</m:t>
+            </m:r>
+            <m:r>
+              <m:t>0.7</m:t>
+            </m:r>
+            <m:r>
+              <m:rPr>
+                <m:sty m:val="p"/>
+              </m:rPr>
+              <m:t>,</m:t>
+            </m:r>
+            <m:r>
+              <m:t>1.6</m:t>
+            </m:r>
+          </m:e>
+        </m:d>
+      </m:oMath>
+      <w:r>
+        <w:rPr>
+          <w:rFonts w:ascii="Times New Roman" w:hAnsi="Times New Roman"/>
+        </w:rPr>
+        <w:t xml:space="preserve"> </w:t>
+      </w:r>
+      <w:r>
+        <w:rPr>
+          <w:rFonts w:ascii="Times New Roman" w:hAnsi="Times New Roman"/>
+        </w:rPr>
+        <w:t xml:space="preserve">points, not</w:t>
+      </w:r>
+      <w:r>
+        <w:rPr>
+          <w:rFonts w:ascii="Times New Roman" w:hAnsi="Times New Roman"/>
+        </w:rPr>
+        <w:t xml:space="preserve"> </w:t>
+      </w:r>
+      <m:oMath>
+        <m:r>
+          <m:t>1.2</m:t>
+        </m:r>
+      </m:oMath>
+      <w:r>
+        <w:rPr>
+          <w:rFonts w:ascii="Times New Roman" w:hAnsi="Times New Roman"/>
+        </w:rPr>
+        <w:t xml:space="preserve">; with the dual encoding</w:t>
+      </w:r>
+      <w:r>
+        <w:rPr>
+          <w:rFonts w:ascii="Times New Roman" w:hAnsi="Times New Roman"/>
+        </w:rPr>
+        <w:t xml:space="preserve"> </w:t>
+      </w:r>
+      <w:r>
+        <w:rPr>
+          <w:rFonts w:ascii="Times New Roman" w:hAnsi="Times New Roman"/>
+        </w:rPr>
+        <w:t xml:space="preserve">it was behind by</w:t>
+      </w:r>
+      <w:r>
+        <w:rPr>
+          <w:rFonts w:ascii="Times New Roman" w:hAnsi="Times New Roman"/>
+        </w:rPr>
+        <w:t xml:space="preserve"> </w:t>
+      </w:r>
+      <m:oMath>
+        <m:r>
+          <m:rPr>
+            <m:sty m:val="p"/>
+          </m:rPr>
+          <m:t>−</m:t>
+        </m:r>
+        <m:r>
+          <m:t>0.4</m:t>
+        </m:r>
+      </m:oMath>
+      <w:r>
+        <w:rPr>
+          <w:rFonts w:ascii="Times New Roman" w:hAnsi="Times New Roman"/>
+        </w:rPr>
+        <w:t xml:space="preserve"> </w:t>
+      </w:r>
+      <m:oMath>
+        <m:d>
+          <m:dPr>
+            <m:begChr m:val="["/>
+            <m:endChr m:val="]"/>
+            <m:sepChr m:val=""/>
+            <m:grow/>
+          </m:dPr>
+          <m:e>
+            <m:r>
+              <m:rPr>
+                <m:sty m:val="p"/>
+              </m:rPr>
+              <m:t>−</m:t>
+            </m:r>
+            <m:r>
+              <m:t>1.2</m:t>
+            </m:r>
+            <m:r>
+              <m:rPr>
+                <m:sty m:val="p"/>
+              </m:rPr>
+              <m:t>,</m:t>
+            </m:r>
+            <m:r>
+              <m:t>0.4</m:t>
+            </m:r>
+          </m:e>
+        </m:d>
+      </m:oMath>
+      <w:r>
+        <w:rPr>
+          <w:rFonts w:ascii="Times New Roman" w:hAnsi="Times New Roman"/>
+        </w:rPr>
+        <w:t xml:space="preserve">, and the difference between the two (</w:t>
+      </w:r>
+      <m:oMath>
+        <m:r>
+          <m:rPr>
+            <m:sty m:val="p"/>
+          </m:rPr>
+          <m:t>+</m:t>
+        </m:r>
+        <m:r>
+          <m:t>0.9</m:t>
+        </m:r>
+      </m:oMath>
+      <w:r>
+        <w:rPr>
+          <w:rFonts w:ascii="Times New Roman" w:hAnsi="Times New Roman"/>
+        </w:rPr>
+        <w:t xml:space="preserve"> </w:t>
+      </w:r>
+      <m:oMath>
+        <m:d>
+          <m:dPr>
+            <m:begChr m:val="["/>
+            <m:endChr m:val="]"/>
+            <m:sepChr m:val=""/>
+            <m:grow/>
+          </m:dPr>
+          <m:e>
+            <m:r>
+              <m:rPr>
+                <m:sty m:val="p"/>
+              </m:rPr>
+              <m:t>−</m:t>
+            </m:r>
+            <m:r>
+              <m:t>0.6</m:t>
+            </m:r>
+            <m:r>
+              <m:rPr>
+                <m:sty m:val="p"/>
+              </m:rPr>
+              <m:t>,</m:t>
+            </m:r>
+            <m:r>
+              <m:t>2.4</m:t>
+            </m:r>
+          </m:e>
+        </m:d>
+      </m:oMath>
+      <w:r>
+        <w:rPr>
+          <w:rFonts w:ascii="Times New Roman" w:hAnsi="Times New Roman"/>
+        </w:rPr>
+        <w:t xml:space="preserve">) was not significant.</w:t>
+      </w:r>
+      <w:r>
+        <w:rPr>
+          <w:rFonts w:ascii="Times New Roman" w:hAnsi="Times New Roman"/>
+        </w:rPr>
+        <w:t xml:space="preserve"> </w:t>
+      </w:r>
+      <w:r>
+        <w:rPr>
+          <w:rFonts w:ascii="Times New Roman" w:hAnsi="Times New Roman"/>
+        </w:rPr>
+        <w:t xml:space="preserve">With the 5-weight</w:t>
+      </w:r>
+      <w:r>
+        <w:rPr>
+          <w:rFonts w:ascii="Times New Roman" w:hAnsi="Times New Roman"/>
+        </w:rPr>
+        <w:t xml:space="preserve"> </w:t>
+      </w:r>
+      <m:oMath>
+        <m:r>
+          <m:t>q</m:t>
+        </m:r>
+        <m:sSub>
+          <m:e>
+            <m:r>
+              <m:t>g</m:t>
+            </m:r>
+          </m:e>
+          <m:sub>
+            <m:r>
+              <m:t>Z</m:t>
+            </m:r>
+          </m:sub>
+        </m:sSub>
+      </m:oMath>
+      <w:r>
+        <w:rPr>
+          <w:rFonts w:ascii="Times New Roman" w:hAnsi="Times New Roman"/>
+        </w:rPr>
+        <w:t xml:space="preserve"> </w:t>
+      </w:r>
+      <w:r>
+        <w:rPr>
+          <w:rFonts w:ascii="Times New Roman" w:hAnsi="Times New Roman"/>
+        </w:rPr>
+        <w:t xml:space="preserve">readout the filter was better by</w:t>
+      </w:r>
+      <w:r>
+        <w:rPr>
+          <w:rFonts w:ascii="Times New Roman" w:hAnsi="Times New Roman"/>
+        </w:rPr>
+        <w:t xml:space="preserve"> </w:t>
+      </w:r>
+      <m:oMath>
+        <m:r>
+          <m:t>0.6</m:t>
+        </m:r>
+      </m:oMath>
+      <w:r>
+        <w:rPr>
+          <w:rFonts w:ascii="Times New Roman" w:hAnsi="Times New Roman"/>
+        </w:rPr>
+        <w:t xml:space="preserve"> </w:t>
+      </w:r>
+      <m:oMath>
+        <m:d>
+          <m:dPr>
+            <m:begChr m:val="["/>
+            <m:endChr m:val="]"/>
+            <m:sepChr m:val=""/>
+            <m:grow/>
+          </m:dPr>
+          <m:e>
+            <m:r>
+              <m:t>0.1</m:t>
+            </m:r>
+            <m:r>
+              <m:rPr>
+                <m:sty m:val="p"/>
+              </m:rPr>
+              <m:t>,</m:t>
+            </m:r>
+            <m:r>
+              <m:t>1.0</m:t>
+            </m:r>
+          </m:e>
+        </m:d>
+      </m:oMath>
+      <w:r>
+        <w:rPr>
+          <w:rFonts w:ascii="Times New Roman" w:hAnsi="Times New Roman"/>
+        </w:rPr>
+        <w:t xml:space="preserve"> </w:t>
+      </w:r>
+      <w:r>
+        <w:rPr>
+          <w:rFonts w:ascii="Times New Roman" w:hAnsi="Times New Roman"/>
+        </w:rPr>
+        <w:t xml:space="preserve">points. The one case where the filter</w:t>
+      </w:r>
+      <w:r>
+        <w:rPr>
+          <w:rFonts w:ascii="Times New Roman" w:hAnsi="Times New Roman"/>
+        </w:rPr>
+        <w:t xml:space="preserve"> </w:t>
+      </w:r>
+      <w:r>
+        <w:rPr>
+          <w:rFonts w:ascii="Times New Roman" w:hAnsi="Times New Roman"/>
+        </w:rPr>
+        <w:t xml:space="preserve">lost does not hold up as a significant effect.</w:t>
       </w:r>
     </w:p>
     <w:p>
@@ -12895,7 +13426,31 @@
         <w:rPr>
           <w:rFonts w:ascii="Times New Roman" w:hAnsi="Times New Roman"/>
         </w:rPr>
-        <w:t xml:space="preserve">value of 0.60–0.95.</w:t>
+        <w:t xml:space="preserve">value of 0.60–0.95. On five device noise models (IBM and IonQ) the filter cuts the error of this readout</w:t>
+      </w:r>
+      <w:r>
+        <w:rPr>
+          <w:rFonts w:ascii="Times New Roman" w:hAnsi="Times New Roman"/>
+        </w:rPr>
+        <w:t xml:space="preserve"> </w:t>
+      </w:r>
+      <w:r>
+        <w:rPr>
+          <w:rFonts w:ascii="Times New Roman" w:hAnsi="Times New Roman"/>
+        </w:rPr>
+        <w:t xml:space="preserve">3.2–4.0 times on trained circuits, but errors that move an excitation inside the sector pass the filter and still</w:t>
+      </w:r>
+      <w:r>
+        <w:rPr>
+          <w:rFonts w:ascii="Times New Roman" w:hAnsi="Times New Roman"/>
+        </w:rPr>
+        <w:t xml:space="preserve"> </w:t>
+      </w:r>
+      <w:r>
+        <w:rPr>
+          <w:rFonts w:ascii="Times New Roman" w:hAnsi="Times New Roman"/>
+        </w:rPr>
+        <w:t xml:space="preserve">make product states look entangled.</w:t>
       </w:r>
     </w:p>
     <w:bookmarkEnd w:id="37"/>
@@ -13144,31 +13699,31 @@
         <w:rPr>
           <w:rFonts w:ascii="Times New Roman" w:hAnsi="Times New Roman"/>
         </w:rPr>
-        <w:t xml:space="preserve">with a distorting encoding and a readout with many parameters, the decayed shots were useful data and the filter</w:t>
-      </w:r>
-      <w:r>
-        <w:rPr>
-          <w:rFonts w:ascii="Times New Roman" w:hAnsi="Times New Roman"/>
-        </w:rPr>
-        <w:t xml:space="preserve"> </w:t>
-      </w:r>
-      <w:r>
-        <w:rPr>
-          <w:rFonts w:ascii="Times New Roman" w:hAnsi="Times New Roman"/>
-        </w:rPr>
-        <w:t xml:space="preserve">cost about a point; with a faithful encoding this cost disappeared, and adding the raw features to the filtered</w:t>
-      </w:r>
-      <w:r>
-        <w:rPr>
-          <w:rFonts w:ascii="Times New Roman" w:hAnsi="Times New Roman"/>
-        </w:rPr>
-        <w:t xml:space="preserve"> </w:t>
-      </w:r>
-      <w:r>
-        <w:rPr>
-          <w:rFonts w:ascii="Times New Roman" w:hAnsi="Times New Roman"/>
-        </w:rPr>
-        <w:t xml:space="preserve">ones gained nothing. For weight-2 models, how the data are loaded matters more than what is read out. The shot</w:t>
+        <w:t xml:space="preserve">with a distorting encoding and a readout with many parameters, the decayed shots looked useful in one study (1.2</w:t>
+      </w:r>
+      <w:r>
+        <w:rPr>
+          <w:rFonts w:ascii="Times New Roman" w:hAnsi="Times New Roman"/>
+        </w:rPr>
+        <w:t xml:space="preserve"> </w:t>
+      </w:r>
+      <w:r>
+        <w:rPr>
+          <w:rFonts w:ascii="Times New Roman" w:hAnsi="Times New Roman"/>
+        </w:rPr>
+        <w:t xml:space="preserve">points), but over 60 new runs the gap was 0.5 points and not significant; with a faithful encoding it was absent,</w:t>
+      </w:r>
+      <w:r>
+        <w:rPr>
+          <w:rFonts w:ascii="Times New Roman" w:hAnsi="Times New Roman"/>
+        </w:rPr>
+        <w:t xml:space="preserve"> </w:t>
+      </w:r>
+      <w:r>
+        <w:rPr>
+          <w:rFonts w:ascii="Times New Roman" w:hAnsi="Times New Roman"/>
+        </w:rPr>
+        <w:t xml:space="preserve">and adding the raw features to the filtered ones gained nothing. For weight-2 models, how the data are loaded matters more than what is read out. The shot</w:t>
       </w:r>
       <w:r>
         <w:rPr>
@@ -13314,7 +13869,7 @@
         <w:rPr>
           <w:rFonts w:ascii="Times New Roman" w:hAnsi="Times New Roman"/>
         </w:rPr>
-        <w:t xml:space="preserve">0.6.5 (</w:t>
+        <w:t xml:space="preserve">0.6.6 (</w:t>
       </w:r>
       <w:r>
         <w:rPr>
@@ -13572,7 +14127,7 @@
         <w:rPr>
           <w:rFonts w:ascii="Times New Roman" w:hAnsi="Times New Roman"/>
         </w:rPr>
-        <w:t xml:space="preserve">and RESEARCH_NOTES §75–§82, §85, §87, §90, §91 and §94–§98, with tests in</w:t>
+        <w:t xml:space="preserve">and RESEARCH_NOTES §75–§82, §85, §87, §90, §91 and §94–§101, with tests in</w:t>
       </w:r>
       <w:r>
         <w:rPr>

</xml_diff>

<commit_message>
qang 0.6.13: QML note (EN/ES, PDF and Word) with the echo calibration of the errors the filter keeps (§104-§106); CHANGELOG, README, Zenodo metadata
</commit_message>
<xml_diff>
--- a/manuscript/qang_qml.docx
+++ b/manuscript/qang_qml.docx
@@ -4388,7 +4388,547 @@
         <w:rPr>
           <w:rFonts w:ascii="Times New Roman" w:hAnsi="Times New Roman"/>
         </w:rPr>
-        <w:t xml:space="preserve">one.</w:t>
+        <w:t xml:space="preserve">one,</w:t>
+      </w:r>
+      <w:r>
+        <w:rPr>
+          <w:rFonts w:ascii="Times New Roman" w:hAnsi="Times New Roman"/>
+        </w:rPr>
+        <w:t xml:space="preserve"> </w:t>
+      </w:r>
+      <w:r>
+        <w:rPr>
+          <w:rFonts w:ascii="Times New Roman" w:hAnsi="Times New Roman"/>
+        </w:rPr>
+        <w:t xml:space="preserve">and</w:t>
+      </w:r>
+      <w:r>
+        <w:rPr>
+          <w:rFonts w:ascii="Times New Roman" w:hAnsi="Times New Roman"/>
+        </w:rPr>
+        <w:t xml:space="preserve"> </w:t>
+      </w:r>
+      <w:r>
+        <w:rPr>
+          <w:rFonts w:ascii="Times New Roman" w:hAnsi="Times New Roman"/>
+        </w:rPr>
+        <w:t xml:space="preserve">calibrating</w:t>
+      </w:r>
+      <w:r>
+        <w:rPr>
+          <w:rFonts w:ascii="Times New Roman" w:hAnsi="Times New Roman"/>
+        </w:rPr>
+        <w:t xml:space="preserve"> </w:t>
+      </w:r>
+      <w:r>
+        <w:rPr>
+          <w:rFonts w:ascii="Times New Roman" w:hAnsi="Times New Roman"/>
+        </w:rPr>
+        <w:t xml:space="preserve">the</w:t>
+      </w:r>
+      <w:r>
+        <w:rPr>
+          <w:rFonts w:ascii="Times New Roman" w:hAnsi="Times New Roman"/>
+        </w:rPr>
+        <w:t xml:space="preserve"> </w:t>
+      </w:r>
+      <w:r>
+        <w:rPr>
+          <w:rFonts w:ascii="Times New Roman" w:hAnsi="Times New Roman"/>
+        </w:rPr>
+        <w:t xml:space="preserve">errors</w:t>
+      </w:r>
+      <w:r>
+        <w:rPr>
+          <w:rFonts w:ascii="Times New Roman" w:hAnsi="Times New Roman"/>
+        </w:rPr>
+        <w:t xml:space="preserve"> </w:t>
+      </w:r>
+      <w:r>
+        <w:rPr>
+          <w:rFonts w:ascii="Times New Roman" w:hAnsi="Times New Roman"/>
+        </w:rPr>
+        <w:t xml:space="preserve">the</w:t>
+      </w:r>
+      <w:r>
+        <w:rPr>
+          <w:rFonts w:ascii="Times New Roman" w:hAnsi="Times New Roman"/>
+        </w:rPr>
+        <w:t xml:space="preserve"> </w:t>
+      </w:r>
+      <w:r>
+        <w:rPr>
+          <w:rFonts w:ascii="Times New Roman" w:hAnsi="Times New Roman"/>
+        </w:rPr>
+        <w:t xml:space="preserve">filter</w:t>
+      </w:r>
+      <w:r>
+        <w:rPr>
+          <w:rFonts w:ascii="Times New Roman" w:hAnsi="Times New Roman"/>
+        </w:rPr>
+        <w:t xml:space="preserve"> </w:t>
+      </w:r>
+      <w:r>
+        <w:rPr>
+          <w:rFonts w:ascii="Times New Roman" w:hAnsi="Times New Roman"/>
+        </w:rPr>
+        <w:t xml:space="preserve">keeps</w:t>
+      </w:r>
+      <w:r>
+        <w:rPr>
+          <w:rFonts w:ascii="Times New Roman" w:hAnsi="Times New Roman"/>
+        </w:rPr>
+        <w:t xml:space="preserve"> </w:t>
+      </w:r>
+      <w:r>
+        <w:rPr>
+          <w:rFonts w:ascii="Times New Roman" w:hAnsi="Times New Roman"/>
+        </w:rPr>
+        <w:t xml:space="preserve">with</w:t>
+      </w:r>
+      <w:r>
+        <w:rPr>
+          <w:rFonts w:ascii="Times New Roman" w:hAnsi="Times New Roman"/>
+        </w:rPr>
+        <w:t xml:space="preserve"> </w:t>
+      </w:r>
+      <w:r>
+        <w:rPr>
+          <w:rFonts w:ascii="Times New Roman" w:hAnsi="Times New Roman"/>
+        </w:rPr>
+        <w:t xml:space="preserve">five</w:t>
+      </w:r>
+      <w:r>
+        <w:rPr>
+          <w:rFonts w:ascii="Times New Roman" w:hAnsi="Times New Roman"/>
+        </w:rPr>
+        <w:t xml:space="preserve"> </w:t>
+      </w:r>
+      <w:r>
+        <w:rPr>
+          <w:rFonts w:ascii="Times New Roman" w:hAnsi="Times New Roman"/>
+        </w:rPr>
+        <w:t xml:space="preserve">echo</w:t>
+      </w:r>
+      <w:r>
+        <w:rPr>
+          <w:rFonts w:ascii="Times New Roman" w:hAnsi="Times New Roman"/>
+        </w:rPr>
+        <w:t xml:space="preserve"> </w:t>
+      </w:r>
+      <w:r>
+        <w:rPr>
+          <w:rFonts w:ascii="Times New Roman" w:hAnsi="Times New Roman"/>
+        </w:rPr>
+        <w:t xml:space="preserve">circuits</w:t>
+      </w:r>
+      <w:r>
+        <w:rPr>
+          <w:rFonts w:ascii="Times New Roman" w:hAnsi="Times New Roman"/>
+        </w:rPr>
+        <w:t xml:space="preserve"> </w:t>
+      </w:r>
+      <w:r>
+        <w:rPr>
+          <w:rFonts w:ascii="Times New Roman" w:hAnsi="Times New Roman"/>
+        </w:rPr>
+        <w:t xml:space="preserve">per</w:t>
+      </w:r>
+      <w:r>
+        <w:rPr>
+          <w:rFonts w:ascii="Times New Roman" w:hAnsi="Times New Roman"/>
+        </w:rPr>
+        <w:t xml:space="preserve"> </w:t>
+      </w:r>
+      <w:r>
+        <w:rPr>
+          <w:rFonts w:ascii="Times New Roman" w:hAnsi="Times New Roman"/>
+        </w:rPr>
+        <w:t xml:space="preserve">model</w:t>
+      </w:r>
+      <w:r>
+        <w:rPr>
+          <w:rFonts w:ascii="Times New Roman" w:hAnsi="Times New Roman"/>
+        </w:rPr>
+        <w:t xml:space="preserve"> </w:t>
+      </w:r>
+      <w:r>
+        <w:rPr>
+          <w:rFonts w:ascii="Times New Roman" w:hAnsi="Times New Roman"/>
+        </w:rPr>
+        <w:t xml:space="preserve">halves</w:t>
+      </w:r>
+      <w:r>
+        <w:rPr>
+          <w:rFonts w:ascii="Times New Roman" w:hAnsi="Times New Roman"/>
+        </w:rPr>
+        <w:t xml:space="preserve"> </w:t>
+      </w:r>
+      <w:r>
+        <w:rPr>
+          <w:rFonts w:ascii="Times New Roman" w:hAnsi="Times New Roman"/>
+        </w:rPr>
+        <w:t xml:space="preserve">the</w:t>
+      </w:r>
+      <w:r>
+        <w:rPr>
+          <w:rFonts w:ascii="Times New Roman" w:hAnsi="Times New Roman"/>
+        </w:rPr>
+        <w:t xml:space="preserve"> </w:t>
+      </w:r>
+      <w:r>
+        <w:rPr>
+          <w:rFonts w:ascii="Times New Roman" w:hAnsi="Times New Roman"/>
+        </w:rPr>
+        <w:t xml:space="preserve">remaining</w:t>
+      </w:r>
+      <w:r>
+        <w:rPr>
+          <w:rFonts w:ascii="Times New Roman" w:hAnsi="Times New Roman"/>
+        </w:rPr>
+        <w:t xml:space="preserve"> </w:t>
+      </w:r>
+      <w:r>
+        <w:rPr>
+          <w:rFonts w:ascii="Times New Roman" w:hAnsi="Times New Roman"/>
+        </w:rPr>
+        <w:t xml:space="preserve">error</w:t>
+      </w:r>
+      <w:r>
+        <w:rPr>
+          <w:rFonts w:ascii="Times New Roman" w:hAnsi="Times New Roman"/>
+        </w:rPr>
+        <w:t xml:space="preserve"> </w:t>
+      </w:r>
+      <w:r>
+        <w:rPr>
+          <w:rFonts w:ascii="Times New Roman" w:hAnsi="Times New Roman"/>
+        </w:rPr>
+        <w:t xml:space="preserve">of</w:t>
+      </w:r>
+      <w:r>
+        <w:rPr>
+          <w:rFonts w:ascii="Times New Roman" w:hAnsi="Times New Roman"/>
+        </w:rPr>
+        <w:t xml:space="preserve"> </w:t>
+      </w:r>
+      <w:r>
+        <w:rPr>
+          <w:rFonts w:ascii="Times New Roman" w:hAnsi="Times New Roman"/>
+        </w:rPr>
+        <w:t xml:space="preserve">the</w:t>
+      </w:r>
+      <w:r>
+        <w:rPr>
+          <w:rFonts w:ascii="Times New Roman" w:hAnsi="Times New Roman"/>
+        </w:rPr>
+        <w:t xml:space="preserve"> </w:t>
+      </w:r>
+      <w:r>
+        <w:rPr>
+          <w:rFonts w:ascii="Times New Roman" w:hAnsi="Times New Roman"/>
+        </w:rPr>
+        <w:t xml:space="preserve">decision</w:t>
+      </w:r>
+      <w:r>
+        <w:rPr>
+          <w:rFonts w:ascii="Times New Roman" w:hAnsi="Times New Roman"/>
+        </w:rPr>
+        <w:t xml:space="preserve"> </w:t>
+      </w:r>
+      <w:r>
+        <w:rPr>
+          <w:rFonts w:ascii="Times New Roman" w:hAnsi="Times New Roman"/>
+        </w:rPr>
+        <w:t xml:space="preserve">value:</w:t>
+      </w:r>
+      <w:r>
+        <w:rPr>
+          <w:rFonts w:ascii="Times New Roman" w:hAnsi="Times New Roman"/>
+        </w:rPr>
+        <w:t xml:space="preserve"> </w:t>
+      </w:r>
+      <w:r>
+        <w:rPr>
+          <w:rFonts w:ascii="Times New Roman" w:hAnsi="Times New Roman"/>
+        </w:rPr>
+        <w:t xml:space="preserve">decisions</w:t>
+      </w:r>
+      <w:r>
+        <w:rPr>
+          <w:rFonts w:ascii="Times New Roman" w:hAnsi="Times New Roman"/>
+        </w:rPr>
+        <w:t xml:space="preserve"> </w:t>
+      </w:r>
+      <w:r>
+        <w:rPr>
+          <w:rFonts w:ascii="Times New Roman" w:hAnsi="Times New Roman"/>
+        </w:rPr>
+        <w:t xml:space="preserve">that</w:t>
+      </w:r>
+      <w:r>
+        <w:rPr>
+          <w:rFonts w:ascii="Times New Roman" w:hAnsi="Times New Roman"/>
+        </w:rPr>
+        <w:t xml:space="preserve"> </w:t>
+      </w:r>
+      <w:r>
+        <w:rPr>
+          <w:rFonts w:ascii="Times New Roman" w:hAnsi="Times New Roman"/>
+        </w:rPr>
+        <w:t xml:space="preserve">differ</w:t>
+      </w:r>
+      <w:r>
+        <w:rPr>
+          <w:rFonts w:ascii="Times New Roman" w:hAnsi="Times New Roman"/>
+        </w:rPr>
+        <w:t xml:space="preserve"> </w:t>
+      </w:r>
+      <w:r>
+        <w:rPr>
+          <w:rFonts w:ascii="Times New Roman" w:hAnsi="Times New Roman"/>
+        </w:rPr>
+        <w:t xml:space="preserve">from</w:t>
+      </w:r>
+      <w:r>
+        <w:rPr>
+          <w:rFonts w:ascii="Times New Roman" w:hAnsi="Times New Roman"/>
+        </w:rPr>
+        <w:t xml:space="preserve"> </w:t>
+      </w:r>
+      <w:r>
+        <w:rPr>
+          <w:rFonts w:ascii="Times New Roman" w:hAnsi="Times New Roman"/>
+        </w:rPr>
+        <w:t xml:space="preserve">the</w:t>
+      </w:r>
+      <w:r>
+        <w:rPr>
+          <w:rFonts w:ascii="Times New Roman" w:hAnsi="Times New Roman"/>
+        </w:rPr>
+        <w:t xml:space="preserve"> </w:t>
+      </w:r>
+      <w:r>
+        <w:rPr>
+          <w:rFonts w:ascii="Times New Roman" w:hAnsi="Times New Roman"/>
+        </w:rPr>
+        <w:t xml:space="preserve">noiseless</w:t>
+      </w:r>
+      <w:r>
+        <w:rPr>
+          <w:rFonts w:ascii="Times New Roman" w:hAnsi="Times New Roman"/>
+        </w:rPr>
+        <w:t xml:space="preserve"> </w:t>
+      </w:r>
+      <w:r>
+        <w:rPr>
+          <w:rFonts w:ascii="Times New Roman" w:hAnsi="Times New Roman"/>
+        </w:rPr>
+        <w:t xml:space="preserve">model</w:t>
+      </w:r>
+      <w:r>
+        <w:rPr>
+          <w:rFonts w:ascii="Times New Roman" w:hAnsi="Times New Roman"/>
+        </w:rPr>
+        <w:t xml:space="preserve"> </w:t>
+      </w:r>
+      <w:r>
+        <w:rPr>
+          <w:rFonts w:ascii="Times New Roman" w:hAnsi="Times New Roman"/>
+        </w:rPr>
+        <w:t xml:space="preserve">fall</w:t>
+      </w:r>
+      <w:r>
+        <w:rPr>
+          <w:rFonts w:ascii="Times New Roman" w:hAnsi="Times New Roman"/>
+        </w:rPr>
+        <w:t xml:space="preserve"> </w:t>
+      </w:r>
+      <w:r>
+        <w:rPr>
+          <w:rFonts w:ascii="Times New Roman" w:hAnsi="Times New Roman"/>
+        </w:rPr>
+        <w:t xml:space="preserve">from</w:t>
+      </w:r>
+      <w:r>
+        <w:rPr>
+          <w:rFonts w:ascii="Times New Roman" w:hAnsi="Times New Roman"/>
+        </w:rPr>
+        <w:t xml:space="preserve"> </w:t>
+      </w:r>
+      <w:r>
+        <w:rPr>
+          <w:rFonts w:ascii="Times New Roman" w:hAnsi="Times New Roman"/>
+        </w:rPr>
+        <w:t xml:space="preserve">15</w:t>
+      </w:r>
+      <w:r>
+        <w:rPr>
+          <w:rFonts w:ascii="Times New Roman" w:hAnsi="Times New Roman"/>
+        </w:rPr>
+        <w:t xml:space="preserve"> </w:t>
+      </w:r>
+      <w:r>
+        <w:rPr>
+          <w:rFonts w:ascii="Times New Roman" w:hAnsi="Times New Roman"/>
+        </w:rPr>
+        <w:t xml:space="preserve">(raw)</w:t>
+      </w:r>
+      <w:r>
+        <w:rPr>
+          <w:rFonts w:ascii="Times New Roman" w:hAnsi="Times New Roman"/>
+        </w:rPr>
+        <w:t xml:space="preserve"> </w:t>
+      </w:r>
+      <w:r>
+        <w:rPr>
+          <w:rFonts w:ascii="Times New Roman" w:hAnsi="Times New Roman"/>
+        </w:rPr>
+        <w:t xml:space="preserve">and</w:t>
+      </w:r>
+      <w:r>
+        <w:rPr>
+          <w:rFonts w:ascii="Times New Roman" w:hAnsi="Times New Roman"/>
+        </w:rPr>
+        <w:t xml:space="preserve"> </w:t>
+      </w:r>
+      <w:r>
+        <w:rPr>
+          <w:rFonts w:ascii="Times New Roman" w:hAnsi="Times New Roman"/>
+        </w:rPr>
+        <w:t xml:space="preserve">7</w:t>
+      </w:r>
+      <w:r>
+        <w:rPr>
+          <w:rFonts w:ascii="Times New Roman" w:hAnsi="Times New Roman"/>
+        </w:rPr>
+        <w:t xml:space="preserve"> </w:t>
+      </w:r>
+      <w:r>
+        <w:rPr>
+          <w:rFonts w:ascii="Times New Roman" w:hAnsi="Times New Roman"/>
+        </w:rPr>
+        <w:t xml:space="preserve">(filter)</w:t>
+      </w:r>
+      <w:r>
+        <w:rPr>
+          <w:rFonts w:ascii="Times New Roman" w:hAnsi="Times New Roman"/>
+        </w:rPr>
+        <w:t xml:space="preserve"> </w:t>
+      </w:r>
+      <w:r>
+        <w:rPr>
+          <w:rFonts w:ascii="Times New Roman" w:hAnsi="Times New Roman"/>
+        </w:rPr>
+        <w:t xml:space="preserve">to</w:t>
+      </w:r>
+      <w:r>
+        <w:rPr>
+          <w:rFonts w:ascii="Times New Roman" w:hAnsi="Times New Roman"/>
+        </w:rPr>
+        <w:t xml:space="preserve"> </w:t>
+      </w:r>
+      <w:r>
+        <w:rPr>
+          <w:rFonts w:ascii="Times New Roman" w:hAnsi="Times New Roman"/>
+        </w:rPr>
+        <w:t xml:space="preserve">3</w:t>
+      </w:r>
+      <w:r>
+        <w:rPr>
+          <w:rFonts w:ascii="Times New Roman" w:hAnsi="Times New Roman"/>
+        </w:rPr>
+        <w:t xml:space="preserve"> </w:t>
+      </w:r>
+      <w:r>
+        <w:rPr>
+          <w:rFonts w:ascii="Times New Roman" w:hAnsi="Times New Roman"/>
+        </w:rPr>
+        <w:t xml:space="preserve">over</w:t>
+      </w:r>
+      <w:r>
+        <w:rPr>
+          <w:rFonts w:ascii="Times New Roman" w:hAnsi="Times New Roman"/>
+        </w:rPr>
+        <w:t xml:space="preserve"> </w:t>
+      </w:r>
+      <w:r>
+        <w:rPr>
+          <w:rFonts w:ascii="Times New Roman" w:hAnsi="Times New Roman"/>
+        </w:rPr>
+        <w:t xml:space="preserve">945</w:t>
+      </w:r>
+      <w:r>
+        <w:rPr>
+          <w:rFonts w:ascii="Times New Roman" w:hAnsi="Times New Roman"/>
+        </w:rPr>
+        <w:t xml:space="preserve"> </w:t>
+      </w:r>
+      <w:r>
+        <w:rPr>
+          <w:rFonts w:ascii="Times New Roman" w:hAnsi="Times New Roman"/>
+        </w:rPr>
+        <w:t xml:space="preserve">readings</w:t>
+      </w:r>
+      <w:r>
+        <w:rPr>
+          <w:rFonts w:ascii="Times New Roman" w:hAnsi="Times New Roman"/>
+        </w:rPr>
+        <w:t xml:space="preserve"> </w:t>
+      </w:r>
+      <w:r>
+        <w:rPr>
+          <w:rFonts w:ascii="Times New Roman" w:hAnsi="Times New Roman"/>
+        </w:rPr>
+        <w:t xml:space="preserve">on</w:t>
+      </w:r>
+      <w:r>
+        <w:rPr>
+          <w:rFonts w:ascii="Times New Roman" w:hAnsi="Times New Roman"/>
+        </w:rPr>
+        <w:t xml:space="preserve"> </w:t>
+      </w:r>
+      <w:r>
+        <w:rPr>
+          <w:rFonts w:ascii="Times New Roman" w:hAnsi="Times New Roman"/>
+        </w:rPr>
+        <w:t xml:space="preserve">five</w:t>
+      </w:r>
+      <w:r>
+        <w:rPr>
+          <w:rFonts w:ascii="Times New Roman" w:hAnsi="Times New Roman"/>
+        </w:rPr>
+        <w:t xml:space="preserve"> </w:t>
+      </w:r>
+      <w:r>
+        <w:rPr>
+          <w:rFonts w:ascii="Times New Roman" w:hAnsi="Times New Roman"/>
+        </w:rPr>
+        <w:t xml:space="preserve">device</w:t>
+      </w:r>
+      <w:r>
+        <w:rPr>
+          <w:rFonts w:ascii="Times New Roman" w:hAnsi="Times New Roman"/>
+        </w:rPr>
+        <w:t xml:space="preserve"> </w:t>
+      </w:r>
+      <w:r>
+        <w:rPr>
+          <w:rFonts w:ascii="Times New Roman" w:hAnsi="Times New Roman"/>
+        </w:rPr>
+        <w:t xml:space="preserve">noise</w:t>
+      </w:r>
+      <w:r>
+        <w:rPr>
+          <w:rFonts w:ascii="Times New Roman" w:hAnsi="Times New Roman"/>
+        </w:rPr>
+        <w:t xml:space="preserve"> </w:t>
+      </w:r>
+      <w:r>
+        <w:rPr>
+          <w:rFonts w:ascii="Times New Roman" w:hAnsi="Times New Roman"/>
+        </w:rPr>
+        <w:t xml:space="preserve">models.</w:t>
       </w:r>
       <w:r>
         <w:rPr>
@@ -5666,7 +6206,7 @@
         <w:rPr>
           <w:rFonts w:ascii="Times New Roman" w:hAnsi="Times New Roman"/>
         </w:rPr>
-        <w:t xml:space="preserve">0.6.6,</w:t>
+        <w:t xml:space="preserve">0.6.13,</w:t>
       </w:r>
       <w:r>
         <w:rPr>
@@ -6034,19 +6574,7 @@
         <w:rPr>
           <w:rFonts w:ascii="Times New Roman" w:hAnsi="Times New Roman"/>
         </w:rPr>
-        <w:t xml:space="preserve">predictions of every study were committed to the repository before the run that tested them. Of 79</w:t>
-      </w:r>
-      <w:r>
-        <w:rPr>
-          <w:rFonts w:ascii="Times New Roman" w:hAnsi="Times New Roman"/>
-        </w:rPr>
-        <w:t xml:space="preserve"> </w:t>
-      </w:r>
-      <w:r>
-        <w:rPr>
-          <w:rFonts w:ascii="Times New Roman" w:hAnsi="Times New Roman"/>
-        </w:rPr>
-        <w:t xml:space="preserve">pre-registered predictions in the studies summarized here, 58 passed and 21 failed; the failures are</w:t>
+        <w:t xml:space="preserve">predictions of every study were committed to the repository before the run that tested them. Of 91 pre-registered predictions in the studies summarized here, 70 passed and 21 failed; the failures are</w:t>
       </w:r>
       <w:r>
         <w:rPr>
@@ -8324,7 +8852,7 @@
       </w:r>
     </w:p>
     <w:bookmarkEnd w:id="28"/>
-    <w:bookmarkStart w:id="38" w:name="results"/>
+    <w:bookmarkStart w:id="39" w:name="results"/>
     <w:p>
       <w:pPr>
         <w:pStyle w:val="Heading1"/>
@@ -8770,7 +9298,7 @@
           <w:rPr>
             <w:rStyle w:val="Hyperlink"/>
           </w:rPr>
-          <w:t xml:space="preserve">4.0.0.5</w:t>
+          <w:t xml:space="preserve">4.0.0.6</w:t>
         </w:r>
       </w:hyperlink>
       <w:r>
@@ -12014,7 +12542,7 @@
       </w:r>
     </w:p>
     <w:bookmarkEnd w:id="36"/>
-    <w:bookmarkStart w:id="37" w:name="sec:scaling"/>
+    <w:bookmarkStart w:id="37" w:name="sec:echo"/>
     <w:p>
       <w:pPr>
         <w:pStyle w:val="Heading4"/>
@@ -12023,7 +12551,299 @@
         <w:rPr>
           <w:rFonts w:ascii="Times New Roman" w:hAnsi="Times New Roman"/>
         </w:rPr>
-        <w:t xml:space="preserve">Two channels, shot cost and what else the filter reads.</w:t>
+        <w:t xml:space="preserve">Echo calibration of the errors the filter keeps.</w:t>
+      </w:r>
+    </w:p>
+    <w:p>
+      <w:pPr>
+        <w:pStyle w:val="FirstParagraph"/>
+      </w:pPr>
+      <w:r>
+        <w:rPr>
+          <w:rFonts w:ascii="Times New Roman" w:hAnsi="Times New Roman"/>
+        </w:rPr>
+        <w:t xml:space="preserve">The filter discards shots that left the</w:t>
+      </w:r>
+      <w:r>
+        <w:rPr>
+          <w:rFonts w:ascii="Times New Roman" w:hAnsi="Times New Roman"/>
+        </w:rPr>
+        <w:t xml:space="preserve"> </w:t>
+      </w:r>
+      <w:r>
+        <w:rPr>
+          <w:rFonts w:ascii="Times New Roman" w:hAnsi="Times New Roman"/>
+        </w:rPr>
+        <w:t xml:space="preserve">sector, but errors that move an excitation inside it pass: on the device noise models 8–23% of the kept shots of a</w:t>
+      </w:r>
+      <w:r>
+        <w:rPr>
+          <w:rFonts w:ascii="Times New Roman" w:hAnsi="Times New Roman"/>
+        </w:rPr>
+        <w:t xml:space="preserve"> </w:t>
+      </w:r>
+      <w:r>
+        <w:rPr>
+          <w:rFonts w:ascii="Times New Roman" w:hAnsi="Times New Roman"/>
+        </w:rPr>
+        <w:t xml:space="preserve">product state put the excitation on the wrong qubit. An echo circuit (qubit</w:t>
+      </w:r>
+      <w:r>
+        <w:rPr>
+          <w:rFonts w:ascii="Times New Roman" w:hAnsi="Times New Roman"/>
+        </w:rPr>
+        <w:t xml:space="preserve"> </w:t>
+      </w:r>
+      <m:oMath>
+        <m:r>
+          <m:t>j</m:t>
+        </m:r>
+      </m:oMath>
+      <w:r>
+        <w:rPr>
+          <w:rFonts w:ascii="Times New Roman" w:hAnsi="Times New Roman"/>
+        </w:rPr>
+        <w:t xml:space="preserve"> </w:t>
+      </w:r>
+      <w:r>
+        <w:rPr>
+          <w:rFonts w:ascii="Times New Roman" w:hAnsi="Times New Roman"/>
+        </w:rPr>
+        <w:t xml:space="preserve">excited, the 15 trained RBS gates and</w:t>
+      </w:r>
+      <w:r>
+        <w:rPr>
+          <w:rFonts w:ascii="Times New Roman" w:hAnsi="Times New Roman"/>
+        </w:rPr>
+        <w:t xml:space="preserve"> </w:t>
+      </w:r>
+      <w:r>
+        <w:rPr>
+          <w:rFonts w:ascii="Times New Roman" w:hAnsi="Times New Roman"/>
+        </w:rPr>
+        <w:t xml:space="preserve">their inverse) should return qubit</w:t>
+      </w:r>
+      <w:r>
+        <w:rPr>
+          <w:rFonts w:ascii="Times New Roman" w:hAnsi="Times New Roman"/>
+        </w:rPr>
+        <w:t xml:space="preserve"> </w:t>
+      </w:r>
+      <m:oMath>
+        <m:r>
+          <m:t>j</m:t>
+        </m:r>
+      </m:oMath>
+      <w:r>
+        <w:rPr>
+          <w:rFonts w:ascii="Times New Roman" w:hAnsi="Times New Roman"/>
+        </w:rPr>
+        <w:t xml:space="preserve">; its filtered distribution is column</w:t>
+      </w:r>
+      <w:r>
+        <w:rPr>
+          <w:rFonts w:ascii="Times New Roman" w:hAnsi="Times New Roman"/>
+        </w:rPr>
+        <w:t xml:space="preserve"> </w:t>
+      </w:r>
+      <m:oMath>
+        <m:r>
+          <m:t>j</m:t>
+        </m:r>
+      </m:oMath>
+      <w:r>
+        <w:rPr>
+          <w:rFonts w:ascii="Times New Roman" w:hAnsi="Times New Roman"/>
+        </w:rPr>
+        <w:t xml:space="preserve"> </w:t>
+      </w:r>
+      <w:r>
+        <w:rPr>
+          <w:rFonts w:ascii="Times New Roman" w:hAnsi="Times New Roman"/>
+        </w:rPr>
+        <w:t xml:space="preserve">of a</w:t>
+      </w:r>
+      <w:r>
+        <w:rPr>
+          <w:rFonts w:ascii="Times New Roman" w:hAnsi="Times New Roman"/>
+        </w:rPr>
+        <w:t xml:space="preserve"> </w:t>
+      </w:r>
+      <m:oMath>
+        <m:r>
+          <m:t>5</m:t>
+        </m:r>
+        <m:r>
+          <m:rPr>
+            <m:sty m:val="p"/>
+          </m:rPr>
+          <m:t>×</m:t>
+        </m:r>
+        <m:r>
+          <m:t>5</m:t>
+        </m:r>
+      </m:oMath>
+      <w:r>
+        <w:rPr>
+          <w:rFonts w:ascii="Times New Roman" w:hAnsi="Times New Roman"/>
+        </w:rPr>
+        <w:t xml:space="preserve"> </w:t>
+      </w:r>
+      <w:r>
+        <w:rPr>
+          <w:rFonts w:ascii="Times New Roman" w:hAnsi="Times New Roman"/>
+        </w:rPr>
+        <w:t xml:space="preserve">transfer matrix</w:t>
+      </w:r>
+      <w:r>
+        <w:rPr>
+          <w:rFonts w:ascii="Times New Roman" w:hAnsi="Times New Roman"/>
+        </w:rPr>
+        <w:t xml:space="preserve"> </w:t>
+      </w:r>
+      <m:oMath>
+        <m:r>
+          <m:t>M</m:t>
+        </m:r>
+      </m:oMath>
+      <w:r>
+        <w:rPr>
+          <w:rFonts w:ascii="Times New Roman" w:hAnsi="Times New Roman"/>
+        </w:rPr>
+        <w:t xml:space="preserve">,</w:t>
+      </w:r>
+      <w:r>
+        <w:rPr>
+          <w:rFonts w:ascii="Times New Roman" w:hAnsi="Times New Roman"/>
+        </w:rPr>
+        <w:t xml:space="preserve"> </w:t>
+      </w:r>
+      <w:r>
+        <w:rPr>
+          <w:rFonts w:ascii="Times New Roman" w:hAnsi="Times New Roman"/>
+        </w:rPr>
+        <w:t xml:space="preserve">and inverting</w:t>
+      </w:r>
+      <w:r>
+        <w:rPr>
+          <w:rFonts w:ascii="Times New Roman" w:hAnsi="Times New Roman"/>
+        </w:rPr>
+        <w:t xml:space="preserve"> </w:t>
+      </w:r>
+      <m:oMath>
+        <m:sSup>
+          <m:e>
+            <m:r>
+              <m:t>M</m:t>
+            </m:r>
+          </m:e>
+          <m:sup>
+            <m:r>
+              <m:t>1</m:t>
+            </m:r>
+            <m:r>
+              <m:rPr>
+                <m:sty m:val="p"/>
+              </m:rPr>
+              <m:t>/</m:t>
+            </m:r>
+            <m:r>
+              <m:t>2</m:t>
+            </m:r>
+          </m:sup>
+        </m:sSup>
+      </m:oMath>
+      <w:r>
+        <w:rPr>
+          <w:rFonts w:ascii="Times New Roman" w:hAnsi="Times New Roman"/>
+        </w:rPr>
+        <w:t xml:space="preserve"> </w:t>
+      </w:r>
+      <w:r>
+        <w:rPr>
+          <w:rFonts w:ascii="Times New Roman" w:hAnsi="Times New Roman"/>
+        </w:rPr>
+        <w:t xml:space="preserve">on the filtered distribution of each input mitigates those errors, as readout mitigation does</w:t>
+      </w:r>
+      <w:r>
+        <w:rPr>
+          <w:rFonts w:ascii="Times New Roman" w:hAnsi="Times New Roman"/>
+        </w:rPr>
+        <w:t xml:space="preserve"> </w:t>
+      </w:r>
+      <w:r>
+        <w:rPr>
+          <w:rFonts w:ascii="Times New Roman" w:hAnsi="Times New Roman"/>
+        </w:rPr>
+        <w:t xml:space="preserve">for bit flips (</w:t>
+      </w:r>
+      <w:r>
+        <w:rPr>
+          <w:rStyle w:val="VerbatimChar"/>
+          <w:rFonts w:ascii="Times New Roman" w:hAnsi="Times New Roman"/>
+        </w:rPr>
+        <w:t xml:space="preserve">qang.sectors.echo_transfer_matrix</w:t>
+      </w:r>
+      <w:r>
+        <w:rPr>
+          <w:rFonts w:ascii="Times New Roman" w:hAnsi="Times New Roman"/>
+        </w:rPr>
+        <w:t xml:space="preserve">,</w:t>
+      </w:r>
+      <w:r>
+        <w:rPr>
+          <w:rFonts w:ascii="Times New Roman" w:hAnsi="Times New Roman"/>
+        </w:rPr>
+        <w:t xml:space="preserve"> </w:t>
+      </w:r>
+      <w:r>
+        <w:rPr>
+          <w:rStyle w:val="VerbatimChar"/>
+          <w:rFonts w:ascii="Times New Roman" w:hAnsi="Times New Roman"/>
+        </w:rPr>
+        <w:t xml:space="preserve">unmix_sector</w:t>
+      </w:r>
+      <w:r>
+        <w:rPr>
+          <w:rFonts w:ascii="Times New Roman" w:hAnsi="Times New Roman"/>
+        </w:rPr>
+        <w:t xml:space="preserve">). With 5 echo circuits per</w:t>
+      </w:r>
+      <w:r>
+        <w:rPr>
+          <w:rFonts w:ascii="Times New Roman" w:hAnsi="Times New Roman"/>
+        </w:rPr>
+        <w:t xml:space="preserve"> </w:t>
+      </w:r>
+      <w:r>
+        <w:rPr>
+          <w:rFonts w:ascii="Times New Roman" w:hAnsi="Times New Roman"/>
+        </w:rPr>
+        <w:t xml:space="preserve">trained model, on the 189 inputs of the four datasets, the three IBM noise models and the IonQ simulator in its</w:t>
+      </w:r>
+      <w:r>
+        <w:rPr>
+          <w:rFonts w:ascii="Times New Roman" w:hAnsi="Times New Roman"/>
+        </w:rPr>
+        <w:t xml:space="preserve"> </w:t>
+      </w:r>
+      <w:r>
+        <w:rPr>
+          <w:rFonts w:ascii="Times New Roman" w:hAnsi="Times New Roman"/>
+        </w:rPr>
+        <w:t xml:space="preserve">native gate set (IonQ’s compiler removes identities from circuits in its standard gate set, so echoes must be sent</w:t>
+      </w:r>
+      <w:r>
+        <w:rPr>
+          <w:rFonts w:ascii="Times New Roman" w:hAnsi="Times New Roman"/>
+        </w:rPr>
+        <w:t xml:space="preserve"> </w:t>
+      </w:r>
+      <w:r>
+        <w:rPr>
+          <w:rFonts w:ascii="Times New Roman" w:hAnsi="Times New Roman"/>
+        </w:rPr>
+        <w:t xml:space="preserve">natively):</w:t>
       </w:r>
     </w:p>
     <w:p>
@@ -12031,6 +12851,97 @@
         <w:numPr>
           <w:ilvl w:val="0"/>
           <w:numId w:val="1004"/>
+        </w:numPr>
+      </w:pPr>
+      <w:r>
+        <w:rPr>
+          <w:rFonts w:ascii="Times New Roman" w:hAnsi="Times New Roman"/>
+        </w:rPr>
+        <w:t xml:space="preserve">the error of the decision value against the noiseless model fell by 43–56% relative to the filter alone,</w:t>
+      </w:r>
+      <w:r>
+        <w:rPr>
+          <w:rFonts w:ascii="Times New Roman" w:hAnsi="Times New Roman"/>
+        </w:rPr>
+        <w:t xml:space="preserve"> </w:t>
+      </w:r>
+      <w:r>
+        <w:rPr>
+          <w:rFonts w:ascii="Times New Roman" w:hAnsi="Times New Roman"/>
+        </w:rPr>
+        <w:t xml:space="preserve">and filter plus echo was 3.7–4.6 times below the raw readout;</w:t>
+      </w:r>
+    </w:p>
+    <w:p>
+      <w:pPr>
+        <w:numPr>
+          <w:ilvl w:val="0"/>
+          <w:numId w:val="1004"/>
+        </w:numPr>
+      </w:pPr>
+      <w:r>
+        <w:rPr>
+          <w:rFonts w:ascii="Times New Roman" w:hAnsi="Times New Roman"/>
+        </w:rPr>
+        <w:t xml:space="preserve">over 945 readings, 15 decisions differed from the noiseless model without the filter, 7 with it and 3 with the</w:t>
+      </w:r>
+      <w:r>
+        <w:rPr>
+          <w:rFonts w:ascii="Times New Roman" w:hAnsi="Times New Roman"/>
+        </w:rPr>
+        <w:t xml:space="preserve"> </w:t>
+      </w:r>
+      <w:r>
+        <w:rPr>
+          <w:rFonts w:ascii="Times New Roman" w:hAnsi="Times New Roman"/>
+        </w:rPr>
+        <w:t xml:space="preserve">filter plus the echo calibration; on the three IBM noise models filter plus echo reached the noiseless accuracy</w:t>
+      </w:r>
+      <w:r>
+        <w:rPr>
+          <w:rFonts w:ascii="Times New Roman" w:hAnsi="Times New Roman"/>
+        </w:rPr>
+        <w:t xml:space="preserve"> </w:t>
+      </w:r>
+      <w:r>
+        <w:rPr>
+          <w:rFonts w:ascii="Times New Roman" w:hAnsi="Times New Roman"/>
+        </w:rPr>
+        <w:t xml:space="preserve">(0.979);</w:t>
+      </w:r>
+    </w:p>
+    <w:p>
+      <w:pPr>
+        <w:numPr>
+          <w:ilvl w:val="0"/>
+          <w:numId w:val="1004"/>
+        </w:numPr>
+      </w:pPr>
+      <w:r>
+        <w:rPr>
+          <w:rFonts w:ascii="Times New Roman" w:hAnsi="Times New Roman"/>
+        </w:rPr>
+        <w:t xml:space="preserve">all twelve predictions of these three studies passed.</w:t>
+      </w:r>
+    </w:p>
+    <w:bookmarkEnd w:id="37"/>
+    <w:bookmarkStart w:id="38" w:name="sec:scaling"/>
+    <w:p>
+      <w:pPr>
+        <w:pStyle w:val="Heading4"/>
+      </w:pPr>
+      <w:r>
+        <w:rPr>
+          <w:rFonts w:ascii="Times New Roman" w:hAnsi="Times New Roman"/>
+        </w:rPr>
+        <w:t xml:space="preserve">Two channels, shot cost and what else the filter reads.</w:t>
+      </w:r>
+    </w:p>
+    <w:p>
+      <w:pPr>
+        <w:numPr>
+          <w:ilvl w:val="0"/>
+          <w:numId w:val="1005"/>
         </w:numPr>
       </w:pPr>
       <w:r>
@@ -12328,7 +13239,7 @@
       <w:pPr>
         <w:numPr>
           <w:ilvl w:val="0"/>
-          <w:numId w:val="1004"/>
+          <w:numId w:val="1005"/>
         </w:numPr>
       </w:pPr>
       <w:r>
@@ -12686,7 +13597,7 @@
       <w:pPr>
         <w:numPr>
           <w:ilvl w:val="0"/>
-          <w:numId w:val="1004"/>
+          <w:numId w:val="1005"/>
         </w:numPr>
       </w:pPr>
       <w:r>
@@ -13240,7 +14151,7 @@
       <w:pPr>
         <w:numPr>
           <w:ilvl w:val="0"/>
-          <w:numId w:val="1004"/>
+          <w:numId w:val="1005"/>
         </w:numPr>
       </w:pPr>
       <w:r>
@@ -13453,9 +14364,9 @@
         <w:t xml:space="preserve">make product states look entangled.</w:t>
       </w:r>
     </w:p>
-    <w:bookmarkEnd w:id="37"/>
     <w:bookmarkEnd w:id="38"/>
-    <w:bookmarkStart w:id="40" w:name="discussion"/>
+    <w:bookmarkEnd w:id="39"/>
+    <w:bookmarkStart w:id="41" w:name="discussion"/>
     <w:p>
       <w:pPr>
         <w:pStyle w:val="Heading1"/>
@@ -13723,22 +14634,34 @@
         <w:rPr>
           <w:rFonts w:ascii="Times New Roman" w:hAnsi="Times New Roman"/>
         </w:rPr>
-        <w:t xml:space="preserve">and adding the raw features to the filtered ones gained nothing. For weight-2 models, how the data are loaded matters more than what is read out. The shot</w:t>
-      </w:r>
-      <w:r>
-        <w:rPr>
-          <w:rFonts w:ascii="Times New Roman" w:hAnsi="Times New Roman"/>
-        </w:rPr>
-        <w:t xml:space="preserve"> </w:t>
-      </w:r>
-      <w:r>
-        <w:rPr>
-          <w:rFonts w:ascii="Times New Roman" w:hAnsi="Times New Roman"/>
-        </w:rPr>
-        <w:t xml:space="preserve">cost of the filter did not decide against it anywhere in our scaling maps.</w:t>
+        <w:t xml:space="preserve">and adding the raw features to the filtered ones gained nothing. For weight-2 models, how the data are loaded matters more than what is read out. The shot cost of the filter did not decide against it anywhere in our scaling maps. What the filter cannot see,</w:t>
+      </w:r>
+      <w:r>
+        <w:rPr>
+          <w:rFonts w:ascii="Times New Roman" w:hAnsi="Times New Roman"/>
+        </w:rPr>
+        <w:t xml:space="preserve"> </w:t>
+      </w:r>
+      <w:r>
+        <w:rPr>
+          <w:rFonts w:ascii="Times New Roman" w:hAnsi="Times New Roman"/>
+        </w:rPr>
+        <w:t xml:space="preserve">errors that keep the excitation in the sector but move it, can be calibrated with echo circuits at the cost of five</w:t>
+      </w:r>
+      <w:r>
+        <w:rPr>
+          <w:rFonts w:ascii="Times New Roman" w:hAnsi="Times New Roman"/>
+        </w:rPr>
+        <w:t xml:space="preserve"> </w:t>
+      </w:r>
+      <w:r>
+        <w:rPr>
+          <w:rFonts w:ascii="Times New Roman" w:hAnsi="Times New Roman"/>
+        </w:rPr>
+        <w:t xml:space="preserve">extra circuits per model.</w:t>
       </w:r>
     </w:p>
-    <w:bookmarkStart w:id="39" w:name="limitations."/>
+    <w:bookmarkStart w:id="40" w:name="limitations."/>
     <w:p>
       <w:pPr>
         <w:pStyle w:val="Heading4"/>
@@ -13797,9 +14720,9 @@
         <w:t xml:space="preserve">simulable. A hardware run with the filter is the natural next test.</w:t>
       </w:r>
     </w:p>
-    <w:bookmarkEnd w:id="39"/>
     <w:bookmarkEnd w:id="40"/>
-    <w:bookmarkStart w:id="54" w:name="code-and-data-availability"/>
+    <w:bookmarkEnd w:id="41"/>
+    <w:bookmarkStart w:id="55" w:name="code-and-data-availability"/>
     <w:p>
       <w:pPr>
         <w:pStyle w:val="Heading1"/>
@@ -13869,7 +14792,7 @@
         <w:rPr>
           <w:rFonts w:ascii="Times New Roman" w:hAnsi="Times New Roman"/>
         </w:rPr>
-        <w:t xml:space="preserve">0.6.6 (</w:t>
+        <w:t xml:space="preserve">0.6.13 (</w:t>
       </w:r>
       <w:r>
         <w:rPr>
@@ -14077,7 +15000,7 @@
         <w:rPr>
           <w:rFonts w:ascii="Times New Roman" w:hAnsi="Times New Roman"/>
         </w:rPr>
-        <w:t xml:space="preserve">. Hardware-ready script:</w:t>
+        <w:t xml:space="preserve">; echo calibration in</w:t>
       </w:r>
       <w:r>
         <w:rPr>
@@ -14090,6 +15013,63 @@
           <w:rStyle w:val="VerbatimChar"/>
           <w:rFonts w:ascii="Times New Roman" w:hAnsi="Times New Roman"/>
         </w:rPr>
+        <w:t xml:space="preserve">qang.sectors</w:t>
+      </w:r>
+      <w:r>
+        <w:rPr>
+          <w:rFonts w:ascii="Times New Roman" w:hAnsi="Times New Roman"/>
+        </w:rPr>
+        <w:t xml:space="preserve"> </w:t>
+      </w:r>
+      <w:r>
+        <w:rPr>
+          <w:rFonts w:ascii="Times New Roman" w:hAnsi="Times New Roman"/>
+        </w:rPr>
+        <w:t xml:space="preserve">(</w:t>
+      </w:r>
+      <w:r>
+        <w:rPr>
+          <w:rStyle w:val="VerbatimChar"/>
+          <w:rFonts w:ascii="Times New Roman" w:hAnsi="Times New Roman"/>
+        </w:rPr>
+        <w:t xml:space="preserve">echo_transfer_matrix</w:t>
+      </w:r>
+      <w:r>
+        <w:rPr>
+          <w:rFonts w:ascii="Times New Roman" w:hAnsi="Times New Roman"/>
+        </w:rPr>
+        <w:t xml:space="preserve">,</w:t>
+      </w:r>
+      <w:r>
+        <w:rPr>
+          <w:rFonts w:ascii="Times New Roman" w:hAnsi="Times New Roman"/>
+        </w:rPr>
+        <w:t xml:space="preserve"> </w:t>
+      </w:r>
+      <w:r>
+        <w:rPr>
+          <w:rStyle w:val="VerbatimChar"/>
+          <w:rFonts w:ascii="Times New Roman" w:hAnsi="Times New Roman"/>
+        </w:rPr>
+        <w:t xml:space="preserve">unmix_sector</w:t>
+      </w:r>
+      <w:r>
+        <w:rPr>
+          <w:rFonts w:ascii="Times New Roman" w:hAnsi="Times New Roman"/>
+        </w:rPr>
+        <w:t xml:space="preserve">). Hardware-ready script:</w:t>
+      </w:r>
+      <w:r>
+        <w:rPr>
+          <w:rFonts w:ascii="Times New Roman" w:hAnsi="Times New Roman"/>
+        </w:rPr>
+        <w:t xml:space="preserve"> </w:t>
+      </w:r>
+      <w:r>
+        <w:rPr>
+          <w:rStyle w:val="VerbatimChar"/>
+          <w:rFonts w:ascii="Times New Roman" w:hAnsi="Times New Roman"/>
+        </w:rPr>
         <w:t xml:space="preserve">examples/qnn_hardware_qg.py</w:t>
       </w:r>
       <w:r>
@@ -14127,7 +15107,7 @@
         <w:rPr>
           <w:rFonts w:ascii="Times New Roman" w:hAnsi="Times New Roman"/>
         </w:rPr>
-        <w:t xml:space="preserve">and RESEARCH_NOTES §75–§82, §85, §87, §90, §91 and §94–§101, with tests in</w:t>
+        <w:t xml:space="preserve">and RESEARCH_NOTES §75–§82, §85, §87, §90, §91 and §94–§101, §104–§106, with tests in</w:t>
       </w:r>
       <w:r>
         <w:rPr>
@@ -14228,7 +15208,7 @@
         </w:rPr>
         <w:t xml:space="preserve"> </w:t>
       </w:r>
-      <w:hyperlink r:id="rId41">
+      <w:hyperlink r:id="rId42">
         <w:r>
           <w:rPr>
             <w:rStyle w:val="Hyperlink"/>
@@ -14431,8 +15411,8 @@
         <w:t xml:space="preserve"># raw readout</w:t>
       </w:r>
     </w:p>
-    <w:bookmarkStart w:id="53" w:name="refs"/>
-    <w:bookmarkStart w:id="42" w:name="ref-bonetmonroig2018"/>
+    <w:bookmarkStart w:id="54" w:name="refs"/>
+    <w:bookmarkStart w:id="43" w:name="ref-bonetmonroig2018"/>
     <w:p>
       <w:pPr>
         <w:pStyle w:val="Bibliography"/>
@@ -14482,8 +15462,8 @@
         <w:t xml:space="preserve">98: 062339.</w:t>
       </w:r>
     </w:p>
-    <w:bookmarkEnd w:id="42"/>
-    <w:bookmarkStart w:id="43" w:name="ref-cerezo2023simulability"/>
+    <w:bookmarkEnd w:id="43"/>
+    <w:bookmarkStart w:id="44" w:name="ref-cerezo2023simulability"/>
     <w:p>
       <w:pPr>
         <w:pStyle w:val="Bibliography"/>
@@ -14525,8 +15505,8 @@
         <w:t xml:space="preserve">r, Why We Need to Rethink Variational Quantum Computing.”</w:t>
       </w:r>
     </w:p>
-    <w:bookmarkEnd w:id="43"/>
-    <w:bookmarkStart w:id="45" w:name="ref-landman2022"/>
+    <w:bookmarkEnd w:id="44"/>
+    <w:bookmarkStart w:id="46" w:name="ref-landman2022"/>
     <w:p>
       <w:pPr>
         <w:pStyle w:val="Bibliography"/>
@@ -14581,7 +15561,7 @@
         </w:rPr>
         <w:t xml:space="preserve"> </w:t>
       </w:r>
-      <w:hyperlink r:id="rId44">
+      <w:hyperlink r:id="rId45">
         <w:r>
           <w:rPr>
             <w:rStyle w:val="Hyperlink"/>
@@ -14596,8 +15576,8 @@
         <w:t xml:space="preserve">.</w:t>
       </w:r>
     </w:p>
-    <w:bookmarkEnd w:id="45"/>
-    <w:bookmarkStart w:id="46" w:name="ref-mcardle2019"/>
+    <w:bookmarkEnd w:id="46"/>
+    <w:bookmarkStart w:id="47" w:name="ref-mcardle2019"/>
     <w:p>
       <w:pPr>
         <w:pStyle w:val="Bibliography"/>
@@ -14647,8 +15627,8 @@
         <w:t xml:space="preserve">122: 180501.</w:t>
       </w:r>
     </w:p>
-    <w:bookmarkEnd w:id="46"/>
-    <w:bookmarkStart w:id="48" w:name="ref-monteverde2026qang"/>
+    <w:bookmarkEnd w:id="47"/>
+    <w:bookmarkStart w:id="49" w:name="ref-monteverde2026qang"/>
     <w:p>
       <w:pPr>
         <w:pStyle w:val="Bibliography"/>
@@ -14701,7 +15681,7 @@
         </w:rPr>
         <w:t xml:space="preserve"> </w:t>
       </w:r>
-      <w:hyperlink r:id="rId47">
+      <w:hyperlink r:id="rId48">
         <w:r>
           <w:rPr>
             <w:rStyle w:val="Hyperlink"/>
@@ -14716,8 +15696,8 @@
         <w:t xml:space="preserve">.</w:t>
       </w:r>
     </w:p>
-    <w:bookmarkEnd w:id="48"/>
-    <w:bookmarkStart w:id="50" w:name="ref-monteverde2026witness"/>
+    <w:bookmarkEnd w:id="49"/>
+    <w:bookmarkStart w:id="51" w:name="ref-monteverde2026witness"/>
     <w:p>
       <w:pPr>
         <w:pStyle w:val="Bibliography"/>
@@ -14766,7 +15746,7 @@
         </w:rPr>
         <w:t xml:space="preserve"> </w:t>
       </w:r>
-      <w:hyperlink r:id="rId49">
+      <w:hyperlink r:id="rId50">
         <w:r>
           <w:rPr>
             <w:rStyle w:val="Hyperlink"/>
@@ -14781,8 +15761,8 @@
         <w:t xml:space="preserve">.</w:t>
       </w:r>
     </w:p>
-    <w:bookmarkEnd w:id="50"/>
-    <w:bookmarkStart w:id="52" w:name="ref-wang2022quantumnat"/>
+    <w:bookmarkEnd w:id="51"/>
+    <w:bookmarkStart w:id="53" w:name="ref-wang2022quantumnat"/>
     <w:p>
       <w:pPr>
         <w:pStyle w:val="Bibliography"/>
@@ -14855,7 +15835,7 @@
         </w:rPr>
         <w:t xml:space="preserve"> </w:t>
       </w:r>
-      <w:hyperlink r:id="rId51">
+      <w:hyperlink r:id="rId52">
         <w:r>
           <w:rPr>
             <w:rStyle w:val="Hyperlink"/>
@@ -14870,9 +15850,9 @@
         <w:t xml:space="preserve">.</w:t>
       </w:r>
     </w:p>
-    <w:bookmarkEnd w:id="52"/>
     <w:bookmarkEnd w:id="53"/>
     <w:bookmarkEnd w:id="54"/>
+    <w:bookmarkEnd w:id="55"/>
     <w:sectPr/>
   </w:body>
 </w:document>
@@ -15068,6 +16048,9 @@
     <w:abstractNumId w:val="991"/>
   </w:num>
   <w:num w:numId="1004">
+    <w:abstractNumId w:val="991"/>
+  </w:num>
+  <w:num w:numId="1005">
     <w:abstractNumId w:val="991"/>
   </w:num>
 </w:numbering>

</xml_diff>

<commit_message>
qang 0.6.17: MultiClassQNN and block_unitaries on PyPI; QML notebooks (EN/ES) install qang>=0.6.17, sections 8-12 with and without qang; QML note (EN/ES, PDF and Word) at 0.6.17; CITATION, Zenodo metadata, README, CHANGELOG
</commit_message>
<xml_diff>
--- a/manuscript/qang_qml.docx
+++ b/manuscript/qang_qml.docx
@@ -7777,7 +7777,7 @@
         <w:rPr>
           <w:rFonts w:ascii="Times New Roman" w:hAnsi="Times New Roman"/>
         </w:rPr>
-        <w:t xml:space="preserve">0.6.16,</w:t>
+        <w:t xml:space="preserve">0.6.17,</w:t>
       </w:r>
       <w:r>
         <w:rPr>
@@ -7796,115 +7796,7 @@
         <w:rPr>
           <w:rFonts w:ascii="Times New Roman" w:hAnsi="Times New Roman"/>
         </w:rPr>
-        <w:t xml:space="preserve">;</w:t>
-      </w:r>
-      <w:r>
-        <w:rPr>
-          <w:rFonts w:ascii="Times New Roman" w:hAnsi="Times New Roman"/>
-        </w:rPr>
-        <w:t xml:space="preserve"> </w:t>
-      </w:r>
-      <w:r>
-        <w:rPr>
-          <w:rFonts w:ascii="Times New Roman" w:hAnsi="Times New Roman"/>
-        </w:rPr>
-        <w:t xml:space="preserve">the</w:t>
-      </w:r>
-      <w:r>
-        <w:rPr>
-          <w:rFonts w:ascii="Times New Roman" w:hAnsi="Times New Roman"/>
-        </w:rPr>
-        <w:t xml:space="preserve"> </w:t>
-      </w:r>
-      <w:r>
-        <w:rPr>
-          <w:rFonts w:ascii="Times New Roman" w:hAnsi="Times New Roman"/>
-        </w:rPr>
-        <w:t xml:space="preserve">multiclass</w:t>
-      </w:r>
-      <w:r>
-        <w:rPr>
-          <w:rFonts w:ascii="Times New Roman" w:hAnsi="Times New Roman"/>
-        </w:rPr>
-        <w:t xml:space="preserve"> </w:t>
-      </w:r>
-      <w:r>
-        <w:rPr>
-          <w:rFonts w:ascii="Times New Roman" w:hAnsi="Times New Roman"/>
-        </w:rPr>
-        <w:t xml:space="preserve">model</w:t>
-      </w:r>
-      <w:r>
-        <w:rPr>
-          <w:rFonts w:ascii="Times New Roman" w:hAnsi="Times New Roman"/>
-        </w:rPr>
-        <w:t xml:space="preserve"> </w:t>
-      </w:r>
-      <w:r>
-        <w:rPr>
-          <w:rFonts w:ascii="Times New Roman" w:hAnsi="Times New Roman"/>
-        </w:rPr>
-        <w:t xml:space="preserve">is</w:t>
-      </w:r>
-      <w:r>
-        <w:rPr>
-          <w:rFonts w:ascii="Times New Roman" w:hAnsi="Times New Roman"/>
-        </w:rPr>
-        <w:t xml:space="preserve"> </w:t>
-      </w:r>
-      <w:r>
-        <w:rPr>
-          <w:rFonts w:ascii="Times New Roman" w:hAnsi="Times New Roman"/>
-        </w:rPr>
-        <w:t xml:space="preserve">on</w:t>
-      </w:r>
-      <w:r>
-        <w:rPr>
-          <w:rFonts w:ascii="Times New Roman" w:hAnsi="Times New Roman"/>
-        </w:rPr>
-        <w:t xml:space="preserve"> </w:t>
-      </w:r>
-      <w:r>
-        <w:rPr>
-          <w:rFonts w:ascii="Times New Roman" w:hAnsi="Times New Roman"/>
-        </w:rPr>
-        <w:t xml:space="preserve">the</w:t>
-      </w:r>
-      <w:r>
-        <w:rPr>
-          <w:rFonts w:ascii="Times New Roman" w:hAnsi="Times New Roman"/>
-        </w:rPr>
-        <w:t xml:space="preserve"> </w:t>
-      </w:r>
-      <w:r>
-        <w:rPr>
-          <w:rFonts w:ascii="Times New Roman" w:hAnsi="Times New Roman"/>
-        </w:rPr>
-        <w:t xml:space="preserve">repository’s</w:t>
-      </w:r>
-      <w:r>
-        <w:rPr>
-          <w:rFonts w:ascii="Times New Roman" w:hAnsi="Times New Roman"/>
-        </w:rPr>
-        <w:t xml:space="preserve"> </w:t>
-      </w:r>
-      <w:r>
-        <w:rPr>
-          <w:rFonts w:ascii="Times New Roman" w:hAnsi="Times New Roman"/>
-        </w:rPr>
-        <w:t xml:space="preserve">main</w:t>
-      </w:r>
-      <w:r>
-        <w:rPr>
-          <w:rFonts w:ascii="Times New Roman" w:hAnsi="Times New Roman"/>
-        </w:rPr>
-        <w:t xml:space="preserve"> </w:t>
-      </w:r>
-      <w:r>
-        <w:rPr>
-          <w:rFonts w:ascii="Times New Roman" w:hAnsi="Times New Roman"/>
-        </w:rPr>
-        <w:t xml:space="preserve">branch).</w:t>
+        <w:t xml:space="preserve">).</w:t>
       </w:r>
     </w:p>
     <w:bookmarkStart w:id="20" w:name="introduction"/>
@@ -18701,7 +18593,7 @@
         <w:rPr>
           <w:rFonts w:ascii="Times New Roman" w:hAnsi="Times New Roman"/>
         </w:rPr>
-        <w:t xml:space="preserve">0.6.16 (</w:t>
+        <w:t xml:space="preserve">0.6.17 (</w:t>
       </w:r>
       <w:r>
         <w:rPr>
@@ -18953,25 +18845,7 @@
         <w:rPr>
           <w:rFonts w:ascii="Times New Roman" w:hAnsi="Times New Roman"/>
         </w:rPr>
-        <w:t xml:space="preserve"> </w:t>
-      </w:r>
-      <w:r>
-        <w:rPr>
-          <w:rFonts w:ascii="Times New Roman" w:hAnsi="Times New Roman"/>
-        </w:rPr>
-        <w:t xml:space="preserve">on the</w:t>
-      </w:r>
-      <w:r>
-        <w:rPr>
-          <w:rFonts w:ascii="Times New Roman" w:hAnsi="Times New Roman"/>
-        </w:rPr>
-        <w:t xml:space="preserve"> </w:t>
-      </w:r>
-      <w:r>
-        <w:rPr>
-          <w:rFonts w:ascii="Times New Roman" w:hAnsi="Times New Roman"/>
-        </w:rPr>
-        <w:t xml:space="preserve">main branch; echo calibration in</w:t>
+        <w:t xml:space="preserve">; echo calibration in</w:t>
       </w:r>
       <w:r>
         <w:rPr>
@@ -19171,7 +19045,7 @@
         <w:rPr>
           <w:rFonts w:ascii="Times New Roman" w:hAnsi="Times New Roman"/>
         </w:rPr>
-        <w:t xml:space="preserve">library from PyPI (or from GitHub for the multiclass model) and show</w:t>
+        <w:t xml:space="preserve">library from PyPI and show</w:t>
       </w:r>
       <w:r>
         <w:rPr>

</xml_diff>

<commit_message>
QML note (EN/ES, PDF and Word) with sections 114-117: F5 ratio invariance, unequal T1 corrected by calibrated training with the filter, eight classes, echo at 8 qubits, IonQ package
</commit_message>
<xml_diff>
--- a/manuscript/qang_qml.docx
+++ b/manuscript/qang_qml.docx
@@ -2781,6 +2781,18 @@
         <w:rPr>
           <w:rFonts w:ascii="Times New Roman" w:hAnsi="Times New Roman"/>
         </w:rPr>
+        <w:t xml:space="preserve">alone</w:t>
+      </w:r>
+      <w:r>
+        <w:rPr>
+          <w:rFonts w:ascii="Times New Roman" w:hAnsi="Times New Roman"/>
+        </w:rPr>
+        <w:t xml:space="preserve"> </w:t>
+      </w:r>
+      <w:r>
+        <w:rPr>
+          <w:rFonts w:ascii="Times New Roman" w:hAnsi="Times New Roman"/>
+        </w:rPr>
         <w:t xml:space="preserve">corrects</w:t>
       </w:r>
       <w:r>
@@ -2878,18 +2890,6 @@
           <w:rFonts w:ascii="Times New Roman" w:hAnsi="Times New Roman"/>
         </w:rPr>
         <w:t xml:space="preserve">although</w:t>
-      </w:r>
-      <w:r>
-        <w:rPr>
-          <w:rFonts w:ascii="Times New Roman" w:hAnsi="Times New Roman"/>
-        </w:rPr>
-        <w:t xml:space="preserve"> </w:t>
-      </w:r>
-      <w:r>
-        <w:rPr>
-          <w:rFonts w:ascii="Times New Roman" w:hAnsi="Times New Roman"/>
-        </w:rPr>
-        <w:t xml:space="preserve">alone</w:t>
       </w:r>
       <w:r>
         <w:rPr>
@@ -3091,6 +3091,739 @@
         <w:rPr>
           <w:rFonts w:ascii="Times New Roman" w:hAnsi="Times New Roman"/>
         </w:rPr>
+        <w:t xml:space="preserve">Unequal</w:t>
+      </w:r>
+      <w:r>
+        <w:rPr>
+          <w:rFonts w:ascii="Times New Roman" w:hAnsi="Times New Roman"/>
+        </w:rPr>
+        <w:t xml:space="preserve"> </w:t>
+      </w:r>
+      <w:r>
+        <w:rPr>
+          <w:rFonts w:ascii="Times New Roman" w:hAnsi="Times New Roman"/>
+        </w:rPr>
+        <w:t xml:space="preserve">T1</w:t>
+      </w:r>
+      <w:r>
+        <w:rPr>
+          <w:rFonts w:ascii="Times New Roman" w:hAnsi="Times New Roman"/>
+        </w:rPr>
+        <w:t xml:space="preserve"> </w:t>
+      </w:r>
+      <w:r>
+        <w:rPr>
+          <w:rFonts w:ascii="Times New Roman" w:hAnsi="Times New Roman"/>
+        </w:rPr>
+        <w:t xml:space="preserve">is</w:t>
+      </w:r>
+      <w:r>
+        <w:rPr>
+          <w:rFonts w:ascii="Times New Roman" w:hAnsi="Times New Roman"/>
+        </w:rPr>
+        <w:t xml:space="preserve"> </w:t>
+      </w:r>
+      <w:r>
+        <w:rPr>
+          <w:rFonts w:ascii="Times New Roman" w:hAnsi="Times New Roman"/>
+        </w:rPr>
+        <w:t xml:space="preserve">corrected</w:t>
+      </w:r>
+      <w:r>
+        <w:rPr>
+          <w:rFonts w:ascii="Times New Roman" w:hAnsi="Times New Roman"/>
+        </w:rPr>
+        <w:t xml:space="preserve"> </w:t>
+      </w:r>
+      <w:r>
+        <w:rPr>
+          <w:rFonts w:ascii="Times New Roman" w:hAnsi="Times New Roman"/>
+        </w:rPr>
+        <w:t xml:space="preserve">by</w:t>
+      </w:r>
+      <w:r>
+        <w:rPr>
+          <w:rFonts w:ascii="Times New Roman" w:hAnsi="Times New Roman"/>
+        </w:rPr>
+        <w:t xml:space="preserve"> </w:t>
+      </w:r>
+      <w:r>
+        <w:rPr>
+          <w:rFonts w:ascii="Times New Roman" w:hAnsi="Times New Roman"/>
+        </w:rPr>
+        <w:t xml:space="preserve">training</w:t>
+      </w:r>
+      <w:r>
+        <w:rPr>
+          <w:rFonts w:ascii="Times New Roman" w:hAnsi="Times New Roman"/>
+        </w:rPr>
+        <w:t xml:space="preserve"> </w:t>
+      </w:r>
+      <w:r>
+        <w:rPr>
+          <w:iCs/>
+          <w:rFonts w:ascii="Times New Roman" w:hAnsi="Times New Roman"/>
+          <w:i/>
+        </w:rPr>
+        <w:t xml:space="preserve">with</w:t>
+      </w:r>
+      <w:r>
+        <w:rPr>
+          <w:rFonts w:ascii="Times New Roman" w:hAnsi="Times New Roman"/>
+        </w:rPr>
+        <w:t xml:space="preserve"> </w:t>
+      </w:r>
+      <w:r>
+        <w:rPr>
+          <w:rFonts w:ascii="Times New Roman" w:hAnsi="Times New Roman"/>
+        </w:rPr>
+        <w:t xml:space="preserve">the</w:t>
+      </w:r>
+      <w:r>
+        <w:rPr>
+          <w:rFonts w:ascii="Times New Roman" w:hAnsi="Times New Roman"/>
+        </w:rPr>
+        <w:t xml:space="preserve"> </w:t>
+      </w:r>
+      <w:r>
+        <w:rPr>
+          <w:rFonts w:ascii="Times New Roman" w:hAnsi="Times New Roman"/>
+        </w:rPr>
+        <w:t xml:space="preserve">filter</w:t>
+      </w:r>
+      <w:r>
+        <w:rPr>
+          <w:rFonts w:ascii="Times New Roman" w:hAnsi="Times New Roman"/>
+        </w:rPr>
+        <w:t xml:space="preserve"> </w:t>
+      </w:r>
+      <w:r>
+        <w:rPr>
+          <w:rFonts w:ascii="Times New Roman" w:hAnsi="Times New Roman"/>
+        </w:rPr>
+        <w:t xml:space="preserve">under</w:t>
+      </w:r>
+      <w:r>
+        <w:rPr>
+          <w:rFonts w:ascii="Times New Roman" w:hAnsi="Times New Roman"/>
+        </w:rPr>
+        <w:t xml:space="preserve"> </w:t>
+      </w:r>
+      <w:r>
+        <w:rPr>
+          <w:rFonts w:ascii="Times New Roman" w:hAnsi="Times New Roman"/>
+        </w:rPr>
+        <w:t xml:space="preserve">the</w:t>
+      </w:r>
+      <w:r>
+        <w:rPr>
+          <w:rFonts w:ascii="Times New Roman" w:hAnsi="Times New Roman"/>
+        </w:rPr>
+        <w:t xml:space="preserve"> </w:t>
+      </w:r>
+      <w:r>
+        <w:rPr>
+          <w:rFonts w:ascii="Times New Roman" w:hAnsi="Times New Roman"/>
+        </w:rPr>
+        <w:t xml:space="preserve">calibrated</w:t>
+      </w:r>
+      <w:r>
+        <w:rPr>
+          <w:rFonts w:ascii="Times New Roman" w:hAnsi="Times New Roman"/>
+        </w:rPr>
+        <w:t xml:space="preserve"> </w:t>
+      </w:r>
+      <w:r>
+        <w:rPr>
+          <w:rFonts w:ascii="Times New Roman" w:hAnsi="Times New Roman"/>
+        </w:rPr>
+        <w:t xml:space="preserve">decay</w:t>
+      </w:r>
+      <w:r>
+        <w:rPr>
+          <w:rFonts w:ascii="Times New Roman" w:hAnsi="Times New Roman"/>
+        </w:rPr>
+        <w:t xml:space="preserve"> </w:t>
+      </w:r>
+      <w:r>
+        <w:rPr>
+          <w:rFonts w:ascii="Times New Roman" w:hAnsi="Times New Roman"/>
+        </w:rPr>
+        <w:t xml:space="preserve">rates:</w:t>
+      </w:r>
+      <w:r>
+        <w:rPr>
+          <w:rFonts w:ascii="Times New Roman" w:hAnsi="Times New Roman"/>
+        </w:rPr>
+        <w:t xml:space="preserve"> </w:t>
+      </w:r>
+      <w:r>
+        <w:rPr>
+          <w:rFonts w:ascii="Times New Roman" w:hAnsi="Times New Roman"/>
+        </w:rPr>
+        <w:t xml:space="preserve">the</w:t>
+      </w:r>
+      <w:r>
+        <w:rPr>
+          <w:rFonts w:ascii="Times New Roman" w:hAnsi="Times New Roman"/>
+        </w:rPr>
+        <w:t xml:space="preserve"> </w:t>
+      </w:r>
+      <w:r>
+        <w:rPr>
+          <w:rFonts w:ascii="Times New Roman" w:hAnsi="Times New Roman"/>
+        </w:rPr>
+        <w:t xml:space="preserve">kept</w:t>
+      </w:r>
+      <w:r>
+        <w:rPr>
+          <w:rFonts w:ascii="Times New Roman" w:hAnsi="Times New Roman"/>
+        </w:rPr>
+        <w:t xml:space="preserve"> </w:t>
+      </w:r>
+      <w:r>
+        <w:rPr>
+          <w:rFonts w:ascii="Times New Roman" w:hAnsi="Times New Roman"/>
+        </w:rPr>
+        <w:t xml:space="preserve">state</w:t>
+      </w:r>
+      <w:r>
+        <w:rPr>
+          <w:rFonts w:ascii="Times New Roman" w:hAnsi="Times New Roman"/>
+        </w:rPr>
+        <w:t xml:space="preserve"> </w:t>
+      </w:r>
+      <w:r>
+        <w:rPr>
+          <w:rFonts w:ascii="Times New Roman" w:hAnsi="Times New Roman"/>
+        </w:rPr>
+        <w:t xml:space="preserve">depends</w:t>
+      </w:r>
+      <w:r>
+        <w:rPr>
+          <w:rFonts w:ascii="Times New Roman" w:hAnsi="Times New Roman"/>
+        </w:rPr>
+        <w:t xml:space="preserve"> </w:t>
+      </w:r>
+      <w:r>
+        <w:rPr>
+          <w:rFonts w:ascii="Times New Roman" w:hAnsi="Times New Roman"/>
+        </w:rPr>
+        <w:t xml:space="preserve">only</w:t>
+      </w:r>
+      <w:r>
+        <w:rPr>
+          <w:rFonts w:ascii="Times New Roman" w:hAnsi="Times New Roman"/>
+        </w:rPr>
+        <w:t xml:space="preserve"> </w:t>
+      </w:r>
+      <w:r>
+        <w:rPr>
+          <w:rFonts w:ascii="Times New Roman" w:hAnsi="Times New Roman"/>
+        </w:rPr>
+        <w:t xml:space="preserve">on</w:t>
+      </w:r>
+      <w:r>
+        <w:rPr>
+          <w:rFonts w:ascii="Times New Roman" w:hAnsi="Times New Roman"/>
+        </w:rPr>
+        <w:t xml:space="preserve"> </w:t>
+      </w:r>
+      <w:r>
+        <w:rPr>
+          <w:rFonts w:ascii="Times New Roman" w:hAnsi="Times New Roman"/>
+        </w:rPr>
+        <w:t xml:space="preserve">their</w:t>
+      </w:r>
+      <w:r>
+        <w:rPr>
+          <w:rFonts w:ascii="Times New Roman" w:hAnsi="Times New Roman"/>
+        </w:rPr>
+        <w:t xml:space="preserve"> </w:t>
+      </w:r>
+      <w:r>
+        <w:rPr>
+          <w:rFonts w:ascii="Times New Roman" w:hAnsi="Times New Roman"/>
+        </w:rPr>
+        <w:t xml:space="preserve">ratios,</w:t>
+      </w:r>
+      <w:r>
+        <w:rPr>
+          <w:rFonts w:ascii="Times New Roman" w:hAnsi="Times New Roman"/>
+        </w:rPr>
+        <w:t xml:space="preserve"> </w:t>
+      </w:r>
+      <w:r>
+        <w:rPr>
+          <w:rFonts w:ascii="Times New Roman" w:hAnsi="Times New Roman"/>
+        </w:rPr>
+        <w:t xml:space="preserve">so</w:t>
+      </w:r>
+      <w:r>
+        <w:rPr>
+          <w:rFonts w:ascii="Times New Roman" w:hAnsi="Times New Roman"/>
+        </w:rPr>
+        <w:t xml:space="preserve"> </w:t>
+      </w:r>
+      <w:r>
+        <w:rPr>
+          <w:rFonts w:ascii="Times New Roman" w:hAnsi="Times New Roman"/>
+        </w:rPr>
+        <w:t xml:space="preserve">the</w:t>
+      </w:r>
+      <w:r>
+        <w:rPr>
+          <w:rFonts w:ascii="Times New Roman" w:hAnsi="Times New Roman"/>
+        </w:rPr>
+        <w:t xml:space="preserve"> </w:t>
+      </w:r>
+      <w:r>
+        <w:rPr>
+          <w:rFonts w:ascii="Times New Roman" w:hAnsi="Times New Roman"/>
+        </w:rPr>
+        <w:t xml:space="preserve">model</w:t>
+      </w:r>
+      <w:r>
+        <w:rPr>
+          <w:rFonts w:ascii="Times New Roman" w:hAnsi="Times New Roman"/>
+        </w:rPr>
+        <w:t xml:space="preserve"> </w:t>
+      </w:r>
+      <w:r>
+        <w:rPr>
+          <w:rFonts w:ascii="Times New Roman" w:hAnsi="Times New Roman"/>
+        </w:rPr>
+        <w:t xml:space="preserve">lands</w:t>
+      </w:r>
+      <w:r>
+        <w:rPr>
+          <w:rFonts w:ascii="Times New Roman" w:hAnsi="Times New Roman"/>
+        </w:rPr>
+        <w:t xml:space="preserve"> </w:t>
+      </w:r>
+      <w:r>
+        <w:rPr>
+          <w:rFonts w:ascii="Times New Roman" w:hAnsi="Times New Roman"/>
+        </w:rPr>
+        <w:t xml:space="preserve">within</w:t>
+      </w:r>
+      <w:r>
+        <w:rPr>
+          <w:rFonts w:ascii="Times New Roman" w:hAnsi="Times New Roman"/>
+        </w:rPr>
+        <w:t xml:space="preserve"> </w:t>
+      </w:r>
+      <w:r>
+        <w:rPr>
+          <w:rFonts w:ascii="Times New Roman" w:hAnsi="Times New Roman"/>
+        </w:rPr>
+        <w:t xml:space="preserve">0.5</w:t>
+      </w:r>
+      <w:r>
+        <w:rPr>
+          <w:rFonts w:ascii="Times New Roman" w:hAnsi="Times New Roman"/>
+        </w:rPr>
+        <w:t xml:space="preserve"> </w:t>
+      </w:r>
+      <w:r>
+        <w:rPr>
+          <w:rFonts w:ascii="Times New Roman" w:hAnsi="Times New Roman"/>
+        </w:rPr>
+        <w:t xml:space="preserve">points</w:t>
+      </w:r>
+      <w:r>
+        <w:rPr>
+          <w:rFonts w:ascii="Times New Roman" w:hAnsi="Times New Roman"/>
+        </w:rPr>
+        <w:t xml:space="preserve"> </w:t>
+      </w:r>
+      <w:r>
+        <w:rPr>
+          <w:rFonts w:ascii="Times New Roman" w:hAnsi="Times New Roman"/>
+        </w:rPr>
+        <w:t xml:space="preserve">of</w:t>
+      </w:r>
+      <w:r>
+        <w:rPr>
+          <w:rFonts w:ascii="Times New Roman" w:hAnsi="Times New Roman"/>
+        </w:rPr>
+        <w:t xml:space="preserve"> </w:t>
+      </w:r>
+      <w:r>
+        <w:rPr>
+          <w:rFonts w:ascii="Times New Roman" w:hAnsi="Times New Roman"/>
+        </w:rPr>
+        <w:t xml:space="preserve">noiseless</w:t>
+      </w:r>
+      <w:r>
+        <w:rPr>
+          <w:rFonts w:ascii="Times New Roman" w:hAnsi="Times New Roman"/>
+        </w:rPr>
+        <w:t xml:space="preserve"> </w:t>
+      </w:r>
+      <w:r>
+        <w:rPr>
+          <w:rFonts w:ascii="Times New Roman" w:hAnsi="Times New Roman"/>
+        </w:rPr>
+        <w:t xml:space="preserve">at</w:t>
+      </w:r>
+      <w:r>
+        <w:rPr>
+          <w:rFonts w:ascii="Times New Roman" w:hAnsi="Times New Roman"/>
+        </w:rPr>
+        <w:t xml:space="preserve"> </w:t>
+      </w:r>
+      <w:r>
+        <w:rPr>
+          <w:rFonts w:ascii="Times New Roman" w:hAnsi="Times New Roman"/>
+        </w:rPr>
+        <w:t xml:space="preserve">a</w:t>
+      </w:r>
+      <w:r>
+        <w:rPr>
+          <w:rFonts w:ascii="Times New Roman" w:hAnsi="Times New Roman"/>
+        </w:rPr>
+        <w:t xml:space="preserve"> </w:t>
+      </w:r>
+      <m:oMath>
+        <m:r>
+          <m:rPr>
+            <m:sty m:val="p"/>
+          </m:rPr>
+          <m:t>±</m:t>
+        </m:r>
+        <m:r>
+          <m:t>100</m:t>
+        </m:r>
+        <m:r>
+          <m:rPr>
+            <m:sty m:val="p"/>
+          </m:rPr>
+          <m:t>%</m:t>
+        </m:r>
+      </m:oMath>
+      <w:r>
+        <w:rPr>
+          <w:rFonts w:ascii="Times New Roman" w:hAnsi="Times New Roman"/>
+        </w:rPr>
+        <w:t xml:space="preserve"> </w:t>
+      </w:r>
+      <w:r>
+        <w:rPr>
+          <w:rFonts w:ascii="Times New Roman" w:hAnsi="Times New Roman"/>
+        </w:rPr>
+        <w:t xml:space="preserve">spread,</w:t>
+      </w:r>
+      <w:r>
+        <w:rPr>
+          <w:rFonts w:ascii="Times New Roman" w:hAnsi="Times New Roman"/>
+        </w:rPr>
+        <w:t xml:space="preserve"> </w:t>
+      </w:r>
+      <w:r>
+        <w:rPr>
+          <w:rFonts w:ascii="Times New Roman" w:hAnsi="Times New Roman"/>
+        </w:rPr>
+        <w:t xml:space="preserve">ignores</w:t>
+      </w:r>
+      <w:r>
+        <w:rPr>
+          <w:rFonts w:ascii="Times New Roman" w:hAnsi="Times New Roman"/>
+        </w:rPr>
+        <w:t xml:space="preserve"> </w:t>
+      </w:r>
+      <w:r>
+        <w:rPr>
+          <w:rFonts w:ascii="Times New Roman" w:hAnsi="Times New Roman"/>
+        </w:rPr>
+        <w:t xml:space="preserve">a</w:t>
+      </w:r>
+      <w:r>
+        <w:rPr>
+          <w:rFonts w:ascii="Times New Roman" w:hAnsi="Times New Roman"/>
+        </w:rPr>
+        <w:t xml:space="preserve"> </w:t>
+      </w:r>
+      <w:r>
+        <w:rPr>
+          <w:rFonts w:ascii="Times New Roman" w:hAnsi="Times New Roman"/>
+        </w:rPr>
+        <w:t xml:space="preserve">10%</w:t>
+      </w:r>
+      <w:r>
+        <w:rPr>
+          <w:rFonts w:ascii="Times New Roman" w:hAnsi="Times New Roman"/>
+        </w:rPr>
+        <w:t xml:space="preserve"> </w:t>
+      </w:r>
+      <w:r>
+        <w:rPr>
+          <w:rFonts w:ascii="Times New Roman" w:hAnsi="Times New Roman"/>
+        </w:rPr>
+        <w:t xml:space="preserve">calibration</w:t>
+      </w:r>
+      <w:r>
+        <w:rPr>
+          <w:rFonts w:ascii="Times New Roman" w:hAnsi="Times New Roman"/>
+        </w:rPr>
+        <w:t xml:space="preserve"> </w:t>
+      </w:r>
+      <w:r>
+        <w:rPr>
+          <w:rFonts w:ascii="Times New Roman" w:hAnsi="Times New Roman"/>
+        </w:rPr>
+        <w:t xml:space="preserve">error</w:t>
+      </w:r>
+      <w:r>
+        <w:rPr>
+          <w:rFonts w:ascii="Times New Roman" w:hAnsi="Times New Roman"/>
+        </w:rPr>
+        <w:t xml:space="preserve"> </w:t>
+      </w:r>
+      <w:r>
+        <w:rPr>
+          <w:rFonts w:ascii="Times New Roman" w:hAnsi="Times New Roman"/>
+        </w:rPr>
+        <w:t xml:space="preserve">and,</w:t>
+      </w:r>
+      <w:r>
+        <w:rPr>
+          <w:rFonts w:ascii="Times New Roman" w:hAnsi="Times New Roman"/>
+        </w:rPr>
+        <w:t xml:space="preserve"> </w:t>
+      </w:r>
+      <w:r>
+        <w:rPr>
+          <w:rFonts w:ascii="Times New Roman" w:hAnsi="Times New Roman"/>
+        </w:rPr>
+        <w:t xml:space="preserve">at</w:t>
+      </w:r>
+      <w:r>
+        <w:rPr>
+          <w:rFonts w:ascii="Times New Roman" w:hAnsi="Times New Roman"/>
+        </w:rPr>
+        <w:t xml:space="preserve"> </w:t>
+      </w:r>
+      <w:r>
+        <w:rPr>
+          <w:rFonts w:ascii="Times New Roman" w:hAnsi="Times New Roman"/>
+        </w:rPr>
+        <w:t xml:space="preserve">weight 2,</w:t>
+      </w:r>
+      <w:r>
+        <w:rPr>
+          <w:rFonts w:ascii="Times New Roman" w:hAnsi="Times New Roman"/>
+        </w:rPr>
+        <w:t xml:space="preserve"> </w:t>
+      </w:r>
+      <w:r>
+        <w:rPr>
+          <w:rFonts w:ascii="Times New Roman" w:hAnsi="Times New Roman"/>
+        </w:rPr>
+        <w:t xml:space="preserve">loses</w:t>
+      </w:r>
+      <w:r>
+        <w:rPr>
+          <w:rFonts w:ascii="Times New Roman" w:hAnsi="Times New Roman"/>
+        </w:rPr>
+        <w:t xml:space="preserve"> </w:t>
+      </w:r>
+      <w:r>
+        <w:rPr>
+          <w:rFonts w:ascii="Times New Roman" w:hAnsi="Times New Roman"/>
+        </w:rPr>
+        <w:t xml:space="preserve">0.7</w:t>
+      </w:r>
+      <w:r>
+        <w:rPr>
+          <w:rFonts w:ascii="Times New Roman" w:hAnsi="Times New Roman"/>
+        </w:rPr>
+        <w:t xml:space="preserve"> </w:t>
+      </w:r>
+      <w:r>
+        <w:rPr>
+          <w:rFonts w:ascii="Times New Roman" w:hAnsi="Times New Roman"/>
+        </w:rPr>
+        <w:t xml:space="preserve">points</w:t>
+      </w:r>
+      <w:r>
+        <w:rPr>
+          <w:rFonts w:ascii="Times New Roman" w:hAnsi="Times New Roman"/>
+        </w:rPr>
+        <w:t xml:space="preserve"> </w:t>
+      </w:r>
+      <w:r>
+        <w:rPr>
+          <w:rFonts w:ascii="Times New Roman" w:hAnsi="Times New Roman"/>
+        </w:rPr>
+        <w:t xml:space="preserve">under</w:t>
+      </w:r>
+      <w:r>
+        <w:rPr>
+          <w:rFonts w:ascii="Times New Roman" w:hAnsi="Times New Roman"/>
+        </w:rPr>
+        <w:t xml:space="preserve"> </w:t>
+      </w:r>
+      <w:r>
+        <w:rPr>
+          <w:rFonts w:ascii="Times New Roman" w:hAnsi="Times New Roman"/>
+        </w:rPr>
+        <w:t xml:space="preserve">a</w:t>
+      </w:r>
+      <w:r>
+        <w:rPr>
+          <w:rFonts w:ascii="Times New Roman" w:hAnsi="Times New Roman"/>
+        </w:rPr>
+        <w:t xml:space="preserve"> </w:t>
+      </w:r>
+      <w:r>
+        <w:rPr>
+          <w:rFonts w:ascii="Times New Roman" w:hAnsi="Times New Roman"/>
+        </w:rPr>
+        <w:t xml:space="preserve">1.5-fold</w:t>
+      </w:r>
+      <w:r>
+        <w:rPr>
+          <w:rFonts w:ascii="Times New Roman" w:hAnsi="Times New Roman"/>
+        </w:rPr>
+        <w:t xml:space="preserve"> </w:t>
+      </w:r>
+      <w:r>
+        <w:rPr>
+          <w:rFonts w:ascii="Times New Roman" w:hAnsi="Times New Roman"/>
+        </w:rPr>
+        <w:t xml:space="preserve">drift</w:t>
+      </w:r>
+      <w:r>
+        <w:rPr>
+          <w:rFonts w:ascii="Times New Roman" w:hAnsi="Times New Roman"/>
+        </w:rPr>
+        <w:t xml:space="preserve"> </w:t>
+      </w:r>
+      <w:r>
+        <w:rPr>
+          <w:rFonts w:ascii="Times New Roman" w:hAnsi="Times New Roman"/>
+        </w:rPr>
+        <w:t xml:space="preserve">of</w:t>
+      </w:r>
+      <w:r>
+        <w:rPr>
+          <w:rFonts w:ascii="Times New Roman" w:hAnsi="Times New Roman"/>
+        </w:rPr>
+        <w:t xml:space="preserve"> </w:t>
+      </w:r>
+      <w:r>
+        <w:rPr>
+          <w:rFonts w:ascii="Times New Roman" w:hAnsi="Times New Roman"/>
+        </w:rPr>
+        <w:t xml:space="preserve">all</w:t>
+      </w:r>
+      <w:r>
+        <w:rPr>
+          <w:rFonts w:ascii="Times New Roman" w:hAnsi="Times New Roman"/>
+        </w:rPr>
+        <w:t xml:space="preserve"> </w:t>
+      </w:r>
+      <w:r>
+        <w:rPr>
+          <w:rFonts w:ascii="Times New Roman" w:hAnsi="Times New Roman"/>
+        </w:rPr>
+        <w:t xml:space="preserve">T1</w:t>
+      </w:r>
+      <w:r>
+        <w:rPr>
+          <w:rFonts w:ascii="Times New Roman" w:hAnsi="Times New Roman"/>
+        </w:rPr>
+        <w:t xml:space="preserve"> </w:t>
+      </w:r>
+      <w:r>
+        <w:rPr>
+          <w:rFonts w:ascii="Times New Roman" w:hAnsi="Times New Roman"/>
+        </w:rPr>
+        <w:t xml:space="preserve">that</w:t>
+      </w:r>
+      <w:r>
+        <w:rPr>
+          <w:rFonts w:ascii="Times New Roman" w:hAnsi="Times New Roman"/>
+        </w:rPr>
+        <w:t xml:space="preserve"> </w:t>
+      </w:r>
+      <w:r>
+        <w:rPr>
+          <w:rFonts w:ascii="Times New Roman" w:hAnsi="Times New Roman"/>
+        </w:rPr>
+        <w:t xml:space="preserve">costs</w:t>
+      </w:r>
+      <w:r>
+        <w:rPr>
+          <w:rFonts w:ascii="Times New Roman" w:hAnsi="Times New Roman"/>
+        </w:rPr>
+        <w:t xml:space="preserve"> </w:t>
+      </w:r>
+      <w:r>
+        <w:rPr>
+          <w:rFonts w:ascii="Times New Roman" w:hAnsi="Times New Roman"/>
+        </w:rPr>
+        <w:t xml:space="preserve">the</w:t>
+      </w:r>
+      <w:r>
+        <w:rPr>
+          <w:rFonts w:ascii="Times New Roman" w:hAnsi="Times New Roman"/>
+        </w:rPr>
+        <w:t xml:space="preserve"> </w:t>
+      </w:r>
+      <w:r>
+        <w:rPr>
+          <w:rFonts w:ascii="Times New Roman" w:hAnsi="Times New Roman"/>
+        </w:rPr>
+        <w:t xml:space="preserve">raw</w:t>
+      </w:r>
+      <w:r>
+        <w:rPr>
+          <w:rFonts w:ascii="Times New Roman" w:hAnsi="Times New Roman"/>
+        </w:rPr>
+        <w:t xml:space="preserve"> </w:t>
+      </w:r>
+      <w:r>
+        <w:rPr>
+          <w:rFonts w:ascii="Times New Roman" w:hAnsi="Times New Roman"/>
+        </w:rPr>
+        <w:t xml:space="preserve">noise-aware</w:t>
+      </w:r>
+      <w:r>
+        <w:rPr>
+          <w:rFonts w:ascii="Times New Roman" w:hAnsi="Times New Roman"/>
+        </w:rPr>
+        <w:t xml:space="preserve"> </w:t>
+      </w:r>
+      <w:r>
+        <w:rPr>
+          <w:rFonts w:ascii="Times New Roman" w:hAnsi="Times New Roman"/>
+        </w:rPr>
+        <w:t xml:space="preserve">model</w:t>
+      </w:r>
+      <w:r>
+        <w:rPr>
+          <w:rFonts w:ascii="Times New Roman" w:hAnsi="Times New Roman"/>
+        </w:rPr>
+        <w:t xml:space="preserve"> </w:t>
+      </w:r>
+      <w:r>
+        <w:rPr>
+          <w:rFonts w:ascii="Times New Roman" w:hAnsi="Times New Roman"/>
+        </w:rPr>
+        <w:t xml:space="preserve">10.</w:t>
+      </w:r>
+      <w:r>
+        <w:rPr>
+          <w:rFonts w:ascii="Times New Roman" w:hAnsi="Times New Roman"/>
+        </w:rPr>
+        <w:t xml:space="preserve"> </w:t>
+      </w:r>
+      <w:r>
+        <w:rPr>
+          <w:rFonts w:ascii="Times New Roman" w:hAnsi="Times New Roman"/>
+        </w:rPr>
         <w:t xml:space="preserve">With</w:t>
       </w:r>
       <w:r>
@@ -7320,7 +8053,219 @@
         <w:rPr>
           <w:rFonts w:ascii="Times New Roman" w:hAnsi="Times New Roman"/>
         </w:rPr>
-        <w:t xml:space="preserve">noise.</w:t>
+        <w:t xml:space="preserve">noise,</w:t>
+      </w:r>
+      <w:r>
+        <w:rPr>
+          <w:rFonts w:ascii="Times New Roman" w:hAnsi="Times New Roman"/>
+        </w:rPr>
+        <w:t xml:space="preserve"> </w:t>
+      </w:r>
+      <w:r>
+        <w:rPr>
+          <w:rFonts w:ascii="Times New Roman" w:hAnsi="Times New Roman"/>
+        </w:rPr>
+        <w:t xml:space="preserve">and</w:t>
+      </w:r>
+      <w:r>
+        <w:rPr>
+          <w:rFonts w:ascii="Times New Roman" w:hAnsi="Times New Roman"/>
+        </w:rPr>
+        <w:t xml:space="preserve"> </w:t>
+      </w:r>
+      <w:r>
+        <w:rPr>
+          <w:rFonts w:ascii="Times New Roman" w:hAnsi="Times New Roman"/>
+        </w:rPr>
+        <w:t xml:space="preserve">it</w:t>
+      </w:r>
+      <w:r>
+        <w:rPr>
+          <w:rFonts w:ascii="Times New Roman" w:hAnsi="Times New Roman"/>
+        </w:rPr>
+        <w:t xml:space="preserve"> </w:t>
+      </w:r>
+      <w:r>
+        <w:rPr>
+          <w:rFonts w:ascii="Times New Roman" w:hAnsi="Times New Roman"/>
+        </w:rPr>
+        <w:t xml:space="preserve">still</w:t>
+      </w:r>
+      <w:r>
+        <w:rPr>
+          <w:rFonts w:ascii="Times New Roman" w:hAnsi="Times New Roman"/>
+        </w:rPr>
+        <w:t xml:space="preserve"> </w:t>
+      </w:r>
+      <w:r>
+        <w:rPr>
+          <w:rFonts w:ascii="Times New Roman" w:hAnsi="Times New Roman"/>
+        </w:rPr>
+        <w:t xml:space="preserve">removed</w:t>
+      </w:r>
+      <w:r>
+        <w:rPr>
+          <w:rFonts w:ascii="Times New Roman" w:hAnsi="Times New Roman"/>
+        </w:rPr>
+        <w:t xml:space="preserve"> </w:t>
+      </w:r>
+      <w:r>
+        <w:rPr>
+          <w:rFonts w:ascii="Times New Roman" w:hAnsi="Times New Roman"/>
+        </w:rPr>
+        <w:t xml:space="preserve">a</w:t>
+      </w:r>
+      <w:r>
+        <w:rPr>
+          <w:rFonts w:ascii="Times New Roman" w:hAnsi="Times New Roman"/>
+        </w:rPr>
+        <w:t xml:space="preserve"> </w:t>
+      </w:r>
+      <w:r>
+        <w:rPr>
+          <w:rFonts w:ascii="Times New Roman" w:hAnsi="Times New Roman"/>
+        </w:rPr>
+        <w:t xml:space="preserve">third</w:t>
+      </w:r>
+      <w:r>
+        <w:rPr>
+          <w:rFonts w:ascii="Times New Roman" w:hAnsi="Times New Roman"/>
+        </w:rPr>
+        <w:t xml:space="preserve"> </w:t>
+      </w:r>
+      <w:r>
+        <w:rPr>
+          <w:rFonts w:ascii="Times New Roman" w:hAnsi="Times New Roman"/>
+        </w:rPr>
+        <w:t xml:space="preserve">of</w:t>
+      </w:r>
+      <w:r>
+        <w:rPr>
+          <w:rFonts w:ascii="Times New Roman" w:hAnsi="Times New Roman"/>
+        </w:rPr>
+        <w:t xml:space="preserve"> </w:t>
+      </w:r>
+      <w:r>
+        <w:rPr>
+          <w:rFonts w:ascii="Times New Roman" w:hAnsi="Times New Roman"/>
+        </w:rPr>
+        <w:t xml:space="preserve">the</w:t>
+      </w:r>
+      <w:r>
+        <w:rPr>
+          <w:rFonts w:ascii="Times New Roman" w:hAnsi="Times New Roman"/>
+        </w:rPr>
+        <w:t xml:space="preserve"> </w:t>
+      </w:r>
+      <w:r>
+        <w:rPr>
+          <w:rFonts w:ascii="Times New Roman" w:hAnsi="Times New Roman"/>
+        </w:rPr>
+        <w:t xml:space="preserve">filtered</w:t>
+      </w:r>
+      <w:r>
+        <w:rPr>
+          <w:rFonts w:ascii="Times New Roman" w:hAnsi="Times New Roman"/>
+        </w:rPr>
+        <w:t xml:space="preserve"> </w:t>
+      </w:r>
+      <w:r>
+        <w:rPr>
+          <w:rFonts w:ascii="Times New Roman" w:hAnsi="Times New Roman"/>
+        </w:rPr>
+        <w:t xml:space="preserve">error</w:t>
+      </w:r>
+      <w:r>
+        <w:rPr>
+          <w:rFonts w:ascii="Times New Roman" w:hAnsi="Times New Roman"/>
+        </w:rPr>
+        <w:t xml:space="preserve"> </w:t>
+      </w:r>
+      <w:r>
+        <w:rPr>
+          <w:rFonts w:ascii="Times New Roman" w:hAnsi="Times New Roman"/>
+        </w:rPr>
+        <w:t xml:space="preserve">with</w:t>
+      </w:r>
+      <w:r>
+        <w:rPr>
+          <w:rFonts w:ascii="Times New Roman" w:hAnsi="Times New Roman"/>
+        </w:rPr>
+        <w:t xml:space="preserve"> </w:t>
+      </w:r>
+      <w:r>
+        <w:rPr>
+          <w:rFonts w:ascii="Times New Roman" w:hAnsi="Times New Roman"/>
+        </w:rPr>
+        <w:t xml:space="preserve">a</w:t>
+      </w:r>
+      <w:r>
+        <w:rPr>
+          <w:rFonts w:ascii="Times New Roman" w:hAnsi="Times New Roman"/>
+        </w:rPr>
+        <w:t xml:space="preserve"> </w:t>
+      </w:r>
+      <m:oMath>
+        <m:r>
+          <m:t>28</m:t>
+        </m:r>
+        <m:r>
+          <m:rPr>
+            <m:sty m:val="p"/>
+          </m:rPr>
+          <m:t>×</m:t>
+        </m:r>
+        <m:r>
+          <m:t>28</m:t>
+        </m:r>
+      </m:oMath>
+      <w:r>
+        <w:rPr>
+          <w:rFonts w:ascii="Times New Roman" w:hAnsi="Times New Roman"/>
+        </w:rPr>
+        <w:t xml:space="preserve"> </w:t>
+      </w:r>
+      <w:r>
+        <w:rPr>
+          <w:rFonts w:ascii="Times New Roman" w:hAnsi="Times New Roman"/>
+        </w:rPr>
+        <w:t xml:space="preserve">matrix</w:t>
+      </w:r>
+      <w:r>
+        <w:rPr>
+          <w:rFonts w:ascii="Times New Roman" w:hAnsi="Times New Roman"/>
+        </w:rPr>
+        <w:t xml:space="preserve"> </w:t>
+      </w:r>
+      <w:r>
+        <w:rPr>
+          <w:rFonts w:ascii="Times New Roman" w:hAnsi="Times New Roman"/>
+        </w:rPr>
+        <w:t xml:space="preserve">at</w:t>
+      </w:r>
+      <w:r>
+        <w:rPr>
+          <w:rFonts w:ascii="Times New Roman" w:hAnsi="Times New Roman"/>
+        </w:rPr>
+        <w:t xml:space="preserve"> </w:t>
+      </w:r>
+      <w:r>
+        <w:rPr>
+          <w:rFonts w:ascii="Times New Roman" w:hAnsi="Times New Roman"/>
+        </w:rPr>
+        <w:t xml:space="preserve">8</w:t>
+      </w:r>
+      <w:r>
+        <w:rPr>
+          <w:rFonts w:ascii="Times New Roman" w:hAnsi="Times New Roman"/>
+        </w:rPr>
+        <w:t xml:space="preserve"> </w:t>
+      </w:r>
+      <w:r>
+        <w:rPr>
+          <w:rFonts w:ascii="Times New Roman" w:hAnsi="Times New Roman"/>
+        </w:rPr>
+        <w:t xml:space="preserve">qubits.</w:t>
       </w:r>
       <w:r>
         <w:rPr>
@@ -8145,7 +9090,7 @@
         <w:rPr>
           <w:rFonts w:ascii="Times New Roman" w:hAnsi="Times New Roman"/>
         </w:rPr>
-        <w:t xml:space="preserve">predictions of every study were committed to the repository before the run that tested them. Of 122 pre-registered predictions in the studies summarized here, 89 passed and 33 failed; the failures are</w:t>
+        <w:t xml:space="preserve">predictions of every study were committed to the repository before the run that tested them. Of 138 pre-registered predictions in the studies summarized here, 99 passed and 39 failed; the failures are</w:t>
       </w:r>
       <w:r>
         <w:rPr>
@@ -8161,7 +9106,7 @@
       </w:r>
     </w:p>
     <w:bookmarkEnd w:id="20"/>
-    <w:bookmarkStart w:id="28" w:name="model-and-theory"/>
+    <w:bookmarkStart w:id="29" w:name="model-and-theory"/>
     <w:p>
       <w:pPr>
         <w:pStyle w:val="Heading1"/>
@@ -9849,7 +10794,410 @@
       </w:r>
     </w:p>
     <w:bookmarkEnd w:id="25"/>
-    <w:bookmarkStart w:id="26" w:name="multiclass-readout."/>
+    <w:bookmarkStart w:id="26" w:name="Xf590342560ea91eb14989932cc332441923214b"/>
+    <w:p>
+      <w:pPr>
+        <w:pStyle w:val="Heading4"/>
+      </w:pPr>
+      <w:r>
+        <w:rPr>
+          <w:rFonts w:ascii="Times New Roman" w:hAnsi="Times New Roman"/>
+        </w:rPr>
+        <w:t xml:space="preserve">F5: only the ratios of the decay rates matter.</w:t>
+      </w:r>
+    </w:p>
+    <w:p>
+      <w:pPr>
+        <w:pStyle w:val="FirstParagraph"/>
+      </w:pPr>
+      <w:r>
+        <w:rPr>
+          <w:rFonts w:ascii="Times New Roman" w:hAnsi="Times New Roman"/>
+        </w:rPr>
+        <w:t xml:space="preserve">Conditioned on no jump, the state is</w:t>
+      </w:r>
+      <w:r>
+        <w:rPr>
+          <w:rFonts w:ascii="Times New Roman" w:hAnsi="Times New Roman"/>
+        </w:rPr>
+        <w:t xml:space="preserve"> </w:t>
+      </w:r>
+      <m:oMath>
+        <m:r>
+          <m:t>A</m:t>
+        </m:r>
+        <m:r>
+          <m:t>ψ</m:t>
+        </m:r>
+        <m:r>
+          <m:rPr>
+            <m:sty m:val="p"/>
+          </m:rPr>
+          <m:t>/</m:t>
+        </m:r>
+        <m:r>
+          <m:rPr>
+            <m:sty m:val="p"/>
+          </m:rPr>
+          <m:t>∥</m:t>
+        </m:r>
+        <m:r>
+          <m:t>A</m:t>
+        </m:r>
+        <m:r>
+          <m:t>ψ</m:t>
+        </m:r>
+        <m:r>
+          <m:rPr>
+            <m:sty m:val="p"/>
+          </m:rPr>
+          <m:t>∥</m:t>
+        </m:r>
+      </m:oMath>
+      <w:r>
+        <w:rPr>
+          <w:rFonts w:ascii="Times New Roman" w:hAnsi="Times New Roman"/>
+        </w:rPr>
+        <w:t xml:space="preserve"> </w:t>
+      </w:r>
+      <w:r>
+        <w:rPr>
+          <w:rFonts w:ascii="Times New Roman" w:hAnsi="Times New Roman"/>
+        </w:rPr>
+        <w:t xml:space="preserve">with</w:t>
+      </w:r>
+      <w:r>
+        <w:rPr>
+          <w:rFonts w:ascii="Times New Roman" w:hAnsi="Times New Roman"/>
+        </w:rPr>
+        <w:t xml:space="preserve"> </w:t>
+      </w:r>
+      <m:oMath>
+        <m:r>
+          <m:t>A</m:t>
+        </m:r>
+        <m:r>
+          <m:rPr>
+            <m:sty m:val="p"/>
+          </m:rPr>
+          <m:t>=</m:t>
+        </m:r>
+        <m:r>
+          <m:t>D</m:t>
+        </m:r>
+        <m:sSub>
+          <m:e>
+            <m:r>
+              <m:t>U</m:t>
+            </m:r>
+          </m:e>
+          <m:sub>
+            <m:r>
+              <m:t>d</m:t>
+            </m:r>
+          </m:sub>
+        </m:sSub>
+        <m:r>
+          <m:rPr>
+            <m:sty m:val="p"/>
+          </m:rPr>
+          <m:t>⋯</m:t>
+        </m:r>
+        <m:r>
+          <m:t>D</m:t>
+        </m:r>
+        <m:sSub>
+          <m:e>
+            <m:r>
+              <m:t>U</m:t>
+            </m:r>
+          </m:e>
+          <m:sub>
+            <m:r>
+              <m:t>1</m:t>
+            </m:r>
+          </m:sub>
+        </m:sSub>
+      </m:oMath>
+      <w:r>
+        <w:rPr>
+          <w:rFonts w:ascii="Times New Roman" w:hAnsi="Times New Roman"/>
+        </w:rPr>
+        <w:t xml:space="preserve"> </w:t>
+      </w:r>
+      <w:r>
+        <w:rPr>
+          <w:rFonts w:ascii="Times New Roman" w:hAnsi="Times New Roman"/>
+        </w:rPr>
+        <w:t xml:space="preserve">and</w:t>
+      </w:r>
+      <w:r>
+        <w:rPr>
+          <w:rFonts w:ascii="Times New Roman" w:hAnsi="Times New Roman"/>
+        </w:rPr>
+        <w:t xml:space="preserve"> </w:t>
+      </w:r>
+      <m:oMath>
+        <m:r>
+          <m:t>D</m:t>
+        </m:r>
+      </m:oMath>
+      <w:r>
+        <w:rPr>
+          <w:rFonts w:ascii="Times New Roman" w:hAnsi="Times New Roman"/>
+        </w:rPr>
+        <w:t xml:space="preserve"> </w:t>
+      </w:r>
+      <w:r>
+        <w:rPr>
+          <w:rFonts w:ascii="Times New Roman" w:hAnsi="Times New Roman"/>
+        </w:rPr>
+        <w:t xml:space="preserve">the diagonal no-jump factor. Multiplying every</w:t>
+      </w:r>
+      <w:r>
+        <w:rPr>
+          <w:rFonts w:ascii="Times New Roman" w:hAnsi="Times New Roman"/>
+        </w:rPr>
+        <w:t xml:space="preserve"> </w:t>
+      </w:r>
+      <m:oMath>
+        <m:d>
+          <m:dPr>
+            <m:begChr m:val="("/>
+            <m:endChr m:val=")"/>
+            <m:sepChr m:val=""/>
+            <m:grow/>
+          </m:dPr>
+          <m:e>
+            <m:r>
+              <m:t>1</m:t>
+            </m:r>
+            <m:r>
+              <m:rPr>
+                <m:sty m:val="p"/>
+              </m:rPr>
+              <m:t>−</m:t>
+            </m:r>
+            <m:sSub>
+              <m:e>
+                <m:r>
+                  <m:t>γ</m:t>
+                </m:r>
+              </m:e>
+              <m:sub>
+                <m:r>
+                  <m:t>q</m:t>
+                </m:r>
+              </m:sub>
+            </m:sSub>
+          </m:e>
+        </m:d>
+      </m:oMath>
+      <w:r>
+        <w:rPr>
+          <w:rFonts w:ascii="Times New Roman" w:hAnsi="Times New Roman"/>
+        </w:rPr>
+        <w:t xml:space="preserve"> </w:t>
+      </w:r>
+      <w:r>
+        <w:rPr>
+          <w:rFonts w:ascii="Times New Roman" w:hAnsi="Times New Roman"/>
+        </w:rPr>
+        <w:t xml:space="preserve">by</w:t>
+      </w:r>
+      <w:r>
+        <w:rPr>
+          <w:rFonts w:ascii="Times New Roman" w:hAnsi="Times New Roman"/>
+        </w:rPr>
+        <w:t xml:space="preserve"> </w:t>
+      </w:r>
+      <w:r>
+        <w:rPr>
+          <w:rFonts w:ascii="Times New Roman" w:hAnsi="Times New Roman"/>
+        </w:rPr>
+        <w:t xml:space="preserve">the same constant multiplies</w:t>
+      </w:r>
+      <w:r>
+        <w:rPr>
+          <w:rFonts w:ascii="Times New Roman" w:hAnsi="Times New Roman"/>
+        </w:rPr>
+        <w:t xml:space="preserve"> </w:t>
+      </w:r>
+      <m:oMath>
+        <m:r>
+          <m:t>D</m:t>
+        </m:r>
+      </m:oMath>
+      <w:r>
+        <w:rPr>
+          <w:rFonts w:ascii="Times New Roman" w:hAnsi="Times New Roman"/>
+        </w:rPr>
+        <w:t xml:space="preserve"> </w:t>
+      </w:r>
+      <w:r>
+        <w:rPr>
+          <w:rFonts w:ascii="Times New Roman" w:hAnsi="Times New Roman"/>
+        </w:rPr>
+        <w:t xml:space="preserve">by a constant on the weight-</w:t>
+      </w:r>
+      <m:oMath>
+        <m:r>
+          <m:t>k</m:t>
+        </m:r>
+      </m:oMath>
+      <w:r>
+        <w:rPr>
+          <w:rFonts w:ascii="Times New Roman" w:hAnsi="Times New Roman"/>
+        </w:rPr>
+        <w:t xml:space="preserve"> </w:t>
+      </w:r>
+      <w:r>
+        <w:rPr>
+          <w:rFonts w:ascii="Times New Roman" w:hAnsi="Times New Roman"/>
+        </w:rPr>
+        <w:t xml:space="preserve">sector, which cancels in the normalization. The</w:t>
+      </w:r>
+      <w:r>
+        <w:rPr>
+          <w:rFonts w:ascii="Times New Roman" w:hAnsi="Times New Roman"/>
+        </w:rPr>
+        <w:t xml:space="preserve"> </w:t>
+      </w:r>
+      <w:r>
+        <w:rPr>
+          <w:rFonts w:ascii="Times New Roman" w:hAnsi="Times New Roman"/>
+        </w:rPr>
+        <w:t xml:space="preserve">filtered readout therefore depends only on the ratios</w:t>
+      </w:r>
+      <w:r>
+        <w:rPr>
+          <w:rFonts w:ascii="Times New Roman" w:hAnsi="Times New Roman"/>
+        </w:rPr>
+        <w:t xml:space="preserve"> </w:t>
+      </w:r>
+      <m:oMath>
+        <m:d>
+          <m:dPr>
+            <m:begChr m:val="("/>
+            <m:endChr m:val=")"/>
+            <m:sepChr m:val=""/>
+            <m:grow/>
+          </m:dPr>
+          <m:e>
+            <m:r>
+              <m:t>1</m:t>
+            </m:r>
+            <m:r>
+              <m:rPr>
+                <m:sty m:val="p"/>
+              </m:rPr>
+              <m:t>−</m:t>
+            </m:r>
+            <m:sSub>
+              <m:e>
+                <m:r>
+                  <m:t>γ</m:t>
+                </m:r>
+              </m:e>
+              <m:sub>
+                <m:r>
+                  <m:t>q</m:t>
+                </m:r>
+              </m:sub>
+            </m:sSub>
+          </m:e>
+        </m:d>
+        <m:r>
+          <m:rPr>
+            <m:sty m:val="p"/>
+          </m:rPr>
+          <m:t>/</m:t>
+        </m:r>
+        <m:d>
+          <m:dPr>
+            <m:begChr m:val="("/>
+            <m:endChr m:val=")"/>
+            <m:sepChr m:val=""/>
+            <m:grow/>
+          </m:dPr>
+          <m:e>
+            <m:r>
+              <m:t>1</m:t>
+            </m:r>
+            <m:r>
+              <m:rPr>
+                <m:sty m:val="p"/>
+              </m:rPr>
+              <m:t>−</m:t>
+            </m:r>
+            <m:sSub>
+              <m:e>
+                <m:r>
+                  <m:t>γ</m:t>
+                </m:r>
+              </m:e>
+              <m:sub>
+                <m:r>
+                  <m:t>r</m:t>
+                </m:r>
+              </m:sub>
+            </m:sSub>
+          </m:e>
+        </m:d>
+      </m:oMath>
+      <w:r>
+        <w:rPr>
+          <w:rFonts w:ascii="Times New Roman" w:hAnsi="Times New Roman"/>
+        </w:rPr>
+        <w:t xml:space="preserve">, at any weight (checked to</w:t>
+      </w:r>
+      <w:r>
+        <w:rPr>
+          <w:rFonts w:ascii="Times New Roman" w:hAnsi="Times New Roman"/>
+        </w:rPr>
+        <w:t xml:space="preserve"> </w:t>
+      </w:r>
+      <m:oMath>
+        <m:sSup>
+          <m:e>
+            <m:r>
+              <m:t>10</m:t>
+            </m:r>
+          </m:e>
+          <m:sup>
+            <m:r>
+              <m:rPr>
+                <m:sty m:val="p"/>
+              </m:rPr>
+              <m:t>−</m:t>
+            </m:r>
+            <m:r>
+              <m:t>12</m:t>
+            </m:r>
+          </m:sup>
+        </m:sSup>
+      </m:oMath>
+      <w:r>
+        <w:rPr>
+          <w:rFonts w:ascii="Times New Roman" w:hAnsi="Times New Roman"/>
+        </w:rPr>
+        <w:t xml:space="preserve">), whereas the raw readout depends on their absolute values. A model trained with the filter under the</w:t>
+      </w:r>
+      <w:r>
+        <w:rPr>
+          <w:rFonts w:ascii="Times New Roman" w:hAnsi="Times New Roman"/>
+        </w:rPr>
+        <w:t xml:space="preserve"> </w:t>
+      </w:r>
+      <w:r>
+        <w:rPr>
+          <w:rFonts w:ascii="Times New Roman" w:hAnsi="Times New Roman"/>
+        </w:rPr>
+        <w:t xml:space="preserve">device’s decay rates needs only the relative T1s.</w:t>
+      </w:r>
+    </w:p>
+    <w:bookmarkEnd w:id="26"/>
+    <w:bookmarkStart w:id="27" w:name="multiclass-readout."/>
     <w:p>
       <w:pPr>
         <w:pStyle w:val="Heading4"/>
@@ -10333,8 +11681,8 @@
         <w:t xml:space="preserve">here moves the excitation to another qubit, i.e. swaps one class for another.</w:t>
       </w:r>
     </w:p>
-    <w:bookmarkEnd w:id="26"/>
-    <w:bookmarkStart w:id="27" w:name="f2-simulability."/>
+    <w:bookmarkEnd w:id="27"/>
+    <w:bookmarkStart w:id="28" w:name="f2-simulability."/>
     <w:p>
       <w:pPr>
         <w:pStyle w:val="Heading4"/>
@@ -10616,9 +11964,9 @@
         <w:t xml:space="preserve">that this note does not address.</w:t>
       </w:r>
     </w:p>
-    <w:bookmarkEnd w:id="27"/>
     <w:bookmarkEnd w:id="28"/>
-    <w:bookmarkStart w:id="29" w:name="methods"/>
+    <w:bookmarkEnd w:id="29"/>
+    <w:bookmarkStart w:id="30" w:name="methods"/>
     <w:p>
       <w:pPr>
         <w:pStyle w:val="Heading1"/>
@@ -10907,8 +12255,8 @@
         <w:t xml:space="preserve">.</w:t>
       </w:r>
     </w:p>
-    <w:bookmarkEnd w:id="29"/>
-    <w:bookmarkStart w:id="42" w:name="results"/>
+    <w:bookmarkEnd w:id="30"/>
+    <w:bookmarkStart w:id="43" w:name="results"/>
     <w:p>
       <w:pPr>
         <w:pStyle w:val="Heading1"/>
@@ -10920,7 +12268,7 @@
         <w:t xml:space="preserve">Results</w:t>
       </w:r>
     </w:p>
-    <w:bookmarkStart w:id="30" w:name="single-seed-studies."/>
+    <w:bookmarkStart w:id="31" w:name="single-seed-studies."/>
     <w:p>
       <w:pPr>
         <w:pStyle w:val="Heading4"/>
@@ -11590,11 +12938,59 @@
         <w:rPr>
           <w:rFonts w:ascii="Times New Roman" w:hAnsi="Times New Roman"/>
         </w:rPr>
-        <w:t xml:space="preserve">or two backends by one input).</w:t>
+        <w:t xml:space="preserve">or two backends by one input); with 3, 5 and 8 classes at 8 qubits, a loss without the filter growing with the</w:t>
+      </w:r>
+      <w:r>
+        <w:rPr>
+          <w:rFonts w:ascii="Times New Roman" w:hAnsi="Times New Roman"/>
+        </w:rPr>
+        <w:t xml:space="preserve"> </w:t>
+      </w:r>
+      <w:r>
+        <w:rPr>
+          <w:rFonts w:ascii="Times New Roman" w:hAnsi="Times New Roman"/>
+        </w:rPr>
+        <w:t xml:space="preserve">classes, at least 15 points with 8 classes, a smaller loss for the qubit readout at every class count (it lost</w:t>
+      </w:r>
+      <w:r>
+        <w:rPr>
+          <w:rFonts w:ascii="Times New Roman" w:hAnsi="Times New Roman"/>
+        </w:rPr>
+        <w:t xml:space="preserve"> </w:t>
+      </w:r>
+      <w:r>
+        <w:rPr>
+          <w:rFonts w:ascii="Times New Roman" w:hAnsi="Times New Roman"/>
+        </w:rPr>
+        <w:t xml:space="preserve">more with 3 classes), and noise-aware training within 3 points (3.0 with 8 classes, at the bound); and, for</w:t>
+      </w:r>
+      <w:r>
+        <w:rPr>
+          <w:rFonts w:ascii="Times New Roman" w:hAnsi="Times New Roman"/>
+        </w:rPr>
+        <w:t xml:space="preserve"> </w:t>
+      </w:r>
+      <w:r>
+        <w:rPr>
+          <w:rFonts w:ascii="Times New Roman" w:hAnsi="Times New Roman"/>
+        </w:rPr>
+        <w:t xml:space="preserve">unequal T1 corrected by calibrated training, a model within 0.5 points of noiseless at weight 2 (0.5 points</w:t>
+      </w:r>
+      <w:r>
+        <w:rPr>
+          <w:rFonts w:ascii="Times New Roman" w:hAnsi="Times New Roman"/>
+        </w:rPr>
+        <w:t xml:space="preserve"> </w:t>
+      </w:r>
+      <w:r>
+        <w:rPr>
+          <w:rFonts w:ascii="Times New Roman" w:hAnsi="Times New Roman"/>
+        </w:rPr>
+        <w:t xml:space="preserve">below) and a larger drift loss for the raw noise-aware model at weight 1 (it lost 0.2 points).</w:t>
       </w:r>
     </w:p>
-    <w:bookmarkEnd w:id="30"/>
-    <w:bookmarkStart w:id="35" w:name="replication-over-60-runs."/>
+    <w:bookmarkEnd w:id="31"/>
+    <w:bookmarkStart w:id="36" w:name="replication-over-60-runs."/>
     <w:p>
       <w:pPr>
         <w:pStyle w:val="Heading4"/>
@@ -11721,7 +13117,7 @@
         <w:t xml:space="preserve">pre-registered predictions of this replication passed.</w:t>
       </w:r>
     </w:p>
-    <w:bookmarkStart w:id="31" w:name="tab:main"/>
+    <w:bookmarkStart w:id="32" w:name="tab:main"/>
     <w:p>
       <w:pPr>
         <w:pStyle w:val="TableCaption"/>
@@ -12206,7 +13602,7 @@
         </w:tc>
       </w:tr>
     </w:tbl>
-    <w:bookmarkEnd w:id="31"/>
+    <w:bookmarkEnd w:id="32"/>
     <w:p>
       <w:pPr>
         <w:pStyle w:val="CaptionedFigure"/>
@@ -12220,18 +13616,18 @@
           <wp:inline>
             <wp:extent cx="4800600" cy="4073236"/>
             <wp:effectExtent b="0" l="0" r="0" t="0"/>
-            <wp:docPr descr="" title="" id="33" name="Picture"/>
+            <wp:docPr descr="" title="" id="34" name="Picture"/>
             <a:graphic>
               <a:graphicData uri="http://schemas.openxmlformats.org/drawingml/2006/picture">
                 <pic:pic>
                   <pic:nvPicPr>
-                    <pic:cNvPr descr="fig_qml.png" id="34" name="Picture"/>
+                    <pic:cNvPr descr="fig_qml.png" id="35" name="Picture"/>
                     <pic:cNvPicPr>
                       <a:picLocks noChangeArrowheads="1" noChangeAspect="1"/>
                     </pic:cNvPicPr>
                   </pic:nvPicPr>
                   <pic:blipFill>
-                    <a:blip r:embed="rId32"/>
+                    <a:blip r:embed="rId33"/>
                     <a:stretch>
                       <a:fillRect/>
                     </a:stretch>
@@ -12988,8 +14384,8 @@
         <w:t xml:space="preserve">points.</w:t>
       </w:r>
     </w:p>
-    <w:bookmarkEnd w:id="35"/>
-    <w:bookmarkStart w:id="36" w:name="sec:more"/>
+    <w:bookmarkEnd w:id="36"/>
+    <w:bookmarkStart w:id="37" w:name="sec:more"/>
     <w:p>
       <w:pPr>
         <w:pStyle w:val="Heading4"/>
@@ -14467,8 +15863,8 @@
         <w:t xml:space="preserve">mean.</w:t>
       </w:r>
     </w:p>
-    <w:bookmarkEnd w:id="36"/>
-    <w:bookmarkStart w:id="37" w:name="device-noise-models."/>
+    <w:bookmarkEnd w:id="37"/>
+    <w:bookmarkStart w:id="38" w:name="device-noise-models."/>
     <w:p>
       <w:pPr>
         <w:pStyle w:val="Heading4"/>
@@ -14778,8 +16174,8 @@
         <w:t xml:space="preserve">hardware runs are prepared, with cost confirmations, and pending.</w:t>
       </w:r>
     </w:p>
-    <w:bookmarkEnd w:id="37"/>
-    <w:bookmarkStart w:id="38" w:name="sec:echo"/>
+    <w:bookmarkEnd w:id="38"/>
+    <w:bookmarkStart w:id="39" w:name="sec:echo"/>
     <w:p>
       <w:pPr>
         <w:pStyle w:val="Heading4"/>
@@ -15354,9 +16750,92 @@
         </w:rPr>
         <w:t xml:space="preserve">when the filtered error is well above its shot-noise level, which a noiseless simulation at the same shots shows.</w:t>
       </w:r>
+      <w:r>
+        <w:rPr>
+          <w:rFonts w:ascii="Times New Roman" w:hAnsi="Times New Roman"/>
+        </w:rPr>
+        <w:t xml:space="preserve"> </w:t>
+      </w:r>
+      <w:r>
+        <w:rPr>
+          <w:rFonts w:ascii="Times New Roman" w:hAnsi="Times New Roman"/>
+        </w:rPr>
+        <w:t xml:space="preserve">At 8 qubits and weight 2 (28 sector states, 28 echoes at 4000 shots, the same five backends) the sector is dirtier:</w:t>
+      </w:r>
+      <w:r>
+        <w:rPr>
+          <w:rFonts w:ascii="Times New Roman" w:hAnsi="Times New Roman"/>
+        </w:rPr>
+        <w:t xml:space="preserve"> </w:t>
+      </w:r>
+      <w:r>
+        <w:rPr>
+          <w:rFonts w:ascii="Times New Roman" w:hAnsi="Times New Roman"/>
+        </w:rPr>
+        <w:t xml:space="preserve">only 50–80% of an echo’s kept shots return to the prepared state, against 70–90% at 5 qubits. The echo still</w:t>
+      </w:r>
+      <w:r>
+        <w:rPr>
+          <w:rFonts w:ascii="Times New Roman" w:hAnsi="Times New Roman"/>
+        </w:rPr>
+        <w:t xml:space="preserve"> </w:t>
+      </w:r>
+      <w:r>
+        <w:rPr>
+          <w:rFonts w:ascii="Times New Roman" w:hAnsi="Times New Roman"/>
+        </w:rPr>
+        <w:t xml:space="preserve">removed 27–38% of the</w:t>
+      </w:r>
+      <w:r>
+        <w:rPr>
+          <w:rFonts w:ascii="Times New Roman" w:hAnsi="Times New Roman"/>
+        </w:rPr>
+        <w:t xml:space="preserve"> </w:t>
+      </w:r>
+      <m:oMath>
+        <m:r>
+          <m:t>q</m:t>
+        </m:r>
+        <m:sSub>
+          <m:e>
+            <m:r>
+              <m:t>g</m:t>
+            </m:r>
+          </m:e>
+          <m:sub>
+            <m:r>
+              <m:t>Z</m:t>
+            </m:r>
+          </m:sub>
+        </m:sSub>
+      </m:oMath>
+      <w:r>
+        <w:rPr>
+          <w:rFonts w:ascii="Times New Roman" w:hAnsi="Times New Roman"/>
+        </w:rPr>
+        <w:t xml:space="preserve"> </w:t>
+      </w:r>
+      <w:r>
+        <w:rPr>
+          <w:rFonts w:ascii="Times New Roman" w:hAnsi="Times New Roman"/>
+        </w:rPr>
+        <w:t xml:space="preserve">error left by the filter (32% on average, against 40% at 5 qubits) and filter plus</w:t>
+      </w:r>
+      <w:r>
+        <w:rPr>
+          <w:rFonts w:ascii="Times New Roman" w:hAnsi="Times New Roman"/>
+        </w:rPr>
+        <w:t xml:space="preserve"> </w:t>
+      </w:r>
+      <w:r>
+        <w:rPr>
+          <w:rFonts w:ascii="Times New Roman" w:hAnsi="Times New Roman"/>
+        </w:rPr>
+        <w:t xml:space="preserve">echo was 3.4–4.1 times below raw; all five predictions passed.</w:t>
+      </w:r>
     </w:p>
-    <w:bookmarkEnd w:id="38"/>
-    <w:bookmarkStart w:id="39" w:name="sec:scaling"/>
+    <w:bookmarkEnd w:id="39"/>
+    <w:bookmarkStart w:id="40" w:name="sec:scaling"/>
     <w:p>
       <w:pPr>
         <w:pStyle w:val="Heading4"/>
@@ -16795,8 +18274,8 @@
         <w:t xml:space="preserve">make product states look entangled.</w:t>
       </w:r>
     </w:p>
-    <w:bookmarkEnd w:id="39"/>
-    <w:bookmarkStart w:id="41" w:name="sec:beyond"/>
+    <w:bookmarkEnd w:id="40"/>
+    <w:bookmarkStart w:id="42" w:name="sec:beyond"/>
     <w:p>
       <w:pPr>
         <w:pStyle w:val="Heading4"/>
@@ -16836,7 +18315,7 @@
         <w:rPr>
           <w:rFonts w:ascii="Times New Roman" w:hAnsi="Times New Roman"/>
         </w:rPr>
-        <w:t xml:space="preserve">collects five studies that each change one thing in the setting above.</w:t>
+        <w:t xml:space="preserve">collects the studies that each change one thing in the setting above.</w:t>
       </w:r>
     </w:p>
     <w:p>
@@ -17606,7 +19085,243 @@
         <w:t xml:space="preserve">with filter plus echo, against 0.91 noiseless.</w:t>
       </w:r>
     </w:p>
-    <w:bookmarkStart w:id="40" w:name="tab:beyond"/>
+    <w:p>
+      <w:pPr>
+        <w:numPr>
+          <w:ilvl w:val="0"/>
+          <w:numId w:val="1006"/>
+        </w:numPr>
+      </w:pPr>
+      <w:r>
+        <w:rPr>
+          <w:iCs/>
+          <w:rFonts w:ascii="Times New Roman" w:hAnsi="Times New Roman"/>
+          <w:i/>
+        </w:rPr>
+        <w:t xml:space="preserve">Eight classes on eight qubits</w:t>
+      </w:r>
+      <w:r>
+        <w:rPr>
+          <w:rFonts w:ascii="Times New Roman" w:hAnsi="Times New Roman"/>
+        </w:rPr>
+        <w:t xml:space="preserve"> </w:t>
+      </w:r>
+      <w:r>
+        <w:rPr>
+          <w:rFonts w:ascii="Times New Roman" w:hAnsi="Times New Roman"/>
+        </w:rPr>
+        <w:t xml:space="preserve">(digits 0..</w:t>
+      </w:r>
+      <m:oMath>
+        <m:r>
+          <m:t>C</m:t>
+        </m:r>
+        <m:r>
+          <m:rPr>
+            <m:sty m:val="p"/>
+          </m:rPr>
+          <m:t>−</m:t>
+        </m:r>
+        <m:r>
+          <m:t>1</m:t>
+        </m:r>
+      </m:oMath>
+      <w:r>
+        <w:rPr>
+          <w:rFonts w:ascii="Times New Roman" w:hAnsi="Times New Roman"/>
+        </w:rPr>
+        <w:t xml:space="preserve">,</w:t>
+      </w:r>
+      <w:r>
+        <w:rPr>
+          <w:rFonts w:ascii="Times New Roman" w:hAnsi="Times New Roman"/>
+        </w:rPr>
+        <w:t xml:space="preserve"> </w:t>
+      </w:r>
+      <m:oMath>
+        <m:r>
+          <m:t>C</m:t>
+        </m:r>
+        <m:r>
+          <m:rPr>
+            <m:sty m:val="p"/>
+          </m:rPr>
+          <m:t>=</m:t>
+        </m:r>
+        <m:r>
+          <m:t>3</m:t>
+        </m:r>
+        <m:r>
+          <m:rPr>
+            <m:sty m:val="p"/>
+          </m:rPr>
+          <m:t>,</m:t>
+        </m:r>
+        <m:r>
+          <m:t>5</m:t>
+        </m:r>
+        <m:r>
+          <m:rPr>
+            <m:sty m:val="p"/>
+          </m:rPr>
+          <m:t>,</m:t>
+        </m:r>
+        <m:r>
+          <m:t>8</m:t>
+        </m:r>
+      </m:oMath>
+      <w:r>
+        <w:rPr>
+          <w:rFonts w:ascii="Times New Roman" w:hAnsi="Times New Roman"/>
+        </w:rPr>
+        <w:t xml:space="preserve">; 5 seeds). With the filter every run equals</w:t>
+      </w:r>
+      <w:r>
+        <w:rPr>
+          <w:rFonts w:ascii="Times New Roman" w:hAnsi="Times New Roman"/>
+        </w:rPr>
+        <w:t xml:space="preserve"> </w:t>
+      </w:r>
+      <w:r>
+        <w:rPr>
+          <w:rFonts w:ascii="Times New Roman" w:hAnsi="Times New Roman"/>
+        </w:rPr>
+        <w:t xml:space="preserve">its noiseless accuracy. Without it the head readout loses 0.7, 15.9 and 11.1 points for 3, 5 and 8 classes, with a</w:t>
+      </w:r>
+      <w:r>
+        <w:rPr>
+          <w:rFonts w:ascii="Times New Roman" w:hAnsi="Times New Roman"/>
+        </w:rPr>
+        <w:t xml:space="preserve"> </w:t>
+      </w:r>
+      <w:r>
+        <w:rPr>
+          <w:rFonts w:ascii="Times New Roman" w:hAnsi="Times New Roman"/>
+        </w:rPr>
+        <w:t xml:space="preserve">large spread between seeds (2–34 points with 5 classes); the qubit readout loses 5.1, 4.4 and 3.4. Unlike at 5</w:t>
+      </w:r>
+      <w:r>
+        <w:rPr>
+          <w:rFonts w:ascii="Times New Roman" w:hAnsi="Times New Roman"/>
+        </w:rPr>
+        <w:t xml:space="preserve"> </w:t>
+      </w:r>
+      <w:r>
+        <w:rPr>
+          <w:rFonts w:ascii="Times New Roman" w:hAnsi="Times New Roman"/>
+        </w:rPr>
+        <w:t xml:space="preserve">qubits, noise-aware training without the filter stays 2–3 points behind with 5 and 8 classes.</w:t>
+      </w:r>
+    </w:p>
+    <w:p>
+      <w:pPr>
+        <w:numPr>
+          <w:ilvl w:val="0"/>
+          <w:numId w:val="1006"/>
+        </w:numPr>
+      </w:pPr>
+      <w:r>
+        <w:rPr>
+          <w:iCs/>
+          <w:rFonts w:ascii="Times New Roman" w:hAnsi="Times New Roman"/>
+          <w:i/>
+        </w:rPr>
+        <w:t xml:space="preserve">Unequal T1 corrected</w:t>
+      </w:r>
+      <w:r>
+        <w:rPr>
+          <w:rFonts w:ascii="Times New Roman" w:hAnsi="Times New Roman"/>
+        </w:rPr>
+        <w:t xml:space="preserve"> </w:t>
+      </w:r>
+      <w:r>
+        <w:rPr>
+          <w:rFonts w:ascii="Times New Roman" w:hAnsi="Times New Roman"/>
+        </w:rPr>
+        <w:t xml:space="preserve">(iris, cancer, wine, digits; 5 seeds;</w:t>
+      </w:r>
+      <w:r>
+        <w:rPr>
+          <w:rFonts w:ascii="Times New Roman" w:hAnsi="Times New Roman"/>
+        </w:rPr>
+        <w:t xml:space="preserve"> </w:t>
+      </w:r>
+      <m:oMath>
+        <m:sSub>
+          <m:e>
+            <m:r>
+              <m:t>γ</m:t>
+            </m:r>
+          </m:e>
+          <m:sub>
+            <m:r>
+              <m:t>q</m:t>
+            </m:r>
+          </m:sub>
+        </m:sSub>
+      </m:oMath>
+      <w:r>
+        <w:rPr>
+          <w:rFonts w:ascii="Times New Roman" w:hAnsi="Times New Roman"/>
+        </w:rPr>
+        <w:t xml:space="preserve"> </w:t>
+      </w:r>
+      <w:r>
+        <w:rPr>
+          <w:rFonts w:ascii="Times New Roman" w:hAnsi="Times New Roman"/>
+        </w:rPr>
+        <w:t xml:space="preserve">from 0 to 0.16). Trained with</w:t>
+      </w:r>
+      <w:r>
+        <w:rPr>
+          <w:rFonts w:ascii="Times New Roman" w:hAnsi="Times New Roman"/>
+        </w:rPr>
+        <w:t xml:space="preserve"> </w:t>
+      </w:r>
+      <w:r>
+        <w:rPr>
+          <w:rFonts w:ascii="Times New Roman" w:hAnsi="Times New Roman"/>
+        </w:rPr>
+        <w:t xml:space="preserve">the filter under rates calibrated with a 10% error, the model reached 0.951 (weight 1) and 0.940 (weight 2)</w:t>
+      </w:r>
+      <w:r>
+        <w:rPr>
+          <w:rFonts w:ascii="Times New Roman" w:hAnsi="Times New Roman"/>
+        </w:rPr>
+        <w:t xml:space="preserve"> </w:t>
+      </w:r>
+      <w:r>
+        <w:rPr>
+          <w:rFonts w:ascii="Times New Roman" w:hAnsi="Times New Roman"/>
+        </w:rPr>
+        <w:t xml:space="preserve">against 0.950 and 0.945 noiseless; the filter alone gave 0.931 and 0.918, the raw readout 0.873 and 0.797. Trained</w:t>
+      </w:r>
+      <w:r>
+        <w:rPr>
+          <w:rFonts w:ascii="Times New Roman" w:hAnsi="Times New Roman"/>
+        </w:rPr>
+        <w:t xml:space="preserve"> </w:t>
+      </w:r>
+      <w:r>
+        <w:rPr>
+          <w:rFonts w:ascii="Times New Roman" w:hAnsi="Times New Roman"/>
+        </w:rPr>
+        <w:t xml:space="preserve">without the filter under the same rates it reached 0.952 and 0.941. When all T1 shortened by 1.5 after training,</w:t>
+      </w:r>
+      <w:r>
+        <w:rPr>
+          <w:rFonts w:ascii="Times New Roman" w:hAnsi="Times New Roman"/>
+        </w:rPr>
+        <w:t xml:space="preserve"> </w:t>
+      </w:r>
+      <w:r>
+        <w:rPr>
+          <w:rFonts w:ascii="Times New Roman" w:hAnsi="Times New Roman"/>
+        </w:rPr>
+        <w:t xml:space="preserve">the filtered model lost 0.8 and 0.7 points and the raw one 0.2 and 10.0 (F5).</w:t>
+      </w:r>
+    </w:p>
+    <w:bookmarkStart w:id="41" w:name="tab:beyond"/>
     <w:p>
       <w:pPr>
         <w:pStyle w:val="TableCaption"/>
@@ -18110,11 +19825,263 @@
           </w:p>
         </w:tc>
       </w:tr>
+      <w:tr>
+        <w:tc>
+          <w:tcPr/>
+          <w:p>
+            <w:pPr>
+              <w:pStyle w:val="Compact"/>
+              <w:jc w:val="left"/>
+            </w:pPr>
+            <w:r>
+              <w:t xml:space="preserve">multiclass, 8 qubits (T1)</w:t>
+            </w:r>
+          </w:p>
+        </w:tc>
+        <w:tc>
+          <w:tcPr/>
+          <w:p>
+            <w:pPr>
+              <w:pStyle w:val="Compact"/>
+              <w:jc w:val="left"/>
+            </w:pPr>
+            <w:r>
+              <w:t xml:space="preserve">head, 5 / 8 classes</w:t>
+            </w:r>
+          </w:p>
+        </w:tc>
+        <w:tc>
+          <w:tcPr/>
+          <w:p>
+            <w:pPr>
+              <w:pStyle w:val="Compact"/>
+              <w:jc w:val="center"/>
+            </w:pPr>
+            <w:r>
+              <w:t xml:space="preserve">0.952 / 0.916</w:t>
+            </w:r>
+          </w:p>
+        </w:tc>
+        <w:tc>
+          <w:tcPr/>
+          <w:p>
+            <w:pPr>
+              <w:pStyle w:val="Compact"/>
+              <w:jc w:val="center"/>
+            </w:pPr>
+            <w:r>
+              <w:t xml:space="preserve">0.952 / 0.916</w:t>
+            </w:r>
+          </w:p>
+        </w:tc>
+        <w:tc>
+          <w:tcPr/>
+          <w:p>
+            <w:pPr>
+              <w:pStyle w:val="Compact"/>
+              <w:jc w:val="center"/>
+            </w:pPr>
+            <w:r>
+              <w:t xml:space="preserve">0.793 / 0.805</w:t>
+            </w:r>
+          </w:p>
+        </w:tc>
+      </w:tr>
+      <w:tr>
+        <w:tc>
+          <w:tcPr/>
+          <w:p>
+            <w:pPr>
+              <w:pStyle w:val="Compact"/>
+              <w:jc w:val="left"/>
+            </w:pPr>
+            <w:r>
+              <w:t xml:space="preserve">unequal T1 (</w:t>
+            </w:r>
+            <m:oMath>
+              <m:r>
+                <m:rPr>
+                  <m:sty m:val="p"/>
+                </m:rPr>
+                <m:t>±</m:t>
+              </m:r>
+              <m:r>
+                <m:t>100</m:t>
+              </m:r>
+              <m:r>
+                <m:rPr>
+                  <m:sty m:val="p"/>
+                </m:rPr>
+                <m:t>%</m:t>
+              </m:r>
+            </m:oMath>
+            <w:r>
+              <w:t xml:space="preserve">)</w:t>
+            </w:r>
+          </w:p>
+        </w:tc>
+        <w:tc>
+          <w:tcPr/>
+          <w:p>
+            <w:pPr>
+              <w:pStyle w:val="Compact"/>
+              <w:jc w:val="left"/>
+            </w:pPr>
+            <w:r>
+              <w:t xml:space="preserve">weight 1 / 2, filter alone</w:t>
+            </w:r>
+          </w:p>
+        </w:tc>
+        <w:tc>
+          <w:tcPr/>
+          <w:p>
+            <w:pPr>
+              <w:pStyle w:val="Compact"/>
+              <w:jc w:val="center"/>
+            </w:pPr>
+            <w:r>
+              <w:t xml:space="preserve">0.950 / 0.945</w:t>
+            </w:r>
+          </w:p>
+        </w:tc>
+        <w:tc>
+          <w:tcPr/>
+          <w:p>
+            <w:pPr>
+              <w:pStyle w:val="Compact"/>
+              <w:jc w:val="center"/>
+            </w:pPr>
+            <w:r>
+              <w:t xml:space="preserve">0.931 / 0.918</w:t>
+            </w:r>
+          </w:p>
+        </w:tc>
+        <w:tc>
+          <w:tcPr/>
+          <w:p>
+            <w:pPr>
+              <w:pStyle w:val="Compact"/>
+              <w:jc w:val="center"/>
+            </w:pPr>
+            <w:r>
+              <w:t xml:space="preserve">0.873 / 0.797</w:t>
+            </w:r>
+          </w:p>
+        </w:tc>
+      </w:tr>
+      <w:tr>
+        <w:tc>
+          <w:tcPr/>
+          <w:p>
+            <w:pPr>
+              <w:pStyle w:val="Compact"/>
+            </w:pPr>
+          </w:p>
+        </w:tc>
+        <w:tc>
+          <w:tcPr/>
+          <w:p>
+            <w:pPr>
+              <w:pStyle w:val="Compact"/>
+              <w:jc w:val="left"/>
+            </w:pPr>
+            <w:r>
+              <w:t xml:space="preserve">trained with calibrated rates</w:t>
+            </w:r>
+          </w:p>
+        </w:tc>
+        <w:tc>
+          <w:tcPr/>
+          <w:p>
+            <w:pPr>
+              <w:pStyle w:val="Compact"/>
+            </w:pPr>
+          </w:p>
+        </w:tc>
+        <w:tc>
+          <w:tcPr/>
+          <w:p>
+            <w:pPr>
+              <w:pStyle w:val="Compact"/>
+              <w:jc w:val="center"/>
+            </w:pPr>
+            <w:r>
+              <w:t xml:space="preserve">0.951 / 0.940</w:t>
+            </w:r>
+          </w:p>
+        </w:tc>
+        <w:tc>
+          <w:tcPr/>
+          <w:p>
+            <w:pPr>
+              <w:pStyle w:val="Compact"/>
+              <w:jc w:val="center"/>
+            </w:pPr>
+            <w:r>
+              <w:t xml:space="preserve">0.952 / 0.941</w:t>
+            </w:r>
+          </w:p>
+        </w:tc>
+      </w:tr>
+      <w:tr>
+        <w:tc>
+          <w:tcPr/>
+          <w:p>
+            <w:pPr>
+              <w:pStyle w:val="Compact"/>
+            </w:pPr>
+          </w:p>
+        </w:tc>
+        <w:tc>
+          <w:tcPr/>
+          <w:p>
+            <w:pPr>
+              <w:pStyle w:val="Compact"/>
+              <w:jc w:val="left"/>
+            </w:pPr>
+            <w:r>
+              <w:t xml:space="preserve">after a 1.5-fold T1 drift</w:t>
+            </w:r>
+          </w:p>
+        </w:tc>
+        <w:tc>
+          <w:tcPr/>
+          <w:p>
+            <w:pPr>
+              <w:pStyle w:val="Compact"/>
+            </w:pPr>
+          </w:p>
+        </w:tc>
+        <w:tc>
+          <w:tcPr/>
+          <w:p>
+            <w:pPr>
+              <w:pStyle w:val="Compact"/>
+              <w:jc w:val="center"/>
+            </w:pPr>
+            <w:r>
+              <w:t xml:space="preserve">0.942 / 0.932</w:t>
+            </w:r>
+          </w:p>
+        </w:tc>
+        <w:tc>
+          <w:tcPr/>
+          <w:p>
+            <w:pPr>
+              <w:pStyle w:val="Compact"/>
+              <w:jc w:val="center"/>
+            </w:pPr>
+            <w:r>
+              <w:t xml:space="preserve">0.950 / 0.841</w:t>
+            </w:r>
+          </w:p>
+        </w:tc>
+      </w:tr>
     </w:tbl>
-    <w:bookmarkEnd w:id="40"/>
     <w:bookmarkEnd w:id="41"/>
     <w:bookmarkEnd w:id="42"/>
-    <w:bookmarkStart w:id="44" w:name="discussion"/>
+    <w:bookmarkEnd w:id="43"/>
+    <w:bookmarkStart w:id="45" w:name="discussion"/>
     <w:p>
       <w:pPr>
         <w:pStyle w:val="Heading1"/>
@@ -18222,31 +20189,55 @@
         <w:rPr>
           <w:rFonts w:ascii="Times New Roman" w:hAnsi="Times New Roman"/>
         </w:rPr>
-        <w:t xml:space="preserve">model and no noisy training runs, and its cost (the discarded shots) is known before running. Unequal T1 and</w:t>
-      </w:r>
-      <w:r>
-        <w:rPr>
-          <w:rFonts w:ascii="Times New Roman" w:hAnsi="Times New Roman"/>
-        </w:rPr>
-        <w:t xml:space="preserve"> </w:t>
-      </w:r>
-      <w:r>
-        <w:rPr>
-          <w:rFonts w:ascii="Times New Roman" w:hAnsi="Times New Roman"/>
-        </w:rPr>
-        <w:t xml:space="preserve">dephasing are not corrected. On hardware with a large spread of T1 or strong dephasing, the filter</w:t>
-      </w:r>
-      <w:r>
-        <w:rPr>
-          <w:rFonts w:ascii="Times New Roman" w:hAnsi="Times New Roman"/>
-        </w:rPr>
-        <w:t xml:space="preserve"> </w:t>
-      </w:r>
-      <w:r>
-        <w:rPr>
-          <w:rFonts w:ascii="Times New Roman" w:hAnsi="Times New Roman"/>
-        </w:rPr>
-        <w:t xml:space="preserve">complements a noise model and does not replace it. Two practical rules follow from the studies above. Up</w:t>
+        <w:t xml:space="preserve">model and no noisy training runs, and its cost (the discarded shots) is known before running. Dephasing is not</w:t>
+      </w:r>
+      <w:r>
+        <w:rPr>
+          <w:rFonts w:ascii="Times New Roman" w:hAnsi="Times New Roman"/>
+        </w:rPr>
+        <w:t xml:space="preserve"> </w:t>
+      </w:r>
+      <w:r>
+        <w:rPr>
+          <w:rFonts w:ascii="Times New Roman" w:hAnsi="Times New Roman"/>
+        </w:rPr>
+        <w:t xml:space="preserve">corrected. Unequal T1 is, when the network is trained with the filter under the calibrated decay rates: since only</w:t>
+      </w:r>
+      <w:r>
+        <w:rPr>
+          <w:rFonts w:ascii="Times New Roman" w:hAnsi="Times New Roman"/>
+        </w:rPr>
+        <w:t xml:space="preserve"> </w:t>
+      </w:r>
+      <w:r>
+        <w:rPr>
+          <w:rFonts w:ascii="Times New Roman" w:hAnsi="Times New Roman"/>
+        </w:rPr>
+        <w:t xml:space="preserve">their ratios enter (F5), this needs the relative T1s, tolerates calibration errors and, at weight 2, survives a</w:t>
+      </w:r>
+      <w:r>
+        <w:rPr>
+          <w:rFonts w:ascii="Times New Roman" w:hAnsi="Times New Roman"/>
+        </w:rPr>
+        <w:t xml:space="preserve"> </w:t>
+      </w:r>
+      <w:r>
+        <w:rPr>
+          <w:rFonts w:ascii="Times New Roman" w:hAnsi="Times New Roman"/>
+        </w:rPr>
+        <w:t xml:space="preserve">common drift that the raw noise-aware model does not. On hardware with strong dephasing the filter complements a noise</w:t>
+      </w:r>
+      <w:r>
+        <w:rPr>
+          <w:rFonts w:ascii="Times New Roman" w:hAnsi="Times New Roman"/>
+        </w:rPr>
+        <w:t xml:space="preserve"> </w:t>
+      </w:r>
+      <w:r>
+        <w:rPr>
+          <w:rFonts w:ascii="Times New Roman" w:hAnsi="Times New Roman"/>
+        </w:rPr>
+        <w:t xml:space="preserve">model and does not replace it. Two practical rules follow from the studies above. Up</w:t>
       </w:r>
       <w:r>
         <w:rPr>
@@ -18462,7 +20453,7 @@
         <w:t xml:space="preserve">.</w:t>
       </w:r>
     </w:p>
-    <w:bookmarkStart w:id="43" w:name="limitations."/>
+    <w:bookmarkStart w:id="44" w:name="limitations."/>
     <w:p>
       <w:pPr>
         <w:pStyle w:val="Heading4"/>
@@ -18518,12 +20509,48 @@
         <w:rPr>
           <w:rFonts w:ascii="Times New Roman" w:hAnsi="Times New Roman"/>
         </w:rPr>
-        <w:t xml:space="preserve">simulable. A hardware run with the filter is the natural next test.</w:t>
+        <w:t xml:space="preserve">simulable. A hardware run with the filter is the natural next test: a guarded IonQ package for the five-class</w:t>
+      </w:r>
+      <w:r>
+        <w:rPr>
+          <w:rFonts w:ascii="Times New Roman" w:hAnsi="Times New Roman"/>
+        </w:rPr>
+        <w:t xml:space="preserve"> </w:t>
+      </w:r>
+      <w:r>
+        <w:rPr>
+          <w:rFonts w:ascii="Times New Roman" w:hAnsi="Times New Roman"/>
+        </w:rPr>
+        <w:t xml:space="preserve">model with echo (55 circuits, 60 000 shots) is ready, rehearsed on the Forte-1 noise model (8, 4 and 1 decisions</w:t>
+      </w:r>
+      <w:r>
+        <w:rPr>
+          <w:rFonts w:ascii="Times New Roman" w:hAnsi="Times New Roman"/>
+        </w:rPr>
+        <w:t xml:space="preserve"> </w:t>
+      </w:r>
+      <w:r>
+        <w:rPr>
+          <w:rFonts w:ascii="Times New Roman" w:hAnsi="Times New Roman"/>
+        </w:rPr>
+        <w:t xml:space="preserve">differing from the noiseless model raw, with the filter and with the echo, over 50 inputs), with its predictions</w:t>
+      </w:r>
+      <w:r>
+        <w:rPr>
+          <w:rFonts w:ascii="Times New Roman" w:hAnsi="Times New Roman"/>
+        </w:rPr>
+        <w:t xml:space="preserve"> </w:t>
+      </w:r>
+      <w:r>
+        <w:rPr>
+          <w:rFonts w:ascii="Times New Roman" w:hAnsi="Times New Roman"/>
+        </w:rPr>
+        <w:t xml:space="preserve">committed, and waits for hardware credits.</w:t>
       </w:r>
     </w:p>
-    <w:bookmarkEnd w:id="43"/>
     <w:bookmarkEnd w:id="44"/>
-    <w:bookmarkStart w:id="58" w:name="code-and-data-availability"/>
+    <w:bookmarkEnd w:id="45"/>
+    <w:bookmarkStart w:id="59" w:name="code-and-data-availability"/>
     <w:p>
       <w:pPr>
         <w:pStyle w:val="Heading1"/>
@@ -18952,7 +20979,7 @@
         <w:rPr>
           <w:rFonts w:ascii="Times New Roman" w:hAnsi="Times New Roman"/>
         </w:rPr>
-        <w:t xml:space="preserve">and RESEARCH_NOTES §75–§82, §85, §87, §90, §91 and §94–§101, §104–§113, with tests in</w:t>
+        <w:t xml:space="preserve">and RESEARCH_NOTES §75–§82, §85, §87, §90, §91 and §94–§101, §104–§117, with tests in</w:t>
       </w:r>
       <w:r>
         <w:rPr>
@@ -19065,7 +21092,7 @@
         </w:rPr>
         <w:t xml:space="preserve"> </w:t>
       </w:r>
-      <w:hyperlink r:id="rId45">
+      <w:hyperlink r:id="rId46">
         <w:r>
           <w:rPr>
             <w:rStyle w:val="Hyperlink"/>
@@ -19268,8 +21295,8 @@
         <w:t xml:space="preserve"># raw readout</w:t>
       </w:r>
     </w:p>
-    <w:bookmarkStart w:id="57" w:name="refs"/>
-    <w:bookmarkStart w:id="46" w:name="ref-bonetmonroig2018"/>
+    <w:bookmarkStart w:id="58" w:name="refs"/>
+    <w:bookmarkStart w:id="47" w:name="ref-bonetmonroig2018"/>
     <w:p>
       <w:pPr>
         <w:pStyle w:val="Bibliography"/>
@@ -19319,8 +21346,8 @@
         <w:t xml:space="preserve">98: 062339.</w:t>
       </w:r>
     </w:p>
-    <w:bookmarkEnd w:id="46"/>
-    <w:bookmarkStart w:id="47" w:name="ref-cerezo2023simulability"/>
+    <w:bookmarkEnd w:id="47"/>
+    <w:bookmarkStart w:id="48" w:name="ref-cerezo2023simulability"/>
     <w:p>
       <w:pPr>
         <w:pStyle w:val="Bibliography"/>
@@ -19362,8 +21389,8 @@
         <w:t xml:space="preserve">r, Why We Need to Rethink Variational Quantum Computing.”</w:t>
       </w:r>
     </w:p>
-    <w:bookmarkEnd w:id="47"/>
-    <w:bookmarkStart w:id="49" w:name="ref-landman2022"/>
+    <w:bookmarkEnd w:id="48"/>
+    <w:bookmarkStart w:id="50" w:name="ref-landman2022"/>
     <w:p>
       <w:pPr>
         <w:pStyle w:val="Bibliography"/>
@@ -19418,7 +21445,7 @@
         </w:rPr>
         <w:t xml:space="preserve"> </w:t>
       </w:r>
-      <w:hyperlink r:id="rId48">
+      <w:hyperlink r:id="rId49">
         <w:r>
           <w:rPr>
             <w:rStyle w:val="Hyperlink"/>
@@ -19433,8 +21460,8 @@
         <w:t xml:space="preserve">.</w:t>
       </w:r>
     </w:p>
-    <w:bookmarkEnd w:id="49"/>
-    <w:bookmarkStart w:id="50" w:name="ref-mcardle2019"/>
+    <w:bookmarkEnd w:id="50"/>
+    <w:bookmarkStart w:id="51" w:name="ref-mcardle2019"/>
     <w:p>
       <w:pPr>
         <w:pStyle w:val="Bibliography"/>
@@ -19484,8 +21511,8 @@
         <w:t xml:space="preserve">122: 180501.</w:t>
       </w:r>
     </w:p>
-    <w:bookmarkEnd w:id="50"/>
-    <w:bookmarkStart w:id="52" w:name="ref-monteverde2026qang"/>
+    <w:bookmarkEnd w:id="51"/>
+    <w:bookmarkStart w:id="53" w:name="ref-monteverde2026qang"/>
     <w:p>
       <w:pPr>
         <w:pStyle w:val="Bibliography"/>
@@ -19538,7 +21565,7 @@
         </w:rPr>
         <w:t xml:space="preserve"> </w:t>
       </w:r>
-      <w:hyperlink r:id="rId51">
+      <w:hyperlink r:id="rId52">
         <w:r>
           <w:rPr>
             <w:rStyle w:val="Hyperlink"/>
@@ -19553,8 +21580,8 @@
         <w:t xml:space="preserve">.</w:t>
       </w:r>
     </w:p>
-    <w:bookmarkEnd w:id="52"/>
-    <w:bookmarkStart w:id="54" w:name="ref-monteverde2026witness"/>
+    <w:bookmarkEnd w:id="53"/>
+    <w:bookmarkStart w:id="55" w:name="ref-monteverde2026witness"/>
     <w:p>
       <w:pPr>
         <w:pStyle w:val="Bibliography"/>
@@ -19603,7 +21630,7 @@
         </w:rPr>
         <w:t xml:space="preserve"> </w:t>
       </w:r>
-      <w:hyperlink r:id="rId53">
+      <w:hyperlink r:id="rId54">
         <w:r>
           <w:rPr>
             <w:rStyle w:val="Hyperlink"/>
@@ -19618,8 +21645,8 @@
         <w:t xml:space="preserve">.</w:t>
       </w:r>
     </w:p>
-    <w:bookmarkEnd w:id="54"/>
-    <w:bookmarkStart w:id="56" w:name="ref-wang2022quantumnat"/>
+    <w:bookmarkEnd w:id="55"/>
+    <w:bookmarkStart w:id="57" w:name="ref-wang2022quantumnat"/>
     <w:p>
       <w:pPr>
         <w:pStyle w:val="Bibliography"/>
@@ -19692,7 +21719,7 @@
         </w:rPr>
         <w:t xml:space="preserve"> </w:t>
       </w:r>
-      <w:hyperlink r:id="rId55">
+      <w:hyperlink r:id="rId56">
         <w:r>
           <w:rPr>
             <w:rStyle w:val="Hyperlink"/>
@@ -19707,9 +21734,9 @@
         <w:t xml:space="preserve">.</w:t>
       </w:r>
     </w:p>
-    <w:bookmarkEnd w:id="56"/>
     <w:bookmarkEnd w:id="57"/>
     <w:bookmarkEnd w:id="58"/>
+    <w:bookmarkEnd w:id="59"/>
     <w:sectPr/>
   </w:body>
 </w:document>

</xml_diff>

<commit_message>
QML note (EN/ES, PDF and Word) with section 118: F6 (the filter turns T1 plus dephasing into dephasing alone), dephasing with filter plus ZNE and with calibrated training
</commit_message>
<xml_diff>
--- a/manuscript/qang_qml.docx
+++ b/manuscript/qang_qml.docx
@@ -3824,6 +3824,774 @@
         <w:rPr>
           <w:rFonts w:ascii="Times New Roman" w:hAnsi="Times New Roman"/>
         </w:rPr>
+        <w:t xml:space="preserve">Under</w:t>
+      </w:r>
+      <w:r>
+        <w:rPr>
+          <w:rFonts w:ascii="Times New Roman" w:hAnsi="Times New Roman"/>
+        </w:rPr>
+        <w:t xml:space="preserve"> </w:t>
+      </w:r>
+      <w:r>
+        <w:rPr>
+          <w:rFonts w:ascii="Times New Roman" w:hAnsi="Times New Roman"/>
+        </w:rPr>
+        <w:t xml:space="preserve">equal</w:t>
+      </w:r>
+      <w:r>
+        <w:rPr>
+          <w:rFonts w:ascii="Times New Roman" w:hAnsi="Times New Roman"/>
+        </w:rPr>
+        <w:t xml:space="preserve"> </w:t>
+      </w:r>
+      <w:r>
+        <w:rPr>
+          <w:rFonts w:ascii="Times New Roman" w:hAnsi="Times New Roman"/>
+        </w:rPr>
+        <w:t xml:space="preserve">T1</w:t>
+      </w:r>
+      <w:r>
+        <w:rPr>
+          <w:rFonts w:ascii="Times New Roman" w:hAnsi="Times New Roman"/>
+        </w:rPr>
+        <w:t xml:space="preserve"> </w:t>
+      </w:r>
+      <w:r>
+        <w:rPr>
+          <w:rFonts w:ascii="Times New Roman" w:hAnsi="Times New Roman"/>
+        </w:rPr>
+        <w:t xml:space="preserve">plus</w:t>
+      </w:r>
+      <w:r>
+        <w:rPr>
+          <w:rFonts w:ascii="Times New Roman" w:hAnsi="Times New Roman"/>
+        </w:rPr>
+        <w:t xml:space="preserve"> </w:t>
+      </w:r>
+      <w:r>
+        <w:rPr>
+          <w:rFonts w:ascii="Times New Roman" w:hAnsi="Times New Roman"/>
+        </w:rPr>
+        <w:t xml:space="preserve">dephasing,</w:t>
+      </w:r>
+      <w:r>
+        <w:rPr>
+          <w:rFonts w:ascii="Times New Roman" w:hAnsi="Times New Roman"/>
+        </w:rPr>
+        <w:t xml:space="preserve"> </w:t>
+      </w:r>
+      <w:r>
+        <w:rPr>
+          <w:rFonts w:ascii="Times New Roman" w:hAnsi="Times New Roman"/>
+        </w:rPr>
+        <w:t xml:space="preserve">the</w:t>
+      </w:r>
+      <w:r>
+        <w:rPr>
+          <w:rFonts w:ascii="Times New Roman" w:hAnsi="Times New Roman"/>
+        </w:rPr>
+        <w:t xml:space="preserve"> </w:t>
+      </w:r>
+      <w:r>
+        <w:rPr>
+          <w:rFonts w:ascii="Times New Roman" w:hAnsi="Times New Roman"/>
+        </w:rPr>
+        <w:t xml:space="preserve">filtered</w:t>
+      </w:r>
+      <w:r>
+        <w:rPr>
+          <w:rFonts w:ascii="Times New Roman" w:hAnsi="Times New Roman"/>
+        </w:rPr>
+        <w:t xml:space="preserve"> </w:t>
+      </w:r>
+      <w:r>
+        <w:rPr>
+          <w:rFonts w:ascii="Times New Roman" w:hAnsi="Times New Roman"/>
+        </w:rPr>
+        <w:t xml:space="preserve">readout</w:t>
+      </w:r>
+      <w:r>
+        <w:rPr>
+          <w:rFonts w:ascii="Times New Roman" w:hAnsi="Times New Roman"/>
+        </w:rPr>
+        <w:t xml:space="preserve"> </w:t>
+      </w:r>
+      <w:r>
+        <w:rPr>
+          <w:rFonts w:ascii="Times New Roman" w:hAnsi="Times New Roman"/>
+        </w:rPr>
+        <w:t xml:space="preserve">equals</w:t>
+      </w:r>
+      <w:r>
+        <w:rPr>
+          <w:rFonts w:ascii="Times New Roman" w:hAnsi="Times New Roman"/>
+        </w:rPr>
+        <w:t xml:space="preserve"> </w:t>
+      </w:r>
+      <w:r>
+        <w:rPr>
+          <w:rFonts w:ascii="Times New Roman" w:hAnsi="Times New Roman"/>
+        </w:rPr>
+        <w:t xml:space="preserve">the</w:t>
+      </w:r>
+      <w:r>
+        <w:rPr>
+          <w:rFonts w:ascii="Times New Roman" w:hAnsi="Times New Roman"/>
+        </w:rPr>
+        <w:t xml:space="preserve"> </w:t>
+      </w:r>
+      <w:r>
+        <w:rPr>
+          <w:rFonts w:ascii="Times New Roman" w:hAnsi="Times New Roman"/>
+        </w:rPr>
+        <w:t xml:space="preserve">dephasing-only</w:t>
+      </w:r>
+      <w:r>
+        <w:rPr>
+          <w:rFonts w:ascii="Times New Roman" w:hAnsi="Times New Roman"/>
+        </w:rPr>
+        <w:t xml:space="preserve"> </w:t>
+      </w:r>
+      <w:r>
+        <w:rPr>
+          <w:rFonts w:ascii="Times New Roman" w:hAnsi="Times New Roman"/>
+        </w:rPr>
+        <w:t xml:space="preserve">one,</w:t>
+      </w:r>
+      <w:r>
+        <w:rPr>
+          <w:rFonts w:ascii="Times New Roman" w:hAnsi="Times New Roman"/>
+        </w:rPr>
+        <w:t xml:space="preserve"> </w:t>
+      </w:r>
+      <w:r>
+        <w:rPr>
+          <w:rFonts w:ascii="Times New Roman" w:hAnsi="Times New Roman"/>
+        </w:rPr>
+        <w:t xml:space="preserve">so</w:t>
+      </w:r>
+      <w:r>
+        <w:rPr>
+          <w:rFonts w:ascii="Times New Roman" w:hAnsi="Times New Roman"/>
+        </w:rPr>
+        <w:t xml:space="preserve"> </w:t>
+      </w:r>
+      <w:r>
+        <w:rPr>
+          <w:rFonts w:ascii="Times New Roman" w:hAnsi="Times New Roman"/>
+        </w:rPr>
+        <w:t xml:space="preserve">zero-noise</w:t>
+      </w:r>
+      <w:r>
+        <w:rPr>
+          <w:rFonts w:ascii="Times New Roman" w:hAnsi="Times New Roman"/>
+        </w:rPr>
+        <w:t xml:space="preserve"> </w:t>
+      </w:r>
+      <w:r>
+        <w:rPr>
+          <w:rFonts w:ascii="Times New Roman" w:hAnsi="Times New Roman"/>
+        </w:rPr>
+        <w:t xml:space="preserve">extrapolation</w:t>
+      </w:r>
+      <w:r>
+        <w:rPr>
+          <w:rFonts w:ascii="Times New Roman" w:hAnsi="Times New Roman"/>
+        </w:rPr>
+        <w:t xml:space="preserve"> </w:t>
+      </w:r>
+      <w:r>
+        <w:rPr>
+          <w:rFonts w:ascii="Times New Roman" w:hAnsi="Times New Roman"/>
+        </w:rPr>
+        <w:t xml:space="preserve">of</w:t>
+      </w:r>
+      <w:r>
+        <w:rPr>
+          <w:rFonts w:ascii="Times New Roman" w:hAnsi="Times New Roman"/>
+        </w:rPr>
+        <w:t xml:space="preserve"> </w:t>
+      </w:r>
+      <w:r>
+        <w:rPr>
+          <w:rFonts w:ascii="Times New Roman" w:hAnsi="Times New Roman"/>
+        </w:rPr>
+        <w:t xml:space="preserve">the</w:t>
+      </w:r>
+      <w:r>
+        <w:rPr>
+          <w:rFonts w:ascii="Times New Roman" w:hAnsi="Times New Roman"/>
+        </w:rPr>
+        <w:t xml:space="preserve"> </w:t>
+      </w:r>
+      <w:r>
+        <w:rPr>
+          <w:rFonts w:ascii="Times New Roman" w:hAnsi="Times New Roman"/>
+        </w:rPr>
+        <w:t xml:space="preserve">filtered</w:t>
+      </w:r>
+      <w:r>
+        <w:rPr>
+          <w:rFonts w:ascii="Times New Roman" w:hAnsi="Times New Roman"/>
+        </w:rPr>
+        <w:t xml:space="preserve"> </w:t>
+      </w:r>
+      <w:r>
+        <w:rPr>
+          <w:rFonts w:ascii="Times New Roman" w:hAnsi="Times New Roman"/>
+        </w:rPr>
+        <w:t xml:space="preserve">features</w:t>
+      </w:r>
+      <w:r>
+        <w:rPr>
+          <w:rFonts w:ascii="Times New Roman" w:hAnsi="Times New Roman"/>
+        </w:rPr>
+        <w:t xml:space="preserve"> </w:t>
+      </w:r>
+      <w:r>
+        <w:rPr>
+          <w:rFonts w:ascii="Times New Roman" w:hAnsi="Times New Roman"/>
+        </w:rPr>
+        <w:t xml:space="preserve">halves</w:t>
+      </w:r>
+      <w:r>
+        <w:rPr>
+          <w:rFonts w:ascii="Times New Roman" w:hAnsi="Times New Roman"/>
+        </w:rPr>
+        <w:t xml:space="preserve"> </w:t>
+      </w:r>
+      <w:r>
+        <w:rPr>
+          <w:rFonts w:ascii="Times New Roman" w:hAnsi="Times New Roman"/>
+        </w:rPr>
+        <w:t xml:space="preserve">(linear)</w:t>
+      </w:r>
+      <w:r>
+        <w:rPr>
+          <w:rFonts w:ascii="Times New Roman" w:hAnsi="Times New Roman"/>
+        </w:rPr>
+        <w:t xml:space="preserve"> </w:t>
+      </w:r>
+      <w:r>
+        <w:rPr>
+          <w:rFonts w:ascii="Times New Roman" w:hAnsi="Times New Roman"/>
+        </w:rPr>
+        <w:t xml:space="preserve">or</w:t>
+      </w:r>
+      <w:r>
+        <w:rPr>
+          <w:rFonts w:ascii="Times New Roman" w:hAnsi="Times New Roman"/>
+        </w:rPr>
+        <w:t xml:space="preserve"> </w:t>
+      </w:r>
+      <w:r>
+        <w:rPr>
+          <w:rFonts w:ascii="Times New Roman" w:hAnsi="Times New Roman"/>
+        </w:rPr>
+        <w:t xml:space="preserve">thirds</w:t>
+      </w:r>
+      <w:r>
+        <w:rPr>
+          <w:rFonts w:ascii="Times New Roman" w:hAnsi="Times New Roman"/>
+        </w:rPr>
+        <w:t xml:space="preserve"> </w:t>
+      </w:r>
+      <w:r>
+        <w:rPr>
+          <w:rFonts w:ascii="Times New Roman" w:hAnsi="Times New Roman"/>
+        </w:rPr>
+        <w:t xml:space="preserve">(Richardson)</w:t>
+      </w:r>
+      <w:r>
+        <w:rPr>
+          <w:rFonts w:ascii="Times New Roman" w:hAnsi="Times New Roman"/>
+        </w:rPr>
+        <w:t xml:space="preserve"> </w:t>
+      </w:r>
+      <w:r>
+        <w:rPr>
+          <w:rFonts w:ascii="Times New Roman" w:hAnsi="Times New Roman"/>
+        </w:rPr>
+        <w:t xml:space="preserve">their</w:t>
+      </w:r>
+      <w:r>
+        <w:rPr>
+          <w:rFonts w:ascii="Times New Roman" w:hAnsi="Times New Roman"/>
+        </w:rPr>
+        <w:t xml:space="preserve"> </w:t>
+      </w:r>
+      <w:r>
+        <w:rPr>
+          <w:rFonts w:ascii="Times New Roman" w:hAnsi="Times New Roman"/>
+        </w:rPr>
+        <w:t xml:space="preserve">error</w:t>
+      </w:r>
+      <w:r>
+        <w:rPr>
+          <w:rFonts w:ascii="Times New Roman" w:hAnsi="Times New Roman"/>
+        </w:rPr>
+        <w:t xml:space="preserve"> </w:t>
+      </w:r>
+      <w:r>
+        <w:rPr>
+          <w:rFonts w:ascii="Times New Roman" w:hAnsi="Times New Roman"/>
+        </w:rPr>
+        <w:t xml:space="preserve">and</w:t>
+      </w:r>
+      <w:r>
+        <w:rPr>
+          <w:rFonts w:ascii="Times New Roman" w:hAnsi="Times New Roman"/>
+        </w:rPr>
+        <w:t xml:space="preserve"> </w:t>
+      </w:r>
+      <w:r>
+        <w:rPr>
+          <w:rFonts w:ascii="Times New Roman" w:hAnsi="Times New Roman"/>
+        </w:rPr>
+        <w:t xml:space="preserve">beats</w:t>
+      </w:r>
+      <w:r>
+        <w:rPr>
+          <w:rFonts w:ascii="Times New Roman" w:hAnsi="Times New Roman"/>
+        </w:rPr>
+        <w:t xml:space="preserve"> </w:t>
+      </w:r>
+      <w:r>
+        <w:rPr>
+          <w:rFonts w:ascii="Times New Roman" w:hAnsi="Times New Roman"/>
+        </w:rPr>
+        <w:t xml:space="preserve">extrapolating</w:t>
+      </w:r>
+      <w:r>
+        <w:rPr>
+          <w:rFonts w:ascii="Times New Roman" w:hAnsi="Times New Roman"/>
+        </w:rPr>
+        <w:t xml:space="preserve"> </w:t>
+      </w:r>
+      <w:r>
+        <w:rPr>
+          <w:rFonts w:ascii="Times New Roman" w:hAnsi="Times New Roman"/>
+        </w:rPr>
+        <w:t xml:space="preserve">the</w:t>
+      </w:r>
+      <w:r>
+        <w:rPr>
+          <w:rFonts w:ascii="Times New Roman" w:hAnsi="Times New Roman"/>
+        </w:rPr>
+        <w:t xml:space="preserve"> </w:t>
+      </w:r>
+      <w:r>
+        <w:rPr>
+          <w:rFonts w:ascii="Times New Roman" w:hAnsi="Times New Roman"/>
+        </w:rPr>
+        <w:t xml:space="preserve">raw</w:t>
+      </w:r>
+      <w:r>
+        <w:rPr>
+          <w:rFonts w:ascii="Times New Roman" w:hAnsi="Times New Roman"/>
+        </w:rPr>
+        <w:t xml:space="preserve"> </w:t>
+      </w:r>
+      <w:r>
+        <w:rPr>
+          <w:rFonts w:ascii="Times New Roman" w:hAnsi="Times New Roman"/>
+        </w:rPr>
+        <w:t xml:space="preserve">readout</w:t>
+      </w:r>
+      <w:r>
+        <w:rPr>
+          <w:rFonts w:ascii="Times New Roman" w:hAnsi="Times New Roman"/>
+        </w:rPr>
+        <w:t xml:space="preserve"> </w:t>
+      </w:r>
+      <w:r>
+        <w:rPr>
+          <w:rFonts w:ascii="Times New Roman" w:hAnsi="Times New Roman"/>
+        </w:rPr>
+        <w:t xml:space="preserve">by</w:t>
+      </w:r>
+      <w:r>
+        <w:rPr>
+          <w:rFonts w:ascii="Times New Roman" w:hAnsi="Times New Roman"/>
+        </w:rPr>
+        <w:t xml:space="preserve"> </w:t>
+      </w:r>
+      <w:r>
+        <w:rPr>
+          <w:rFonts w:ascii="Times New Roman" w:hAnsi="Times New Roman"/>
+        </w:rPr>
+        <w:t xml:space="preserve">3–10</w:t>
+      </w:r>
+      <w:r>
+        <w:rPr>
+          <w:rFonts w:ascii="Times New Roman" w:hAnsi="Times New Roman"/>
+        </w:rPr>
+        <w:t xml:space="preserve"> </w:t>
+      </w:r>
+      <w:r>
+        <w:rPr>
+          <w:rFonts w:ascii="Times New Roman" w:hAnsi="Times New Roman"/>
+        </w:rPr>
+        <w:t xml:space="preserve">points,</w:t>
+      </w:r>
+      <w:r>
+        <w:rPr>
+          <w:rFonts w:ascii="Times New Roman" w:hAnsi="Times New Roman"/>
+        </w:rPr>
+        <w:t xml:space="preserve"> </w:t>
+      </w:r>
+      <w:r>
+        <w:rPr>
+          <w:rFonts w:ascii="Times New Roman" w:hAnsi="Times New Roman"/>
+        </w:rPr>
+        <w:t xml:space="preserve">although</w:t>
+      </w:r>
+      <w:r>
+        <w:rPr>
+          <w:rFonts w:ascii="Times New Roman" w:hAnsi="Times New Roman"/>
+        </w:rPr>
+        <w:t xml:space="preserve"> </w:t>
+      </w:r>
+      <w:r>
+        <w:rPr>
+          <w:rFonts w:ascii="Times New Roman" w:hAnsi="Times New Roman"/>
+        </w:rPr>
+        <w:t xml:space="preserve">with</w:t>
+      </w:r>
+      <w:r>
+        <w:rPr>
+          <w:rFonts w:ascii="Times New Roman" w:hAnsi="Times New Roman"/>
+        </w:rPr>
+        <w:t xml:space="preserve"> </w:t>
+      </w:r>
+      <w:r>
+        <w:rPr>
+          <w:rFonts w:ascii="Times New Roman" w:hAnsi="Times New Roman"/>
+        </w:rPr>
+        <w:t xml:space="preserve">1000</w:t>
+      </w:r>
+      <w:r>
+        <w:rPr>
+          <w:rFonts w:ascii="Times New Roman" w:hAnsi="Times New Roman"/>
+        </w:rPr>
+        <w:t xml:space="preserve"> </w:t>
+      </w:r>
+      <w:r>
+        <w:rPr>
+          <w:rFonts w:ascii="Times New Roman" w:hAnsi="Times New Roman"/>
+        </w:rPr>
+        <w:t xml:space="preserve">shots</w:t>
+      </w:r>
+      <w:r>
+        <w:rPr>
+          <w:rFonts w:ascii="Times New Roman" w:hAnsi="Times New Roman"/>
+        </w:rPr>
+        <w:t xml:space="preserve"> </w:t>
+      </w:r>
+      <w:r>
+        <w:rPr>
+          <w:rFonts w:ascii="Times New Roman" w:hAnsi="Times New Roman"/>
+        </w:rPr>
+        <w:t xml:space="preserve">per</w:t>
+      </w:r>
+      <w:r>
+        <w:rPr>
+          <w:rFonts w:ascii="Times New Roman" w:hAnsi="Times New Roman"/>
+        </w:rPr>
+        <w:t xml:space="preserve"> </w:t>
+      </w:r>
+      <w:r>
+        <w:rPr>
+          <w:rFonts w:ascii="Times New Roman" w:hAnsi="Times New Roman"/>
+        </w:rPr>
+        <w:t xml:space="preserve">noise</w:t>
+      </w:r>
+      <w:r>
+        <w:rPr>
+          <w:rFonts w:ascii="Times New Roman" w:hAnsi="Times New Roman"/>
+        </w:rPr>
+        <w:t xml:space="preserve"> </w:t>
+      </w:r>
+      <w:r>
+        <w:rPr>
+          <w:rFonts w:ascii="Times New Roman" w:hAnsi="Times New Roman"/>
+        </w:rPr>
+        <w:t xml:space="preserve">scale</w:t>
+      </w:r>
+      <w:r>
+        <w:rPr>
+          <w:rFonts w:ascii="Times New Roman" w:hAnsi="Times New Roman"/>
+        </w:rPr>
+        <w:t xml:space="preserve"> </w:t>
+      </w:r>
+      <w:r>
+        <w:rPr>
+          <w:rFonts w:ascii="Times New Roman" w:hAnsi="Times New Roman"/>
+        </w:rPr>
+        <w:t xml:space="preserve">its</w:t>
+      </w:r>
+      <w:r>
+        <w:rPr>
+          <w:rFonts w:ascii="Times New Roman" w:hAnsi="Times New Roman"/>
+        </w:rPr>
+        <w:t xml:space="preserve"> </w:t>
+      </w:r>
+      <w:r>
+        <w:rPr>
+          <w:rFonts w:ascii="Times New Roman" w:hAnsi="Times New Roman"/>
+        </w:rPr>
+        <w:t xml:space="preserve">variance</w:t>
+      </w:r>
+      <w:r>
+        <w:rPr>
+          <w:rFonts w:ascii="Times New Roman" w:hAnsi="Times New Roman"/>
+        </w:rPr>
+        <w:t xml:space="preserve"> </w:t>
+      </w:r>
+      <w:r>
+        <w:rPr>
+          <w:rFonts w:ascii="Times New Roman" w:hAnsi="Times New Roman"/>
+        </w:rPr>
+        <w:t xml:space="preserve">cancels</w:t>
+      </w:r>
+      <w:r>
+        <w:rPr>
+          <w:rFonts w:ascii="Times New Roman" w:hAnsi="Times New Roman"/>
+        </w:rPr>
+        <w:t xml:space="preserve"> </w:t>
+      </w:r>
+      <w:r>
+        <w:rPr>
+          <w:rFonts w:ascii="Times New Roman" w:hAnsi="Times New Roman"/>
+        </w:rPr>
+        <w:t xml:space="preserve">the</w:t>
+      </w:r>
+      <w:r>
+        <w:rPr>
+          <w:rFonts w:ascii="Times New Roman" w:hAnsi="Times New Roman"/>
+        </w:rPr>
+        <w:t xml:space="preserve"> </w:t>
+      </w:r>
+      <w:r>
+        <w:rPr>
+          <w:rFonts w:ascii="Times New Roman" w:hAnsi="Times New Roman"/>
+        </w:rPr>
+        <w:t xml:space="preserve">gain</w:t>
+      </w:r>
+      <w:r>
+        <w:rPr>
+          <w:rFonts w:ascii="Times New Roman" w:hAnsi="Times New Roman"/>
+        </w:rPr>
+        <w:t xml:space="preserve"> </w:t>
+      </w:r>
+      <w:r>
+        <w:rPr>
+          <w:rFonts w:ascii="Times New Roman" w:hAnsi="Times New Roman"/>
+        </w:rPr>
+        <w:t xml:space="preserve">at</w:t>
+      </w:r>
+      <w:r>
+        <w:rPr>
+          <w:rFonts w:ascii="Times New Roman" w:hAnsi="Times New Roman"/>
+        </w:rPr>
+        <w:t xml:space="preserve"> </w:t>
+      </w:r>
+      <w:r>
+        <w:rPr>
+          <w:rFonts w:ascii="Times New Roman" w:hAnsi="Times New Roman"/>
+        </w:rPr>
+        <w:t xml:space="preserve">weight 2;</w:t>
+      </w:r>
+      <w:r>
+        <w:rPr>
+          <w:rFonts w:ascii="Times New Roman" w:hAnsi="Times New Roman"/>
+        </w:rPr>
+        <w:t xml:space="preserve"> </w:t>
+      </w:r>
+      <w:r>
+        <w:rPr>
+          <w:rFonts w:ascii="Times New Roman" w:hAnsi="Times New Roman"/>
+        </w:rPr>
+        <w:t xml:space="preserve">training</w:t>
+      </w:r>
+      <w:r>
+        <w:rPr>
+          <w:rFonts w:ascii="Times New Roman" w:hAnsi="Times New Roman"/>
+        </w:rPr>
+        <w:t xml:space="preserve"> </w:t>
+      </w:r>
+      <w:r>
+        <w:rPr>
+          <w:rFonts w:ascii="Times New Roman" w:hAnsi="Times New Roman"/>
+        </w:rPr>
+        <w:t xml:space="preserve">with</w:t>
+      </w:r>
+      <w:r>
+        <w:rPr>
+          <w:rFonts w:ascii="Times New Roman" w:hAnsi="Times New Roman"/>
+        </w:rPr>
+        <w:t xml:space="preserve"> </w:t>
+      </w:r>
+      <w:r>
+        <w:rPr>
+          <w:rFonts w:ascii="Times New Roman" w:hAnsi="Times New Roman"/>
+        </w:rPr>
+        <w:t xml:space="preserve">the</w:t>
+      </w:r>
+      <w:r>
+        <w:rPr>
+          <w:rFonts w:ascii="Times New Roman" w:hAnsi="Times New Roman"/>
+        </w:rPr>
+        <w:t xml:space="preserve"> </w:t>
+      </w:r>
+      <w:r>
+        <w:rPr>
+          <w:rFonts w:ascii="Times New Roman" w:hAnsi="Times New Roman"/>
+        </w:rPr>
+        <w:t xml:space="preserve">filter</w:t>
+      </w:r>
+      <w:r>
+        <w:rPr>
+          <w:rFonts w:ascii="Times New Roman" w:hAnsi="Times New Roman"/>
+        </w:rPr>
+        <w:t xml:space="preserve"> </w:t>
+      </w:r>
+      <w:r>
+        <w:rPr>
+          <w:rFonts w:ascii="Times New Roman" w:hAnsi="Times New Roman"/>
+        </w:rPr>
+        <w:t xml:space="preserve">under</w:t>
+      </w:r>
+      <w:r>
+        <w:rPr>
+          <w:rFonts w:ascii="Times New Roman" w:hAnsi="Times New Roman"/>
+        </w:rPr>
+        <w:t xml:space="preserve"> </w:t>
+      </w:r>
+      <w:r>
+        <w:rPr>
+          <w:rFonts w:ascii="Times New Roman" w:hAnsi="Times New Roman"/>
+        </w:rPr>
+        <w:t xml:space="preserve">the</w:t>
+      </w:r>
+      <w:r>
+        <w:rPr>
+          <w:rFonts w:ascii="Times New Roman" w:hAnsi="Times New Roman"/>
+        </w:rPr>
+        <w:t xml:space="preserve"> </w:t>
+      </w:r>
+      <w:r>
+        <w:rPr>
+          <w:rFonts w:ascii="Times New Roman" w:hAnsi="Times New Roman"/>
+        </w:rPr>
+        <w:t xml:space="preserve">calibrated</w:t>
+      </w:r>
+      <w:r>
+        <w:rPr>
+          <w:rFonts w:ascii="Times New Roman" w:hAnsi="Times New Roman"/>
+        </w:rPr>
+        <w:t xml:space="preserve"> </w:t>
+      </w:r>
+      <w:r>
+        <w:rPr>
+          <w:rFonts w:ascii="Times New Roman" w:hAnsi="Times New Roman"/>
+        </w:rPr>
+        <w:t xml:space="preserve">noise</w:t>
+      </w:r>
+      <w:r>
+        <w:rPr>
+          <w:rFonts w:ascii="Times New Roman" w:hAnsi="Times New Roman"/>
+        </w:rPr>
+        <w:t xml:space="preserve"> </w:t>
+      </w:r>
+      <w:r>
+        <w:rPr>
+          <w:rFonts w:ascii="Times New Roman" w:hAnsi="Times New Roman"/>
+        </w:rPr>
+        <w:t xml:space="preserve">recovers</w:t>
+      </w:r>
+      <w:r>
+        <w:rPr>
+          <w:rFonts w:ascii="Times New Roman" w:hAnsi="Times New Roman"/>
+        </w:rPr>
+        <w:t xml:space="preserve"> </w:t>
+      </w:r>
+      <w:r>
+        <w:rPr>
+          <w:rFonts w:ascii="Times New Roman" w:hAnsi="Times New Roman"/>
+        </w:rPr>
+        <w:t xml:space="preserve">the</w:t>
+      </w:r>
+      <w:r>
+        <w:rPr>
+          <w:rFonts w:ascii="Times New Roman" w:hAnsi="Times New Roman"/>
+        </w:rPr>
+        <w:t xml:space="preserve"> </w:t>
+      </w:r>
+      <w:r>
+        <w:rPr>
+          <w:rFonts w:ascii="Times New Roman" w:hAnsi="Times New Roman"/>
+        </w:rPr>
+        <w:t xml:space="preserve">noiseless</w:t>
+      </w:r>
+      <w:r>
+        <w:rPr>
+          <w:rFonts w:ascii="Times New Roman" w:hAnsi="Times New Roman"/>
+        </w:rPr>
+        <w:t xml:space="preserve"> </w:t>
+      </w:r>
+      <w:r>
+        <w:rPr>
+          <w:rFonts w:ascii="Times New Roman" w:hAnsi="Times New Roman"/>
+        </w:rPr>
+        <w:t xml:space="preserve">accuracy</w:t>
+      </w:r>
+      <w:r>
+        <w:rPr>
+          <w:rFonts w:ascii="Times New Roman" w:hAnsi="Times New Roman"/>
+        </w:rPr>
+        <w:t xml:space="preserve"> </w:t>
+      </w:r>
+      <w:r>
+        <w:rPr>
+          <w:rFonts w:ascii="Times New Roman" w:hAnsi="Times New Roman"/>
+        </w:rPr>
+        <w:t xml:space="preserve">under</w:t>
+      </w:r>
+      <w:r>
+        <w:rPr>
+          <w:rFonts w:ascii="Times New Roman" w:hAnsi="Times New Roman"/>
+        </w:rPr>
+        <w:t xml:space="preserve"> </w:t>
+      </w:r>
+      <w:r>
+        <w:rPr>
+          <w:rFonts w:ascii="Times New Roman" w:hAnsi="Times New Roman"/>
+        </w:rPr>
+        <w:t xml:space="preserve">dephasing</w:t>
+      </w:r>
+      <w:r>
+        <w:rPr>
+          <w:rFonts w:ascii="Times New Roman" w:hAnsi="Times New Roman"/>
+        </w:rPr>
+        <w:t xml:space="preserve"> </w:t>
+      </w:r>
+      <w:r>
+        <w:rPr>
+          <w:rFonts w:ascii="Times New Roman" w:hAnsi="Times New Roman"/>
+        </w:rPr>
+        <w:t xml:space="preserve">too.</w:t>
+      </w:r>
+      <w:r>
+        <w:rPr>
+          <w:rFonts w:ascii="Times New Roman" w:hAnsi="Times New Roman"/>
+        </w:rPr>
+        <w:t xml:space="preserve"> </w:t>
+      </w:r>
+      <w:r>
+        <w:rPr>
+          <w:rFonts w:ascii="Times New Roman" w:hAnsi="Times New Roman"/>
+        </w:rPr>
         <w:t xml:space="preserve">With</w:t>
       </w:r>
       <w:r>
@@ -9090,7 +9858,7 @@
         <w:rPr>
           <w:rFonts w:ascii="Times New Roman" w:hAnsi="Times New Roman"/>
         </w:rPr>
-        <w:t xml:space="preserve">predictions of every study were committed to the repository before the run that tested them. Of 138 pre-registered predictions in the studies summarized here, 99 passed and 39 failed; the failures are</w:t>
+        <w:t xml:space="preserve">predictions of every study were committed to the repository before the run that tested them. Of 143 pre-registered predictions in the studies summarized here, 101 passed and 42 failed; the failures are</w:t>
       </w:r>
       <w:r>
         <w:rPr>
@@ -9106,7 +9874,7 @@
       </w:r>
     </w:p>
     <w:bookmarkEnd w:id="20"/>
-    <w:bookmarkStart w:id="29" w:name="model-and-theory"/>
+    <w:bookmarkStart w:id="30" w:name="model-and-theory"/>
     <w:p>
       <w:pPr>
         <w:pStyle w:val="Heading1"/>
@@ -11197,7 +11965,99 @@
       </w:r>
     </w:p>
     <w:bookmarkEnd w:id="26"/>
-    <w:bookmarkStart w:id="27" w:name="multiclass-readout."/>
+    <w:bookmarkStart w:id="27" w:name="X98f8470caf7f04c74444d9d1fd2dd0523733a4a"/>
+    <w:p>
+      <w:pPr>
+        <w:pStyle w:val="Heading4"/>
+      </w:pPr>
+      <w:r>
+        <w:rPr>
+          <w:rFonts w:ascii="Times New Roman" w:hAnsi="Times New Roman"/>
+        </w:rPr>
+        <w:t xml:space="preserve">F6: the filter turns T1 plus dephasing into dephasing alone.</w:t>
+      </w:r>
+    </w:p>
+    <w:p>
+      <w:pPr>
+        <w:pStyle w:val="FirstParagraph"/>
+      </w:pPr>
+      <w:r>
+        <w:rPr>
+          <w:rFonts w:ascii="Times New Roman" w:hAnsi="Times New Roman"/>
+        </w:rPr>
+        <w:t xml:space="preserve">Under equal T1, the no-jump factor is a</w:t>
+      </w:r>
+      <w:r>
+        <w:rPr>
+          <w:rFonts w:ascii="Times New Roman" w:hAnsi="Times New Roman"/>
+        </w:rPr>
+        <w:t xml:space="preserve"> </w:t>
+      </w:r>
+      <w:r>
+        <w:rPr>
+          <w:rFonts w:ascii="Times New Roman" w:hAnsi="Times New Roman"/>
+        </w:rPr>
+        <w:t xml:space="preserve">scalar on the sector and commutes with the diagonal dephasing channel, so the filtered readout of a circuit with T1</w:t>
+      </w:r>
+      <w:r>
+        <w:rPr>
+          <w:rFonts w:ascii="Times New Roman" w:hAnsi="Times New Roman"/>
+        </w:rPr>
+        <w:t xml:space="preserve"> </w:t>
+      </w:r>
+      <w:r>
+        <w:rPr>
+          <w:rFonts w:ascii="Times New Roman" w:hAnsi="Times New Roman"/>
+        </w:rPr>
+        <w:t xml:space="preserve">and dephasing equals that of the same circuit with dephasing alone (checked to</w:t>
+      </w:r>
+      <w:r>
+        <w:rPr>
+          <w:rFonts w:ascii="Times New Roman" w:hAnsi="Times New Roman"/>
+        </w:rPr>
+        <w:t xml:space="preserve"> </w:t>
+      </w:r>
+      <m:oMath>
+        <m:sSup>
+          <m:e>
+            <m:r>
+              <m:t>10</m:t>
+            </m:r>
+          </m:e>
+          <m:sup>
+            <m:r>
+              <m:rPr>
+                <m:sty m:val="p"/>
+              </m:rPr>
+              <m:t>−</m:t>
+            </m:r>
+            <m:r>
+              <m:t>16</m:t>
+            </m:r>
+          </m:sup>
+        </m:sSup>
+      </m:oMath>
+      <w:r>
+        <w:rPr>
+          <w:rFonts w:ascii="Times New Roman" w:hAnsi="Times New Roman"/>
+        </w:rPr>
+        <w:t xml:space="preserve">). The filter leaves a single</w:t>
+      </w:r>
+      <w:r>
+        <w:rPr>
+          <w:rFonts w:ascii="Times New Roman" w:hAnsi="Times New Roman"/>
+        </w:rPr>
+        <w:t xml:space="preserve"> </w:t>
+      </w:r>
+      <w:r>
+        <w:rPr>
+          <w:rFonts w:ascii="Times New Roman" w:hAnsi="Times New Roman"/>
+        </w:rPr>
+        <w:t xml:space="preserve">noise parameter, which zero-noise extrapolation can remove.</w:t>
+      </w:r>
+    </w:p>
+    <w:bookmarkEnd w:id="27"/>
+    <w:bookmarkStart w:id="28" w:name="multiclass-readout."/>
     <w:p>
       <w:pPr>
         <w:pStyle w:val="Heading4"/>
@@ -11681,8 +12541,8 @@
         <w:t xml:space="preserve">here moves the excitation to another qubit, i.e. swaps one class for another.</w:t>
       </w:r>
     </w:p>
-    <w:bookmarkEnd w:id="27"/>
-    <w:bookmarkStart w:id="28" w:name="f2-simulability."/>
+    <w:bookmarkEnd w:id="28"/>
+    <w:bookmarkStart w:id="29" w:name="f2-simulability."/>
     <w:p>
       <w:pPr>
         <w:pStyle w:val="Heading4"/>
@@ -11964,9 +12824,9 @@
         <w:t xml:space="preserve">that this note does not address.</w:t>
       </w:r>
     </w:p>
-    <w:bookmarkEnd w:id="28"/>
     <w:bookmarkEnd w:id="29"/>
-    <w:bookmarkStart w:id="30" w:name="methods"/>
+    <w:bookmarkEnd w:id="30"/>
+    <w:bookmarkStart w:id="31" w:name="methods"/>
     <w:p>
       <w:pPr>
         <w:pStyle w:val="Heading1"/>
@@ -12255,8 +13115,8 @@
         <w:t xml:space="preserve">.</w:t>
       </w:r>
     </w:p>
-    <w:bookmarkEnd w:id="30"/>
-    <w:bookmarkStart w:id="43" w:name="results"/>
+    <w:bookmarkEnd w:id="31"/>
+    <w:bookmarkStart w:id="44" w:name="results"/>
     <w:p>
       <w:pPr>
         <w:pStyle w:val="Heading1"/>
@@ -12268,7 +13128,7 @@
         <w:t xml:space="preserve">Results</w:t>
       </w:r>
     </w:p>
-    <w:bookmarkStart w:id="31" w:name="single-seed-studies."/>
+    <w:bookmarkStart w:id="32" w:name="single-seed-studies."/>
     <w:p>
       <w:pPr>
         <w:pStyle w:val="Heading4"/>
@@ -12986,11 +13846,47 @@
         <w:rPr>
           <w:rFonts w:ascii="Times New Roman" w:hAnsi="Times New Roman"/>
         </w:rPr>
-        <w:t xml:space="preserve">below) and a larger drift loss for the raw noise-aware model at weight 1 (it lost 0.2 points).</w:t>
+        <w:t xml:space="preserve">below) and a larger drift loss for the raw noise-aware model at weight 1 (it lost 0.2 points); and, for dephasing</w:t>
+      </w:r>
+      <w:r>
+        <w:rPr>
+          <w:rFonts w:ascii="Times New Roman" w:hAnsi="Times New Roman"/>
+        </w:rPr>
+        <w:t xml:space="preserve"> </w:t>
+      </w:r>
+      <w:r>
+        <w:rPr>
+          <w:rFonts w:ascii="Times New Roman" w:hAnsi="Times New Roman"/>
+        </w:rPr>
+        <w:t xml:space="preserve">with zero-noise extrapolation, a linear extrapolation removing at least half of the filter’s feature error (it left</w:t>
+      </w:r>
+      <w:r>
+        <w:rPr>
+          <w:rFonts w:ascii="Times New Roman" w:hAnsi="Times New Roman"/>
+        </w:rPr>
+        <w:t xml:space="preserve"> </w:t>
+      </w:r>
+      <w:r>
+        <w:rPr>
+          <w:rFonts w:ascii="Times New Roman" w:hAnsi="Times New Roman"/>
+        </w:rPr>
+        <w:t xml:space="preserve">50.3% and 57.5%), accuracy within 1 point of noiseless at weight 2 (1.3 points below), and no loss against the filter</w:t>
+      </w:r>
+      <w:r>
+        <w:rPr>
+          <w:rFonts w:ascii="Times New Roman" w:hAnsi="Times New Roman"/>
+        </w:rPr>
+        <w:t xml:space="preserve"> </w:t>
+      </w:r>
+      <w:r>
+        <w:rPr>
+          <w:rFonts w:ascii="Times New Roman" w:hAnsi="Times New Roman"/>
+        </w:rPr>
+        <w:t xml:space="preserve">alone with 1000 shots per scale at weight 2 (2.9 points below).</w:t>
       </w:r>
     </w:p>
-    <w:bookmarkEnd w:id="31"/>
-    <w:bookmarkStart w:id="36" w:name="replication-over-60-runs."/>
+    <w:bookmarkEnd w:id="32"/>
+    <w:bookmarkStart w:id="37" w:name="replication-over-60-runs."/>
     <w:p>
       <w:pPr>
         <w:pStyle w:val="Heading4"/>
@@ -13117,7 +14013,7 @@
         <w:t xml:space="preserve">pre-registered predictions of this replication passed.</w:t>
       </w:r>
     </w:p>
-    <w:bookmarkStart w:id="32" w:name="tab:main"/>
+    <w:bookmarkStart w:id="33" w:name="tab:main"/>
     <w:p>
       <w:pPr>
         <w:pStyle w:val="TableCaption"/>
@@ -13602,7 +14498,7 @@
         </w:tc>
       </w:tr>
     </w:tbl>
-    <w:bookmarkEnd w:id="32"/>
+    <w:bookmarkEnd w:id="33"/>
     <w:p>
       <w:pPr>
         <w:pStyle w:val="CaptionedFigure"/>
@@ -13616,18 +14512,18 @@
           <wp:inline>
             <wp:extent cx="4800600" cy="4073236"/>
             <wp:effectExtent b="0" l="0" r="0" t="0"/>
-            <wp:docPr descr="" title="" id="34" name="Picture"/>
+            <wp:docPr descr="" title="" id="35" name="Picture"/>
             <a:graphic>
               <a:graphicData uri="http://schemas.openxmlformats.org/drawingml/2006/picture">
                 <pic:pic>
                   <pic:nvPicPr>
-                    <pic:cNvPr descr="fig_qml.png" id="35" name="Picture"/>
+                    <pic:cNvPr descr="fig_qml.png" id="36" name="Picture"/>
                     <pic:cNvPicPr>
                       <a:picLocks noChangeArrowheads="1" noChangeAspect="1"/>
                     </pic:cNvPicPr>
                   </pic:nvPicPr>
                   <pic:blipFill>
-                    <a:blip r:embed="rId33"/>
+                    <a:blip r:embed="rId34"/>
                     <a:stretch>
                       <a:fillRect/>
                     </a:stretch>
@@ -14384,8 +15280,8 @@
         <w:t xml:space="preserve">points.</w:t>
       </w:r>
     </w:p>
-    <w:bookmarkEnd w:id="36"/>
-    <w:bookmarkStart w:id="37" w:name="sec:more"/>
+    <w:bookmarkEnd w:id="37"/>
+    <w:bookmarkStart w:id="38" w:name="sec:more"/>
     <w:p>
       <w:pPr>
         <w:pStyle w:val="Heading4"/>
@@ -15863,8 +16759,8 @@
         <w:t xml:space="preserve">mean.</w:t>
       </w:r>
     </w:p>
-    <w:bookmarkEnd w:id="37"/>
-    <w:bookmarkStart w:id="38" w:name="device-noise-models."/>
+    <w:bookmarkEnd w:id="38"/>
+    <w:bookmarkStart w:id="39" w:name="device-noise-models."/>
     <w:p>
       <w:pPr>
         <w:pStyle w:val="Heading4"/>
@@ -16174,8 +17070,8 @@
         <w:t xml:space="preserve">hardware runs are prepared, with cost confirmations, and pending.</w:t>
       </w:r>
     </w:p>
-    <w:bookmarkEnd w:id="38"/>
-    <w:bookmarkStart w:id="39" w:name="sec:echo"/>
+    <w:bookmarkEnd w:id="39"/>
+    <w:bookmarkStart w:id="40" w:name="sec:echo"/>
     <w:p>
       <w:pPr>
         <w:pStyle w:val="Heading4"/>
@@ -16834,8 +17730,8 @@
         <w:t xml:space="preserve">echo was 3.4–4.1 times below raw; all five predictions passed.</w:t>
       </w:r>
     </w:p>
-    <w:bookmarkEnd w:id="39"/>
-    <w:bookmarkStart w:id="40" w:name="sec:scaling"/>
+    <w:bookmarkEnd w:id="40"/>
+    <w:bookmarkStart w:id="41" w:name="sec:scaling"/>
     <w:p>
       <w:pPr>
         <w:pStyle w:val="Heading4"/>
@@ -18274,8 +19170,8 @@
         <w:t xml:space="preserve">make product states look entangled.</w:t>
       </w:r>
     </w:p>
-    <w:bookmarkEnd w:id="40"/>
-    <w:bookmarkStart w:id="42" w:name="sec:beyond"/>
+    <w:bookmarkEnd w:id="41"/>
+    <w:bookmarkStart w:id="43" w:name="sec:beyond"/>
     <w:p>
       <w:pPr>
         <w:pStyle w:val="Heading4"/>
@@ -19321,7 +20217,197 @@
         <w:t xml:space="preserve">the filtered model lost 0.8 and 0.7 points and the raw one 0.2 and 10.0 (F5).</w:t>
       </w:r>
     </w:p>
-    <w:bookmarkStart w:id="41" w:name="tab:beyond"/>
+    <w:p>
+      <w:pPr>
+        <w:numPr>
+          <w:ilvl w:val="0"/>
+          <w:numId w:val="1006"/>
+        </w:numPr>
+      </w:pPr>
+      <w:r>
+        <w:rPr>
+          <w:iCs/>
+          <w:rFonts w:ascii="Times New Roman" w:hAnsi="Times New Roman"/>
+          <w:i/>
+        </w:rPr>
+        <w:t xml:space="preserve">Dephasing with zero-noise extrapolation</w:t>
+      </w:r>
+      <w:r>
+        <w:rPr>
+          <w:rFonts w:ascii="Times New Roman" w:hAnsi="Times New Roman"/>
+        </w:rPr>
+        <w:t xml:space="preserve"> </w:t>
+      </w:r>
+      <w:r>
+        <w:rPr>
+          <w:rFonts w:ascii="Times New Roman" w:hAnsi="Times New Roman"/>
+        </w:rPr>
+        <w:t xml:space="preserve">(same data and seeds; T1 0.08 plus dephasing</w:t>
+      </w:r>
+      <w:r>
+        <w:rPr>
+          <w:rFonts w:ascii="Times New Roman" w:hAnsi="Times New Roman"/>
+        </w:rPr>
+        <w:t xml:space="preserve"> </w:t>
+      </w:r>
+      <m:oMath>
+        <m:r>
+          <m:t>p</m:t>
+        </m:r>
+        <m:r>
+          <m:rPr>
+            <m:sty m:val="p"/>
+          </m:rPr>
+          <m:t>=</m:t>
+        </m:r>
+        <m:r>
+          <m:t>0.03</m:t>
+        </m:r>
+      </m:oMath>
+      <w:r>
+        <w:rPr>
+          <w:rFonts w:ascii="Times New Roman" w:hAnsi="Times New Roman"/>
+        </w:rPr>
+        <w:t xml:space="preserve"> </w:t>
+      </w:r>
+      <w:r>
+        <w:rPr>
+          <w:rFonts w:ascii="Times New Roman" w:hAnsi="Times New Roman"/>
+        </w:rPr>
+        <w:t xml:space="preserve">or</w:t>
+      </w:r>
+      <w:r>
+        <w:rPr>
+          <w:rFonts w:ascii="Times New Roman" w:hAnsi="Times New Roman"/>
+        </w:rPr>
+        <w:t xml:space="preserve"> </w:t>
+      </w:r>
+      <w:r>
+        <w:rPr>
+          <w:rFonts w:ascii="Times New Roman" w:hAnsi="Times New Roman"/>
+        </w:rPr>
+        <w:t xml:space="preserve">0.06; noise scales 1, 2, 3 as by gate folding; features extrapolated linearly or by Richardson). At</w:t>
+      </w:r>
+      <w:r>
+        <w:rPr>
+          <w:rFonts w:ascii="Times New Roman" w:hAnsi="Times New Roman"/>
+        </w:rPr>
+        <w:t xml:space="preserve"> </w:t>
+      </w:r>
+      <m:oMath>
+        <m:r>
+          <m:t>p</m:t>
+        </m:r>
+        <m:r>
+          <m:rPr>
+            <m:sty m:val="p"/>
+          </m:rPr>
+          <m:t>=</m:t>
+        </m:r>
+        <m:r>
+          <m:t>0.03</m:t>
+        </m:r>
+      </m:oMath>
+      <w:r>
+        <w:rPr>
+          <w:rFonts w:ascii="Times New Roman" w:hAnsi="Times New Roman"/>
+        </w:rPr>
+        <w:t xml:space="preserve"> </w:t>
+      </w:r>
+      <w:r>
+        <w:rPr>
+          <w:rFonts w:ascii="Times New Roman" w:hAnsi="Times New Roman"/>
+        </w:rPr>
+        <w:t xml:space="preserve">the</w:t>
+      </w:r>
+      <w:r>
+        <w:rPr>
+          <w:rFonts w:ascii="Times New Roman" w:hAnsi="Times New Roman"/>
+        </w:rPr>
+        <w:t xml:space="preserve"> </w:t>
+      </w:r>
+      <w:r>
+        <w:rPr>
+          <w:rFonts w:ascii="Times New Roman" w:hAnsi="Times New Roman"/>
+        </w:rPr>
+        <w:t xml:space="preserve">filter alone gave 0.933 / 0.919 (weight 1 / 2), filter plus linear ZNE 0.949 / 0.943 and Richardson 0.953 / 0.946,</w:t>
+      </w:r>
+      <w:r>
+        <w:rPr>
+          <w:rFonts w:ascii="Times New Roman" w:hAnsi="Times New Roman"/>
+        </w:rPr>
+        <w:t xml:space="preserve"> </w:t>
+      </w:r>
+      <w:r>
+        <w:rPr>
+          <w:rFonts w:ascii="Times New Roman" w:hAnsi="Times New Roman"/>
+        </w:rPr>
+        <w:t xml:space="preserve">against 0.952 / 0.956 noiseless; ZNE of the raw readout gave 0.915 / 0.844. At</w:t>
+      </w:r>
+      <w:r>
+        <w:rPr>
+          <w:rFonts w:ascii="Times New Roman" w:hAnsi="Times New Roman"/>
+        </w:rPr>
+        <w:t xml:space="preserve"> </w:t>
+      </w:r>
+      <m:oMath>
+        <m:r>
+          <m:t>p</m:t>
+        </m:r>
+        <m:r>
+          <m:rPr>
+            <m:sty m:val="p"/>
+          </m:rPr>
+          <m:t>=</m:t>
+        </m:r>
+        <m:r>
+          <m:t>0.06</m:t>
+        </m:r>
+      </m:oMath>
+      <w:r>
+        <w:rPr>
+          <w:rFonts w:ascii="Times New Roman" w:hAnsi="Times New Roman"/>
+        </w:rPr>
+        <w:t xml:space="preserve">, weight 2, filter plus ZNE</w:t>
+      </w:r>
+      <w:r>
+        <w:rPr>
+          <w:rFonts w:ascii="Times New Roman" w:hAnsi="Times New Roman"/>
+        </w:rPr>
+        <w:t xml:space="preserve"> </w:t>
+      </w:r>
+      <w:r>
+        <w:rPr>
+          <w:rFonts w:ascii="Times New Roman" w:hAnsi="Times New Roman"/>
+        </w:rPr>
+        <w:t xml:space="preserve">gained 10.6 points over the filter alone. With 1000 shots per scale, filter plus ZNE gave 0.945 / 0.864 against</w:t>
+      </w:r>
+      <w:r>
+        <w:rPr>
+          <w:rFonts w:ascii="Times New Roman" w:hAnsi="Times New Roman"/>
+        </w:rPr>
+        <w:t xml:space="preserve"> </w:t>
+      </w:r>
+      <w:r>
+        <w:rPr>
+          <w:rFonts w:ascii="Times New Roman" w:hAnsi="Times New Roman"/>
+        </w:rPr>
+        <w:t xml:space="preserve">0.932 / 0.893 for the filter alone, and Richardson fell to 0.710 at weight 2. Training with the filter under the</w:t>
+      </w:r>
+      <w:r>
+        <w:rPr>
+          <w:rFonts w:ascii="Times New Roman" w:hAnsi="Times New Roman"/>
+        </w:rPr>
+        <w:t xml:space="preserve"> </w:t>
+      </w:r>
+      <w:r>
+        <w:rPr>
+          <w:rFonts w:ascii="Times New Roman" w:hAnsi="Times New Roman"/>
+        </w:rPr>
+        <w:t xml:space="preserve">calibrated noise reached 0.951–0.956 at both dephasing levels (F6).</w:t>
+      </w:r>
+    </w:p>
+    <w:bookmarkStart w:id="42" w:name="tab:beyond"/>
     <w:p>
       <w:pPr>
         <w:pStyle w:val="TableCaption"/>
@@ -20077,11 +21163,231 @@
           </w:p>
         </w:tc>
       </w:tr>
+      <w:tr>
+        <w:tc>
+          <w:tcPr/>
+          <w:p>
+            <w:pPr>
+              <w:pStyle w:val="Compact"/>
+              <w:jc w:val="left"/>
+            </w:pPr>
+            <w:r>
+              <w:t xml:space="preserve">T1 + dephasing 0.03</w:t>
+            </w:r>
+          </w:p>
+        </w:tc>
+        <w:tc>
+          <w:tcPr/>
+          <w:p>
+            <w:pPr>
+              <w:pStyle w:val="Compact"/>
+              <w:jc w:val="left"/>
+            </w:pPr>
+            <w:r>
+              <w:t xml:space="preserve">weight 1 / 2, filter alone</w:t>
+            </w:r>
+          </w:p>
+        </w:tc>
+        <w:tc>
+          <w:tcPr/>
+          <w:p>
+            <w:pPr>
+              <w:pStyle w:val="Compact"/>
+              <w:jc w:val="center"/>
+            </w:pPr>
+            <w:r>
+              <w:t xml:space="preserve">0.952 / 0.956</w:t>
+            </w:r>
+          </w:p>
+        </w:tc>
+        <w:tc>
+          <w:tcPr/>
+          <w:p>
+            <w:pPr>
+              <w:pStyle w:val="Compact"/>
+              <w:jc w:val="center"/>
+            </w:pPr>
+            <w:r>
+              <w:t xml:space="preserve">0.933 / 0.919</w:t>
+            </w:r>
+          </w:p>
+        </w:tc>
+        <w:tc>
+          <w:tcPr/>
+          <w:p>
+            <w:pPr>
+              <w:pStyle w:val="Compact"/>
+              <w:jc w:val="center"/>
+            </w:pPr>
+            <w:r>
+              <w:t xml:space="preserve">0.815 / 0.686</w:t>
+            </w:r>
+          </w:p>
+        </w:tc>
+      </w:tr>
+      <w:tr>
+        <w:tc>
+          <w:tcPr/>
+          <w:p>
+            <w:pPr>
+              <w:pStyle w:val="Compact"/>
+            </w:pPr>
+          </w:p>
+        </w:tc>
+        <w:tc>
+          <w:tcPr/>
+          <w:p>
+            <w:pPr>
+              <w:pStyle w:val="Compact"/>
+              <w:jc w:val="left"/>
+            </w:pPr>
+            <w:r>
+              <w:t xml:space="preserve">with linear ZNE (exact)</w:t>
+            </w:r>
+          </w:p>
+        </w:tc>
+        <w:tc>
+          <w:tcPr/>
+          <w:p>
+            <w:pPr>
+              <w:pStyle w:val="Compact"/>
+            </w:pPr>
+          </w:p>
+        </w:tc>
+        <w:tc>
+          <w:tcPr/>
+          <w:p>
+            <w:pPr>
+              <w:pStyle w:val="Compact"/>
+              <w:jc w:val="center"/>
+            </w:pPr>
+            <w:r>
+              <w:t xml:space="preserve">0.949 / 0.943</w:t>
+            </w:r>
+          </w:p>
+        </w:tc>
+        <w:tc>
+          <w:tcPr/>
+          <w:p>
+            <w:pPr>
+              <w:pStyle w:val="Compact"/>
+              <w:jc w:val="center"/>
+            </w:pPr>
+            <w:r>
+              <w:t xml:space="preserve">0.915 / 0.844</w:t>
+            </w:r>
+          </w:p>
+        </w:tc>
+      </w:tr>
+      <w:tr>
+        <w:tc>
+          <w:tcPr/>
+          <w:p>
+            <w:pPr>
+              <w:pStyle w:val="Compact"/>
+            </w:pPr>
+          </w:p>
+        </w:tc>
+        <w:tc>
+          <w:tcPr/>
+          <w:p>
+            <w:pPr>
+              <w:pStyle w:val="Compact"/>
+              <w:jc w:val="left"/>
+            </w:pPr>
+            <w:r>
+              <w:t xml:space="preserve">with linear ZNE (1000 shots)</w:t>
+            </w:r>
+          </w:p>
+        </w:tc>
+        <w:tc>
+          <w:tcPr/>
+          <w:p>
+            <w:pPr>
+              <w:pStyle w:val="Compact"/>
+            </w:pPr>
+          </w:p>
+        </w:tc>
+        <w:tc>
+          <w:tcPr/>
+          <w:p>
+            <w:pPr>
+              <w:pStyle w:val="Compact"/>
+              <w:jc w:val="center"/>
+            </w:pPr>
+            <w:r>
+              <w:t xml:space="preserve">0.945 / 0.864</w:t>
+            </w:r>
+          </w:p>
+        </w:tc>
+        <w:tc>
+          <w:tcPr/>
+          <w:p>
+            <w:pPr>
+              <w:pStyle w:val="Compact"/>
+              <w:jc w:val="center"/>
+            </w:pPr>
+            <w:r>
+              <w:t xml:space="preserve">0.909 / 0.841</w:t>
+            </w:r>
+          </w:p>
+        </w:tc>
+      </w:tr>
+      <w:tr>
+        <w:tc>
+          <w:tcPr/>
+          <w:p>
+            <w:pPr>
+              <w:pStyle w:val="Compact"/>
+            </w:pPr>
+          </w:p>
+        </w:tc>
+        <w:tc>
+          <w:tcPr/>
+          <w:p>
+            <w:pPr>
+              <w:pStyle w:val="Compact"/>
+              <w:jc w:val="left"/>
+            </w:pPr>
+            <w:r>
+              <w:t xml:space="preserve">trained with filter under noise</w:t>
+            </w:r>
+          </w:p>
+        </w:tc>
+        <w:tc>
+          <w:tcPr/>
+          <w:p>
+            <w:pPr>
+              <w:pStyle w:val="Compact"/>
+            </w:pPr>
+          </w:p>
+        </w:tc>
+        <w:tc>
+          <w:tcPr/>
+          <w:p>
+            <w:pPr>
+              <w:pStyle w:val="Compact"/>
+              <w:jc w:val="center"/>
+            </w:pPr>
+            <w:r>
+              <w:t xml:space="preserve">0.953 / 0.956</w:t>
+            </w:r>
+          </w:p>
+        </w:tc>
+        <w:tc>
+          <w:tcPr/>
+          <w:p>
+            <w:pPr>
+              <w:pStyle w:val="Compact"/>
+            </w:pPr>
+          </w:p>
+        </w:tc>
+      </w:tr>
     </w:tbl>
-    <w:bookmarkEnd w:id="41"/>
     <w:bookmarkEnd w:id="42"/>
     <w:bookmarkEnd w:id="43"/>
-    <w:bookmarkStart w:id="45" w:name="discussion"/>
+    <w:bookmarkEnd w:id="44"/>
+    <w:bookmarkStart w:id="46" w:name="discussion"/>
     <w:p>
       <w:pPr>
         <w:pStyle w:val="Heading1"/>
@@ -20189,19 +21495,19 @@
         <w:rPr>
           <w:rFonts w:ascii="Times New Roman" w:hAnsi="Times New Roman"/>
         </w:rPr>
-        <w:t xml:space="preserve">model and no noisy training runs, and its cost (the discarded shots) is known before running. Dephasing is not</w:t>
-      </w:r>
-      <w:r>
-        <w:rPr>
-          <w:rFonts w:ascii="Times New Roman" w:hAnsi="Times New Roman"/>
-        </w:rPr>
-        <w:t xml:space="preserve"> </w:t>
-      </w:r>
-      <w:r>
-        <w:rPr>
-          <w:rFonts w:ascii="Times New Roman" w:hAnsi="Times New Roman"/>
-        </w:rPr>
-        <w:t xml:space="preserve">corrected. Unequal T1 is, when the network is trained with the filter under the calibrated decay rates: since only</w:t>
+        <w:t xml:space="preserve">model and no noisy training runs, and its cost (the discarded shots) is known before running. Unequal T1 is corrected</w:t>
+      </w:r>
+      <w:r>
+        <w:rPr>
+          <w:rFonts w:ascii="Times New Roman" w:hAnsi="Times New Roman"/>
+        </w:rPr>
+        <w:t xml:space="preserve"> </w:t>
+      </w:r>
+      <w:r>
+        <w:rPr>
+          <w:rFonts w:ascii="Times New Roman" w:hAnsi="Times New Roman"/>
+        </w:rPr>
+        <w:t xml:space="preserve">when the network is trained with the filter under the calibrated decay rates: since only</w:t>
       </w:r>
       <w:r>
         <w:rPr>
@@ -20225,19 +21531,55 @@
         <w:rPr>
           <w:rFonts w:ascii="Times New Roman" w:hAnsi="Times New Roman"/>
         </w:rPr>
-        <w:t xml:space="preserve">common drift that the raw noise-aware model does not. On hardware with strong dephasing the filter complements a noise</w:t>
-      </w:r>
-      <w:r>
-        <w:rPr>
-          <w:rFonts w:ascii="Times New Roman" w:hAnsi="Times New Roman"/>
-        </w:rPr>
-        <w:t xml:space="preserve"> </w:t>
-      </w:r>
-      <w:r>
-        <w:rPr>
-          <w:rFonts w:ascii="Times New Roman" w:hAnsi="Times New Roman"/>
-        </w:rPr>
-        <w:t xml:space="preserve">model and does not replace it. Two practical rules follow from the studies above. Up</w:t>
+        <w:t xml:space="preserve">common drift that the raw noise-aware model does not. Dephasing is corrected the same way, by training with the filter</w:t>
+      </w:r>
+      <w:r>
+        <w:rPr>
+          <w:rFonts w:ascii="Times New Roman" w:hAnsi="Times New Roman"/>
+        </w:rPr>
+        <w:t xml:space="preserve"> </w:t>
+      </w:r>
+      <w:r>
+        <w:rPr>
+          <w:rFonts w:ascii="Times New Roman" w:hAnsi="Times New Roman"/>
+        </w:rPr>
+        <w:t xml:space="preserve">under the calibrated noise; and because the filter turns T1 plus dephasing into dephasing alone (F6), zero-noise</w:t>
+      </w:r>
+      <w:r>
+        <w:rPr>
+          <w:rFonts w:ascii="Times New Roman" w:hAnsi="Times New Roman"/>
+        </w:rPr>
+        <w:t xml:space="preserve"> </w:t>
+      </w:r>
+      <w:r>
+        <w:rPr>
+          <w:rFonts w:ascii="Times New Roman" w:hAnsi="Times New Roman"/>
+        </w:rPr>
+        <w:t xml:space="preserve">extrapolation of the filtered readout removes most of the remaining bias of observables, at a shot cost that at 1000</w:t>
+      </w:r>
+      <w:r>
+        <w:rPr>
+          <w:rFonts w:ascii="Times New Roman" w:hAnsi="Times New Roman"/>
+        </w:rPr>
+        <w:t xml:space="preserve"> </w:t>
+      </w:r>
+      <w:r>
+        <w:rPr>
+          <w:rFonts w:ascii="Times New Roman" w:hAnsi="Times New Roman"/>
+        </w:rPr>
+        <w:t xml:space="preserve">shots per scale cancelled the gain at weight 2. The filter and calibrated training are most</w:t>
+      </w:r>
+      <w:r>
+        <w:rPr>
+          <w:rFonts w:ascii="Times New Roman" w:hAnsi="Times New Roman"/>
+        </w:rPr>
+        <w:t xml:space="preserve"> </w:t>
+      </w:r>
+      <w:r>
+        <w:rPr>
+          <w:rFonts w:ascii="Times New Roman" w:hAnsi="Times New Roman"/>
+        </w:rPr>
+        <w:t xml:space="preserve">useful together. Two practical rules follow from the studies above. Up</w:t>
       </w:r>
       <w:r>
         <w:rPr>
@@ -20453,7 +21795,7 @@
         <w:t xml:space="preserve">.</w:t>
       </w:r>
     </w:p>
-    <w:bookmarkStart w:id="44" w:name="limitations."/>
+    <w:bookmarkStart w:id="45" w:name="limitations."/>
     <w:p>
       <w:pPr>
         <w:pStyle w:val="Heading4"/>
@@ -20548,9 +21890,9 @@
         <w:t xml:space="preserve">committed, and waits for hardware credits.</w:t>
       </w:r>
     </w:p>
-    <w:bookmarkEnd w:id="44"/>
     <w:bookmarkEnd w:id="45"/>
-    <w:bookmarkStart w:id="59" w:name="code-and-data-availability"/>
+    <w:bookmarkEnd w:id="46"/>
+    <w:bookmarkStart w:id="60" w:name="code-and-data-availability"/>
     <w:p>
       <w:pPr>
         <w:pStyle w:val="Heading1"/>
@@ -20979,7 +22321,7 @@
         <w:rPr>
           <w:rFonts w:ascii="Times New Roman" w:hAnsi="Times New Roman"/>
         </w:rPr>
-        <w:t xml:space="preserve">and RESEARCH_NOTES §75–§82, §85, §87, §90, §91 and §94–§101, §104–§117, with tests in</w:t>
+        <w:t xml:space="preserve">and RESEARCH_NOTES §75–§82, §85, §87, §90, §91 and §94–§101, §104–§118, with tests in</w:t>
       </w:r>
       <w:r>
         <w:rPr>
@@ -21092,7 +22434,7 @@
         </w:rPr>
         <w:t xml:space="preserve"> </w:t>
       </w:r>
-      <w:hyperlink r:id="rId46">
+      <w:hyperlink r:id="rId47">
         <w:r>
           <w:rPr>
             <w:rStyle w:val="Hyperlink"/>
@@ -21295,8 +22637,8 @@
         <w:t xml:space="preserve"># raw readout</w:t>
       </w:r>
     </w:p>
-    <w:bookmarkStart w:id="58" w:name="refs"/>
-    <w:bookmarkStart w:id="47" w:name="ref-bonetmonroig2018"/>
+    <w:bookmarkStart w:id="59" w:name="refs"/>
+    <w:bookmarkStart w:id="48" w:name="ref-bonetmonroig2018"/>
     <w:p>
       <w:pPr>
         <w:pStyle w:val="Bibliography"/>
@@ -21346,8 +22688,8 @@
         <w:t xml:space="preserve">98: 062339.</w:t>
       </w:r>
     </w:p>
-    <w:bookmarkEnd w:id="47"/>
-    <w:bookmarkStart w:id="48" w:name="ref-cerezo2023simulability"/>
+    <w:bookmarkEnd w:id="48"/>
+    <w:bookmarkStart w:id="49" w:name="ref-cerezo2023simulability"/>
     <w:p>
       <w:pPr>
         <w:pStyle w:val="Bibliography"/>
@@ -21389,8 +22731,8 @@
         <w:t xml:space="preserve">r, Why We Need to Rethink Variational Quantum Computing.”</w:t>
       </w:r>
     </w:p>
-    <w:bookmarkEnd w:id="48"/>
-    <w:bookmarkStart w:id="50" w:name="ref-landman2022"/>
+    <w:bookmarkEnd w:id="49"/>
+    <w:bookmarkStart w:id="51" w:name="ref-landman2022"/>
     <w:p>
       <w:pPr>
         <w:pStyle w:val="Bibliography"/>
@@ -21445,7 +22787,7 @@
         </w:rPr>
         <w:t xml:space="preserve"> </w:t>
       </w:r>
-      <w:hyperlink r:id="rId49">
+      <w:hyperlink r:id="rId50">
         <w:r>
           <w:rPr>
             <w:rStyle w:val="Hyperlink"/>
@@ -21460,8 +22802,8 @@
         <w:t xml:space="preserve">.</w:t>
       </w:r>
     </w:p>
-    <w:bookmarkEnd w:id="50"/>
-    <w:bookmarkStart w:id="51" w:name="ref-mcardle2019"/>
+    <w:bookmarkEnd w:id="51"/>
+    <w:bookmarkStart w:id="52" w:name="ref-mcardle2019"/>
     <w:p>
       <w:pPr>
         <w:pStyle w:val="Bibliography"/>
@@ -21511,8 +22853,8 @@
         <w:t xml:space="preserve">122: 180501.</w:t>
       </w:r>
     </w:p>
-    <w:bookmarkEnd w:id="51"/>
-    <w:bookmarkStart w:id="53" w:name="ref-monteverde2026qang"/>
+    <w:bookmarkEnd w:id="52"/>
+    <w:bookmarkStart w:id="54" w:name="ref-monteverde2026qang"/>
     <w:p>
       <w:pPr>
         <w:pStyle w:val="Bibliography"/>
@@ -21565,7 +22907,7 @@
         </w:rPr>
         <w:t xml:space="preserve"> </w:t>
       </w:r>
-      <w:hyperlink r:id="rId52">
+      <w:hyperlink r:id="rId53">
         <w:r>
           <w:rPr>
             <w:rStyle w:val="Hyperlink"/>
@@ -21580,8 +22922,8 @@
         <w:t xml:space="preserve">.</w:t>
       </w:r>
     </w:p>
-    <w:bookmarkEnd w:id="53"/>
-    <w:bookmarkStart w:id="55" w:name="ref-monteverde2026witness"/>
+    <w:bookmarkEnd w:id="54"/>
+    <w:bookmarkStart w:id="56" w:name="ref-monteverde2026witness"/>
     <w:p>
       <w:pPr>
         <w:pStyle w:val="Bibliography"/>
@@ -21630,7 +22972,7 @@
         </w:rPr>
         <w:t xml:space="preserve"> </w:t>
       </w:r>
-      <w:hyperlink r:id="rId54">
+      <w:hyperlink r:id="rId55">
         <w:r>
           <w:rPr>
             <w:rStyle w:val="Hyperlink"/>
@@ -21645,8 +22987,8 @@
         <w:t xml:space="preserve">.</w:t>
       </w:r>
     </w:p>
-    <w:bookmarkEnd w:id="55"/>
-    <w:bookmarkStart w:id="57" w:name="ref-wang2022quantumnat"/>
+    <w:bookmarkEnd w:id="56"/>
+    <w:bookmarkStart w:id="58" w:name="ref-wang2022quantumnat"/>
     <w:p>
       <w:pPr>
         <w:pStyle w:val="Bibliography"/>
@@ -21719,7 +23061,7 @@
         </w:rPr>
         <w:t xml:space="preserve"> </w:t>
       </w:r>
-      <w:hyperlink r:id="rId56">
+      <w:hyperlink r:id="rId57">
         <w:r>
           <w:rPr>
             <w:rStyle w:val="Hyperlink"/>
@@ -21734,9 +23076,9 @@
         <w:t xml:space="preserve">.</w:t>
       </w:r>
     </w:p>
-    <w:bookmarkEnd w:id="57"/>
     <w:bookmarkEnd w:id="58"/>
     <w:bookmarkEnd w:id="59"/>
+    <w:bookmarkEnd w:id="60"/>
     <w:sectPr/>
   </w:body>
 </w:document>

</xml_diff>

<commit_message>
qang 0.6.18: unequal T1 and dephasing corrected (F5, F6; sections 117-118), eight classes, echo at 8 qubits, IonQ package; QML note (EN/ES, PDF and Word) at 0.6.18; CITATION, Zenodo metadata, CHANGELOG
</commit_message>
<xml_diff>
--- a/manuscript/qang_qml.docx
+++ b/manuscript/qang_qml.docx
@@ -9490,7 +9490,7 @@
         <w:rPr>
           <w:rFonts w:ascii="Times New Roman" w:hAnsi="Times New Roman"/>
         </w:rPr>
-        <w:t xml:space="preserve">0.6.17,</w:t>
+        <w:t xml:space="preserve">0.6.18,</w:t>
       </w:r>
       <w:r>
         <w:rPr>
@@ -21962,7 +21962,7 @@
         <w:rPr>
           <w:rFonts w:ascii="Times New Roman" w:hAnsi="Times New Roman"/>
         </w:rPr>
-        <w:t xml:space="preserve">0.6.17 (</w:t>
+        <w:t xml:space="preserve">0.6.18 (</w:t>
       </w:r>
       <w:r>
         <w:rPr>

</xml_diff>

<commit_message>
QML note (EN/ES, PDF and Word) with section 119: on device noise models dominated by gate errors, calibrated training from T1/T2 adds nothing
</commit_message>
<xml_diff>
--- a/manuscript/qang_qml.docx
+++ b/manuscript/qang_qml.docx
@@ -4592,6 +4592,474 @@
         <w:rPr>
           <w:rFonts w:ascii="Times New Roman" w:hAnsi="Times New Roman"/>
         </w:rPr>
+        <w:t xml:space="preserve">On</w:t>
+      </w:r>
+      <w:r>
+        <w:rPr>
+          <w:rFonts w:ascii="Times New Roman" w:hAnsi="Times New Roman"/>
+        </w:rPr>
+        <w:t xml:space="preserve"> </w:t>
+      </w:r>
+      <w:r>
+        <w:rPr>
+          <w:rFonts w:ascii="Times New Roman" w:hAnsi="Times New Roman"/>
+        </w:rPr>
+        <w:t xml:space="preserve">IBM</w:t>
+      </w:r>
+      <w:r>
+        <w:rPr>
+          <w:rFonts w:ascii="Times New Roman" w:hAnsi="Times New Roman"/>
+        </w:rPr>
+        <w:t xml:space="preserve"> </w:t>
+      </w:r>
+      <w:r>
+        <w:rPr>
+          <w:rFonts w:ascii="Times New Roman" w:hAnsi="Times New Roman"/>
+        </w:rPr>
+        <w:t xml:space="preserve">device</w:t>
+      </w:r>
+      <w:r>
+        <w:rPr>
+          <w:rFonts w:ascii="Times New Roman" w:hAnsi="Times New Roman"/>
+        </w:rPr>
+        <w:t xml:space="preserve"> </w:t>
+      </w:r>
+      <w:r>
+        <w:rPr>
+          <w:rFonts w:ascii="Times New Roman" w:hAnsi="Times New Roman"/>
+        </w:rPr>
+        <w:t xml:space="preserve">noise</w:t>
+      </w:r>
+      <w:r>
+        <w:rPr>
+          <w:rFonts w:ascii="Times New Roman" w:hAnsi="Times New Roman"/>
+        </w:rPr>
+        <w:t xml:space="preserve"> </w:t>
+      </w:r>
+      <w:r>
+        <w:rPr>
+          <w:rFonts w:ascii="Times New Roman" w:hAnsi="Times New Roman"/>
+        </w:rPr>
+        <w:t xml:space="preserve">models,</w:t>
+      </w:r>
+      <w:r>
+        <w:rPr>
+          <w:rFonts w:ascii="Times New Roman" w:hAnsi="Times New Roman"/>
+        </w:rPr>
+        <w:t xml:space="preserve"> </w:t>
+      </w:r>
+      <w:r>
+        <w:rPr>
+          <w:rFonts w:ascii="Times New Roman" w:hAnsi="Times New Roman"/>
+        </w:rPr>
+        <w:t xml:space="preserve">however,</w:t>
+      </w:r>
+      <w:r>
+        <w:rPr>
+          <w:rFonts w:ascii="Times New Roman" w:hAnsi="Times New Roman"/>
+        </w:rPr>
+        <w:t xml:space="preserve"> </w:t>
+      </w:r>
+      <w:r>
+        <w:rPr>
+          <w:rFonts w:ascii="Times New Roman" w:hAnsi="Times New Roman"/>
+        </w:rPr>
+        <w:t xml:space="preserve">where</w:t>
+      </w:r>
+      <w:r>
+        <w:rPr>
+          <w:rFonts w:ascii="Times New Roman" w:hAnsi="Times New Roman"/>
+        </w:rPr>
+        <w:t xml:space="preserve"> </w:t>
+      </w:r>
+      <w:r>
+        <w:rPr>
+          <w:rFonts w:ascii="Times New Roman" w:hAnsi="Times New Roman"/>
+        </w:rPr>
+        <w:t xml:space="preserve">gate</w:t>
+      </w:r>
+      <w:r>
+        <w:rPr>
+          <w:rFonts w:ascii="Times New Roman" w:hAnsi="Times New Roman"/>
+        </w:rPr>
+        <w:t xml:space="preserve"> </w:t>
+      </w:r>
+      <w:r>
+        <w:rPr>
+          <w:rFonts w:ascii="Times New Roman" w:hAnsi="Times New Roman"/>
+        </w:rPr>
+        <w:t xml:space="preserve">errors</w:t>
+      </w:r>
+      <w:r>
+        <w:rPr>
+          <w:rFonts w:ascii="Times New Roman" w:hAnsi="Times New Roman"/>
+        </w:rPr>
+        <w:t xml:space="preserve"> </w:t>
+      </w:r>
+      <w:r>
+        <w:rPr>
+          <w:rFonts w:ascii="Times New Roman" w:hAnsi="Times New Roman"/>
+        </w:rPr>
+        <w:t xml:space="preserve">dominate</w:t>
+      </w:r>
+      <w:r>
+        <w:rPr>
+          <w:rFonts w:ascii="Times New Roman" w:hAnsi="Times New Roman"/>
+        </w:rPr>
+        <w:t xml:space="preserve"> </w:t>
+      </w:r>
+      <w:r>
+        <w:rPr>
+          <w:rFonts w:ascii="Times New Roman" w:hAnsi="Times New Roman"/>
+        </w:rPr>
+        <w:t xml:space="preserve">and</w:t>
+      </w:r>
+      <w:r>
+        <w:rPr>
+          <w:rFonts w:ascii="Times New Roman" w:hAnsi="Times New Roman"/>
+        </w:rPr>
+        <w:t xml:space="preserve"> </w:t>
+      </w:r>
+      <w:r>
+        <w:rPr>
+          <w:rFonts w:ascii="Times New Roman" w:hAnsi="Times New Roman"/>
+        </w:rPr>
+        <w:t xml:space="preserve">the</w:t>
+      </w:r>
+      <w:r>
+        <w:rPr>
+          <w:rFonts w:ascii="Times New Roman" w:hAnsi="Times New Roman"/>
+        </w:rPr>
+        <w:t xml:space="preserve"> </w:t>
+      </w:r>
+      <w:r>
+        <w:rPr>
+          <w:rFonts w:ascii="Times New Roman" w:hAnsi="Times New Roman"/>
+        </w:rPr>
+        <w:t xml:space="preserve">published</w:t>
+      </w:r>
+      <w:r>
+        <w:rPr>
+          <w:rFonts w:ascii="Times New Roman" w:hAnsi="Times New Roman"/>
+        </w:rPr>
+        <w:t xml:space="preserve"> </w:t>
+      </w:r>
+      <w:r>
+        <w:rPr>
+          <w:rFonts w:ascii="Times New Roman" w:hAnsi="Times New Roman"/>
+        </w:rPr>
+        <w:t xml:space="preserve">T1</w:t>
+      </w:r>
+      <w:r>
+        <w:rPr>
+          <w:rFonts w:ascii="Times New Roman" w:hAnsi="Times New Roman"/>
+        </w:rPr>
+        <w:t xml:space="preserve"> </w:t>
+      </w:r>
+      <w:r>
+        <w:rPr>
+          <w:rFonts w:ascii="Times New Roman" w:hAnsi="Times New Roman"/>
+        </w:rPr>
+        <w:t xml:space="preserve">and</w:t>
+      </w:r>
+      <w:r>
+        <w:rPr>
+          <w:rFonts w:ascii="Times New Roman" w:hAnsi="Times New Roman"/>
+        </w:rPr>
+        <w:t xml:space="preserve"> </w:t>
+      </w:r>
+      <w:r>
+        <w:rPr>
+          <w:rFonts w:ascii="Times New Roman" w:hAnsi="Times New Roman"/>
+        </w:rPr>
+        <w:t xml:space="preserve">T2</w:t>
+      </w:r>
+      <w:r>
+        <w:rPr>
+          <w:rFonts w:ascii="Times New Roman" w:hAnsi="Times New Roman"/>
+        </w:rPr>
+        <w:t xml:space="preserve"> </w:t>
+      </w:r>
+      <w:r>
+        <w:rPr>
+          <w:rFonts w:ascii="Times New Roman" w:hAnsi="Times New Roman"/>
+        </w:rPr>
+        <w:t xml:space="preserve">give</w:t>
+      </w:r>
+      <w:r>
+        <w:rPr>
+          <w:rFonts w:ascii="Times New Roman" w:hAnsi="Times New Roman"/>
+        </w:rPr>
+        <w:t xml:space="preserve"> </w:t>
+      </w:r>
+      <w:r>
+        <w:rPr>
+          <w:rFonts w:ascii="Times New Roman" w:hAnsi="Times New Roman"/>
+        </w:rPr>
+        <w:t xml:space="preserve">a</w:t>
+      </w:r>
+      <w:r>
+        <w:rPr>
+          <w:rFonts w:ascii="Times New Roman" w:hAnsi="Times New Roman"/>
+        </w:rPr>
+        <w:t xml:space="preserve"> </w:t>
+      </w:r>
+      <w:r>
+        <w:rPr>
+          <w:rFonts w:ascii="Times New Roman" w:hAnsi="Times New Roman"/>
+        </w:rPr>
+        <w:t xml:space="preserve">decay</w:t>
+      </w:r>
+      <w:r>
+        <w:rPr>
+          <w:rFonts w:ascii="Times New Roman" w:hAnsi="Times New Roman"/>
+        </w:rPr>
+        <w:t xml:space="preserve"> </w:t>
+      </w:r>
+      <w:r>
+        <w:rPr>
+          <w:rFonts w:ascii="Times New Roman" w:hAnsi="Times New Roman"/>
+        </w:rPr>
+        <w:t xml:space="preserve">of</w:t>
+      </w:r>
+      <w:r>
+        <w:rPr>
+          <w:rFonts w:ascii="Times New Roman" w:hAnsi="Times New Roman"/>
+        </w:rPr>
+        <w:t xml:space="preserve"> </w:t>
+      </w:r>
+      <w:r>
+        <w:rPr>
+          <w:rFonts w:ascii="Times New Roman" w:hAnsi="Times New Roman"/>
+        </w:rPr>
+        <w:t xml:space="preserve">only</w:t>
+      </w:r>
+      <w:r>
+        <w:rPr>
+          <w:rFonts w:ascii="Times New Roman" w:hAnsi="Times New Roman"/>
+        </w:rPr>
+        <w:t xml:space="preserve"> </w:t>
+      </w:r>
+      <w:r>
+        <w:rPr>
+          <w:rFonts w:ascii="Times New Roman" w:hAnsi="Times New Roman"/>
+        </w:rPr>
+        <w:t xml:space="preserve">0.002–0.017</w:t>
+      </w:r>
+      <w:r>
+        <w:rPr>
+          <w:rFonts w:ascii="Times New Roman" w:hAnsi="Times New Roman"/>
+        </w:rPr>
+        <w:t xml:space="preserve"> </w:t>
+      </w:r>
+      <w:r>
+        <w:rPr>
+          <w:rFonts w:ascii="Times New Roman" w:hAnsi="Times New Roman"/>
+        </w:rPr>
+        <w:t xml:space="preserve">per</w:t>
+      </w:r>
+      <w:r>
+        <w:rPr>
+          <w:rFonts w:ascii="Times New Roman" w:hAnsi="Times New Roman"/>
+        </w:rPr>
+        <w:t xml:space="preserve"> </w:t>
+      </w:r>
+      <w:r>
+        <w:rPr>
+          <w:rFonts w:ascii="Times New Roman" w:hAnsi="Times New Roman"/>
+        </w:rPr>
+        <w:t xml:space="preserve">sublayer,</w:t>
+      </w:r>
+      <w:r>
+        <w:rPr>
+          <w:rFonts w:ascii="Times New Roman" w:hAnsi="Times New Roman"/>
+        </w:rPr>
+        <w:t xml:space="preserve"> </w:t>
+      </w:r>
+      <w:r>
+        <w:rPr>
+          <w:rFonts w:ascii="Times New Roman" w:hAnsi="Times New Roman"/>
+        </w:rPr>
+        <w:t xml:space="preserve">training</w:t>
+      </w:r>
+      <w:r>
+        <w:rPr>
+          <w:rFonts w:ascii="Times New Roman" w:hAnsi="Times New Roman"/>
+        </w:rPr>
+        <w:t xml:space="preserve"> </w:t>
+      </w:r>
+      <w:r>
+        <w:rPr>
+          <w:rFonts w:ascii="Times New Roman" w:hAnsi="Times New Roman"/>
+        </w:rPr>
+        <w:t xml:space="preserve">under</w:t>
+      </w:r>
+      <w:r>
+        <w:rPr>
+          <w:rFonts w:ascii="Times New Roman" w:hAnsi="Times New Roman"/>
+        </w:rPr>
+        <w:t xml:space="preserve"> </w:t>
+      </w:r>
+      <w:r>
+        <w:rPr>
+          <w:rFonts w:ascii="Times New Roman" w:hAnsi="Times New Roman"/>
+        </w:rPr>
+        <w:t xml:space="preserve">that</w:t>
+      </w:r>
+      <w:r>
+        <w:rPr>
+          <w:rFonts w:ascii="Times New Roman" w:hAnsi="Times New Roman"/>
+        </w:rPr>
+        <w:t xml:space="preserve"> </w:t>
+      </w:r>
+      <w:r>
+        <w:rPr>
+          <w:rFonts w:ascii="Times New Roman" w:hAnsi="Times New Roman"/>
+        </w:rPr>
+        <w:t xml:space="preserve">calibration</w:t>
+      </w:r>
+      <w:r>
+        <w:rPr>
+          <w:rFonts w:ascii="Times New Roman" w:hAnsi="Times New Roman"/>
+        </w:rPr>
+        <w:t xml:space="preserve"> </w:t>
+      </w:r>
+      <w:r>
+        <w:rPr>
+          <w:rFonts w:ascii="Times New Roman" w:hAnsi="Times New Roman"/>
+        </w:rPr>
+        <w:t xml:space="preserve">added</w:t>
+      </w:r>
+      <w:r>
+        <w:rPr>
+          <w:rFonts w:ascii="Times New Roman" w:hAnsi="Times New Roman"/>
+        </w:rPr>
+        <w:t xml:space="preserve"> </w:t>
+      </w:r>
+      <w:r>
+        <w:rPr>
+          <w:rFonts w:ascii="Times New Roman" w:hAnsi="Times New Roman"/>
+        </w:rPr>
+        <w:t xml:space="preserve">nothing:</w:t>
+      </w:r>
+      <w:r>
+        <w:rPr>
+          <w:rFonts w:ascii="Times New Roman" w:hAnsi="Times New Roman"/>
+        </w:rPr>
+        <w:t xml:space="preserve"> </w:t>
+      </w:r>
+      <w:r>
+        <w:rPr>
+          <w:rFonts w:ascii="Times New Roman" w:hAnsi="Times New Roman"/>
+        </w:rPr>
+        <w:t xml:space="preserve">the</w:t>
+      </w:r>
+      <w:r>
+        <w:rPr>
+          <w:rFonts w:ascii="Times New Roman" w:hAnsi="Times New Roman"/>
+        </w:rPr>
+        <w:t xml:space="preserve"> </w:t>
+      </w:r>
+      <w:r>
+        <w:rPr>
+          <w:rFonts w:ascii="Times New Roman" w:hAnsi="Times New Roman"/>
+        </w:rPr>
+        <w:t xml:space="preserve">filter</w:t>
+      </w:r>
+      <w:r>
+        <w:rPr>
+          <w:rFonts w:ascii="Times New Roman" w:hAnsi="Times New Roman"/>
+        </w:rPr>
+        <w:t xml:space="preserve"> </w:t>
+      </w:r>
+      <w:r>
+        <w:rPr>
+          <w:rFonts w:ascii="Times New Roman" w:hAnsi="Times New Roman"/>
+        </w:rPr>
+        <w:t xml:space="preserve">alone</w:t>
+      </w:r>
+      <w:r>
+        <w:rPr>
+          <w:rFonts w:ascii="Times New Roman" w:hAnsi="Times New Roman"/>
+        </w:rPr>
+        <w:t xml:space="preserve"> </w:t>
+      </w:r>
+      <w:r>
+        <w:rPr>
+          <w:rFonts w:ascii="Times New Roman" w:hAnsi="Times New Roman"/>
+        </w:rPr>
+        <w:t xml:space="preserve">lifted</w:t>
+      </w:r>
+      <w:r>
+        <w:rPr>
+          <w:rFonts w:ascii="Times New Roman" w:hAnsi="Times New Roman"/>
+        </w:rPr>
+        <w:t xml:space="preserve"> </w:t>
+      </w:r>
+      <w:r>
+        <w:rPr>
+          <w:rFonts w:ascii="Times New Roman" w:hAnsi="Times New Roman"/>
+        </w:rPr>
+        <w:t xml:space="preserve">0.958</w:t>
+      </w:r>
+      <w:r>
+        <w:rPr>
+          <w:rFonts w:ascii="Times New Roman" w:hAnsi="Times New Roman"/>
+        </w:rPr>
+        <w:t xml:space="preserve"> </w:t>
+      </w:r>
+      <w:r>
+        <w:rPr>
+          <w:rFonts w:ascii="Times New Roman" w:hAnsi="Times New Roman"/>
+        </w:rPr>
+        <w:t xml:space="preserve">to</w:t>
+      </w:r>
+      <w:r>
+        <w:rPr>
+          <w:rFonts w:ascii="Times New Roman" w:hAnsi="Times New Roman"/>
+        </w:rPr>
+        <w:t xml:space="preserve"> </w:t>
+      </w:r>
+      <w:r>
+        <w:rPr>
+          <w:rFonts w:ascii="Times New Roman" w:hAnsi="Times New Roman"/>
+        </w:rPr>
+        <w:t xml:space="preserve">0.972</w:t>
+      </w:r>
+      <w:r>
+        <w:rPr>
+          <w:rFonts w:ascii="Times New Roman" w:hAnsi="Times New Roman"/>
+        </w:rPr>
+        <w:t xml:space="preserve"> </w:t>
+      </w:r>
+      <w:r>
+        <w:rPr>
+          <w:rFonts w:ascii="Times New Roman" w:hAnsi="Times New Roman"/>
+        </w:rPr>
+        <w:t xml:space="preserve">(noiseless</w:t>
+      </w:r>
+      <w:r>
+        <w:rPr>
+          <w:rFonts w:ascii="Times New Roman" w:hAnsi="Times New Roman"/>
+        </w:rPr>
+        <w:t xml:space="preserve"> </w:t>
+      </w:r>
+      <w:r>
+        <w:rPr>
+          <w:rFonts w:ascii="Times New Roman" w:hAnsi="Times New Roman"/>
+        </w:rPr>
+        <w:t xml:space="preserve">0.979).</w:t>
+      </w:r>
+      <w:r>
+        <w:rPr>
+          <w:rFonts w:ascii="Times New Roman" w:hAnsi="Times New Roman"/>
+        </w:rPr>
+        <w:t xml:space="preserve"> </w:t>
+      </w:r>
+      <w:r>
+        <w:rPr>
+          <w:rFonts w:ascii="Times New Roman" w:hAnsi="Times New Roman"/>
+        </w:rPr>
         <w:t xml:space="preserve">With</w:t>
       </w:r>
       <w:r>
@@ -9858,7 +10326,7 @@
         <w:rPr>
           <w:rFonts w:ascii="Times New Roman" w:hAnsi="Times New Roman"/>
         </w:rPr>
-        <w:t xml:space="preserve">predictions of every study were committed to the repository before the run that tested them. Of 143 pre-registered predictions in the studies summarized here, 101 passed and 42 failed; the failures are</w:t>
+        <w:t xml:space="preserve">predictions of every study were committed to the repository before the run that tested them. Of 147 pre-registered predictions in the studies summarized here, 101 passed and 46 failed; the failures are</w:t>
       </w:r>
       <w:r>
         <w:rPr>
@@ -13882,7 +14350,19 @@
         <w:rPr>
           <w:rFonts w:ascii="Times New Roman" w:hAnsi="Times New Roman"/>
         </w:rPr>
-        <w:t xml:space="preserve">alone with 1000 shots per scale at weight 2 (2.9 points below).</w:t>
+        <w:t xml:space="preserve">alone with 1000 shots per scale at weight 2 (2.9 points below); and all four predictions that calibrated training</w:t>
+      </w:r>
+      <w:r>
+        <w:rPr>
+          <w:rFonts w:ascii="Times New Roman" w:hAnsi="Times New Roman"/>
+        </w:rPr>
+        <w:t xml:space="preserve"> </w:t>
+      </w:r>
+      <w:r>
+        <w:rPr>
+          <w:rFonts w:ascii="Times New Roman" w:hAnsi="Times New Roman"/>
+        </w:rPr>
+        <w:t xml:space="preserve">from the published T1 and T2 would help on device noise models.</w:t>
       </w:r>
     </w:p>
     <w:bookmarkEnd w:id="32"/>
@@ -20405,6 +20885,108 @@
           <w:rFonts w:ascii="Times New Roman" w:hAnsi="Times New Roman"/>
         </w:rPr>
         <w:t xml:space="preserve">calibrated noise reached 0.951–0.956 at both dephasing levels (F6).</w:t>
+      </w:r>
+    </w:p>
+    <w:p>
+      <w:pPr>
+        <w:numPr>
+          <w:ilvl w:val="0"/>
+          <w:numId w:val="1006"/>
+        </w:numPr>
+      </w:pPr>
+      <w:r>
+        <w:rPr>
+          <w:iCs/>
+          <w:rFonts w:ascii="Times New Roman" w:hAnsi="Times New Roman"/>
+          <w:i/>
+        </w:rPr>
+        <w:t xml:space="preserve">The whole pipeline on device noise models</w:t>
+      </w:r>
+      <w:r>
+        <w:rPr>
+          <w:rFonts w:ascii="Times New Roman" w:hAnsi="Times New Roman"/>
+        </w:rPr>
+        <w:t xml:space="preserve"> </w:t>
+      </w:r>
+      <w:r>
+        <w:rPr>
+          <w:rFonts w:ascii="Times New Roman" w:hAnsi="Times New Roman"/>
+        </w:rPr>
+        <w:t xml:space="preserve">(the IBM fake backends of Sec. </w:t>
+      </w:r>
+      <w:hyperlink w:anchor="sec:echo">
+        <w:r>
+          <w:rPr>
+            <w:rStyle w:val="Hyperlink"/>
+          </w:rPr>
+          <w:t xml:space="preserve">4.0.0.5</w:t>
+        </w:r>
+      </w:hyperlink>
+      <w:r>
+        <w:rPr>
+          <w:rFonts w:ascii="Times New Roman" w:hAnsi="Times New Roman"/>
+        </w:rPr>
+        <w:t xml:space="preserve">, the 189 inputs of</w:t>
+      </w:r>
+      <w:r>
+        <w:rPr>
+          <w:rFonts w:ascii="Times New Roman" w:hAnsi="Times New Roman"/>
+        </w:rPr>
+        <w:t xml:space="preserve"> </w:t>
+      </w:r>
+      <w:r>
+        <w:rPr>
+          <w:rFonts w:ascii="Times New Roman" w:hAnsi="Times New Roman"/>
+        </w:rPr>
+        <w:t xml:space="preserve">the four datasets, a fixed layout). The published T1 and T2 of the chosen qubits and the circuit duration gave a decay</w:t>
+      </w:r>
+      <w:r>
+        <w:rPr>
+          <w:rFonts w:ascii="Times New Roman" w:hAnsi="Times New Roman"/>
+        </w:rPr>
+        <w:t xml:space="preserve"> </w:t>
+      </w:r>
+      <w:r>
+        <w:rPr>
+          <w:rFonts w:ascii="Times New Roman" w:hAnsi="Times New Roman"/>
+        </w:rPr>
+        <w:t xml:space="preserve">of 0.002–0.017 and a dephasing of 0.001–0.005 per sublayer. Trained noiselessly, the model gave 0.958 raw and</w:t>
+      </w:r>
+      <w:r>
+        <w:rPr>
+          <w:rFonts w:ascii="Times New Roman" w:hAnsi="Times New Roman"/>
+        </w:rPr>
+        <w:t xml:space="preserve"> </w:t>
+      </w:r>
+      <w:r>
+        <w:rPr>
+          <w:rFonts w:ascii="Times New Roman" w:hAnsi="Times New Roman"/>
+        </w:rPr>
+        <w:t xml:space="preserve">0.972 with the filter (with or without the echo), against 0.979 noiseless; trained with the filter under that</w:t>
+      </w:r>
+      <w:r>
+        <w:rPr>
+          <w:rFonts w:ascii="Times New Roman" w:hAnsi="Times New Roman"/>
+        </w:rPr>
+        <w:t xml:space="preserve"> </w:t>
+      </w:r>
+      <w:r>
+        <w:rPr>
+          <w:rFonts w:ascii="Times New Roman" w:hAnsi="Times New Roman"/>
+        </w:rPr>
+        <w:t xml:space="preserve">calibration it gave 0.968, and trained without the filter under it 0.968. Gate errors, which a T1/T2 calibration</w:t>
+      </w:r>
+      <w:r>
+        <w:rPr>
+          <w:rFonts w:ascii="Times New Roman" w:hAnsi="Times New Roman"/>
+        </w:rPr>
+        <w:t xml:space="preserve"> </w:t>
+      </w:r>
+      <w:r>
+        <w:rPr>
+          <w:rFonts w:ascii="Times New Roman" w:hAnsi="Times New Roman"/>
+        </w:rPr>
+        <w:t xml:space="preserve">does not describe, dominate these noise models; the echo cut the decision error but changed no decision.</w:t>
       </w:r>
     </w:p>
     <w:bookmarkStart w:id="42" w:name="tab:beyond"/>
@@ -21383,6 +21965,122 @@
           </w:p>
         </w:tc>
       </w:tr>
+      <w:tr>
+        <w:tc>
+          <w:tcPr/>
+          <w:p>
+            <w:pPr>
+              <w:pStyle w:val="Compact"/>
+              <w:jc w:val="left"/>
+            </w:pPr>
+            <w:r>
+              <w:t xml:space="preserve">IBM noise (189)</w:t>
+            </w:r>
+          </w:p>
+        </w:tc>
+        <w:tc>
+          <w:tcPr/>
+          <w:p>
+            <w:pPr>
+              <w:pStyle w:val="Compact"/>
+              <w:jc w:val="left"/>
+            </w:pPr>
+            <w:r>
+              <w:t xml:space="preserve">weight 1, clean training</w:t>
+            </w:r>
+          </w:p>
+        </w:tc>
+        <w:tc>
+          <w:tcPr/>
+          <w:p>
+            <w:pPr>
+              <w:pStyle w:val="Compact"/>
+              <w:jc w:val="center"/>
+            </w:pPr>
+            <w:r>
+              <w:t xml:space="preserve">0.979</w:t>
+            </w:r>
+          </w:p>
+        </w:tc>
+        <w:tc>
+          <w:tcPr/>
+          <w:p>
+            <w:pPr>
+              <w:pStyle w:val="Compact"/>
+              <w:jc w:val="center"/>
+            </w:pPr>
+            <w:r>
+              <w:t xml:space="preserve">0.972</w:t>
+            </w:r>
+          </w:p>
+        </w:tc>
+        <w:tc>
+          <w:tcPr/>
+          <w:p>
+            <w:pPr>
+              <w:pStyle w:val="Compact"/>
+              <w:jc w:val="center"/>
+            </w:pPr>
+            <w:r>
+              <w:t xml:space="preserve">0.958</w:t>
+            </w:r>
+          </w:p>
+        </w:tc>
+      </w:tr>
+      <w:tr>
+        <w:tc>
+          <w:tcPr/>
+          <w:p>
+            <w:pPr>
+              <w:pStyle w:val="Compact"/>
+            </w:pPr>
+          </w:p>
+        </w:tc>
+        <w:tc>
+          <w:tcPr/>
+          <w:p>
+            <w:pPr>
+              <w:pStyle w:val="Compact"/>
+              <w:jc w:val="left"/>
+            </w:pPr>
+            <w:r>
+              <w:t xml:space="preserve">T1/T2-calibrated training</w:t>
+            </w:r>
+          </w:p>
+        </w:tc>
+        <w:tc>
+          <w:tcPr/>
+          <w:p>
+            <w:pPr>
+              <w:pStyle w:val="Compact"/>
+            </w:pPr>
+          </w:p>
+        </w:tc>
+        <w:tc>
+          <w:tcPr/>
+          <w:p>
+            <w:pPr>
+              <w:pStyle w:val="Compact"/>
+              <w:jc w:val="center"/>
+            </w:pPr>
+            <w:r>
+              <w:t xml:space="preserve">0.968</w:t>
+            </w:r>
+          </w:p>
+        </w:tc>
+        <w:tc>
+          <w:tcPr/>
+          <w:p>
+            <w:pPr>
+              <w:pStyle w:val="Compact"/>
+              <w:jc w:val="center"/>
+            </w:pPr>
+            <w:r>
+              <w:t xml:space="preserve">0.968</w:t>
+            </w:r>
+          </w:p>
+        </w:tc>
+      </w:tr>
     </w:tbl>
     <w:bookmarkEnd w:id="42"/>
     <w:bookmarkEnd w:id="43"/>
@@ -21579,7 +22277,19 @@
         <w:rPr>
           <w:rFonts w:ascii="Times New Roman" w:hAnsi="Times New Roman"/>
         </w:rPr>
-        <w:t xml:space="preserve">useful together. Two practical rules follow from the studies above. Up</w:t>
+        <w:t xml:space="preserve">useful together where decay or dephasing is strong; on device noise models dominated by gate errors, a calibration</w:t>
+      </w:r>
+      <w:r>
+        <w:rPr>
+          <w:rFonts w:ascii="Times New Roman" w:hAnsi="Times New Roman"/>
+        </w:rPr>
+        <w:t xml:space="preserve"> </w:t>
+      </w:r>
+      <w:r>
+        <w:rPr>
+          <w:rFonts w:ascii="Times New Roman" w:hAnsi="Times New Roman"/>
+        </w:rPr>
+        <w:t xml:space="preserve">from the published T1 and T2 added nothing, and noiseless training plus the filter was the best pipeline. Two practical rules follow from the studies above. Up</w:t>
       </w:r>
       <w:r>
         <w:rPr>
@@ -22321,7 +23031,7 @@
         <w:rPr>
           <w:rFonts w:ascii="Times New Roman" w:hAnsi="Times New Roman"/>
         </w:rPr>
-        <w:t xml:space="preserve">and RESEARCH_NOTES §75–§82, §85, §87, §90, §91 and §94–§101, §104–§118, with tests in</w:t>
+        <w:t xml:space="preserve">and RESEARCH_NOTES §75–§82, §85, §87, §90, §91 and §94–§101, §104–§119, with tests in</w:t>
       </w:r>
       <w:r>
         <w:rPr>

</xml_diff>

<commit_message>
QML note (EN/ES, PDF and Word) with sections 120-122: device calibration, F7 and the seed spread, dephasing at 8 qubits
</commit_message>
<xml_diff>
--- a/manuscript/qang_qml.docx
+++ b/manuscript/qang_qml.docx
@@ -5048,7 +5048,691 @@
         <w:rPr>
           <w:rFonts w:ascii="Times New Roman" w:hAnsi="Times New Roman"/>
         </w:rPr>
-        <w:t xml:space="preserve">0.979).</w:t>
+        <w:t xml:space="preserve">0.979),</w:t>
+      </w:r>
+      <w:r>
+        <w:rPr>
+          <w:rFonts w:ascii="Times New Roman" w:hAnsi="Times New Roman"/>
+        </w:rPr>
+        <w:t xml:space="preserve"> </w:t>
+      </w:r>
+      <w:r>
+        <w:rPr>
+          <w:rFonts w:ascii="Times New Roman" w:hAnsi="Times New Roman"/>
+        </w:rPr>
+        <w:t xml:space="preserve">and</w:t>
+      </w:r>
+      <w:r>
+        <w:rPr>
+          <w:rFonts w:ascii="Times New Roman" w:hAnsi="Times New Roman"/>
+        </w:rPr>
+        <w:t xml:space="preserve"> </w:t>
+      </w:r>
+      <w:r>
+        <w:rPr>
+          <w:rFonts w:ascii="Times New Roman" w:hAnsi="Times New Roman"/>
+        </w:rPr>
+        <w:t xml:space="preserve">a</w:t>
+      </w:r>
+      <w:r>
+        <w:rPr>
+          <w:rFonts w:ascii="Times New Roman" w:hAnsi="Times New Roman"/>
+        </w:rPr>
+        <w:t xml:space="preserve"> </w:t>
+      </w:r>
+      <w:r>
+        <w:rPr>
+          <w:rFonts w:ascii="Times New Roman" w:hAnsi="Times New Roman"/>
+        </w:rPr>
+        <w:t xml:space="preserve">calibration</w:t>
+      </w:r>
+      <w:r>
+        <w:rPr>
+          <w:rFonts w:ascii="Times New Roman" w:hAnsi="Times New Roman"/>
+        </w:rPr>
+        <w:t xml:space="preserve"> </w:t>
+      </w:r>
+      <w:r>
+        <w:rPr>
+          <w:rFonts w:ascii="Times New Roman" w:hAnsi="Times New Roman"/>
+        </w:rPr>
+        <w:t xml:space="preserve">measured</w:t>
+      </w:r>
+      <w:r>
+        <w:rPr>
+          <w:rFonts w:ascii="Times New Roman" w:hAnsi="Times New Roman"/>
+        </w:rPr>
+        <w:t xml:space="preserve"> </w:t>
+      </w:r>
+      <w:r>
+        <w:rPr>
+          <w:rFonts w:ascii="Times New Roman" w:hAnsi="Times New Roman"/>
+        </w:rPr>
+        <w:t xml:space="preserve">on</w:t>
+      </w:r>
+      <w:r>
+        <w:rPr>
+          <w:rFonts w:ascii="Times New Roman" w:hAnsi="Times New Roman"/>
+        </w:rPr>
+        <w:t xml:space="preserve"> </w:t>
+      </w:r>
+      <w:r>
+        <w:rPr>
+          <w:rFonts w:ascii="Times New Roman" w:hAnsi="Times New Roman"/>
+        </w:rPr>
+        <w:t xml:space="preserve">the</w:t>
+      </w:r>
+      <w:r>
+        <w:rPr>
+          <w:rFonts w:ascii="Times New Roman" w:hAnsi="Times New Roman"/>
+        </w:rPr>
+        <w:t xml:space="preserve"> </w:t>
+      </w:r>
+      <w:r>
+        <w:rPr>
+          <w:rFonts w:ascii="Times New Roman" w:hAnsi="Times New Roman"/>
+        </w:rPr>
+        <w:t xml:space="preserve">device</w:t>
+      </w:r>
+      <w:r>
+        <w:rPr>
+          <w:rFonts w:ascii="Times New Roman" w:hAnsi="Times New Roman"/>
+        </w:rPr>
+        <w:t xml:space="preserve"> </w:t>
+      </w:r>
+      <w:r>
+        <w:rPr>
+          <w:rFonts w:ascii="Times New Roman" w:hAnsi="Times New Roman"/>
+        </w:rPr>
+        <w:t xml:space="preserve">itself</w:t>
+      </w:r>
+      <w:r>
+        <w:rPr>
+          <w:rFonts w:ascii="Times New Roman" w:hAnsi="Times New Roman"/>
+        </w:rPr>
+        <w:t xml:space="preserve"> </w:t>
+      </w:r>
+      <w:r>
+        <w:rPr>
+          <w:rFonts w:ascii="Times New Roman" w:hAnsi="Times New Roman"/>
+        </w:rPr>
+        <w:t xml:space="preserve">(echo-aware</w:t>
+      </w:r>
+      <w:r>
+        <w:rPr>
+          <w:rFonts w:ascii="Times New Roman" w:hAnsi="Times New Roman"/>
+        </w:rPr>
+        <w:t xml:space="preserve"> </w:t>
+      </w:r>
+      <w:r>
+        <w:rPr>
+          <w:rFonts w:ascii="Times New Roman" w:hAnsi="Times New Roman"/>
+        </w:rPr>
+        <w:t xml:space="preserve">training,</w:t>
+      </w:r>
+      <w:r>
+        <w:rPr>
+          <w:rFonts w:ascii="Times New Roman" w:hAnsi="Times New Roman"/>
+        </w:rPr>
+        <w:t xml:space="preserve"> </w:t>
+      </w:r>
+      <w:r>
+        <w:rPr>
+          <w:rFonts w:ascii="Times New Roman" w:hAnsi="Times New Roman"/>
+        </w:rPr>
+        <w:t xml:space="preserve">or</w:t>
+      </w:r>
+      <w:r>
+        <w:rPr>
+          <w:rFonts w:ascii="Times New Roman" w:hAnsi="Times New Roman"/>
+        </w:rPr>
+        <w:t xml:space="preserve"> </w:t>
+      </w:r>
+      <w:r>
+        <w:rPr>
+          <w:rFonts w:ascii="Times New Roman" w:hAnsi="Times New Roman"/>
+        </w:rPr>
+        <w:t xml:space="preserve">a</w:t>
+      </w:r>
+      <w:r>
+        <w:rPr>
+          <w:rFonts w:ascii="Times New Roman" w:hAnsi="Times New Roman"/>
+        </w:rPr>
+        <w:t xml:space="preserve"> </w:t>
+      </w:r>
+      <w:r>
+        <w:rPr>
+          <w:rFonts w:ascii="Times New Roman" w:hAnsi="Times New Roman"/>
+        </w:rPr>
+        <w:t xml:space="preserve">readout</w:t>
+      </w:r>
+      <w:r>
+        <w:rPr>
+          <w:rFonts w:ascii="Times New Roman" w:hAnsi="Times New Roman"/>
+        </w:rPr>
+        <w:t xml:space="preserve"> </w:t>
+      </w:r>
+      <w:r>
+        <w:rPr>
+          <w:rFonts w:ascii="Times New Roman" w:hAnsi="Times New Roman"/>
+        </w:rPr>
+        <w:t xml:space="preserve">refit</w:t>
+      </w:r>
+      <w:r>
+        <w:rPr>
+          <w:rFonts w:ascii="Times New Roman" w:hAnsi="Times New Roman"/>
+        </w:rPr>
+        <w:t xml:space="preserve"> </w:t>
+      </w:r>
+      <w:r>
+        <w:rPr>
+          <w:rFonts w:ascii="Times New Roman" w:hAnsi="Times New Roman"/>
+        </w:rPr>
+        <w:t xml:space="preserve">on</w:t>
+      </w:r>
+      <w:r>
+        <w:rPr>
+          <w:rFonts w:ascii="Times New Roman" w:hAnsi="Times New Roman"/>
+        </w:rPr>
+        <w:t xml:space="preserve"> </w:t>
+      </w:r>
+      <w:r>
+        <w:rPr>
+          <w:rFonts w:ascii="Times New Roman" w:hAnsi="Times New Roman"/>
+        </w:rPr>
+        <w:t xml:space="preserve">device</w:t>
+      </w:r>
+      <w:r>
+        <w:rPr>
+          <w:rFonts w:ascii="Times New Roman" w:hAnsi="Times New Roman"/>
+        </w:rPr>
+        <w:t xml:space="preserve"> </w:t>
+      </w:r>
+      <w:r>
+        <w:rPr>
+          <w:rFonts w:ascii="Times New Roman" w:hAnsi="Times New Roman"/>
+        </w:rPr>
+        <w:t xml:space="preserve">data)</w:t>
+      </w:r>
+      <w:r>
+        <w:rPr>
+          <w:rFonts w:ascii="Times New Roman" w:hAnsi="Times New Roman"/>
+        </w:rPr>
+        <w:t xml:space="preserve"> </w:t>
+      </w:r>
+      <w:r>
+        <w:rPr>
+          <w:rFonts w:ascii="Times New Roman" w:hAnsi="Times New Roman"/>
+        </w:rPr>
+        <w:t xml:space="preserve">did</w:t>
+      </w:r>
+      <w:r>
+        <w:rPr>
+          <w:rFonts w:ascii="Times New Roman" w:hAnsi="Times New Roman"/>
+        </w:rPr>
+        <w:t xml:space="preserve"> </w:t>
+      </w:r>
+      <w:r>
+        <w:rPr>
+          <w:rFonts w:ascii="Times New Roman" w:hAnsi="Times New Roman"/>
+        </w:rPr>
+        <w:t xml:space="preserve">no</w:t>
+      </w:r>
+      <w:r>
+        <w:rPr>
+          <w:rFonts w:ascii="Times New Roman" w:hAnsi="Times New Roman"/>
+        </w:rPr>
+        <w:t xml:space="preserve"> </w:t>
+      </w:r>
+      <w:r>
+        <w:rPr>
+          <w:rFonts w:ascii="Times New Roman" w:hAnsi="Times New Roman"/>
+        </w:rPr>
+        <w:t xml:space="preserve">better.</w:t>
+      </w:r>
+      <w:r>
+        <w:rPr>
+          <w:rFonts w:ascii="Times New Roman" w:hAnsi="Times New Roman"/>
+        </w:rPr>
+        <w:t xml:space="preserve"> </w:t>
+      </w:r>
+      <w:r>
+        <w:rPr>
+          <w:rFonts w:ascii="Times New Roman" w:hAnsi="Times New Roman"/>
+        </w:rPr>
+        <w:t xml:space="preserve">Without</w:t>
+      </w:r>
+      <w:r>
+        <w:rPr>
+          <w:rFonts w:ascii="Times New Roman" w:hAnsi="Times New Roman"/>
+        </w:rPr>
+        <w:t xml:space="preserve"> </w:t>
+      </w:r>
+      <w:r>
+        <w:rPr>
+          <w:rFonts w:ascii="Times New Roman" w:hAnsi="Times New Roman"/>
+        </w:rPr>
+        <w:t xml:space="preserve">the</w:t>
+      </w:r>
+      <w:r>
+        <w:rPr>
+          <w:rFonts w:ascii="Times New Roman" w:hAnsi="Times New Roman"/>
+        </w:rPr>
+        <w:t xml:space="preserve"> </w:t>
+      </w:r>
+      <w:r>
+        <w:rPr>
+          <w:rFonts w:ascii="Times New Roman" w:hAnsi="Times New Roman"/>
+        </w:rPr>
+        <w:t xml:space="preserve">filter,</w:t>
+      </w:r>
+      <w:r>
+        <w:rPr>
+          <w:rFonts w:ascii="Times New Roman" w:hAnsi="Times New Roman"/>
+        </w:rPr>
+        <w:t xml:space="preserve"> </w:t>
+      </w:r>
+      <w:r>
+        <w:rPr>
+          <w:rFonts w:ascii="Times New Roman" w:hAnsi="Times New Roman"/>
+        </w:rPr>
+        <w:t xml:space="preserve">the</w:t>
+      </w:r>
+      <w:r>
+        <w:rPr>
+          <w:rFonts w:ascii="Times New Roman" w:hAnsi="Times New Roman"/>
+        </w:rPr>
+        <w:t xml:space="preserve"> </w:t>
+      </w:r>
+      <w:r>
+        <w:rPr>
+          <w:rFonts w:ascii="Times New Roman" w:hAnsi="Times New Roman"/>
+        </w:rPr>
+        <w:t xml:space="preserve">raw</w:t>
+      </w:r>
+      <w:r>
+        <w:rPr>
+          <w:rFonts w:ascii="Times New Roman" w:hAnsi="Times New Roman"/>
+        </w:rPr>
+        <w:t xml:space="preserve"> </w:t>
+      </w:r>
+      <w:r>
+        <w:rPr>
+          <w:rFonts w:ascii="Times New Roman" w:hAnsi="Times New Roman"/>
+        </w:rPr>
+        <w:t xml:space="preserve">multiclass</w:t>
+      </w:r>
+      <w:r>
+        <w:rPr>
+          <w:rFonts w:ascii="Times New Roman" w:hAnsi="Times New Roman"/>
+        </w:rPr>
+        <w:t xml:space="preserve"> </w:t>
+      </w:r>
+      <w:r>
+        <w:rPr>
+          <w:rFonts w:ascii="Times New Roman" w:hAnsi="Times New Roman"/>
+        </w:rPr>
+        <w:t xml:space="preserve">logits</w:t>
+      </w:r>
+      <w:r>
+        <w:rPr>
+          <w:rFonts w:ascii="Times New Roman" w:hAnsi="Times New Roman"/>
+        </w:rPr>
+        <w:t xml:space="preserve"> </w:t>
+      </w:r>
+      <w:r>
+        <w:rPr>
+          <w:rFonts w:ascii="Times New Roman" w:hAnsi="Times New Roman"/>
+        </w:rPr>
+        <w:t xml:space="preserve">are</w:t>
+      </w:r>
+      <w:r>
+        <w:rPr>
+          <w:rFonts w:ascii="Times New Roman" w:hAnsi="Times New Roman"/>
+        </w:rPr>
+        <w:t xml:space="preserve"> </w:t>
+      </w:r>
+      <w:r>
+        <w:rPr>
+          <w:rFonts w:ascii="Times New Roman" w:hAnsi="Times New Roman"/>
+        </w:rPr>
+        <w:t xml:space="preserve">exactly</w:t>
+      </w:r>
+      <w:r>
+        <w:rPr>
+          <w:rFonts w:ascii="Times New Roman" w:hAnsi="Times New Roman"/>
+        </w:rPr>
+        <w:t xml:space="preserve"> </w:t>
+      </w:r>
+      <w:r>
+        <w:rPr>
+          <w:rFonts w:ascii="Times New Roman" w:hAnsi="Times New Roman"/>
+        </w:rPr>
+        <w:t xml:space="preserve">a</w:t>
+      </w:r>
+      <w:r>
+        <w:rPr>
+          <w:rFonts w:ascii="Times New Roman" w:hAnsi="Times New Roman"/>
+        </w:rPr>
+        <w:t xml:space="preserve"> </w:t>
+      </w:r>
+      <w:r>
+        <w:rPr>
+          <w:rFonts w:ascii="Times New Roman" w:hAnsi="Times New Roman"/>
+        </w:rPr>
+        <w:t xml:space="preserve">blend</w:t>
+      </w:r>
+      <w:r>
+        <w:rPr>
+          <w:rFonts w:ascii="Times New Roman" w:hAnsi="Times New Roman"/>
+        </w:rPr>
+        <w:t xml:space="preserve"> </w:t>
+      </w:r>
+      <w:r>
+        <w:rPr>
+          <w:rFonts w:ascii="Times New Roman" w:hAnsi="Times New Roman"/>
+        </w:rPr>
+        <w:t xml:space="preserve">of</w:t>
+      </w:r>
+      <w:r>
+        <w:rPr>
+          <w:rFonts w:ascii="Times New Roman" w:hAnsi="Times New Roman"/>
+        </w:rPr>
+        <w:t xml:space="preserve"> </w:t>
+      </w:r>
+      <w:r>
+        <w:rPr>
+          <w:rFonts w:ascii="Times New Roman" w:hAnsi="Times New Roman"/>
+        </w:rPr>
+        <w:t xml:space="preserve">the</w:t>
+      </w:r>
+      <w:r>
+        <w:rPr>
+          <w:rFonts w:ascii="Times New Roman" w:hAnsi="Times New Roman"/>
+        </w:rPr>
+        <w:t xml:space="preserve"> </w:t>
+      </w:r>
+      <w:r>
+        <w:rPr>
+          <w:rFonts w:ascii="Times New Roman" w:hAnsi="Times New Roman"/>
+        </w:rPr>
+        <w:t xml:space="preserve">noiseless</w:t>
+      </w:r>
+      <w:r>
+        <w:rPr>
+          <w:rFonts w:ascii="Times New Roman" w:hAnsi="Times New Roman"/>
+        </w:rPr>
+        <w:t xml:space="preserve"> </w:t>
+      </w:r>
+      <w:r>
+        <w:rPr>
+          <w:rFonts w:ascii="Times New Roman" w:hAnsi="Times New Roman"/>
+        </w:rPr>
+        <w:t xml:space="preserve">logits</w:t>
+      </w:r>
+      <w:r>
+        <w:rPr>
+          <w:rFonts w:ascii="Times New Roman" w:hAnsi="Times New Roman"/>
+        </w:rPr>
+        <w:t xml:space="preserve"> </w:t>
+      </w:r>
+      <w:r>
+        <w:rPr>
+          <w:rFonts w:ascii="Times New Roman" w:hAnsi="Times New Roman"/>
+        </w:rPr>
+        <w:t xml:space="preserve">with</w:t>
+      </w:r>
+      <w:r>
+        <w:rPr>
+          <w:rFonts w:ascii="Times New Roman" w:hAnsi="Times New Roman"/>
+        </w:rPr>
+        <w:t xml:space="preserve"> </w:t>
+      </w:r>
+      <w:r>
+        <w:rPr>
+          <w:rFonts w:ascii="Times New Roman" w:hAnsi="Times New Roman"/>
+        </w:rPr>
+        <w:t xml:space="preserve">a</w:t>
+      </w:r>
+      <w:r>
+        <w:rPr>
+          <w:rFonts w:ascii="Times New Roman" w:hAnsi="Times New Roman"/>
+        </w:rPr>
+        <w:t xml:space="preserve"> </w:t>
+      </w:r>
+      <w:r>
+        <w:rPr>
+          <w:rFonts w:ascii="Times New Roman" w:hAnsi="Times New Roman"/>
+        </w:rPr>
+        <w:t xml:space="preserve">constant</w:t>
+      </w:r>
+      <w:r>
+        <w:rPr>
+          <w:rFonts w:ascii="Times New Roman" w:hAnsi="Times New Roman"/>
+        </w:rPr>
+        <w:t xml:space="preserve"> </w:t>
+      </w:r>
+      <w:r>
+        <w:rPr>
+          <w:rFonts w:ascii="Times New Roman" w:hAnsi="Times New Roman"/>
+        </w:rPr>
+        <w:t xml:space="preserve">vector</w:t>
+      </w:r>
+      <w:r>
+        <w:rPr>
+          <w:rFonts w:ascii="Times New Roman" w:hAnsi="Times New Roman"/>
+        </w:rPr>
+        <w:t xml:space="preserve"> </w:t>
+      </w:r>
+      <w:r>
+        <w:rPr>
+          <w:rFonts w:ascii="Times New Roman" w:hAnsi="Times New Roman"/>
+        </w:rPr>
+        <w:t xml:space="preserve">fixed</w:t>
+      </w:r>
+      <w:r>
+        <w:rPr>
+          <w:rFonts w:ascii="Times New Roman" w:hAnsi="Times New Roman"/>
+        </w:rPr>
+        <w:t xml:space="preserve"> </w:t>
+      </w:r>
+      <w:r>
+        <w:rPr>
+          <w:rFonts w:ascii="Times New Roman" w:hAnsi="Times New Roman"/>
+        </w:rPr>
+        <w:t xml:space="preserve">by</w:t>
+      </w:r>
+      <w:r>
+        <w:rPr>
+          <w:rFonts w:ascii="Times New Roman" w:hAnsi="Times New Roman"/>
+        </w:rPr>
+        <w:t xml:space="preserve"> </w:t>
+      </w:r>
+      <w:r>
+        <w:rPr>
+          <w:rFonts w:ascii="Times New Roman" w:hAnsi="Times New Roman"/>
+        </w:rPr>
+        <w:t xml:space="preserve">training,</w:t>
+      </w:r>
+      <w:r>
+        <w:rPr>
+          <w:rFonts w:ascii="Times New Roman" w:hAnsi="Times New Roman"/>
+        </w:rPr>
+        <w:t xml:space="preserve"> </w:t>
+      </w:r>
+      <w:r>
+        <w:rPr>
+          <w:rFonts w:ascii="Times New Roman" w:hAnsi="Times New Roman"/>
+        </w:rPr>
+        <w:t xml:space="preserve">which</w:t>
+      </w:r>
+      <w:r>
+        <w:rPr>
+          <w:rFonts w:ascii="Times New Roman" w:hAnsi="Times New Roman"/>
+        </w:rPr>
+        <w:t xml:space="preserve"> </w:t>
+      </w:r>
+      <w:r>
+        <w:rPr>
+          <w:rFonts w:ascii="Times New Roman" w:hAnsi="Times New Roman"/>
+        </w:rPr>
+        <w:t xml:space="preserve">explains</w:t>
+      </w:r>
+      <w:r>
+        <w:rPr>
+          <w:rFonts w:ascii="Times New Roman" w:hAnsi="Times New Roman"/>
+        </w:rPr>
+        <w:t xml:space="preserve"> </w:t>
+      </w:r>
+      <w:r>
+        <w:rPr>
+          <w:rFonts w:ascii="Times New Roman" w:hAnsi="Times New Roman"/>
+        </w:rPr>
+        <w:t xml:space="preserve">why</w:t>
+      </w:r>
+      <w:r>
+        <w:rPr>
+          <w:rFonts w:ascii="Times New Roman" w:hAnsi="Times New Roman"/>
+        </w:rPr>
+        <w:t xml:space="preserve"> </w:t>
+      </w:r>
+      <w:r>
+        <w:rPr>
+          <w:rFonts w:ascii="Times New Roman" w:hAnsi="Times New Roman"/>
+        </w:rPr>
+        <w:t xml:space="preserve">the</w:t>
+      </w:r>
+      <w:r>
+        <w:rPr>
+          <w:rFonts w:ascii="Times New Roman" w:hAnsi="Times New Roman"/>
+        </w:rPr>
+        <w:t xml:space="preserve"> </w:t>
+      </w:r>
+      <w:r>
+        <w:rPr>
+          <w:rFonts w:ascii="Times New Roman" w:hAnsi="Times New Roman"/>
+        </w:rPr>
+        <w:t xml:space="preserve">loss</w:t>
+      </w:r>
+      <w:r>
+        <w:rPr>
+          <w:rFonts w:ascii="Times New Roman" w:hAnsi="Times New Roman"/>
+        </w:rPr>
+        <w:t xml:space="preserve"> </w:t>
+      </w:r>
+      <w:r>
+        <w:rPr>
+          <w:rFonts w:ascii="Times New Roman" w:hAnsi="Times New Roman"/>
+        </w:rPr>
+        <w:t xml:space="preserve">without</w:t>
+      </w:r>
+      <w:r>
+        <w:rPr>
+          <w:rFonts w:ascii="Times New Roman" w:hAnsi="Times New Roman"/>
+        </w:rPr>
+        <w:t xml:space="preserve"> </w:t>
+      </w:r>
+      <w:r>
+        <w:rPr>
+          <w:rFonts w:ascii="Times New Roman" w:hAnsi="Times New Roman"/>
+        </w:rPr>
+        <w:t xml:space="preserve">qang</w:t>
+      </w:r>
+      <w:r>
+        <w:rPr>
+          <w:rFonts w:ascii="Times New Roman" w:hAnsi="Times New Roman"/>
+        </w:rPr>
+        <w:t xml:space="preserve"> </w:t>
+      </w:r>
+      <w:r>
+        <w:rPr>
+          <w:rFonts w:ascii="Times New Roman" w:hAnsi="Times New Roman"/>
+        </w:rPr>
+        <w:t xml:space="preserve">ranged</w:t>
+      </w:r>
+      <w:r>
+        <w:rPr>
+          <w:rFonts w:ascii="Times New Roman" w:hAnsi="Times New Roman"/>
+        </w:rPr>
+        <w:t xml:space="preserve"> </w:t>
+      </w:r>
+      <w:r>
+        <w:rPr>
+          <w:rFonts w:ascii="Times New Roman" w:hAnsi="Times New Roman"/>
+        </w:rPr>
+        <w:t xml:space="preserve">from</w:t>
+      </w:r>
+      <w:r>
+        <w:rPr>
+          <w:rFonts w:ascii="Times New Roman" w:hAnsi="Times New Roman"/>
+        </w:rPr>
+        <w:t xml:space="preserve"> </w:t>
+      </w:r>
+      <w:r>
+        <w:rPr>
+          <w:rFonts w:ascii="Times New Roman" w:hAnsi="Times New Roman"/>
+        </w:rPr>
+        <w:t xml:space="preserve">3</w:t>
+      </w:r>
+      <w:r>
+        <w:rPr>
+          <w:rFonts w:ascii="Times New Roman" w:hAnsi="Times New Roman"/>
+        </w:rPr>
+        <w:t xml:space="preserve"> </w:t>
+      </w:r>
+      <w:r>
+        <w:rPr>
+          <w:rFonts w:ascii="Times New Roman" w:hAnsi="Times New Roman"/>
+        </w:rPr>
+        <w:t xml:space="preserve">to</w:t>
+      </w:r>
+      <w:r>
+        <w:rPr>
+          <w:rFonts w:ascii="Times New Roman" w:hAnsi="Times New Roman"/>
+        </w:rPr>
+        <w:t xml:space="preserve"> </w:t>
+      </w:r>
+      <w:r>
+        <w:rPr>
+          <w:rFonts w:ascii="Times New Roman" w:hAnsi="Times New Roman"/>
+        </w:rPr>
+        <w:t xml:space="preserve">42</w:t>
+      </w:r>
+      <w:r>
+        <w:rPr>
+          <w:rFonts w:ascii="Times New Roman" w:hAnsi="Times New Roman"/>
+        </w:rPr>
+        <w:t xml:space="preserve"> </w:t>
+      </w:r>
+      <w:r>
+        <w:rPr>
+          <w:rFonts w:ascii="Times New Roman" w:hAnsi="Times New Roman"/>
+        </w:rPr>
+        <w:t xml:space="preserve">points</w:t>
+      </w:r>
+      <w:r>
+        <w:rPr>
+          <w:rFonts w:ascii="Times New Roman" w:hAnsi="Times New Roman"/>
+        </w:rPr>
+        <w:t xml:space="preserve"> </w:t>
+      </w:r>
+      <w:r>
+        <w:rPr>
+          <w:rFonts w:ascii="Times New Roman" w:hAnsi="Times New Roman"/>
+        </w:rPr>
+        <w:t xml:space="preserve">between</w:t>
+      </w:r>
+      <w:r>
+        <w:rPr>
+          <w:rFonts w:ascii="Times New Roman" w:hAnsi="Times New Roman"/>
+        </w:rPr>
+        <w:t xml:space="preserve"> </w:t>
+      </w:r>
+      <w:r>
+        <w:rPr>
+          <w:rFonts w:ascii="Times New Roman" w:hAnsi="Times New Roman"/>
+        </w:rPr>
+        <w:t xml:space="preserve">seeds.</w:t>
       </w:r>
       <w:r>
         <w:rPr>
@@ -10326,7 +11010,7 @@
         <w:rPr>
           <w:rFonts w:ascii="Times New Roman" w:hAnsi="Times New Roman"/>
         </w:rPr>
-        <w:t xml:space="preserve">predictions of every study were committed to the repository before the run that tested them. Of 147 pre-registered predictions in the studies summarized here, 101 passed and 46 failed; the failures are</w:t>
+        <w:t xml:space="preserve">predictions of every study were committed to the repository before the run that tested them. Of 162 pre-registered predictions in the studies summarized here, 110 passed and 52 failed; the failures are</w:t>
       </w:r>
       <w:r>
         <w:rPr>
@@ -10342,7 +11026,7 @@
       </w:r>
     </w:p>
     <w:bookmarkEnd w:id="20"/>
-    <w:bookmarkStart w:id="30" w:name="model-and-theory"/>
+    <w:bookmarkStart w:id="31" w:name="model-and-theory"/>
     <w:p>
       <w:pPr>
         <w:pStyle w:val="Heading1"/>
@@ -12525,7 +13209,410 @@
       </w:r>
     </w:p>
     <w:bookmarkEnd w:id="27"/>
-    <w:bookmarkStart w:id="28" w:name="multiclass-readout."/>
+    <w:bookmarkStart w:id="28" w:name="X24e22474afbb22966c7851a096c3b1a20253df1"/>
+    <w:p>
+      <w:pPr>
+        <w:pStyle w:val="Heading4"/>
+      </w:pPr>
+      <w:r>
+        <w:rPr>
+          <w:rFonts w:ascii="Times New Roman" w:hAnsi="Times New Roman"/>
+        </w:rPr>
+        <w:t xml:space="preserve">F7: the raw multiclass readout is a blend.</w:t>
+      </w:r>
+    </w:p>
+    <w:p>
+      <w:pPr>
+        <w:pStyle w:val="FirstParagraph"/>
+      </w:pPr>
+      <w:r>
+        <w:rPr>
+          <w:rFonts w:ascii="Times New Roman" w:hAnsi="Times New Roman"/>
+        </w:rPr>
+        <w:t xml:space="preserve">At weight 1 under equal T1 every decayed shot lands in</w:t>
+      </w:r>
+      <w:r>
+        <w:rPr>
+          <w:rFonts w:ascii="Times New Roman" w:hAnsi="Times New Roman"/>
+        </w:rPr>
+        <w:t xml:space="preserve"> </w:t>
+      </w:r>
+      <m:oMath>
+        <m:r>
+          <m:rPr>
+            <m:sty m:val="p"/>
+          </m:rPr>
+          <m:t>|</m:t>
+        </m:r>
+        <m:r>
+          <m:t>0</m:t>
+        </m:r>
+        <m:r>
+          <m:rPr>
+            <m:sty m:val="p"/>
+          </m:rPr>
+          <m:t>⋯</m:t>
+        </m:r>
+        <m:r>
+          <m:t>0</m:t>
+        </m:r>
+        <m:r>
+          <m:rPr>
+            <m:sty m:val="p"/>
+          </m:rPr>
+          <m:t>⟩</m:t>
+        </m:r>
+      </m:oMath>
+      <w:r>
+        <w:rPr>
+          <w:rFonts w:ascii="Times New Roman" w:hAnsi="Times New Roman"/>
+        </w:rPr>
+        <w:t xml:space="preserve">, where every</w:t>
+      </w:r>
+      <w:r>
+        <w:rPr>
+          <w:rFonts w:ascii="Times New Roman" w:hAnsi="Times New Roman"/>
+        </w:rPr>
+        <w:t xml:space="preserve"> </w:t>
+      </w:r>
+      <m:oMath>
+        <m:r>
+          <m:t>q</m:t>
+        </m:r>
+        <m:sSub>
+          <m:e>
+            <m:r>
+              <m:t>g</m:t>
+            </m:r>
+          </m:e>
+          <m:sub>
+            <m:r>
+              <m:t>Z</m:t>
+            </m:r>
+          </m:sub>
+        </m:sSub>
+        <m:r>
+          <m:rPr>
+            <m:sty m:val="p"/>
+          </m:rPr>
+          <m:t>=</m:t>
+        </m:r>
+        <m:r>
+          <m:rPr>
+            <m:sty m:val="p"/>
+          </m:rPr>
+          <m:t>+</m:t>
+        </m:r>
+        <m:r>
+          <m:t>1</m:t>
+        </m:r>
+      </m:oMath>
+      <w:r>
+        <w:rPr>
+          <w:rFonts w:ascii="Times New Roman" w:hAnsi="Times New Roman"/>
+        </w:rPr>
+        <w:t xml:space="preserve"> </w:t>
+      </w:r>
+      <w:r>
+        <w:rPr>
+          <w:rFonts w:ascii="Times New Roman" w:hAnsi="Times New Roman"/>
+        </w:rPr>
+        <w:t xml:space="preserve">(every</w:t>
+      </w:r>
+      <w:r>
+        <w:rPr>
+          <w:rFonts w:ascii="Times New Roman" w:hAnsi="Times New Roman"/>
+        </w:rPr>
+        <w:t xml:space="preserve"> </w:t>
+      </w:r>
+      <m:oMath>
+        <m:sSub>
+          <m:e>
+            <m:r>
+              <m:t>p</m:t>
+            </m:r>
+          </m:e>
+          <m:sub>
+            <m:r>
+              <m:t>c</m:t>
+            </m:r>
+          </m:sub>
+        </m:sSub>
+        <m:r>
+          <m:rPr>
+            <m:sty m:val="p"/>
+          </m:rPr>
+          <m:t>=</m:t>
+        </m:r>
+        <m:r>
+          <m:t>0</m:t>
+        </m:r>
+      </m:oMath>
+      <w:r>
+        <w:rPr>
+          <w:rFonts w:ascii="Times New Roman" w:hAnsi="Times New Roman"/>
+        </w:rPr>
+        <w:t xml:space="preserve">). The raw logits are therefore</w:t>
+      </w:r>
+      <w:r>
+        <w:rPr>
+          <w:rFonts w:ascii="Times New Roman" w:hAnsi="Times New Roman"/>
+        </w:rPr>
+        <w:t xml:space="preserve"> </w:t>
+      </w:r>
+      <m:oMath>
+        <m:r>
+          <m:t>K</m:t>
+        </m:r>
+        <m:sSub>
+          <m:e>
+            <m:r>
+              <m:t>L</m:t>
+            </m:r>
+          </m:e>
+          <m:sub>
+            <m:r>
+              <m:t>c</m:t>
+            </m:r>
+          </m:sub>
+        </m:sSub>
+        <m:r>
+          <m:rPr>
+            <m:sty m:val="p"/>
+          </m:rPr>
+          <m:t>+</m:t>
+        </m:r>
+        <m:d>
+          <m:dPr>
+            <m:begChr m:val="("/>
+            <m:endChr m:val=")"/>
+            <m:sepChr m:val=""/>
+            <m:grow/>
+          </m:dPr>
+          <m:e>
+            <m:r>
+              <m:t>1</m:t>
+            </m:r>
+            <m:r>
+              <m:rPr>
+                <m:sty m:val="p"/>
+              </m:rPr>
+              <m:t>−</m:t>
+            </m:r>
+            <m:r>
+              <m:t>K</m:t>
+            </m:r>
+          </m:e>
+        </m:d>
+        <m:sSub>
+          <m:e>
+            <m:r>
+              <m:t>v</m:t>
+            </m:r>
+          </m:e>
+          <m:sub>
+            <m:r>
+              <m:t>c</m:t>
+            </m:r>
+          </m:sub>
+        </m:sSub>
+      </m:oMath>
+      <w:r>
+        <w:rPr>
+          <w:rFonts w:ascii="Times New Roman" w:hAnsi="Times New Roman"/>
+        </w:rPr>
+        <w:t xml:space="preserve">, with</w:t>
+      </w:r>
+      <w:r>
+        <w:rPr>
+          <w:rFonts w:ascii="Times New Roman" w:hAnsi="Times New Roman"/>
+        </w:rPr>
+        <w:t xml:space="preserve"> </w:t>
+      </w:r>
+      <m:oMath>
+        <m:r>
+          <m:t>L</m:t>
+        </m:r>
+      </m:oMath>
+      <w:r>
+        <w:rPr>
+          <w:rFonts w:ascii="Times New Roman" w:hAnsi="Times New Roman"/>
+        </w:rPr>
+        <w:t xml:space="preserve"> </w:t>
+      </w:r>
+      <w:r>
+        <w:rPr>
+          <w:rFonts w:ascii="Times New Roman" w:hAnsi="Times New Roman"/>
+        </w:rPr>
+        <w:t xml:space="preserve">the</w:t>
+      </w:r>
+      <w:r>
+        <w:rPr>
+          <w:rFonts w:ascii="Times New Roman" w:hAnsi="Times New Roman"/>
+        </w:rPr>
+        <w:t xml:space="preserve"> </w:t>
+      </w:r>
+      <w:r>
+        <w:rPr>
+          <w:rFonts w:ascii="Times New Roman" w:hAnsi="Times New Roman"/>
+        </w:rPr>
+        <w:t xml:space="preserve">noiseless logits,</w:t>
+      </w:r>
+      <w:r>
+        <w:rPr>
+          <w:rFonts w:ascii="Times New Roman" w:hAnsi="Times New Roman"/>
+        </w:rPr>
+        <w:t xml:space="preserve"> </w:t>
+      </w:r>
+      <m:oMath>
+        <m:r>
+          <m:t>K</m:t>
+        </m:r>
+      </m:oMath>
+      <w:r>
+        <w:rPr>
+          <w:rFonts w:ascii="Times New Roman" w:hAnsi="Times New Roman"/>
+        </w:rPr>
+        <w:t xml:space="preserve"> </w:t>
+      </w:r>
+      <w:r>
+        <w:rPr>
+          <w:rFonts w:ascii="Times New Roman" w:hAnsi="Times New Roman"/>
+        </w:rPr>
+        <w:t xml:space="preserve">the kept fraction and</w:t>
+      </w:r>
+      <w:r>
+        <w:rPr>
+          <w:rFonts w:ascii="Times New Roman" w:hAnsi="Times New Roman"/>
+        </w:rPr>
+        <w:t xml:space="preserve"> </w:t>
+      </w:r>
+      <m:oMath>
+        <m:r>
+          <m:t>v</m:t>
+        </m:r>
+      </m:oMath>
+      <w:r>
+        <w:rPr>
+          <w:rFonts w:ascii="Times New Roman" w:hAnsi="Times New Roman"/>
+        </w:rPr>
+        <w:t xml:space="preserve"> </w:t>
+      </w:r>
+      <w:r>
+        <w:rPr>
+          <w:rFonts w:ascii="Times New Roman" w:hAnsi="Times New Roman"/>
+        </w:rPr>
+        <w:t xml:space="preserve">a constant vector set by training (</w:t>
+      </w:r>
+      <m:oMath>
+        <m:sSup>
+          <m:e>
+            <m:r>
+              <m:t>W</m:t>
+            </m:r>
+          </m:e>
+          <m:sup>
+            <m:r>
+              <m:rPr>
+                <m:sty m:val="p"/>
+                <m:scr m:val="sans-serif"/>
+              </m:rPr>
+              <m:t>T</m:t>
+            </m:r>
+          </m:sup>
+        </m:sSup>
+        <m:r>
+          <m:rPr>
+            <m:sty m:val="b"/>
+          </m:rPr>
+          <m:t>1</m:t>
+        </m:r>
+        <m:r>
+          <m:rPr>
+            <m:sty m:val="p"/>
+          </m:rPr>
+          <m:t>+</m:t>
+        </m:r>
+        <m:r>
+          <m:t>b</m:t>
+        </m:r>
+      </m:oMath>
+      <w:r>
+        <w:rPr>
+          <w:rFonts w:ascii="Times New Roman" w:hAnsi="Times New Roman"/>
+        </w:rPr>
+        <w:t xml:space="preserve"> </w:t>
+      </w:r>
+      <w:r>
+        <w:rPr>
+          <w:rFonts w:ascii="Times New Roman" w:hAnsi="Times New Roman"/>
+        </w:rPr>
+        <w:t xml:space="preserve">for the head</w:t>
+      </w:r>
+      <w:r>
+        <w:rPr>
+          <w:rFonts w:ascii="Times New Roman" w:hAnsi="Times New Roman"/>
+        </w:rPr>
+        <w:t xml:space="preserve"> </w:t>
+      </w:r>
+      <w:r>
+        <w:rPr>
+          <w:rFonts w:ascii="Times New Roman" w:hAnsi="Times New Roman"/>
+        </w:rPr>
+        <w:t xml:space="preserve">readout,</w:t>
+      </w:r>
+      <w:r>
+        <w:rPr>
+          <w:rFonts w:ascii="Times New Roman" w:hAnsi="Times New Roman"/>
+        </w:rPr>
+        <w:t xml:space="preserve"> </w:t>
+      </w:r>
+      <m:oMath>
+        <m:r>
+          <m:t>b</m:t>
+        </m:r>
+      </m:oMath>
+      <w:r>
+        <w:rPr>
+          <w:rFonts w:ascii="Times New Roman" w:hAnsi="Times New Roman"/>
+        </w:rPr>
+        <w:t xml:space="preserve"> </w:t>
+      </w:r>
+      <w:r>
+        <w:rPr>
+          <w:rFonts w:ascii="Times New Roman" w:hAnsi="Times New Roman"/>
+        </w:rPr>
+        <w:t xml:space="preserve">for the qubit readout): without the filter every input is pulled toward the class with the largest</w:t>
+      </w:r>
+      <w:r>
+        <w:rPr>
+          <w:rFonts w:ascii="Times New Roman" w:hAnsi="Times New Roman"/>
+        </w:rPr>
+        <w:t xml:space="preserve"> </w:t>
+      </w:r>
+      <m:oMath>
+        <m:sSub>
+          <m:e>
+            <m:r>
+              <m:t>v</m:t>
+            </m:r>
+          </m:e>
+          <m:sub>
+            <m:r>
+              <m:t>c</m:t>
+            </m:r>
+          </m:sub>
+        </m:sSub>
+      </m:oMath>
+      <w:r>
+        <w:rPr>
+          <w:rFonts w:ascii="Times New Roman" w:hAnsi="Times New Roman"/>
+        </w:rPr>
+        <w:t xml:space="preserve">.</w:t>
+      </w:r>
+    </w:p>
+    <w:bookmarkEnd w:id="28"/>
+    <w:bookmarkStart w:id="29" w:name="multiclass-readout."/>
     <w:p>
       <w:pPr>
         <w:pStyle w:val="Heading4"/>
@@ -13009,8 +14096,8 @@
         <w:t xml:space="preserve">here moves the excitation to another qubit, i.e. swaps one class for another.</w:t>
       </w:r>
     </w:p>
-    <w:bookmarkEnd w:id="28"/>
-    <w:bookmarkStart w:id="29" w:name="f2-simulability."/>
+    <w:bookmarkEnd w:id="29"/>
+    <w:bookmarkStart w:id="30" w:name="f2-simulability."/>
     <w:p>
       <w:pPr>
         <w:pStyle w:val="Heading4"/>
@@ -13292,9 +14379,9 @@
         <w:t xml:space="preserve">that this note does not address.</w:t>
       </w:r>
     </w:p>
-    <w:bookmarkEnd w:id="29"/>
     <w:bookmarkEnd w:id="30"/>
-    <w:bookmarkStart w:id="31" w:name="methods"/>
+    <w:bookmarkEnd w:id="31"/>
+    <w:bookmarkStart w:id="32" w:name="methods"/>
     <w:p>
       <w:pPr>
         <w:pStyle w:val="Heading1"/>
@@ -13583,8 +14670,8 @@
         <w:t xml:space="preserve">.</w:t>
       </w:r>
     </w:p>
-    <w:bookmarkEnd w:id="31"/>
-    <w:bookmarkStart w:id="44" w:name="results"/>
+    <w:bookmarkEnd w:id="32"/>
+    <w:bookmarkStart w:id="45" w:name="results"/>
     <w:p>
       <w:pPr>
         <w:pStyle w:val="Heading1"/>
@@ -13596,7 +14683,7 @@
         <w:t xml:space="preserve">Results</w:t>
       </w:r>
     </w:p>
-    <w:bookmarkStart w:id="32" w:name="single-seed-studies."/>
+    <w:bookmarkStart w:id="33" w:name="single-seed-studies."/>
     <w:p>
       <w:pPr>
         <w:pStyle w:val="Heading4"/>
@@ -14362,11 +15449,35 @@
         <w:rPr>
           <w:rFonts w:ascii="Times New Roman" w:hAnsi="Times New Roman"/>
         </w:rPr>
-        <w:t xml:space="preserve">from the published T1 and T2 would help on device noise models.</w:t>
+        <w:t xml:space="preserve">from the published T1 and T2 would help on device noise models; all five predictions that a calibration measured on</w:t>
+      </w:r>
+      <w:r>
+        <w:rPr>
+          <w:rFonts w:ascii="Times New Roman" w:hAnsi="Times New Roman"/>
+        </w:rPr>
+        <w:t xml:space="preserve"> </w:t>
+      </w:r>
+      <w:r>
+        <w:rPr>
+          <w:rFonts w:ascii="Times New Roman" w:hAnsi="Times New Roman"/>
+        </w:rPr>
+        <w:t xml:space="preserve">the device would; and a factor of at least 3 between the losses of the top and bottom thirds of the pull index</w:t>
+      </w:r>
+      <w:r>
+        <w:rPr>
+          <w:rFonts w:ascii="Times New Roman" w:hAnsi="Times New Roman"/>
+        </w:rPr>
+        <w:t xml:space="preserve"> </w:t>
+      </w:r>
+      <w:r>
+        <w:rPr>
+          <w:rFonts w:ascii="Times New Roman" w:hAnsi="Times New Roman"/>
+        </w:rPr>
+        <w:t xml:space="preserve">(2.5).</w:t>
       </w:r>
     </w:p>
-    <w:bookmarkEnd w:id="32"/>
-    <w:bookmarkStart w:id="37" w:name="replication-over-60-runs."/>
+    <w:bookmarkEnd w:id="33"/>
+    <w:bookmarkStart w:id="38" w:name="replication-over-60-runs."/>
     <w:p>
       <w:pPr>
         <w:pStyle w:val="Heading4"/>
@@ -14493,7 +15604,7 @@
         <w:t xml:space="preserve">pre-registered predictions of this replication passed.</w:t>
       </w:r>
     </w:p>
-    <w:bookmarkStart w:id="33" w:name="tab:main"/>
+    <w:bookmarkStart w:id="34" w:name="tab:main"/>
     <w:p>
       <w:pPr>
         <w:pStyle w:val="TableCaption"/>
@@ -14978,7 +16089,7 @@
         </w:tc>
       </w:tr>
     </w:tbl>
-    <w:bookmarkEnd w:id="33"/>
+    <w:bookmarkEnd w:id="34"/>
     <w:p>
       <w:pPr>
         <w:pStyle w:val="CaptionedFigure"/>
@@ -14992,18 +16103,18 @@
           <wp:inline>
             <wp:extent cx="4800600" cy="4073236"/>
             <wp:effectExtent b="0" l="0" r="0" t="0"/>
-            <wp:docPr descr="" title="" id="35" name="Picture"/>
+            <wp:docPr descr="" title="" id="36" name="Picture"/>
             <a:graphic>
               <a:graphicData uri="http://schemas.openxmlformats.org/drawingml/2006/picture">
                 <pic:pic>
                   <pic:nvPicPr>
-                    <pic:cNvPr descr="fig_qml.png" id="36" name="Picture"/>
+                    <pic:cNvPr descr="fig_qml.png" id="37" name="Picture"/>
                     <pic:cNvPicPr>
                       <a:picLocks noChangeArrowheads="1" noChangeAspect="1"/>
                     </pic:cNvPicPr>
                   </pic:nvPicPr>
                   <pic:blipFill>
-                    <a:blip r:embed="rId34"/>
+                    <a:blip r:embed="rId35"/>
                     <a:stretch>
                       <a:fillRect/>
                     </a:stretch>
@@ -15760,8 +16871,8 @@
         <w:t xml:space="preserve">points.</w:t>
       </w:r>
     </w:p>
-    <w:bookmarkEnd w:id="37"/>
-    <w:bookmarkStart w:id="38" w:name="sec:more"/>
+    <w:bookmarkEnd w:id="38"/>
+    <w:bookmarkStart w:id="39" w:name="sec:more"/>
     <w:p>
       <w:pPr>
         <w:pStyle w:val="Heading4"/>
@@ -17239,8 +18350,8 @@
         <w:t xml:space="preserve">mean.</w:t>
       </w:r>
     </w:p>
-    <w:bookmarkEnd w:id="38"/>
-    <w:bookmarkStart w:id="39" w:name="device-noise-models."/>
+    <w:bookmarkEnd w:id="39"/>
+    <w:bookmarkStart w:id="40" w:name="device-noise-models."/>
     <w:p>
       <w:pPr>
         <w:pStyle w:val="Heading4"/>
@@ -17550,8 +18661,8 @@
         <w:t xml:space="preserve">hardware runs are prepared, with cost confirmations, and pending.</w:t>
       </w:r>
     </w:p>
-    <w:bookmarkEnd w:id="39"/>
-    <w:bookmarkStart w:id="40" w:name="sec:echo"/>
+    <w:bookmarkEnd w:id="40"/>
+    <w:bookmarkStart w:id="41" w:name="sec:echo"/>
     <w:p>
       <w:pPr>
         <w:pStyle w:val="Heading4"/>
@@ -18210,8 +19321,8 @@
         <w:t xml:space="preserve">echo was 3.4–4.1 times below raw; all five predictions passed.</w:t>
       </w:r>
     </w:p>
-    <w:bookmarkEnd w:id="40"/>
-    <w:bookmarkStart w:id="41" w:name="sec:scaling"/>
+    <w:bookmarkEnd w:id="41"/>
+    <w:bookmarkStart w:id="42" w:name="sec:scaling"/>
     <w:p>
       <w:pPr>
         <w:pStyle w:val="Heading4"/>
@@ -19650,8 +20761,8 @@
         <w:t xml:space="preserve">make product states look entangled.</w:t>
       </w:r>
     </w:p>
-    <w:bookmarkEnd w:id="41"/>
-    <w:bookmarkStart w:id="43" w:name="sec:beyond"/>
+    <w:bookmarkEnd w:id="42"/>
+    <w:bookmarkStart w:id="44" w:name="sec:beyond"/>
     <w:p>
       <w:pPr>
         <w:pStyle w:val="Heading4"/>
@@ -20989,7 +22100,261 @@
         <w:t xml:space="preserve">does not describe, dominate these noise models; the echo cut the decision error but changed no decision.</w:t>
       </w:r>
     </w:p>
-    <w:bookmarkStart w:id="42" w:name="tab:beyond"/>
+    <w:p>
+      <w:pPr>
+        <w:numPr>
+          <w:ilvl w:val="0"/>
+          <w:numId w:val="1006"/>
+        </w:numPr>
+      </w:pPr>
+      <w:r>
+        <w:rPr>
+          <w:iCs/>
+          <w:rFonts w:ascii="Times New Roman" w:hAnsi="Times New Roman"/>
+          <w:i/>
+        </w:rPr>
+        <w:t xml:space="preserve">Calibrating with the device itself</w:t>
+      </w:r>
+      <w:r>
+        <w:rPr>
+          <w:rFonts w:ascii="Times New Roman" w:hAnsi="Times New Roman"/>
+        </w:rPr>
+        <w:t xml:space="preserve"> </w:t>
+      </w:r>
+      <w:r>
+        <w:rPr>
+          <w:rFonts w:ascii="Times New Roman" w:hAnsi="Times New Roman"/>
+        </w:rPr>
+        <w:t xml:space="preserve">(same backends and inputs). Retraining with the filter through the</w:t>
+      </w:r>
+      <w:r>
+        <w:rPr>
+          <w:rFonts w:ascii="Times New Roman" w:hAnsi="Times New Roman"/>
+        </w:rPr>
+        <w:t xml:space="preserve"> </w:t>
+      </w:r>
+      <w:r>
+        <w:rPr>
+          <w:rFonts w:ascii="Times New Roman" w:hAnsi="Times New Roman"/>
+        </w:rPr>
+        <w:t xml:space="preserve">in-sector mixing measured by the echo gave 0.970, and refitting the linear readout on 40 training inputs run on the</w:t>
+      </w:r>
+      <w:r>
+        <w:rPr>
+          <w:rFonts w:ascii="Times New Roman" w:hAnsi="Times New Roman"/>
+        </w:rPr>
+        <w:t xml:space="preserve"> </w:t>
+      </w:r>
+      <w:r>
+        <w:rPr>
+          <w:rFonts w:ascii="Times New Roman" w:hAnsi="Times New Roman"/>
+        </w:rPr>
+        <w:t xml:space="preserve">device gave 0.965, against 0.972 for noiseless training plus the filter.</w:t>
+      </w:r>
+    </w:p>
+    <w:p>
+      <w:pPr>
+        <w:numPr>
+          <w:ilvl w:val="0"/>
+          <w:numId w:val="1006"/>
+        </w:numPr>
+      </w:pPr>
+      <w:r>
+        <w:rPr>
+          <w:iCs/>
+          <w:rFonts w:ascii="Times New Roman" w:hAnsi="Times New Roman"/>
+          <w:i/>
+        </w:rPr>
+        <w:t xml:space="preserve">Why the multiclass loss varies between seeds</w:t>
+      </w:r>
+      <w:r>
+        <w:rPr>
+          <w:rFonts w:ascii="Times New Roman" w:hAnsi="Times New Roman"/>
+        </w:rPr>
+        <w:t xml:space="preserve"> </w:t>
+      </w:r>
+      <w:r>
+        <w:rPr>
+          <w:rFonts w:ascii="Times New Roman" w:hAnsi="Times New Roman"/>
+        </w:rPr>
+        <w:t xml:space="preserve">(5-class digits, 20 seeds per readout). F7 predicted every</w:t>
+      </w:r>
+      <w:r>
+        <w:rPr>
+          <w:rFonts w:ascii="Times New Roman" w:hAnsi="Times New Roman"/>
+        </w:rPr>
+        <w:t xml:space="preserve"> </w:t>
+      </w:r>
+      <w:r>
+        <w:rPr>
+          <w:rFonts w:ascii="Times New Roman" w:hAnsi="Times New Roman"/>
+        </w:rPr>
+        <w:t xml:space="preserve">raw decision in all 40 runs. A pull index,</w:t>
+      </w:r>
+      <w:r>
+        <w:rPr>
+          <w:rFonts w:ascii="Times New Roman" w:hAnsi="Times New Roman"/>
+        </w:rPr>
+        <w:t xml:space="preserve"> </w:t>
+      </w:r>
+      <m:oMath>
+        <m:d>
+          <m:dPr>
+            <m:begChr m:val="("/>
+            <m:endChr m:val=")"/>
+            <m:sepChr m:val=""/>
+            <m:grow/>
+          </m:dPr>
+          <m:e>
+            <m:r>
+              <m:t>1</m:t>
+            </m:r>
+            <m:r>
+              <m:rPr>
+                <m:sty m:val="p"/>
+              </m:rPr>
+              <m:t>−</m:t>
+            </m:r>
+            <m:r>
+              <m:t>K</m:t>
+            </m:r>
+          </m:e>
+        </m:d>
+        <m:r>
+          <m:rPr>
+            <m:sty m:val="p"/>
+          </m:rPr>
+          <m:t>/</m:t>
+        </m:r>
+        <m:r>
+          <m:t>K</m:t>
+        </m:r>
+      </m:oMath>
+      <w:r>
+        <w:rPr>
+          <w:rFonts w:ascii="Times New Roman" w:hAnsi="Times New Roman"/>
+        </w:rPr>
+        <w:t xml:space="preserve"> </w:t>
+      </w:r>
+      <w:r>
+        <w:rPr>
+          <w:rFonts w:ascii="Times New Roman" w:hAnsi="Times New Roman"/>
+        </w:rPr>
+        <w:t xml:space="preserve">times the spread of</w:t>
+      </w:r>
+      <w:r>
+        <w:rPr>
+          <w:rFonts w:ascii="Times New Roman" w:hAnsi="Times New Roman"/>
+        </w:rPr>
+        <w:t xml:space="preserve"> </w:t>
+      </w:r>
+      <m:oMath>
+        <m:r>
+          <m:t>v</m:t>
+        </m:r>
+      </m:oMath>
+      <w:r>
+        <w:rPr>
+          <w:rFonts w:ascii="Times New Roman" w:hAnsi="Times New Roman"/>
+        </w:rPr>
+        <w:t xml:space="preserve"> </w:t>
+      </w:r>
+      <w:r>
+        <w:rPr>
+          <w:rFonts w:ascii="Times New Roman" w:hAnsi="Times New Roman"/>
+        </w:rPr>
+        <w:t xml:space="preserve">over the median training margin,</w:t>
+      </w:r>
+      <w:r>
+        <w:rPr>
+          <w:rFonts w:ascii="Times New Roman" w:hAnsi="Times New Roman"/>
+        </w:rPr>
+        <w:t xml:space="preserve"> </w:t>
+      </w:r>
+      <w:r>
+        <w:rPr>
+          <w:rFonts w:ascii="Times New Roman" w:hAnsi="Times New Roman"/>
+        </w:rPr>
+        <w:t xml:space="preserve">ranked the seeds by their loss without qang (Spearman 0.98 for the qubit readout, 0.65 for the head); the losses</w:t>
+      </w:r>
+      <w:r>
+        <w:rPr>
+          <w:rFonts w:ascii="Times New Roman" w:hAnsi="Times New Roman"/>
+        </w:rPr>
+        <w:t xml:space="preserve"> </w:t>
+      </w:r>
+      <w:r>
+        <w:rPr>
+          <w:rFonts w:ascii="Times New Roman" w:hAnsi="Times New Roman"/>
+        </w:rPr>
+        <w:t xml:space="preserve">ran from 3 to 42 points, and with qang every run was noiseless.</w:t>
+      </w:r>
+    </w:p>
+    <w:p>
+      <w:pPr>
+        <w:numPr>
+          <w:ilvl w:val="0"/>
+          <w:numId w:val="1006"/>
+        </w:numPr>
+      </w:pPr>
+      <w:r>
+        <w:rPr>
+          <w:iCs/>
+          <w:rFonts w:ascii="Times New Roman" w:hAnsi="Times New Roman"/>
+          <w:i/>
+        </w:rPr>
+        <w:t xml:space="preserve">Dephasing at 8 qubits</w:t>
+      </w:r>
+      <w:r>
+        <w:rPr>
+          <w:rFonts w:ascii="Times New Roman" w:hAnsi="Times New Roman"/>
+        </w:rPr>
+        <w:t xml:space="preserve"> </w:t>
+      </w:r>
+      <w:r>
+        <w:rPr>
+          <w:rFonts w:ascii="Times New Roman" w:hAnsi="Times New Roman"/>
+        </w:rPr>
+        <w:t xml:space="preserve">(cancer, wine, digits; 3 seeds; T1 0.08 plus dephasing 0.03). As at 5 qubits,</w:t>
+      </w:r>
+      <w:r>
+        <w:rPr>
+          <w:rFonts w:ascii="Times New Roman" w:hAnsi="Times New Roman"/>
+        </w:rPr>
+        <w:t xml:space="preserve"> </w:t>
+      </w:r>
+      <w:r>
+        <w:rPr>
+          <w:rFonts w:ascii="Times New Roman" w:hAnsi="Times New Roman"/>
+        </w:rPr>
+        <w:t xml:space="preserve">linear filter plus ZNE left 50% and 56% of the filter’s feature error and reached 0.955 / 0.962 (noiseless 0.959 /</w:t>
+      </w:r>
+      <w:r>
+        <w:rPr>
+          <w:rFonts w:ascii="Times New Roman" w:hAnsi="Times New Roman"/>
+        </w:rPr>
+        <w:t xml:space="preserve"> </w:t>
+      </w:r>
+      <w:r>
+        <w:rPr>
+          <w:rFonts w:ascii="Times New Roman" w:hAnsi="Times New Roman"/>
+        </w:rPr>
+        <w:t xml:space="preserve">0.964) with exact probabilities; with 1000 shots per scale at weight 2 it fell to 0.879, below the filter alone</w:t>
+      </w:r>
+      <w:r>
+        <w:rPr>
+          <w:rFonts w:ascii="Times New Roman" w:hAnsi="Times New Roman"/>
+        </w:rPr>
+        <w:t xml:space="preserve"> </w:t>
+      </w:r>
+      <w:r>
+        <w:rPr>
+          <w:rFonts w:ascii="Times New Roman" w:hAnsi="Times New Roman"/>
+        </w:rPr>
+        <w:t xml:space="preserve">(0.915); training with the filter under the noise gave 0.963 / 0.961. All five predictions passed.</w:t>
+      </w:r>
+    </w:p>
+    <w:bookmarkStart w:id="43" w:name="tab:beyond"/>
     <w:p>
       <w:pPr>
         <w:pStyle w:val="TableCaption"/>
@@ -22081,11 +23446,177 @@
           </w:p>
         </w:tc>
       </w:tr>
+      <w:tr>
+        <w:tc>
+          <w:tcPr/>
+          <w:p>
+            <w:pPr>
+              <w:pStyle w:val="Compact"/>
+            </w:pPr>
+          </w:p>
+        </w:tc>
+        <w:tc>
+          <w:tcPr/>
+          <w:p>
+            <w:pPr>
+              <w:pStyle w:val="Compact"/>
+              <w:jc w:val="left"/>
+            </w:pPr>
+            <w:r>
+              <w:t xml:space="preserve">device calibration</w:t>
+            </w:r>
+          </w:p>
+        </w:tc>
+        <w:tc>
+          <w:tcPr/>
+          <w:p>
+            <w:pPr>
+              <w:pStyle w:val="Compact"/>
+            </w:pPr>
+          </w:p>
+        </w:tc>
+        <w:tc>
+          <w:tcPr/>
+          <w:p>
+            <w:pPr>
+              <w:pStyle w:val="Compact"/>
+              <w:jc w:val="center"/>
+            </w:pPr>
+            <w:r>
+              <w:t xml:space="preserve">0.970 / 0.965</w:t>
+            </w:r>
+          </w:p>
+        </w:tc>
+        <w:tc>
+          <w:tcPr/>
+          <w:p>
+            <w:pPr>
+              <w:pStyle w:val="Compact"/>
+            </w:pPr>
+          </w:p>
+        </w:tc>
+      </w:tr>
+      <w:tr>
+        <w:tc>
+          <w:tcPr/>
+          <w:p>
+            <w:pPr>
+              <w:pStyle w:val="Compact"/>
+              <w:jc w:val="left"/>
+            </w:pPr>
+            <w:r>
+              <w:t xml:space="preserve">T1 + deph., 8 qubits</w:t>
+            </w:r>
+          </w:p>
+        </w:tc>
+        <w:tc>
+          <w:tcPr/>
+          <w:p>
+            <w:pPr>
+              <w:pStyle w:val="Compact"/>
+              <w:jc w:val="left"/>
+            </w:pPr>
+            <w:r>
+              <w:t xml:space="preserve">weight 1 / 2, filter alone</w:t>
+            </w:r>
+          </w:p>
+        </w:tc>
+        <w:tc>
+          <w:tcPr/>
+          <w:p>
+            <w:pPr>
+              <w:pStyle w:val="Compact"/>
+              <w:jc w:val="center"/>
+            </w:pPr>
+            <w:r>
+              <w:t xml:space="preserve">0.959 / 0.964</w:t>
+            </w:r>
+          </w:p>
+        </w:tc>
+        <w:tc>
+          <w:tcPr/>
+          <w:p>
+            <w:pPr>
+              <w:pStyle w:val="Compact"/>
+              <w:jc w:val="center"/>
+            </w:pPr>
+            <w:r>
+              <w:t xml:space="preserve">0.925 / 0.950</w:t>
+            </w:r>
+          </w:p>
+        </w:tc>
+        <w:tc>
+          <w:tcPr/>
+          <w:p>
+            <w:pPr>
+              <w:pStyle w:val="Compact"/>
+              <w:jc w:val="center"/>
+            </w:pPr>
+            <w:r>
+              <w:t xml:space="preserve">0.788 / 0.650</w:t>
+            </w:r>
+          </w:p>
+        </w:tc>
+      </w:tr>
+      <w:tr>
+        <w:tc>
+          <w:tcPr/>
+          <w:p>
+            <w:pPr>
+              <w:pStyle w:val="Compact"/>
+            </w:pPr>
+          </w:p>
+        </w:tc>
+        <w:tc>
+          <w:tcPr/>
+          <w:p>
+            <w:pPr>
+              <w:pStyle w:val="Compact"/>
+              <w:jc w:val="left"/>
+            </w:pPr>
+            <w:r>
+              <w:t xml:space="preserve">with linear ZNE (exact)</w:t>
+            </w:r>
+          </w:p>
+        </w:tc>
+        <w:tc>
+          <w:tcPr/>
+          <w:p>
+            <w:pPr>
+              <w:pStyle w:val="Compact"/>
+            </w:pPr>
+          </w:p>
+        </w:tc>
+        <w:tc>
+          <w:tcPr/>
+          <w:p>
+            <w:pPr>
+              <w:pStyle w:val="Compact"/>
+              <w:jc w:val="center"/>
+            </w:pPr>
+            <w:r>
+              <w:t xml:space="preserve">0.955 / 0.962</w:t>
+            </w:r>
+          </w:p>
+        </w:tc>
+        <w:tc>
+          <w:tcPr/>
+          <w:p>
+            <w:pPr>
+              <w:pStyle w:val="Compact"/>
+              <w:jc w:val="center"/>
+            </w:pPr>
+            <w:r>
+              <w:t xml:space="preserve">0.914 / 0.851</w:t>
+            </w:r>
+          </w:p>
+        </w:tc>
+      </w:tr>
     </w:tbl>
-    <w:bookmarkEnd w:id="42"/>
     <w:bookmarkEnd w:id="43"/>
     <w:bookmarkEnd w:id="44"/>
-    <w:bookmarkStart w:id="46" w:name="discussion"/>
+    <w:bookmarkEnd w:id="45"/>
+    <w:bookmarkStart w:id="47" w:name="discussion"/>
     <w:p>
       <w:pPr>
         <w:pStyle w:val="Heading1"/>
@@ -22505,7 +24036,7 @@
         <w:t xml:space="preserve">.</w:t>
       </w:r>
     </w:p>
-    <w:bookmarkStart w:id="45" w:name="limitations."/>
+    <w:bookmarkStart w:id="46" w:name="limitations."/>
     <w:p>
       <w:pPr>
         <w:pStyle w:val="Heading4"/>
@@ -22600,9 +24131,9 @@
         <w:t xml:space="preserve">committed, and waits for hardware credits.</w:t>
       </w:r>
     </w:p>
-    <w:bookmarkEnd w:id="45"/>
     <w:bookmarkEnd w:id="46"/>
-    <w:bookmarkStart w:id="60" w:name="code-and-data-availability"/>
+    <w:bookmarkEnd w:id="47"/>
+    <w:bookmarkStart w:id="61" w:name="code-and-data-availability"/>
     <w:p>
       <w:pPr>
         <w:pStyle w:val="Heading1"/>
@@ -23031,7 +24562,7 @@
         <w:rPr>
           <w:rFonts w:ascii="Times New Roman" w:hAnsi="Times New Roman"/>
         </w:rPr>
-        <w:t xml:space="preserve">and RESEARCH_NOTES §75–§82, §85, §87, §90, §91 and §94–§101, §104–§119, with tests in</w:t>
+        <w:t xml:space="preserve">and RESEARCH_NOTES §75–§82, §85, §87, §90, §91 and §94–§101, §104–§122, with tests in</w:t>
       </w:r>
       <w:r>
         <w:rPr>
@@ -23144,7 +24675,7 @@
         </w:rPr>
         <w:t xml:space="preserve"> </w:t>
       </w:r>
-      <w:hyperlink r:id="rId47">
+      <w:hyperlink r:id="rId48">
         <w:r>
           <w:rPr>
             <w:rStyle w:val="Hyperlink"/>
@@ -23347,8 +24878,8 @@
         <w:t xml:space="preserve"># raw readout</w:t>
       </w:r>
     </w:p>
-    <w:bookmarkStart w:id="59" w:name="refs"/>
-    <w:bookmarkStart w:id="48" w:name="ref-bonetmonroig2018"/>
+    <w:bookmarkStart w:id="60" w:name="refs"/>
+    <w:bookmarkStart w:id="49" w:name="ref-bonetmonroig2018"/>
     <w:p>
       <w:pPr>
         <w:pStyle w:val="Bibliography"/>
@@ -23398,8 +24929,8 @@
         <w:t xml:space="preserve">98: 062339.</w:t>
       </w:r>
     </w:p>
-    <w:bookmarkEnd w:id="48"/>
-    <w:bookmarkStart w:id="49" w:name="ref-cerezo2023simulability"/>
+    <w:bookmarkEnd w:id="49"/>
+    <w:bookmarkStart w:id="50" w:name="ref-cerezo2023simulability"/>
     <w:p>
       <w:pPr>
         <w:pStyle w:val="Bibliography"/>
@@ -23441,8 +24972,8 @@
         <w:t xml:space="preserve">r, Why We Need to Rethink Variational Quantum Computing.”</w:t>
       </w:r>
     </w:p>
-    <w:bookmarkEnd w:id="49"/>
-    <w:bookmarkStart w:id="51" w:name="ref-landman2022"/>
+    <w:bookmarkEnd w:id="50"/>
+    <w:bookmarkStart w:id="52" w:name="ref-landman2022"/>
     <w:p>
       <w:pPr>
         <w:pStyle w:val="Bibliography"/>
@@ -23497,7 +25028,7 @@
         </w:rPr>
         <w:t xml:space="preserve"> </w:t>
       </w:r>
-      <w:hyperlink r:id="rId50">
+      <w:hyperlink r:id="rId51">
         <w:r>
           <w:rPr>
             <w:rStyle w:val="Hyperlink"/>
@@ -23512,8 +25043,8 @@
         <w:t xml:space="preserve">.</w:t>
       </w:r>
     </w:p>
-    <w:bookmarkEnd w:id="51"/>
-    <w:bookmarkStart w:id="52" w:name="ref-mcardle2019"/>
+    <w:bookmarkEnd w:id="52"/>
+    <w:bookmarkStart w:id="53" w:name="ref-mcardle2019"/>
     <w:p>
       <w:pPr>
         <w:pStyle w:val="Bibliography"/>
@@ -23563,8 +25094,8 @@
         <w:t xml:space="preserve">122: 180501.</w:t>
       </w:r>
     </w:p>
-    <w:bookmarkEnd w:id="52"/>
-    <w:bookmarkStart w:id="54" w:name="ref-monteverde2026qang"/>
+    <w:bookmarkEnd w:id="53"/>
+    <w:bookmarkStart w:id="55" w:name="ref-monteverde2026qang"/>
     <w:p>
       <w:pPr>
         <w:pStyle w:val="Bibliography"/>
@@ -23617,7 +25148,7 @@
         </w:rPr>
         <w:t xml:space="preserve"> </w:t>
       </w:r>
-      <w:hyperlink r:id="rId53">
+      <w:hyperlink r:id="rId54">
         <w:r>
           <w:rPr>
             <w:rStyle w:val="Hyperlink"/>
@@ -23632,8 +25163,8 @@
         <w:t xml:space="preserve">.</w:t>
       </w:r>
     </w:p>
-    <w:bookmarkEnd w:id="54"/>
-    <w:bookmarkStart w:id="56" w:name="ref-monteverde2026witness"/>
+    <w:bookmarkEnd w:id="55"/>
+    <w:bookmarkStart w:id="57" w:name="ref-monteverde2026witness"/>
     <w:p>
       <w:pPr>
         <w:pStyle w:val="Bibliography"/>
@@ -23682,7 +25213,7 @@
         </w:rPr>
         <w:t xml:space="preserve"> </w:t>
       </w:r>
-      <w:hyperlink r:id="rId55">
+      <w:hyperlink r:id="rId56">
         <w:r>
           <w:rPr>
             <w:rStyle w:val="Hyperlink"/>
@@ -23697,8 +25228,8 @@
         <w:t xml:space="preserve">.</w:t>
       </w:r>
     </w:p>
-    <w:bookmarkEnd w:id="56"/>
-    <w:bookmarkStart w:id="58" w:name="ref-wang2022quantumnat"/>
+    <w:bookmarkEnd w:id="57"/>
+    <w:bookmarkStart w:id="59" w:name="ref-wang2022quantumnat"/>
     <w:p>
       <w:pPr>
         <w:pStyle w:val="Bibliography"/>
@@ -23771,7 +25302,7 @@
         </w:rPr>
         <w:t xml:space="preserve"> </w:t>
       </w:r>
-      <w:hyperlink r:id="rId57">
+      <w:hyperlink r:id="rId58">
         <w:r>
           <w:rPr>
             <w:rStyle w:val="Hyperlink"/>
@@ -23786,9 +25317,9 @@
         <w:t xml:space="preserve">.</w:t>
       </w:r>
     </w:p>
-    <w:bookmarkEnd w:id="58"/>
     <w:bookmarkEnd w:id="59"/>
     <w:bookmarkEnd w:id="60"/>
+    <w:bookmarkEnd w:id="61"/>
     <w:sectPr/>
   </w:body>
 </w:document>

</xml_diff>

<commit_message>
qang 0.6.19: sections 119-122 (device noise models, device calibration, F7 seed spread, dephasing at 8 qubits); QML note (EN/ES, PDF and Word) at 0.6.19; CITATION, Zenodo metadata, CHANGELOG
</commit_message>
<xml_diff>
--- a/manuscript/qang_qml.docx
+++ b/manuscript/qang_qml.docx
@@ -10642,7 +10642,7 @@
         <w:rPr>
           <w:rFonts w:ascii="Times New Roman" w:hAnsi="Times New Roman"/>
         </w:rPr>
-        <w:t xml:space="preserve">0.6.18,</w:t>
+        <w:t xml:space="preserve">0.6.19,</w:t>
       </w:r>
       <w:r>
         <w:rPr>
@@ -24203,7 +24203,7 @@
         <w:rPr>
           <w:rFonts w:ascii="Times New Roman" w:hAnsi="Times New Roman"/>
         </w:rPr>
-        <w:t xml:space="preserve">0.6.18 (</w:t>
+        <w:t xml:space="preserve">0.6.19 (</w:t>
       </w:r>
       <w:r>
         <w:rPr>

</xml_diff>

<commit_message>
QML note (EN/ES, PDF and Word) with section 123: the pull-free readout
</commit_message>
<xml_diff>
--- a/manuscript/qang_qml.docx
+++ b/manuscript/qang_qml.docx
@@ -5732,7 +5732,295 @@
         <w:rPr>
           <w:rFonts w:ascii="Times New Roman" w:hAnsi="Times New Roman"/>
         </w:rPr>
-        <w:t xml:space="preserve">seeds.</w:t>
+        <w:t xml:space="preserve">seeds;</w:t>
+      </w:r>
+      <w:r>
+        <w:rPr>
+          <w:rFonts w:ascii="Times New Roman" w:hAnsi="Times New Roman"/>
+        </w:rPr>
+        <w:t xml:space="preserve"> </w:t>
+      </w:r>
+      <w:r>
+        <w:rPr>
+          <w:rFonts w:ascii="Times New Roman" w:hAnsi="Times New Roman"/>
+        </w:rPr>
+        <w:t xml:space="preserve">a</w:t>
+      </w:r>
+      <w:r>
+        <w:rPr>
+          <w:rFonts w:ascii="Times New Roman" w:hAnsi="Times New Roman"/>
+        </w:rPr>
+        <w:t xml:space="preserve"> </w:t>
+      </w:r>
+      <w:r>
+        <w:rPr>
+          <w:rFonts w:ascii="Times New Roman" w:hAnsi="Times New Roman"/>
+        </w:rPr>
+        <w:t xml:space="preserve">readout</w:t>
+      </w:r>
+      <w:r>
+        <w:rPr>
+          <w:rFonts w:ascii="Times New Roman" w:hAnsi="Times New Roman"/>
+        </w:rPr>
+        <w:t xml:space="preserve"> </w:t>
+      </w:r>
+      <w:r>
+        <w:rPr>
+          <w:rFonts w:ascii="Times New Roman" w:hAnsi="Times New Roman"/>
+        </w:rPr>
+        <w:t xml:space="preserve">linear</w:t>
+      </w:r>
+      <w:r>
+        <w:rPr>
+          <w:rFonts w:ascii="Times New Roman" w:hAnsi="Times New Roman"/>
+        </w:rPr>
+        <w:t xml:space="preserve"> </w:t>
+      </w:r>
+      <w:r>
+        <w:rPr>
+          <w:rFonts w:ascii="Times New Roman" w:hAnsi="Times New Roman"/>
+        </w:rPr>
+        <w:t xml:space="preserve">in</w:t>
+      </w:r>
+      <w:r>
+        <w:rPr>
+          <w:rFonts w:ascii="Times New Roman" w:hAnsi="Times New Roman"/>
+        </w:rPr>
+        <w:t xml:space="preserve"> </w:t>
+      </w:r>
+      <w:r>
+        <w:rPr>
+          <w:rFonts w:ascii="Times New Roman" w:hAnsi="Times New Roman"/>
+        </w:rPr>
+        <w:t xml:space="preserve">the</w:t>
+      </w:r>
+      <w:r>
+        <w:rPr>
+          <w:rFonts w:ascii="Times New Roman" w:hAnsi="Times New Roman"/>
+        </w:rPr>
+        <w:t xml:space="preserve"> </w:t>
+      </w:r>
+      <w:r>
+        <w:rPr>
+          <w:rFonts w:ascii="Times New Roman" w:hAnsi="Times New Roman"/>
+        </w:rPr>
+        <w:t xml:space="preserve">excitation</w:t>
+      </w:r>
+      <w:r>
+        <w:rPr>
+          <w:rFonts w:ascii="Times New Roman" w:hAnsi="Times New Roman"/>
+        </w:rPr>
+        <w:t xml:space="preserve"> </w:t>
+      </w:r>
+      <w:r>
+        <w:rPr>
+          <w:rFonts w:ascii="Times New Roman" w:hAnsi="Times New Roman"/>
+        </w:rPr>
+        <w:t xml:space="preserve">probabilities</w:t>
+      </w:r>
+      <w:r>
+        <w:rPr>
+          <w:rFonts w:ascii="Times New Roman" w:hAnsi="Times New Roman"/>
+        </w:rPr>
+        <w:t xml:space="preserve"> </w:t>
+      </w:r>
+      <w:r>
+        <w:rPr>
+          <w:rFonts w:ascii="Times New Roman" w:hAnsi="Times New Roman"/>
+        </w:rPr>
+        <w:t xml:space="preserve">with</w:t>
+      </w:r>
+      <w:r>
+        <w:rPr>
+          <w:rFonts w:ascii="Times New Roman" w:hAnsi="Times New Roman"/>
+        </w:rPr>
+        <w:t xml:space="preserve"> </w:t>
+      </w:r>
+      <w:r>
+        <w:rPr>
+          <w:rFonts w:ascii="Times New Roman" w:hAnsi="Times New Roman"/>
+        </w:rPr>
+        <w:t xml:space="preserve">no</w:t>
+      </w:r>
+      <w:r>
+        <w:rPr>
+          <w:rFonts w:ascii="Times New Roman" w:hAnsi="Times New Roman"/>
+        </w:rPr>
+        <w:t xml:space="preserve"> </w:t>
+      </w:r>
+      <w:r>
+        <w:rPr>
+          <w:rFonts w:ascii="Times New Roman" w:hAnsi="Times New Roman"/>
+        </w:rPr>
+        <w:t xml:space="preserve">class</w:t>
+      </w:r>
+      <w:r>
+        <w:rPr>
+          <w:rFonts w:ascii="Times New Roman" w:hAnsi="Times New Roman"/>
+        </w:rPr>
+        <w:t xml:space="preserve"> </w:t>
+      </w:r>
+      <w:r>
+        <w:rPr>
+          <w:rFonts w:ascii="Times New Roman" w:hAnsi="Times New Roman"/>
+        </w:rPr>
+        <w:t xml:space="preserve">biases</w:t>
+      </w:r>
+      <w:r>
+        <w:rPr>
+          <w:rFonts w:ascii="Times New Roman" w:hAnsi="Times New Roman"/>
+        </w:rPr>
+        <w:t xml:space="preserve"> </w:t>
+      </w:r>
+      <w:r>
+        <w:rPr>
+          <w:rFonts w:ascii="Times New Roman" w:hAnsi="Times New Roman"/>
+        </w:rPr>
+        <w:t xml:space="preserve">has</w:t>
+      </w:r>
+      <w:r>
+        <w:rPr>
+          <w:rFonts w:ascii="Times New Roman" w:hAnsi="Times New Roman"/>
+        </w:rPr>
+        <w:t xml:space="preserve"> </w:t>
+      </w:r>
+      <w:r>
+        <w:rPr>
+          <w:rFonts w:ascii="Times New Roman" w:hAnsi="Times New Roman"/>
+        </w:rPr>
+        <w:t xml:space="preserve">no</w:t>
+      </w:r>
+      <w:r>
+        <w:rPr>
+          <w:rFonts w:ascii="Times New Roman" w:hAnsi="Times New Roman"/>
+        </w:rPr>
+        <w:t xml:space="preserve"> </w:t>
+      </w:r>
+      <w:r>
+        <w:rPr>
+          <w:rFonts w:ascii="Times New Roman" w:hAnsi="Times New Roman"/>
+        </w:rPr>
+        <w:t xml:space="preserve">such</w:t>
+      </w:r>
+      <w:r>
+        <w:rPr>
+          <w:rFonts w:ascii="Times New Roman" w:hAnsi="Times New Roman"/>
+        </w:rPr>
+        <w:t xml:space="preserve"> </w:t>
+      </w:r>
+      <w:r>
+        <w:rPr>
+          <w:rFonts w:ascii="Times New Roman" w:hAnsi="Times New Roman"/>
+        </w:rPr>
+        <w:t xml:space="preserve">pull,</w:t>
+      </w:r>
+      <w:r>
+        <w:rPr>
+          <w:rFonts w:ascii="Times New Roman" w:hAnsi="Times New Roman"/>
+        </w:rPr>
+        <w:t xml:space="preserve"> </w:t>
+      </w:r>
+      <w:r>
+        <w:rPr>
+          <w:rFonts w:ascii="Times New Roman" w:hAnsi="Times New Roman"/>
+        </w:rPr>
+        <w:t xml:space="preserve">carries</w:t>
+      </w:r>
+      <w:r>
+        <w:rPr>
+          <w:rFonts w:ascii="Times New Roman" w:hAnsi="Times New Roman"/>
+        </w:rPr>
+        <w:t xml:space="preserve"> </w:t>
+      </w:r>
+      <w:r>
+        <w:rPr>
+          <w:rFonts w:ascii="Times New Roman" w:hAnsi="Times New Roman"/>
+        </w:rPr>
+        <w:t xml:space="preserve">the</w:t>
+      </w:r>
+      <w:r>
+        <w:rPr>
+          <w:rFonts w:ascii="Times New Roman" w:hAnsi="Times New Roman"/>
+        </w:rPr>
+        <w:t xml:space="preserve"> </w:t>
+      </w:r>
+      <w:r>
+        <w:rPr>
+          <w:rFonts w:ascii="Times New Roman" w:hAnsi="Times New Roman"/>
+        </w:rPr>
+        <w:t xml:space="preserve">filter</w:t>
+      </w:r>
+      <w:r>
+        <w:rPr>
+          <w:rFonts w:ascii="Times New Roman" w:hAnsi="Times New Roman"/>
+        </w:rPr>
+        <w:t xml:space="preserve"> </w:t>
+      </w:r>
+      <w:r>
+        <w:rPr>
+          <w:rFonts w:ascii="Times New Roman" w:hAnsi="Times New Roman"/>
+        </w:rPr>
+        <w:t xml:space="preserve">inside</w:t>
+      </w:r>
+      <w:r>
+        <w:rPr>
+          <w:rFonts w:ascii="Times New Roman" w:hAnsi="Times New Roman"/>
+        </w:rPr>
+        <w:t xml:space="preserve"> </w:t>
+      </w:r>
+      <w:r>
+        <w:rPr>
+          <w:rFonts w:ascii="Times New Roman" w:hAnsi="Times New Roman"/>
+        </w:rPr>
+        <w:t xml:space="preserve">it</w:t>
+      </w:r>
+      <w:r>
+        <w:rPr>
+          <w:rFonts w:ascii="Times New Roman" w:hAnsi="Times New Roman"/>
+        </w:rPr>
+        <w:t xml:space="preserve"> </w:t>
+      </w:r>
+      <w:r>
+        <w:rPr>
+          <w:rFonts w:ascii="Times New Roman" w:hAnsi="Times New Roman"/>
+        </w:rPr>
+        <w:t xml:space="preserve">and</w:t>
+      </w:r>
+      <w:r>
+        <w:rPr>
+          <w:rFonts w:ascii="Times New Roman" w:hAnsi="Times New Roman"/>
+        </w:rPr>
+        <w:t xml:space="preserve"> </w:t>
+      </w:r>
+      <w:r>
+        <w:rPr>
+          <w:rFonts w:ascii="Times New Roman" w:hAnsi="Times New Roman"/>
+        </w:rPr>
+        <w:t xml:space="preserve">lost</w:t>
+      </w:r>
+      <w:r>
+        <w:rPr>
+          <w:rFonts w:ascii="Times New Roman" w:hAnsi="Times New Roman"/>
+        </w:rPr>
+        <w:t xml:space="preserve"> </w:t>
+      </w:r>
+      <w:r>
+        <w:rPr>
+          <w:rFonts w:ascii="Times New Roman" w:hAnsi="Times New Roman"/>
+        </w:rPr>
+        <w:t xml:space="preserve">nothing</w:t>
+      </w:r>
+      <w:r>
+        <w:rPr>
+          <w:rFonts w:ascii="Times New Roman" w:hAnsi="Times New Roman"/>
+        </w:rPr>
+        <w:t xml:space="preserve"> </w:t>
+      </w:r>
+      <w:r>
+        <w:rPr>
+          <w:rFonts w:ascii="Times New Roman" w:hAnsi="Times New Roman"/>
+        </w:rPr>
+        <w:t xml:space="preserve">noiselessly.</w:t>
       </w:r>
       <w:r>
         <w:rPr>
@@ -11010,7 +11298,7 @@
         <w:rPr>
           <w:rFonts w:ascii="Times New Roman" w:hAnsi="Times New Roman"/>
         </w:rPr>
-        <w:t xml:space="preserve">predictions of every study were committed to the repository before the run that tested them. Of 162 pre-registered predictions in the studies summarized here, 110 passed and 52 failed; the failures are</w:t>
+        <w:t xml:space="preserve">predictions of every study were committed to the repository before the run that tested them. Of 167 pre-registered predictions in the studies summarized here, 115 passed and 52 failed; the failures are</w:t>
       </w:r>
       <w:r>
         <w:rPr>
@@ -13609,6 +13897,158 @@
           <w:rFonts w:ascii="Times New Roman" w:hAnsi="Times New Roman"/>
         </w:rPr>
         <w:t xml:space="preserve">.</w:t>
+      </w:r>
+      <w:r>
+        <w:rPr>
+          <w:rFonts w:ascii="Times New Roman" w:hAnsi="Times New Roman"/>
+        </w:rPr>
+        <w:t xml:space="preserve"> </w:t>
+      </w:r>
+      <w:r>
+        <w:rPr>
+          <w:rFonts w:ascii="Times New Roman" w:hAnsi="Times New Roman"/>
+        </w:rPr>
+        <w:t xml:space="preserve">A readout with no class biases and logits linear in the excitation probabilities (</w:t>
+      </w:r>
+      <m:oMath>
+        <m:sSup>
+          <m:e>
+            <m:r>
+              <m:t>W</m:t>
+            </m:r>
+          </m:e>
+          <m:sup>
+            <m:r>
+              <m:rPr>
+                <m:sty m:val="p"/>
+                <m:scr m:val="sans-serif"/>
+              </m:rPr>
+              <m:t>T</m:t>
+            </m:r>
+          </m:sup>
+        </m:sSup>
+        <m:d>
+          <m:dPr>
+            <m:begChr m:val="("/>
+            <m:endChr m:val=")"/>
+            <m:sepChr m:val=""/>
+            <m:grow/>
+          </m:dPr>
+          <m:e>
+            <m:r>
+              <m:t>q</m:t>
+            </m:r>
+            <m:sSub>
+              <m:e>
+                <m:r>
+                  <m:t>g</m:t>
+                </m:r>
+              </m:e>
+              <m:sub>
+                <m:r>
+                  <m:t>Z</m:t>
+                </m:r>
+              </m:sub>
+            </m:sSub>
+            <m:r>
+              <m:rPr>
+                <m:sty m:val="p"/>
+              </m:rPr>
+              <m:t>−</m:t>
+            </m:r>
+            <m:r>
+              <m:rPr>
+                <m:sty m:val="b"/>
+              </m:rPr>
+              <m:t>1</m:t>
+            </m:r>
+          </m:e>
+        </m:d>
+      </m:oMath>
+      <w:r>
+        <w:rPr>
+          <w:rFonts w:ascii="Times New Roman" w:hAnsi="Times New Roman"/>
+        </w:rPr>
+        <w:t xml:space="preserve">, or</w:t>
+      </w:r>
+      <w:r>
+        <w:rPr>
+          <w:rFonts w:ascii="Times New Roman" w:hAnsi="Times New Roman"/>
+        </w:rPr>
+        <w:t xml:space="preserve"> </w:t>
+      </w:r>
+      <m:oMath>
+        <m:r>
+          <m:t>a</m:t>
+        </m:r>
+        <m:r>
+          <m:t> </m:t>
+        </m:r>
+        <m:sSub>
+          <m:e>
+            <m:r>
+              <m:t>p</m:t>
+            </m:r>
+          </m:e>
+          <m:sub>
+            <m:r>
+              <m:t>c</m:t>
+            </m:r>
+          </m:sub>
+        </m:sSub>
+      </m:oMath>
+      <w:r>
+        <w:rPr>
+          <w:rFonts w:ascii="Times New Roman" w:hAnsi="Times New Roman"/>
+        </w:rPr>
+        <w:t xml:space="preserve">) has no pull: the decayed shots, with every</w:t>
+      </w:r>
+      <w:r>
+        <w:rPr>
+          <w:rFonts w:ascii="Times New Roman" w:hAnsi="Times New Roman"/>
+        </w:rPr>
+        <w:t xml:space="preserve"> </w:t>
+      </w:r>
+      <m:oMath>
+        <m:sSub>
+          <m:e>
+            <m:r>
+              <m:t>p</m:t>
+            </m:r>
+          </m:e>
+          <m:sub>
+            <m:r>
+              <m:t>c</m:t>
+            </m:r>
+          </m:sub>
+        </m:sSub>
+        <m:r>
+          <m:rPr>
+            <m:sty m:val="p"/>
+          </m:rPr>
+          <m:t>=</m:t>
+        </m:r>
+        <m:r>
+          <m:t>0</m:t>
+        </m:r>
+      </m:oMath>
+      <w:r>
+        <w:rPr>
+          <w:rFonts w:ascii="Times New Roman" w:hAnsi="Times New Roman"/>
+        </w:rPr>
+        <w:t xml:space="preserve">, only rescale its logits, so its raw decisions equal the</w:t>
+      </w:r>
+      <w:r>
+        <w:rPr>
+          <w:rFonts w:ascii="Times New Roman" w:hAnsi="Times New Roman"/>
+        </w:rPr>
+        <w:t xml:space="preserve"> </w:t>
+      </w:r>
+      <w:r>
+        <w:rPr>
+          <w:rFonts w:ascii="Times New Roman" w:hAnsi="Times New Roman"/>
+        </w:rPr>
+        <w:t xml:space="preserve">filtered ones under any T1, equal or not, and with shots.</w:t>
       </w:r>
     </w:p>
     <w:bookmarkEnd w:id="28"/>
@@ -22352,6 +22792,70 @@
           <w:rFonts w:ascii="Times New Roman" w:hAnsi="Times New Roman"/>
         </w:rPr>
         <w:t xml:space="preserve">(0.915); training with the filter under the noise gave 0.963 / 0.961. All five predictions passed.</w:t>
+      </w:r>
+    </w:p>
+    <w:p>
+      <w:pPr>
+        <w:numPr>
+          <w:ilvl w:val="0"/>
+          <w:numId w:val="1006"/>
+        </w:numPr>
+      </w:pPr>
+      <w:r>
+        <w:rPr>
+          <w:iCs/>
+          <w:rFonts w:ascii="Times New Roman" w:hAnsi="Times New Roman"/>
+          <w:i/>
+        </w:rPr>
+        <w:t xml:space="preserve">A pull-free multiclass readout</w:t>
+      </w:r>
+      <w:r>
+        <w:rPr>
+          <w:rFonts w:ascii="Times New Roman" w:hAnsi="Times New Roman"/>
+        </w:rPr>
+        <w:t xml:space="preserve"> </w:t>
+      </w:r>
+      <w:r>
+        <w:rPr>
+          <w:rFonts w:ascii="Times New Roman" w:hAnsi="Times New Roman"/>
+        </w:rPr>
+        <w:t xml:space="preserve">(5-class digits, 10 seeds). Dropping the class biases cost nothing</w:t>
+      </w:r>
+      <w:r>
+        <w:rPr>
+          <w:rFonts w:ascii="Times New Roman" w:hAnsi="Times New Roman"/>
+        </w:rPr>
+        <w:t xml:space="preserve"> </w:t>
+      </w:r>
+      <w:r>
+        <w:rPr>
+          <w:rFonts w:ascii="Times New Roman" w:hAnsi="Times New Roman"/>
+        </w:rPr>
+        <w:t xml:space="preserve">noiselessly (0.938 against 0.932 for the head readout). Without the filter, the pull-free head readout kept 0.938 under</w:t>
+      </w:r>
+      <w:r>
+        <w:rPr>
+          <w:rFonts w:ascii="Times New Roman" w:hAnsi="Times New Roman"/>
+        </w:rPr>
+        <w:t xml:space="preserve"> </w:t>
+      </w:r>
+      <w:r>
+        <w:rPr>
+          <w:rFonts w:ascii="Times New Roman" w:hAnsi="Times New Roman"/>
+        </w:rPr>
+        <w:t xml:space="preserve">equal T1 and 0.928 under unequal T1, against 0.653 and 0.624 for the standard readout, and its raw decisions equalled</w:t>
+      </w:r>
+      <w:r>
+        <w:rPr>
+          <w:rFonts w:ascii="Times New Roman" w:hAnsi="Times New Roman"/>
+        </w:rPr>
+        <w:t xml:space="preserve"> </w:t>
+      </w:r>
+      <w:r>
+        <w:rPr>
+          <w:rFonts w:ascii="Times New Roman" w:hAnsi="Times New Roman"/>
+        </w:rPr>
+        <w:t xml:space="preserve">the filtered ones in every run and condition. All five predictions passed.</w:t>
       </w:r>
     </w:p>
     <w:bookmarkStart w:id="43" w:name="tab:beyond"/>
@@ -23612,6 +24116,68 @@
           </w:p>
         </w:tc>
       </w:tr>
+      <w:tr>
+        <w:tc>
+          <w:tcPr/>
+          <w:p>
+            <w:pPr>
+              <w:pStyle w:val="Compact"/>
+              <w:jc w:val="left"/>
+            </w:pPr>
+            <w:r>
+              <w:t xml:space="preserve">multiclass head, T1</w:t>
+            </w:r>
+          </w:p>
+        </w:tc>
+        <w:tc>
+          <w:tcPr/>
+          <w:p>
+            <w:pPr>
+              <w:pStyle w:val="Compact"/>
+              <w:jc w:val="left"/>
+            </w:pPr>
+            <w:r>
+              <w:t xml:space="preserve">standard / pull-free</w:t>
+            </w:r>
+          </w:p>
+        </w:tc>
+        <w:tc>
+          <w:tcPr/>
+          <w:p>
+            <w:pPr>
+              <w:pStyle w:val="Compact"/>
+              <w:jc w:val="center"/>
+            </w:pPr>
+            <w:r>
+              <w:t xml:space="preserve">0.932 / 0.938</w:t>
+            </w:r>
+          </w:p>
+        </w:tc>
+        <w:tc>
+          <w:tcPr/>
+          <w:p>
+            <w:pPr>
+              <w:pStyle w:val="Compact"/>
+              <w:jc w:val="center"/>
+            </w:pPr>
+            <w:r>
+              <w:t xml:space="preserve">0.932 / 0.938</w:t>
+            </w:r>
+          </w:p>
+        </w:tc>
+        <w:tc>
+          <w:tcPr/>
+          <w:p>
+            <w:pPr>
+              <w:pStyle w:val="Compact"/>
+              <w:jc w:val="center"/>
+            </w:pPr>
+            <w:r>
+              <w:t xml:space="preserve">0.653 / 0.938</w:t>
+            </w:r>
+          </w:p>
+        </w:tc>
+      </w:tr>
     </w:tbl>
     <w:bookmarkEnd w:id="43"/>
     <w:bookmarkEnd w:id="44"/>
@@ -24562,7 +25128,7 @@
         <w:rPr>
           <w:rFonts w:ascii="Times New Roman" w:hAnsi="Times New Roman"/>
         </w:rPr>
-        <w:t xml:space="preserve">and RESEARCH_NOTES §75–§82, §85, §87, §90, §91 and §94–§101, §104–§122, with tests in</w:t>
+        <w:t xml:space="preserve">and RESEARCH_NOTES §75–§82, §85, §87, §90, §91 and §94–§101, §104–§123, with tests in</w:t>
       </w:r>
       <w:r>
         <w:rPr>

</xml_diff>

<commit_message>
qang 0.7.0: sections 123-127 (qang.proportions, qang.clock_comparison, qang.complementarity); QML note (EN/ES, PDF and Word) with §124; CITATION, Zenodo metadata, CHANGELOG
Co-Authored-By: Claude Opus 5.5 <noreply@anthropic.com>
Claude-Session: https://claude.ai/code/session_01VmfpwzVWvRWhRHG7VzpiEN
</commit_message>
<xml_diff>
--- a/manuscript/qang_qml.docx
+++ b/manuscript/qang_qml.docx
@@ -5288,7 +5288,175 @@
         <w:rPr>
           <w:rFonts w:ascii="Times New Roman" w:hAnsi="Times New Roman"/>
         </w:rPr>
-        <w:t xml:space="preserve">better.</w:t>
+        <w:t xml:space="preserve">better,</w:t>
+      </w:r>
+      <w:r>
+        <w:rPr>
+          <w:rFonts w:ascii="Times New Roman" w:hAnsi="Times New Roman"/>
+        </w:rPr>
+        <w:t xml:space="preserve"> </w:t>
+      </w:r>
+      <w:r>
+        <w:rPr>
+          <w:rFonts w:ascii="Times New Roman" w:hAnsi="Times New Roman"/>
+        </w:rPr>
+        <w:t xml:space="preserve">and</w:t>
+      </w:r>
+      <w:r>
+        <w:rPr>
+          <w:rFonts w:ascii="Times New Roman" w:hAnsi="Times New Roman"/>
+        </w:rPr>
+        <w:t xml:space="preserve"> </w:t>
+      </w:r>
+      <w:r>
+        <w:rPr>
+          <w:rFonts w:ascii="Times New Roman" w:hAnsi="Times New Roman"/>
+        </w:rPr>
+        <w:t xml:space="preserve">neither</w:t>
+      </w:r>
+      <w:r>
+        <w:rPr>
+          <w:rFonts w:ascii="Times New Roman" w:hAnsi="Times New Roman"/>
+        </w:rPr>
+        <w:t xml:space="preserve"> </w:t>
+      </w:r>
+      <w:r>
+        <w:rPr>
+          <w:rFonts w:ascii="Times New Roman" w:hAnsi="Times New Roman"/>
+        </w:rPr>
+        <w:t xml:space="preserve">did</w:t>
+      </w:r>
+      <w:r>
+        <w:rPr>
+          <w:rFonts w:ascii="Times New Roman" w:hAnsi="Times New Roman"/>
+        </w:rPr>
+        <w:t xml:space="preserve"> </w:t>
+      </w:r>
+      <w:r>
+        <w:rPr>
+          <w:rFonts w:ascii="Times New Roman" w:hAnsi="Times New Roman"/>
+        </w:rPr>
+        <w:t xml:space="preserve">adding</w:t>
+      </w:r>
+      <w:r>
+        <w:rPr>
+          <w:rFonts w:ascii="Times New Roman" w:hAnsi="Times New Roman"/>
+        </w:rPr>
+        <w:t xml:space="preserve"> </w:t>
+      </w:r>
+      <w:r>
+        <w:rPr>
+          <w:rFonts w:ascii="Times New Roman" w:hAnsi="Times New Roman"/>
+        </w:rPr>
+        <w:t xml:space="preserve">the</w:t>
+      </w:r>
+      <w:r>
+        <w:rPr>
+          <w:rFonts w:ascii="Times New Roman" w:hAnsi="Times New Roman"/>
+        </w:rPr>
+        <w:t xml:space="preserve"> </w:t>
+      </w:r>
+      <w:r>
+        <w:rPr>
+          <w:rFonts w:ascii="Times New Roman" w:hAnsi="Times New Roman"/>
+        </w:rPr>
+        <w:t xml:space="preserve">published</w:t>
+      </w:r>
+      <w:r>
+        <w:rPr>
+          <w:rFonts w:ascii="Times New Roman" w:hAnsi="Times New Roman"/>
+        </w:rPr>
+        <w:t xml:space="preserve"> </w:t>
+      </w:r>
+      <w:r>
+        <w:rPr>
+          <w:rFonts w:ascii="Times New Roman" w:hAnsi="Times New Roman"/>
+        </w:rPr>
+        <w:t xml:space="preserve">two-qubit</w:t>
+      </w:r>
+      <w:r>
+        <w:rPr>
+          <w:rFonts w:ascii="Times New Roman" w:hAnsi="Times New Roman"/>
+        </w:rPr>
+        <w:t xml:space="preserve"> </w:t>
+      </w:r>
+      <w:r>
+        <w:rPr>
+          <w:rFonts w:ascii="Times New Roman" w:hAnsi="Times New Roman"/>
+        </w:rPr>
+        <w:t xml:space="preserve">gate</w:t>
+      </w:r>
+      <w:r>
+        <w:rPr>
+          <w:rFonts w:ascii="Times New Roman" w:hAnsi="Times New Roman"/>
+        </w:rPr>
+        <w:t xml:space="preserve"> </w:t>
+      </w:r>
+      <w:r>
+        <w:rPr>
+          <w:rFonts w:ascii="Times New Roman" w:hAnsi="Times New Roman"/>
+        </w:rPr>
+        <w:t xml:space="preserve">errors</w:t>
+      </w:r>
+      <w:r>
+        <w:rPr>
+          <w:rFonts w:ascii="Times New Roman" w:hAnsi="Times New Roman"/>
+        </w:rPr>
+        <w:t xml:space="preserve"> </w:t>
+      </w:r>
+      <w:r>
+        <w:rPr>
+          <w:rFonts w:ascii="Times New Roman" w:hAnsi="Times New Roman"/>
+        </w:rPr>
+        <w:t xml:space="preserve">to</w:t>
+      </w:r>
+      <w:r>
+        <w:rPr>
+          <w:rFonts w:ascii="Times New Roman" w:hAnsi="Times New Roman"/>
+        </w:rPr>
+        <w:t xml:space="preserve"> </w:t>
+      </w:r>
+      <w:r>
+        <w:rPr>
+          <w:rFonts w:ascii="Times New Roman" w:hAnsi="Times New Roman"/>
+        </w:rPr>
+        <w:t xml:space="preserve">the</w:t>
+      </w:r>
+      <w:r>
+        <w:rPr>
+          <w:rFonts w:ascii="Times New Roman" w:hAnsi="Times New Roman"/>
+        </w:rPr>
+        <w:t xml:space="preserve"> </w:t>
+      </w:r>
+      <w:r>
+        <w:rPr>
+          <w:rFonts w:ascii="Times New Roman" w:hAnsi="Times New Roman"/>
+        </w:rPr>
+        <w:t xml:space="preserve">training</w:t>
+      </w:r>
+      <w:r>
+        <w:rPr>
+          <w:rFonts w:ascii="Times New Roman" w:hAnsi="Times New Roman"/>
+        </w:rPr>
+        <w:t xml:space="preserve"> </w:t>
+      </w:r>
+      <w:r>
+        <w:rPr>
+          <w:rFonts w:ascii="Times New Roman" w:hAnsi="Times New Roman"/>
+        </w:rPr>
+        <w:t xml:space="preserve">simulator</w:t>
+      </w:r>
+      <w:r>
+        <w:rPr>
+          <w:rFonts w:ascii="Times New Roman" w:hAnsi="Times New Roman"/>
+        </w:rPr>
+        <w:t xml:space="preserve"> </w:t>
+      </w:r>
+      <w:r>
+        <w:rPr>
+          <w:rFonts w:ascii="Times New Roman" w:hAnsi="Times New Roman"/>
+        </w:rPr>
+        <w:t xml:space="preserve">(0.966).</w:t>
       </w:r>
       <w:r>
         <w:rPr>
@@ -10930,7 +11098,7 @@
         <w:rPr>
           <w:rFonts w:ascii="Times New Roman" w:hAnsi="Times New Roman"/>
         </w:rPr>
-        <w:t xml:space="preserve">0.6.19,</w:t>
+        <w:t xml:space="preserve">0.7.0,</w:t>
       </w:r>
       <w:r>
         <w:rPr>
@@ -22856,6 +23024,119 @@
           <w:rFonts w:ascii="Times New Roman" w:hAnsi="Times New Roman"/>
         </w:rPr>
         <w:t xml:space="preserve">the filtered ones in every run and condition. All five predictions passed.</w:t>
+      </w:r>
+    </w:p>
+    <w:p>
+      <w:pPr>
+        <w:numPr>
+          <w:ilvl w:val="0"/>
+          <w:numId w:val="1006"/>
+        </w:numPr>
+      </w:pPr>
+      <w:r>
+        <w:rPr>
+          <w:iCs/>
+          <w:rFonts w:ascii="Times New Roman" w:hAnsi="Times New Roman"/>
+          <w:i/>
+        </w:rPr>
+        <w:t xml:space="preserve">Gate errors in the training simulator</w:t>
+      </w:r>
+      <w:r>
+        <w:rPr>
+          <w:rFonts w:ascii="Times New Roman" w:hAnsi="Times New Roman"/>
+        </w:rPr>
+        <w:t xml:space="preserve"> </w:t>
+      </w:r>
+      <w:r>
+        <w:rPr>
+          <w:rFonts w:ascii="Times New Roman" w:hAnsi="Times New Roman"/>
+        </w:rPr>
+        <w:t xml:space="preserve">(the IBM backends and inputs above; a two-qubit depolarizing</w:t>
+      </w:r>
+      <w:r>
+        <w:rPr>
+          <w:rFonts w:ascii="Times New Roman" w:hAnsi="Times New Roman"/>
+        </w:rPr>
+        <w:t xml:space="preserve"> </w:t>
+      </w:r>
+      <w:r>
+        <w:rPr>
+          <w:rFonts w:ascii="Times New Roman" w:hAnsi="Times New Roman"/>
+        </w:rPr>
+        <w:t xml:space="preserve">error after every RBS gate,</w:t>
+      </w:r>
+      <w:r>
+        <w:rPr>
+          <w:rFonts w:ascii="Times New Roman" w:hAnsi="Times New Roman"/>
+        </w:rPr>
+        <w:t xml:space="preserve"> </w:t>
+      </w:r>
+      <m:oMath>
+        <m:r>
+          <m:t>p</m:t>
+        </m:r>
+        <m:r>
+          <m:rPr>
+            <m:sty m:val="p"/>
+          </m:rPr>
+          <m:t>=</m:t>
+        </m:r>
+        <m:r>
+          <m:t>0.015</m:t>
+        </m:r>
+      </m:oMath>
+      <w:r>
+        <w:rPr>
+          <w:rFonts w:ascii="Times New Roman" w:hAnsi="Times New Roman"/>
+        </w:rPr>
+        <w:t xml:space="preserve">–</w:t>
+      </w:r>
+      <m:oMath>
+        <m:r>
+          <m:t>0.028</m:t>
+        </m:r>
+      </m:oMath>
+      <w:r>
+        <w:rPr>
+          <w:rFonts w:ascii="Times New Roman" w:hAnsi="Times New Roman"/>
+        </w:rPr>
+        <w:t xml:space="preserve">, from the published ECR or CZ error). Trained with the filter under</w:t>
+      </w:r>
+      <w:r>
+        <w:rPr>
+          <w:rFonts w:ascii="Times New Roman" w:hAnsi="Times New Roman"/>
+        </w:rPr>
+        <w:t xml:space="preserve"> </w:t>
+      </w:r>
+      <w:r>
+        <w:rPr>
+          <w:rFonts w:ascii="Times New Roman" w:hAnsi="Times New Roman"/>
+        </w:rPr>
+        <w:t xml:space="preserve">T1/T2 plus that gate error the model gave 0.966, against 0.972 for noiseless training plus the filter; trained</w:t>
+      </w:r>
+      <w:r>
+        <w:rPr>
+          <w:rFonts w:ascii="Times New Roman" w:hAnsi="Times New Roman"/>
+        </w:rPr>
+        <w:t xml:space="preserve"> </w:t>
+      </w:r>
+      <w:r>
+        <w:rPr>
+          <w:rFonts w:ascii="Times New Roman" w:hAnsi="Times New Roman"/>
+        </w:rPr>
+        <w:t xml:space="preserve">without the filter under it, 0.970, 1.2 points above the noiseless model read raw. The simulator overestimated the</w:t>
+      </w:r>
+      <w:r>
+        <w:rPr>
+          <w:rFonts w:ascii="Times New Roman" w:hAnsi="Times New Roman"/>
+        </w:rPr>
+        <w:t xml:space="preserve"> </w:t>
+      </w:r>
+      <w:r>
+        <w:rPr>
+          <w:rFonts w:ascii="Times New Roman" w:hAnsi="Times New Roman"/>
+        </w:rPr>
+        <w:t xml:space="preserve">kept fraction by 0.03–0.12, plausibly because it has no readout error. One of five predictions passed.</w:t>
       </w:r>
     </w:p>
     <w:bookmarkStart w:id="43" w:name="tab:beyond"/>
@@ -24006,6 +24287,60 @@
           <w:p>
             <w:pPr>
               <w:pStyle w:val="Compact"/>
+            </w:pPr>
+          </w:p>
+        </w:tc>
+        <w:tc>
+          <w:tcPr/>
+          <w:p>
+            <w:pPr>
+              <w:pStyle w:val="Compact"/>
+              <w:jc w:val="left"/>
+            </w:pPr>
+            <w:r>
+              <w:t xml:space="preserve">gate-error-aware training</w:t>
+            </w:r>
+          </w:p>
+        </w:tc>
+        <w:tc>
+          <w:tcPr/>
+          <w:p>
+            <w:pPr>
+              <w:pStyle w:val="Compact"/>
+            </w:pPr>
+          </w:p>
+        </w:tc>
+        <w:tc>
+          <w:tcPr/>
+          <w:p>
+            <w:pPr>
+              <w:pStyle w:val="Compact"/>
+              <w:jc w:val="center"/>
+            </w:pPr>
+            <w:r>
+              <w:t xml:space="preserve">0.966</w:t>
+            </w:r>
+          </w:p>
+        </w:tc>
+        <w:tc>
+          <w:tcPr/>
+          <w:p>
+            <w:pPr>
+              <w:pStyle w:val="Compact"/>
+              <w:jc w:val="center"/>
+            </w:pPr>
+            <w:r>
+              <w:t xml:space="preserve">0.970</w:t>
+            </w:r>
+          </w:p>
+        </w:tc>
+      </w:tr>
+      <w:tr>
+        <w:tc>
+          <w:tcPr/>
+          <w:p>
+            <w:pPr>
+              <w:pStyle w:val="Compact"/>
               <w:jc w:val="left"/>
             </w:pPr>
             <w:r>
@@ -24386,7 +24721,7 @@
         <w:rPr>
           <w:rFonts w:ascii="Times New Roman" w:hAnsi="Times New Roman"/>
         </w:rPr>
-        <w:t xml:space="preserve">from the published T1 and T2 added nothing, and noiseless training plus the filter was the best pipeline. Two practical rules follow from the studies above. Up</w:t>
+        <w:t xml:space="preserve">from the published T1 and T2, or with the published gate errors added, gave nothing, and noiseless training plus the filter was the best pipeline. Two practical rules follow from the studies above. Up</w:t>
       </w:r>
       <w:r>
         <w:rPr>
@@ -24769,7 +25104,7 @@
         <w:rPr>
           <w:rFonts w:ascii="Times New Roman" w:hAnsi="Times New Roman"/>
         </w:rPr>
-        <w:t xml:space="preserve">0.6.19 (</w:t>
+        <w:t xml:space="preserve">0.7.0 (</w:t>
       </w:r>
       <w:r>
         <w:rPr>
@@ -25128,7 +25463,7 @@
         <w:rPr>
           <w:rFonts w:ascii="Times New Roman" w:hAnsi="Times New Roman"/>
         </w:rPr>
-        <w:t xml:space="preserve">and RESEARCH_NOTES §75–§82, §85, §87, §90, §91 and §94–§101, §104–§123, with tests in</w:t>
+        <w:t xml:space="preserve">and RESEARCH_NOTES §75–§82, §85, §87, §90, §91 and §94–§101, §104–§124, with tests in</w:t>
       </w:r>
       <w:r>
         <w:rPr>

</xml_diff>